<commit_message>
ZP-DOC-01..04 v2.0 approved by B.M.P Banneka, Product Owner, 14 Oct 2026 (CR-001..CR-006 baselined; supersedes v1.0); README docs table updated
Co-Authored-By: Claude Opus 5.5 (1M context) <noreply@anthropic.com>
</commit_message>
<xml_diff>
--- a/docs/01-vision-and-scope/ZP-DOC-01_Vision-and-Scope.docx
+++ b/docs/01-vision-and-scope/ZP-DOC-01_Vision-and-Scope.docx
@@ -90,7 +90,7 @@
           <w:left w:w="10" w:type="dxa"/>
           <w:right w:w="10" w:type="dxa"/>
         </w:tblCellMar>
-        <w:tblLook w:val="04A0" w:firstRow="1" w:lastRow="0" w:firstColumn="1" w:lastColumn="0" w:noHBand="0" w:noVBand="1"/>
+        <w:tblLook w:val="0000" w:firstRow="0" w:lastRow="0" w:firstColumn="0" w:lastColumn="0" w:noHBand="0" w:noVBand="0"/>
       </w:tblPr>
       <w:tblGrid>
         <w:gridCol w:w="2600"/>
@@ -157,7 +157,7 @@
                 <w:sz w:val="19"/>
                 <w:szCs w:val="19"/>
               </w:rPr>
-              <w:t>2.0 (draft)</w:t>
+              <w:t>2.0</w:t>
             </w:r>
           </w:p>
         </w:tc>
@@ -223,7 +223,7 @@
                 <w:sz w:val="19"/>
                 <w:szCs w:val="19"/>
               </w:rPr>
-              <w:t>Under revision</w:t>
+              <w:t>Approved</w:t>
             </w:r>
           </w:p>
         </w:tc>
@@ -289,7 +289,7 @@
                 <w:sz w:val="19"/>
                 <w:szCs w:val="19"/>
               </w:rPr>
-              <w:t>11 October 2026</w:t>
+              <w:t>14 October 2026</w:t>
             </w:r>
           </w:p>
         </w:tc>
@@ -494,7 +494,7 @@
           <w:left w:w="10" w:type="dxa"/>
           <w:right w:w="10" w:type="dxa"/>
         </w:tblCellMar>
-        <w:tblLook w:val="04A0" w:firstRow="1" w:lastRow="0" w:firstColumn="1" w:lastColumn="0" w:noHBand="0" w:noVBand="1"/>
+        <w:tblLook w:val="0000" w:firstRow="0" w:lastRow="0" w:firstColumn="0" w:lastColumn="0" w:noHBand="0" w:noVBand="0"/>
       </w:tblPr>
       <w:tblGrid>
         <w:gridCol w:w="2600"/>
@@ -693,7 +693,7 @@
                 <w:sz w:val="19"/>
                 <w:szCs w:val="19"/>
               </w:rPr>
-              <w:t>2.0 (draft)</w:t>
+              <w:t>2.0</w:t>
             </w:r>
           </w:p>
         </w:tc>
@@ -759,7 +759,7 @@
                 <w:sz w:val="19"/>
                 <w:szCs w:val="19"/>
               </w:rPr>
-              <w:t>Under revision</w:t>
+              <w:t>Approved</w:t>
             </w:r>
           </w:p>
         </w:tc>
@@ -1189,7 +1189,7 @@
           <w:left w:w="10" w:type="dxa"/>
           <w:right w:w="10" w:type="dxa"/>
         </w:tblCellMar>
-        <w:tblLook w:val="04A0" w:firstRow="1" w:lastRow="0" w:firstColumn="1" w:lastColumn="0" w:noHBand="0" w:noVBand="1"/>
+        <w:tblLook w:val="0000" w:firstRow="0" w:lastRow="0" w:firstColumn="0" w:lastColumn="0" w:noHBand="0" w:noVBand="0"/>
       </w:tblPr>
       <w:tblGrid>
         <w:gridCol w:w="964"/>
@@ -1683,6 +1683,122 @@
           </w:p>
         </w:tc>
       </w:tr>
+      <w:tr>
+        <w:tblPrEx>
+          <w:tblCellMar>
+            <w:top w:w="0" w:type="dxa"/>
+            <w:bottom w:w="0" w:type="dxa"/>
+          </w:tblCellMar>
+        </w:tblPrEx>
+        <w:trPr>
+          <w:cantSplit/>
+          <w:trHeight w:val="420"/>
+        </w:trPr>
+        <w:tc>
+          <w:tcPr>
+            <w:tcW w:w="964" w:type="dxa"/>
+            <w:tcBorders>
+              <w:top w:val="single" w:sz="4" w:space="0" w:color="C9D3D0"/>
+              <w:left w:val="single" w:sz="4" w:space="0" w:color="C9D3D0"/>
+              <w:bottom w:val="single" w:sz="4" w:space="0" w:color="C9D3D0"/>
+              <w:right w:val="single" w:sz="4" w:space="0" w:color="C9D3D0"/>
+            </w:tcBorders>
+            <w:tcMar>
+              <w:top w:w="50" w:type="dxa"/>
+              <w:left w:w="100" w:type="dxa"/>
+              <w:bottom w:w="50" w:type="dxa"/>
+              <w:right w:w="100" w:type="dxa"/>
+            </w:tcMar>
+          </w:tcPr>
+          <w:p>
+            <w:r>
+              <w:rPr>
+                <w:sz w:val="19"/>
+                <w:szCs w:val="19"/>
+              </w:rPr>
+              <w:t>2.0</w:t>
+            </w:r>
+          </w:p>
+        </w:tc>
+        <w:tc>
+          <w:tcPr>
+            <w:tcW w:w="1542" w:type="dxa"/>
+            <w:tcBorders>
+              <w:top w:val="single" w:sz="4" w:space="0" w:color="C9D3D0"/>
+              <w:left w:val="single" w:sz="4" w:space="0" w:color="C9D3D0"/>
+              <w:bottom w:val="single" w:sz="4" w:space="0" w:color="C9D3D0"/>
+              <w:right w:val="single" w:sz="4" w:space="0" w:color="C9D3D0"/>
+            </w:tcBorders>
+            <w:tcMar>
+              <w:top w:w="50" w:type="dxa"/>
+              <w:left w:w="100" w:type="dxa"/>
+              <w:bottom w:w="50" w:type="dxa"/>
+              <w:right w:w="100" w:type="dxa"/>
+            </w:tcMar>
+          </w:tcPr>
+          <w:p>
+            <w:r>
+              <w:rPr>
+                <w:sz w:val="19"/>
+                <w:szCs w:val="19"/>
+              </w:rPr>
+              <w:t>14 Oct 2026</w:t>
+            </w:r>
+          </w:p>
+        </w:tc>
+        <w:tc>
+          <w:tcPr>
+            <w:tcW w:w="1928" w:type="dxa"/>
+            <w:tcBorders>
+              <w:top w:val="single" w:sz="4" w:space="0" w:color="C9D3D0"/>
+              <w:left w:val="single" w:sz="4" w:space="0" w:color="C9D3D0"/>
+              <w:bottom w:val="single" w:sz="4" w:space="0" w:color="C9D3D0"/>
+              <w:right w:val="single" w:sz="4" w:space="0" w:color="C9D3D0"/>
+            </w:tcBorders>
+            <w:tcMar>
+              <w:top w:w="50" w:type="dxa"/>
+              <w:left w:w="100" w:type="dxa"/>
+              <w:bottom w:w="50" w:type="dxa"/>
+              <w:right w:w="100" w:type="dxa"/>
+            </w:tcMar>
+          </w:tcPr>
+          <w:p>
+            <w:r>
+              <w:rPr>
+                <w:sz w:val="19"/>
+                <w:szCs w:val="19"/>
+              </w:rPr>
+              <w:t>B.M.P Banneka</w:t>
+            </w:r>
+          </w:p>
+        </w:tc>
+        <w:tc>
+          <w:tcPr>
+            <w:tcW w:w="5204" w:type="dxa"/>
+            <w:tcBorders>
+              <w:top w:val="single" w:sz="4" w:space="0" w:color="C9D3D0"/>
+              <w:left w:val="single" w:sz="4" w:space="0" w:color="C9D3D0"/>
+              <w:bottom w:val="single" w:sz="4" w:space="0" w:color="C9D3D0"/>
+              <w:right w:val="single" w:sz="4" w:space="0" w:color="C9D3D0"/>
+            </w:tcBorders>
+            <w:tcMar>
+              <w:top w:w="50" w:type="dxa"/>
+              <w:left w:w="100" w:type="dxa"/>
+              <w:bottom w:w="50" w:type="dxa"/>
+              <w:right w:w="100" w:type="dxa"/>
+            </w:tcMar>
+          </w:tcPr>
+          <w:p>
+            <w:r>
+              <w:rPr>
+                <w:sz w:val="19"/>
+                <w:szCs w:val="19"/>
+              </w:rPr>
+              <w:t>Approved by the product owner; baselined. Supersedes 1.0</w:t>
+            </w:r>
+          </w:p>
+        </w:tc>
+      </w:tr>
     </w:tbl>
     <w:p>
       <w:pPr>
@@ -1725,7 +1841,7 @@
           <w:left w:w="10" w:type="dxa"/>
           <w:right w:w="10" w:type="dxa"/>
         </w:tblCellMar>
-        <w:tblLook w:val="04A0" w:firstRow="1" w:lastRow="0" w:firstColumn="1" w:lastColumn="0" w:noHBand="0" w:noVBand="1"/>
+        <w:tblLook w:val="0000" w:firstRow="0" w:lastRow="0" w:firstColumn="0" w:lastColumn="0" w:noHBand="0" w:noVBand="0"/>
       </w:tblPr>
       <w:tblGrid>
         <w:gridCol w:w="2120"/>
@@ -2049,7 +2165,7 @@
                 <w:sz w:val="19"/>
                 <w:szCs w:val="19"/>
               </w:rPr>
-              <w:t>v1.0 approved in writing (project channel); this revision awaits approval</w:t>
+              <w:t>Approved in writing (project channel), v2.0 on 14 Oct 2026 and v1.0 on 5 Oct 2026</w:t>
             </w:r>
           </w:p>
         </w:tc>
@@ -2075,7 +2191,7 @@
                 <w:sz w:val="19"/>
                 <w:szCs w:val="19"/>
               </w:rPr>
-              <w:t>5 Oct 2026 (v1.0)</w:t>
+              <w:t>14 Oct 2026 (v2.0); 5 Oct 2026 (v1.0)</w:t>
             </w:r>
           </w:p>
         </w:tc>
@@ -2083,6 +2199,7 @@
     </w:tbl>
     <w:p>
       <w:r>
+        <w:lastRenderedPageBreak/>
         <w:br w:type="page"/>
       </w:r>
     </w:p>
@@ -2098,7 +2215,7 @@
     <w:sdt>
       <w:sdtPr>
         <w:alias w:val="Contents"/>
-        <w:id w:val="-298540570"/>
+        <w:id w:val="-598564440"/>
       </w:sdtPr>
       <w:sdtEndPr/>
       <w:sdtContent>
@@ -2127,7 +2244,7 @@
           <w:r>
             <w:fldChar w:fldCharType="separate"/>
           </w:r>
-          <w:hyperlink w:anchor="_Toc242619621" w:history="1">
+          <w:hyperlink w:anchor="_Toc242912107" w:history="1">
             <w:r>
               <w:rPr>
                 <w:rStyle w:val="Hyperlink"/>
@@ -2151,7 +2268,7 @@
               <w:rPr>
                 <w:noProof/>
               </w:rPr>
-              <w:instrText xml:space="preserve"> PAGEREF _Toc242619621 \h </w:instrText>
+              <w:instrText xml:space="preserve"> PAGEREF _Toc242912107 \h </w:instrText>
             </w:r>
             <w:r>
               <w:rPr>
@@ -2168,7 +2285,7 @@
               <w:rPr>
                 <w:noProof/>
               </w:rPr>
-              <w:t>5</w:t>
+              <w:t>6</w:t>
             </w:r>
             <w:r>
               <w:rPr>
@@ -2194,7 +2311,7 @@
               <w14:ligatures w14:val="standardContextual"/>
             </w:rPr>
           </w:pPr>
-          <w:hyperlink w:anchor="_Toc242619622" w:history="1">
+          <w:hyperlink w:anchor="_Toc242912108" w:history="1">
             <w:r>
               <w:rPr>
                 <w:rStyle w:val="Hyperlink"/>
@@ -2218,7 +2335,7 @@
               <w:rPr>
                 <w:noProof/>
               </w:rPr>
-              <w:instrText xml:space="preserve"> PAGEREF _Toc242619622 \h </w:instrText>
+              <w:instrText xml:space="preserve"> PAGEREF _Toc242912108 \h </w:instrText>
             </w:r>
             <w:r>
               <w:rPr>
@@ -2235,7 +2352,7 @@
               <w:rPr>
                 <w:noProof/>
               </w:rPr>
-              <w:t>5</w:t>
+              <w:t>6</w:t>
             </w:r>
             <w:r>
               <w:rPr>
@@ -2261,7 +2378,7 @@
               <w14:ligatures w14:val="standardContextual"/>
             </w:rPr>
           </w:pPr>
-          <w:hyperlink w:anchor="_Toc242619623" w:history="1">
+          <w:hyperlink w:anchor="_Toc242912109" w:history="1">
             <w:r>
               <w:rPr>
                 <w:rStyle w:val="Hyperlink"/>
@@ -2285,7 +2402,7 @@
               <w:rPr>
                 <w:noProof/>
               </w:rPr>
-              <w:instrText xml:space="preserve"> PAGEREF _Toc242619623 \h </w:instrText>
+              <w:instrText xml:space="preserve"> PAGEREF _Toc242912109 \h </w:instrText>
             </w:r>
             <w:r>
               <w:rPr>
@@ -2302,7 +2419,7 @@
               <w:rPr>
                 <w:noProof/>
               </w:rPr>
-              <w:t>5</w:t>
+              <w:t>6</w:t>
             </w:r>
             <w:r>
               <w:rPr>
@@ -2328,7 +2445,7 @@
               <w14:ligatures w14:val="standardContextual"/>
             </w:rPr>
           </w:pPr>
-          <w:hyperlink w:anchor="_Toc242619624" w:history="1">
+          <w:hyperlink w:anchor="_Toc242912110" w:history="1">
             <w:r>
               <w:rPr>
                 <w:rStyle w:val="Hyperlink"/>
@@ -2352,7 +2469,7 @@
               <w:rPr>
                 <w:noProof/>
               </w:rPr>
-              <w:instrText xml:space="preserve"> PAGEREF _Toc242619624 \h </w:instrText>
+              <w:instrText xml:space="preserve"> PAGEREF _Toc242912110 \h </w:instrText>
             </w:r>
             <w:r>
               <w:rPr>
@@ -2369,7 +2486,7 @@
               <w:rPr>
                 <w:noProof/>
               </w:rPr>
-              <w:t>5</w:t>
+              <w:t>6</w:t>
             </w:r>
             <w:r>
               <w:rPr>
@@ -2395,7 +2512,7 @@
               <w14:ligatures w14:val="standardContextual"/>
             </w:rPr>
           </w:pPr>
-          <w:hyperlink w:anchor="_Toc242619625" w:history="1">
+          <w:hyperlink w:anchor="_Toc242912111" w:history="1">
             <w:r>
               <w:rPr>
                 <w:rStyle w:val="Hyperlink"/>
@@ -2419,7 +2536,7 @@
               <w:rPr>
                 <w:noProof/>
               </w:rPr>
-              <w:instrText xml:space="preserve"> PAGEREF _Toc242619625 \h </w:instrText>
+              <w:instrText xml:space="preserve"> PAGEREF _Toc242912111 \h </w:instrText>
             </w:r>
             <w:r>
               <w:rPr>
@@ -2436,7 +2553,7 @@
               <w:rPr>
                 <w:noProof/>
               </w:rPr>
-              <w:t>5</w:t>
+              <w:t>6</w:t>
             </w:r>
             <w:r>
               <w:rPr>
@@ -2462,7 +2579,7 @@
               <w14:ligatures w14:val="standardContextual"/>
             </w:rPr>
           </w:pPr>
-          <w:hyperlink w:anchor="_Toc242619626" w:history="1">
+          <w:hyperlink w:anchor="_Toc242912112" w:history="1">
             <w:r>
               <w:rPr>
                 <w:rStyle w:val="Hyperlink"/>
@@ -2486,7 +2603,7 @@
               <w:rPr>
                 <w:noProof/>
               </w:rPr>
-              <w:instrText xml:space="preserve"> PAGEREF _Toc242619626 \h </w:instrText>
+              <w:instrText xml:space="preserve"> PAGEREF _Toc242912112 \h </w:instrText>
             </w:r>
             <w:r>
               <w:rPr>
@@ -2503,7 +2620,7 @@
               <w:rPr>
                 <w:noProof/>
               </w:rPr>
-              <w:t>5</w:t>
+              <w:t>6</w:t>
             </w:r>
             <w:r>
               <w:rPr>
@@ -2529,7 +2646,7 @@
               <w14:ligatures w14:val="standardContextual"/>
             </w:rPr>
           </w:pPr>
-          <w:hyperlink w:anchor="_Toc242619627" w:history="1">
+          <w:hyperlink w:anchor="_Toc242912113" w:history="1">
             <w:r>
               <w:rPr>
                 <w:rStyle w:val="Hyperlink"/>
@@ -2553,7 +2670,7 @@
               <w:rPr>
                 <w:noProof/>
               </w:rPr>
-              <w:instrText xml:space="preserve"> PAGEREF _Toc242619627 \h </w:instrText>
+              <w:instrText xml:space="preserve"> PAGEREF _Toc242912113 \h </w:instrText>
             </w:r>
             <w:r>
               <w:rPr>
@@ -2570,7 +2687,7 @@
               <w:rPr>
                 <w:noProof/>
               </w:rPr>
-              <w:t>7</w:t>
+              <w:t>8</w:t>
             </w:r>
             <w:r>
               <w:rPr>
@@ -2596,7 +2713,7 @@
               <w14:ligatures w14:val="standardContextual"/>
             </w:rPr>
           </w:pPr>
-          <w:hyperlink w:anchor="_Toc242619628" w:history="1">
+          <w:hyperlink w:anchor="_Toc242912114" w:history="1">
             <w:r>
               <w:rPr>
                 <w:rStyle w:val="Hyperlink"/>
@@ -2620,7 +2737,7 @@
               <w:rPr>
                 <w:noProof/>
               </w:rPr>
-              <w:instrText xml:space="preserve"> PAGEREF _Toc242619628 \h </w:instrText>
+              <w:instrText xml:space="preserve"> PAGEREF _Toc242912114 \h </w:instrText>
             </w:r>
             <w:r>
               <w:rPr>
@@ -2637,7 +2754,7 @@
               <w:rPr>
                 <w:noProof/>
               </w:rPr>
-              <w:t>7</w:t>
+              <w:t>8</w:t>
             </w:r>
             <w:r>
               <w:rPr>
@@ -2663,7 +2780,7 @@
               <w14:ligatures w14:val="standardContextual"/>
             </w:rPr>
           </w:pPr>
-          <w:hyperlink w:anchor="_Toc242619629" w:history="1">
+          <w:hyperlink w:anchor="_Toc242912115" w:history="1">
             <w:r>
               <w:rPr>
                 <w:rStyle w:val="Hyperlink"/>
@@ -2687,7 +2804,7 @@
               <w:rPr>
                 <w:noProof/>
               </w:rPr>
-              <w:instrText xml:space="preserve"> PAGEREF _Toc242619629 \h </w:instrText>
+              <w:instrText xml:space="preserve"> PAGEREF _Toc242912115 \h </w:instrText>
             </w:r>
             <w:r>
               <w:rPr>
@@ -2704,7 +2821,7 @@
               <w:rPr>
                 <w:noProof/>
               </w:rPr>
-              <w:t>7</w:t>
+              <w:t>8</w:t>
             </w:r>
             <w:r>
               <w:rPr>
@@ -2730,7 +2847,7 @@
               <w14:ligatures w14:val="standardContextual"/>
             </w:rPr>
           </w:pPr>
-          <w:hyperlink w:anchor="_Toc242619630" w:history="1">
+          <w:hyperlink w:anchor="_Toc242912116" w:history="1">
             <w:r>
               <w:rPr>
                 <w:rStyle w:val="Hyperlink"/>
@@ -2754,7 +2871,7 @@
               <w:rPr>
                 <w:noProof/>
               </w:rPr>
-              <w:instrText xml:space="preserve"> PAGEREF _Toc242619630 \h </w:instrText>
+              <w:instrText xml:space="preserve"> PAGEREF _Toc242912116 \h </w:instrText>
             </w:r>
             <w:r>
               <w:rPr>
@@ -2771,7 +2888,7 @@
               <w:rPr>
                 <w:noProof/>
               </w:rPr>
-              <w:t>7</w:t>
+              <w:t>8</w:t>
             </w:r>
             <w:r>
               <w:rPr>
@@ -2797,7 +2914,7 @@
               <w14:ligatures w14:val="standardContextual"/>
             </w:rPr>
           </w:pPr>
-          <w:hyperlink w:anchor="_Toc242619631" w:history="1">
+          <w:hyperlink w:anchor="_Toc242912117" w:history="1">
             <w:r>
               <w:rPr>
                 <w:rStyle w:val="Hyperlink"/>
@@ -2821,7 +2938,7 @@
               <w:rPr>
                 <w:noProof/>
               </w:rPr>
-              <w:instrText xml:space="preserve"> PAGEREF _Toc242619631 \h </w:instrText>
+              <w:instrText xml:space="preserve"> PAGEREF _Toc242912117 \h </w:instrText>
             </w:r>
             <w:r>
               <w:rPr>
@@ -2838,7 +2955,7 @@
               <w:rPr>
                 <w:noProof/>
               </w:rPr>
-              <w:t>8</w:t>
+              <w:t>9</w:t>
             </w:r>
             <w:r>
               <w:rPr>
@@ -2864,7 +2981,7 @@
               <w14:ligatures w14:val="standardContextual"/>
             </w:rPr>
           </w:pPr>
-          <w:hyperlink w:anchor="_Toc242619632" w:history="1">
+          <w:hyperlink w:anchor="_Toc242912118" w:history="1">
             <w:r>
               <w:rPr>
                 <w:rStyle w:val="Hyperlink"/>
@@ -2888,7 +3005,7 @@
               <w:rPr>
                 <w:noProof/>
               </w:rPr>
-              <w:instrText xml:space="preserve"> PAGEREF _Toc242619632 \h </w:instrText>
+              <w:instrText xml:space="preserve"> PAGEREF _Toc242912118 \h </w:instrText>
             </w:r>
             <w:r>
               <w:rPr>
@@ -2905,7 +3022,7 @@
               <w:rPr>
                 <w:noProof/>
               </w:rPr>
-              <w:t>8</w:t>
+              <w:t>9</w:t>
             </w:r>
             <w:r>
               <w:rPr>
@@ -2931,7 +3048,7 @@
               <w14:ligatures w14:val="standardContextual"/>
             </w:rPr>
           </w:pPr>
-          <w:hyperlink w:anchor="_Toc242619633" w:history="1">
+          <w:hyperlink w:anchor="_Toc242912119" w:history="1">
             <w:r>
               <w:rPr>
                 <w:rStyle w:val="Hyperlink"/>
@@ -2955,7 +3072,7 @@
               <w:rPr>
                 <w:noProof/>
               </w:rPr>
-              <w:instrText xml:space="preserve"> PAGEREF _Toc242619633 \h </w:instrText>
+              <w:instrText xml:space="preserve"> PAGEREF _Toc242912119 \h </w:instrText>
             </w:r>
             <w:r>
               <w:rPr>
@@ -2972,7 +3089,7 @@
               <w:rPr>
                 <w:noProof/>
               </w:rPr>
-              <w:t>8</w:t>
+              <w:t>9</w:t>
             </w:r>
             <w:r>
               <w:rPr>
@@ -2998,7 +3115,7 @@
               <w14:ligatures w14:val="standardContextual"/>
             </w:rPr>
           </w:pPr>
-          <w:hyperlink w:anchor="_Toc242619634" w:history="1">
+          <w:hyperlink w:anchor="_Toc242912120" w:history="1">
             <w:r>
               <w:rPr>
                 <w:rStyle w:val="Hyperlink"/>
@@ -3022,7 +3139,7 @@
               <w:rPr>
                 <w:noProof/>
               </w:rPr>
-              <w:instrText xml:space="preserve"> PAGEREF _Toc242619634 \h </w:instrText>
+              <w:instrText xml:space="preserve"> PAGEREF _Toc242912120 \h </w:instrText>
             </w:r>
             <w:r>
               <w:rPr>
@@ -3039,7 +3156,7 @@
               <w:rPr>
                 <w:noProof/>
               </w:rPr>
-              <w:t>8</w:t>
+              <w:t>9</w:t>
             </w:r>
             <w:r>
               <w:rPr>
@@ -3065,7 +3182,7 @@
               <w14:ligatures w14:val="standardContextual"/>
             </w:rPr>
           </w:pPr>
-          <w:hyperlink w:anchor="_Toc242619635" w:history="1">
+          <w:hyperlink w:anchor="_Toc242912121" w:history="1">
             <w:r>
               <w:rPr>
                 <w:rStyle w:val="Hyperlink"/>
@@ -3089,7 +3206,7 @@
               <w:rPr>
                 <w:noProof/>
               </w:rPr>
-              <w:instrText xml:space="preserve"> PAGEREF _Toc242619635 \h </w:instrText>
+              <w:instrText xml:space="preserve"> PAGEREF _Toc242912121 \h </w:instrText>
             </w:r>
             <w:r>
               <w:rPr>
@@ -3106,7 +3223,7 @@
               <w:rPr>
                 <w:noProof/>
               </w:rPr>
-              <w:t>9</w:t>
+              <w:t>10</w:t>
             </w:r>
             <w:r>
               <w:rPr>
@@ -3132,7 +3249,7 @@
               <w14:ligatures w14:val="standardContextual"/>
             </w:rPr>
           </w:pPr>
-          <w:hyperlink w:anchor="_Toc242619636" w:history="1">
+          <w:hyperlink w:anchor="_Toc242912122" w:history="1">
             <w:r>
               <w:rPr>
                 <w:rStyle w:val="Hyperlink"/>
@@ -3156,7 +3273,7 @@
               <w:rPr>
                 <w:noProof/>
               </w:rPr>
-              <w:instrText xml:space="preserve"> PAGEREF _Toc242619636 \h </w:instrText>
+              <w:instrText xml:space="preserve"> PAGEREF _Toc242912122 \h </w:instrText>
             </w:r>
             <w:r>
               <w:rPr>
@@ -3173,7 +3290,7 @@
               <w:rPr>
                 <w:noProof/>
               </w:rPr>
-              <w:t>10</w:t>
+              <w:t>11</w:t>
             </w:r>
             <w:r>
               <w:rPr>
@@ -3199,7 +3316,7 @@
               <w14:ligatures w14:val="standardContextual"/>
             </w:rPr>
           </w:pPr>
-          <w:hyperlink w:anchor="_Toc242619637" w:history="1">
+          <w:hyperlink w:anchor="_Toc242912123" w:history="1">
             <w:r>
               <w:rPr>
                 <w:rStyle w:val="Hyperlink"/>
@@ -3223,7 +3340,7 @@
               <w:rPr>
                 <w:noProof/>
               </w:rPr>
-              <w:instrText xml:space="preserve"> PAGEREF _Toc242619637 \h </w:instrText>
+              <w:instrText xml:space="preserve"> PAGEREF _Toc242912123 \h </w:instrText>
             </w:r>
             <w:r>
               <w:rPr>
@@ -3240,7 +3357,7 @@
               <w:rPr>
                 <w:noProof/>
               </w:rPr>
-              <w:t>10</w:t>
+              <w:t>11</w:t>
             </w:r>
             <w:r>
               <w:rPr>
@@ -3266,7 +3383,7 @@
               <w14:ligatures w14:val="standardContextual"/>
             </w:rPr>
           </w:pPr>
-          <w:hyperlink w:anchor="_Toc242619638" w:history="1">
+          <w:hyperlink w:anchor="_Toc242912124" w:history="1">
             <w:r>
               <w:rPr>
                 <w:rStyle w:val="Hyperlink"/>
@@ -3290,7 +3407,7 @@
               <w:rPr>
                 <w:noProof/>
               </w:rPr>
-              <w:instrText xml:space="preserve"> PAGEREF _Toc242619638 \h </w:instrText>
+              <w:instrText xml:space="preserve"> PAGEREF _Toc242912124 \h </w:instrText>
             </w:r>
             <w:r>
               <w:rPr>
@@ -3307,7 +3424,7 @@
               <w:rPr>
                 <w:noProof/>
               </w:rPr>
-              <w:t>10</w:t>
+              <w:t>11</w:t>
             </w:r>
             <w:r>
               <w:rPr>
@@ -3333,7 +3450,7 @@
               <w14:ligatures w14:val="standardContextual"/>
             </w:rPr>
           </w:pPr>
-          <w:hyperlink w:anchor="_Toc242619639" w:history="1">
+          <w:hyperlink w:anchor="_Toc242912125" w:history="1">
             <w:r>
               <w:rPr>
                 <w:rStyle w:val="Hyperlink"/>
@@ -3357,7 +3474,7 @@
               <w:rPr>
                 <w:noProof/>
               </w:rPr>
-              <w:instrText xml:space="preserve"> PAGEREF _Toc242619639 \h </w:instrText>
+              <w:instrText xml:space="preserve"> PAGEREF _Toc242912125 \h </w:instrText>
             </w:r>
             <w:r>
               <w:rPr>
@@ -3374,7 +3491,7 @@
               <w:rPr>
                 <w:noProof/>
               </w:rPr>
-              <w:t>11</w:t>
+              <w:t>12</w:t>
             </w:r>
             <w:r>
               <w:rPr>
@@ -3400,7 +3517,7 @@
               <w14:ligatures w14:val="standardContextual"/>
             </w:rPr>
           </w:pPr>
-          <w:hyperlink w:anchor="_Toc242619640" w:history="1">
+          <w:hyperlink w:anchor="_Toc242912126" w:history="1">
             <w:r>
               <w:rPr>
                 <w:rStyle w:val="Hyperlink"/>
@@ -3424,7 +3541,7 @@
               <w:rPr>
                 <w:noProof/>
               </w:rPr>
-              <w:instrText xml:space="preserve"> PAGEREF _Toc242619640 \h </w:instrText>
+              <w:instrText xml:space="preserve"> PAGEREF _Toc242912126 \h </w:instrText>
             </w:r>
             <w:r>
               <w:rPr>
@@ -3441,7 +3558,7 @@
               <w:rPr>
                 <w:noProof/>
               </w:rPr>
-              <w:t>13</w:t>
+              <w:t>14</w:t>
             </w:r>
             <w:r>
               <w:rPr>
@@ -3467,7 +3584,7 @@
               <w14:ligatures w14:val="standardContextual"/>
             </w:rPr>
           </w:pPr>
-          <w:hyperlink w:anchor="_Toc242619641" w:history="1">
+          <w:hyperlink w:anchor="_Toc242912127" w:history="1">
             <w:r>
               <w:rPr>
                 <w:rStyle w:val="Hyperlink"/>
@@ -3491,7 +3608,7 @@
               <w:rPr>
                 <w:noProof/>
               </w:rPr>
-              <w:instrText xml:space="preserve"> PAGEREF _Toc242619641 \h </w:instrText>
+              <w:instrText xml:space="preserve"> PAGEREF _Toc242912127 \h </w:instrText>
             </w:r>
             <w:r>
               <w:rPr>
@@ -3508,7 +3625,7 @@
               <w:rPr>
                 <w:noProof/>
               </w:rPr>
-              <w:t>13</w:t>
+              <w:t>14</w:t>
             </w:r>
             <w:r>
               <w:rPr>
@@ -3534,7 +3651,7 @@
               <w14:ligatures w14:val="standardContextual"/>
             </w:rPr>
           </w:pPr>
-          <w:hyperlink w:anchor="_Toc242619642" w:history="1">
+          <w:hyperlink w:anchor="_Toc242912128" w:history="1">
             <w:r>
               <w:rPr>
                 <w:rStyle w:val="Hyperlink"/>
@@ -3558,7 +3675,7 @@
               <w:rPr>
                 <w:noProof/>
               </w:rPr>
-              <w:instrText xml:space="preserve"> PAGEREF _Toc242619642 \h </w:instrText>
+              <w:instrText xml:space="preserve"> PAGEREF _Toc242912128 \h </w:instrText>
             </w:r>
             <w:r>
               <w:rPr>
@@ -3575,7 +3692,7 @@
               <w:rPr>
                 <w:noProof/>
               </w:rPr>
-              <w:t>13</w:t>
+              <w:t>14</w:t>
             </w:r>
             <w:r>
               <w:rPr>
@@ -3601,7 +3718,7 @@
               <w14:ligatures w14:val="standardContextual"/>
             </w:rPr>
           </w:pPr>
-          <w:hyperlink w:anchor="_Toc242619643" w:history="1">
+          <w:hyperlink w:anchor="_Toc242912129" w:history="1">
             <w:r>
               <w:rPr>
                 <w:rStyle w:val="Hyperlink"/>
@@ -3625,7 +3742,7 @@
               <w:rPr>
                 <w:noProof/>
               </w:rPr>
-              <w:instrText xml:space="preserve"> PAGEREF _Toc242619643 \h </w:instrText>
+              <w:instrText xml:space="preserve"> PAGEREF _Toc242912129 \h </w:instrText>
             </w:r>
             <w:r>
               <w:rPr>
@@ -3642,7 +3759,7 @@
               <w:rPr>
                 <w:noProof/>
               </w:rPr>
-              <w:t>13</w:t>
+              <w:t>14</w:t>
             </w:r>
             <w:r>
               <w:rPr>
@@ -3668,7 +3785,7 @@
               <w14:ligatures w14:val="standardContextual"/>
             </w:rPr>
           </w:pPr>
-          <w:hyperlink w:anchor="_Toc242619644" w:history="1">
+          <w:hyperlink w:anchor="_Toc242912130" w:history="1">
             <w:r>
               <w:rPr>
                 <w:rStyle w:val="Hyperlink"/>
@@ -3692,7 +3809,7 @@
               <w:rPr>
                 <w:noProof/>
               </w:rPr>
-              <w:instrText xml:space="preserve"> PAGEREF _Toc242619644 \h </w:instrText>
+              <w:instrText xml:space="preserve"> PAGEREF _Toc242912130 \h </w:instrText>
             </w:r>
             <w:r>
               <w:rPr>
@@ -3709,7 +3826,7 @@
               <w:rPr>
                 <w:noProof/>
               </w:rPr>
-              <w:t>14</w:t>
+              <w:t>15</w:t>
             </w:r>
             <w:r>
               <w:rPr>
@@ -3735,7 +3852,7 @@
               <w14:ligatures w14:val="standardContextual"/>
             </w:rPr>
           </w:pPr>
-          <w:hyperlink w:anchor="_Toc242619645" w:history="1">
+          <w:hyperlink w:anchor="_Toc242912131" w:history="1">
             <w:r>
               <w:rPr>
                 <w:rStyle w:val="Hyperlink"/>
@@ -3759,7 +3876,7 @@
               <w:rPr>
                 <w:noProof/>
               </w:rPr>
-              <w:instrText xml:space="preserve"> PAGEREF _Toc242619645 \h </w:instrText>
+              <w:instrText xml:space="preserve"> PAGEREF _Toc242912131 \h </w:instrText>
             </w:r>
             <w:r>
               <w:rPr>
@@ -3776,7 +3893,7 @@
               <w:rPr>
                 <w:noProof/>
               </w:rPr>
-              <w:t>15</w:t>
+              <w:t>16</w:t>
             </w:r>
             <w:r>
               <w:rPr>
@@ -3805,7 +3922,7 @@
     <w:sdt>
       <w:sdtPr>
         <w:alias w:val="Figures"/>
-        <w:id w:val="1568840494"/>
+        <w:id w:val="-74283736"/>
       </w:sdtPr>
       <w:sdtEndPr/>
       <w:sdtContent>
@@ -3834,7 +3951,7 @@
           <w:r>
             <w:fldChar w:fldCharType="separate"/>
           </w:r>
-          <w:hyperlink w:anchor="_Toc242619646" w:history="1">
+          <w:hyperlink w:anchor="_Toc242912132" w:history="1">
             <w:r>
               <w:rPr>
                 <w:rStyle w:val="Hyperlink"/>
@@ -3858,7 +3975,7 @@
               <w:rPr>
                 <w:noProof/>
               </w:rPr>
-              <w:instrText xml:space="preserve"> PAGEREF _Toc242619646 \h </w:instrText>
+              <w:instrText xml:space="preserve"> PAGEREF _Toc242912132 \h </w:instrText>
             </w:r>
             <w:r>
               <w:rPr>
@@ -3875,7 +3992,7 @@
               <w:rPr>
                 <w:noProof/>
               </w:rPr>
-              <w:t>11</w:t>
+              <w:t>12</w:t>
             </w:r>
             <w:r>
               <w:rPr>
@@ -3904,7 +4021,7 @@
     <w:sdt>
       <w:sdtPr>
         <w:alias w:val="Tables"/>
-        <w:id w:val="-2043050768"/>
+        <w:id w:val="-1409768094"/>
       </w:sdtPr>
       <w:sdtEndPr/>
       <w:sdtContent>
@@ -3933,7 +4050,7 @@
           <w:r>
             <w:fldChar w:fldCharType="separate"/>
           </w:r>
-          <w:hyperlink w:anchor="_Toc242619647" w:history="1">
+          <w:hyperlink w:anchor="_Toc242912133" w:history="1">
             <w:r>
               <w:rPr>
                 <w:rStyle w:val="Hyperlink"/>
@@ -3957,7 +4074,7 @@
               <w:rPr>
                 <w:noProof/>
               </w:rPr>
-              <w:instrText xml:space="preserve"> PAGEREF _Toc242619647 \h </w:instrText>
+              <w:instrText xml:space="preserve"> PAGEREF _Toc242912133 \h </w:instrText>
             </w:r>
             <w:r>
               <w:rPr>
@@ -3974,7 +4091,7 @@
               <w:rPr>
                 <w:noProof/>
               </w:rPr>
-              <w:t>5</w:t>
+              <w:t>6</w:t>
             </w:r>
             <w:r>
               <w:rPr>
@@ -4000,7 +4117,7 @@
               <w14:ligatures w14:val="standardContextual"/>
             </w:rPr>
           </w:pPr>
-          <w:hyperlink w:anchor="_Toc242619648" w:history="1">
+          <w:hyperlink w:anchor="_Toc242912134" w:history="1">
             <w:r>
               <w:rPr>
                 <w:rStyle w:val="Hyperlink"/>
@@ -4024,7 +4141,7 @@
               <w:rPr>
                 <w:noProof/>
               </w:rPr>
-              <w:instrText xml:space="preserve"> PAGEREF _Toc242619648 \h </w:instrText>
+              <w:instrText xml:space="preserve"> PAGEREF _Toc242912134 \h </w:instrText>
             </w:r>
             <w:r>
               <w:rPr>
@@ -4041,7 +4158,7 @@
               <w:rPr>
                 <w:noProof/>
               </w:rPr>
-              <w:t>5</w:t>
+              <w:t>6</w:t>
             </w:r>
             <w:r>
               <w:rPr>
@@ -4067,7 +4184,7 @@
               <w14:ligatures w14:val="standardContextual"/>
             </w:rPr>
           </w:pPr>
-          <w:hyperlink w:anchor="_Toc242619649" w:history="1">
+          <w:hyperlink w:anchor="_Toc242912135" w:history="1">
             <w:r>
               <w:rPr>
                 <w:rStyle w:val="Hyperlink"/>
@@ -4091,7 +4208,7 @@
               <w:rPr>
                 <w:noProof/>
               </w:rPr>
-              <w:instrText xml:space="preserve"> PAGEREF _Toc242619649 \h </w:instrText>
+              <w:instrText xml:space="preserve"> PAGEREF _Toc242912135 \h </w:instrText>
             </w:r>
             <w:r>
               <w:rPr>
@@ -4108,7 +4225,7 @@
               <w:rPr>
                 <w:noProof/>
               </w:rPr>
-              <w:t>7</w:t>
+              <w:t>8</w:t>
             </w:r>
             <w:r>
               <w:rPr>
@@ -4134,7 +4251,7 @@
               <w14:ligatures w14:val="standardContextual"/>
             </w:rPr>
           </w:pPr>
-          <w:hyperlink w:anchor="_Toc242619650" w:history="1">
+          <w:hyperlink w:anchor="_Toc242912136" w:history="1">
             <w:r>
               <w:rPr>
                 <w:rStyle w:val="Hyperlink"/>
@@ -4158,7 +4275,7 @@
               <w:rPr>
                 <w:noProof/>
               </w:rPr>
-              <w:instrText xml:space="preserve"> PAGEREF _Toc242619650 \h </w:instrText>
+              <w:instrText xml:space="preserve"> PAGEREF _Toc242912136 \h </w:instrText>
             </w:r>
             <w:r>
               <w:rPr>
@@ -4175,7 +4292,7 @@
               <w:rPr>
                 <w:noProof/>
               </w:rPr>
-              <w:t>8</w:t>
+              <w:t>9</w:t>
             </w:r>
             <w:r>
               <w:rPr>
@@ -4201,7 +4318,7 @@
               <w14:ligatures w14:val="standardContextual"/>
             </w:rPr>
           </w:pPr>
-          <w:hyperlink w:anchor="_Toc242619651" w:history="1">
+          <w:hyperlink w:anchor="_Toc242912137" w:history="1">
             <w:r>
               <w:rPr>
                 <w:rStyle w:val="Hyperlink"/>
@@ -4225,7 +4342,7 @@
               <w:rPr>
                 <w:noProof/>
               </w:rPr>
-              <w:instrText xml:space="preserve"> PAGEREF _Toc242619651 \h </w:instrText>
+              <w:instrText xml:space="preserve"> PAGEREF _Toc242912137 \h </w:instrText>
             </w:r>
             <w:r>
               <w:rPr>
@@ -4242,7 +4359,7 @@
               <w:rPr>
                 <w:noProof/>
               </w:rPr>
-              <w:t>8</w:t>
+              <w:t>9</w:t>
             </w:r>
             <w:r>
               <w:rPr>
@@ -4268,7 +4385,7 @@
               <w14:ligatures w14:val="standardContextual"/>
             </w:rPr>
           </w:pPr>
-          <w:hyperlink w:anchor="_Toc242619652" w:history="1">
+          <w:hyperlink w:anchor="_Toc242912138" w:history="1">
             <w:r>
               <w:rPr>
                 <w:rStyle w:val="Hyperlink"/>
@@ -4292,7 +4409,7 @@
               <w:rPr>
                 <w:noProof/>
               </w:rPr>
-              <w:instrText xml:space="preserve"> PAGEREF _Toc242619652 \h </w:instrText>
+              <w:instrText xml:space="preserve"> PAGEREF _Toc242912138 \h </w:instrText>
             </w:r>
             <w:r>
               <w:rPr>
@@ -4309,7 +4426,7 @@
               <w:rPr>
                 <w:noProof/>
               </w:rPr>
-              <w:t>9</w:t>
+              <w:t>10</w:t>
             </w:r>
             <w:r>
               <w:rPr>
@@ -4335,7 +4452,7 @@
               <w14:ligatures w14:val="standardContextual"/>
             </w:rPr>
           </w:pPr>
-          <w:hyperlink w:anchor="_Toc242619653" w:history="1">
+          <w:hyperlink w:anchor="_Toc242912139" w:history="1">
             <w:r>
               <w:rPr>
                 <w:rStyle w:val="Hyperlink"/>
@@ -4359,7 +4476,7 @@
               <w:rPr>
                 <w:noProof/>
               </w:rPr>
-              <w:instrText xml:space="preserve"> PAGEREF _Toc242619653 \h </w:instrText>
+              <w:instrText xml:space="preserve"> PAGEREF _Toc242912139 \h </w:instrText>
             </w:r>
             <w:r>
               <w:rPr>
@@ -4376,7 +4493,7 @@
               <w:rPr>
                 <w:noProof/>
               </w:rPr>
-              <w:t>10</w:t>
+              <w:t>11</w:t>
             </w:r>
             <w:r>
               <w:rPr>
@@ -4402,7 +4519,7 @@
               <w14:ligatures w14:val="standardContextual"/>
             </w:rPr>
           </w:pPr>
-          <w:hyperlink w:anchor="_Toc242619654" w:history="1">
+          <w:hyperlink w:anchor="_Toc242912140" w:history="1">
             <w:r>
               <w:rPr>
                 <w:rStyle w:val="Hyperlink"/>
@@ -4426,7 +4543,7 @@
               <w:rPr>
                 <w:noProof/>
               </w:rPr>
-              <w:instrText xml:space="preserve"> PAGEREF _Toc242619654 \h </w:instrText>
+              <w:instrText xml:space="preserve"> PAGEREF _Toc242912140 \h </w:instrText>
             </w:r>
             <w:r>
               <w:rPr>
@@ -4443,7 +4560,7 @@
               <w:rPr>
                 <w:noProof/>
               </w:rPr>
-              <w:t>10</w:t>
+              <w:t>11</w:t>
             </w:r>
             <w:r>
               <w:rPr>
@@ -4469,7 +4586,7 @@
               <w14:ligatures w14:val="standardContextual"/>
             </w:rPr>
           </w:pPr>
-          <w:hyperlink w:anchor="_Toc242619655" w:history="1">
+          <w:hyperlink w:anchor="_Toc242912141" w:history="1">
             <w:r>
               <w:rPr>
                 <w:rStyle w:val="Hyperlink"/>
@@ -4493,7 +4610,7 @@
               <w:rPr>
                 <w:noProof/>
               </w:rPr>
-              <w:instrText xml:space="preserve"> PAGEREF _Toc242619655 \h </w:instrText>
+              <w:instrText xml:space="preserve"> PAGEREF _Toc242912141 \h </w:instrText>
             </w:r>
             <w:r>
               <w:rPr>
@@ -4510,7 +4627,7 @@
               <w:rPr>
                 <w:noProof/>
               </w:rPr>
-              <w:t>13</w:t>
+              <w:t>14</w:t>
             </w:r>
             <w:r>
               <w:rPr>
@@ -4536,7 +4653,7 @@
               <w14:ligatures w14:val="standardContextual"/>
             </w:rPr>
           </w:pPr>
-          <w:hyperlink w:anchor="_Toc242619656" w:history="1">
+          <w:hyperlink w:anchor="_Toc242912142" w:history="1">
             <w:r>
               <w:rPr>
                 <w:rStyle w:val="Hyperlink"/>
@@ -4560,7 +4677,7 @@
               <w:rPr>
                 <w:noProof/>
               </w:rPr>
-              <w:instrText xml:space="preserve"> PAGEREF _Toc242619656 \h </w:instrText>
+              <w:instrText xml:space="preserve"> PAGEREF _Toc242912142 \h </w:instrText>
             </w:r>
             <w:r>
               <w:rPr>
@@ -4577,7 +4694,7 @@
               <w:rPr>
                 <w:noProof/>
               </w:rPr>
-              <w:t>13</w:t>
+              <w:t>14</w:t>
             </w:r>
             <w:r>
               <w:rPr>
@@ -4603,7 +4720,7 @@
               <w14:ligatures w14:val="standardContextual"/>
             </w:rPr>
           </w:pPr>
-          <w:hyperlink w:anchor="_Toc242619657" w:history="1">
+          <w:hyperlink w:anchor="_Toc242912143" w:history="1">
             <w:r>
               <w:rPr>
                 <w:rStyle w:val="Hyperlink"/>
@@ -4627,7 +4744,7 @@
               <w:rPr>
                 <w:noProof/>
               </w:rPr>
-              <w:instrText xml:space="preserve"> PAGEREF _Toc242619657 \h </w:instrText>
+              <w:instrText xml:space="preserve"> PAGEREF _Toc242912143 \h </w:instrText>
             </w:r>
             <w:r>
               <w:rPr>
@@ -4644,7 +4761,7 @@
               <w:rPr>
                 <w:noProof/>
               </w:rPr>
-              <w:t>14</w:t>
+              <w:t>15</w:t>
             </w:r>
             <w:r>
               <w:rPr>
@@ -4670,7 +4787,7 @@
               <w14:ligatures w14:val="standardContextual"/>
             </w:rPr>
           </w:pPr>
-          <w:hyperlink w:anchor="_Toc242619658" w:history="1">
+          <w:hyperlink w:anchor="_Toc242912144" w:history="1">
             <w:r>
               <w:rPr>
                 <w:rStyle w:val="Hyperlink"/>
@@ -4694,7 +4811,7 @@
               <w:rPr>
                 <w:noProof/>
               </w:rPr>
-              <w:instrText xml:space="preserve"> PAGEREF _Toc242619658 \h </w:instrText>
+              <w:instrText xml:space="preserve"> PAGEREF _Toc242912144 \h </w:instrText>
             </w:r>
             <w:r>
               <w:rPr>
@@ -4711,7 +4828,7 @@
               <w:rPr>
                 <w:noProof/>
               </w:rPr>
-              <w:t>15</w:t>
+              <w:t>16</w:t>
             </w:r>
             <w:r>
               <w:rPr>
@@ -4735,7 +4852,7 @@
         <w:keepLines/>
         <w:pageBreakBefore/>
       </w:pPr>
-      <w:bookmarkStart w:id="0" w:name="_Toc242619621"/>
+      <w:bookmarkStart w:id="0" w:name="_Toc242912107"/>
       <w:r>
         <w:lastRenderedPageBreak/>
         <w:t>1 Introduction</w:t>
@@ -4748,12 +4865,9 @@
         <w:keepNext/>
         <w:keepLines/>
       </w:pPr>
-      <w:bookmarkStart w:id="1" w:name="_Toc242619622"/>
-      <w:r>
-        <w:t>1.1 </w:t>
-      </w:r>
-      <w:r>
-        <w:t>Purpose</w:t>
+      <w:bookmarkStart w:id="1" w:name="_Toc242912108"/>
+      <w:r>
+        <w:t>1.1 Purpose</w:t>
       </w:r>
       <w:bookmarkEnd w:id="1"/>
     </w:p>
@@ -4801,7 +4915,7 @@
         <w:keepNext/>
         <w:keepLines/>
       </w:pPr>
-      <w:bookmarkStart w:id="2" w:name="_Toc242619623"/>
+      <w:bookmarkStart w:id="2" w:name="_Toc242912109"/>
       <w:r>
         <w:t>1.2 Scope</w:t>
       </w:r>
@@ -4821,7 +4935,7 @@
         <w:keepNext/>
         <w:keepLines/>
       </w:pPr>
-      <w:bookmarkStart w:id="3" w:name="_Toc242619624"/>
+      <w:bookmarkStart w:id="3" w:name="_Toc242912110"/>
       <w:r>
         <w:t>1.3 Intended audience</w:t>
       </w:r>
@@ -4841,7 +4955,7 @@
         <w:keepNext/>
         <w:keepLines/>
       </w:pPr>
-      <w:bookmarkStart w:id="4" w:name="_Toc242619625"/>
+      <w:bookmarkStart w:id="4" w:name="_Toc242912111"/>
       <w:r>
         <w:t>1.4 Relationship to other documents</w:t>
       </w:r>
@@ -4852,7 +4966,7 @@
         <w:pStyle w:val="Caption"/>
         <w:keepNext/>
       </w:pPr>
-      <w:bookmarkStart w:id="5" w:name="_Toc242619647"/>
+      <w:bookmarkStart w:id="5" w:name="_Toc242912133"/>
       <w:r>
         <w:t xml:space="preserve">Table </w:t>
       </w:r>
@@ -4894,7 +5008,7 @@
           <w:left w:w="10" w:type="dxa"/>
           <w:right w:w="10" w:type="dxa"/>
         </w:tblCellMar>
-        <w:tblLook w:val="04A0" w:firstRow="1" w:lastRow="0" w:firstColumn="1" w:lastColumn="0" w:noHBand="0" w:noVBand="1"/>
+        <w:tblLook w:val="0000" w:firstRow="0" w:lastRow="0" w:firstColumn="0" w:lastColumn="0" w:noHBand="0" w:noVBand="0"/>
       </w:tblPr>
       <w:tblGrid>
         <w:gridCol w:w="4337"/>
@@ -5280,7 +5394,7 @@
         <w:keepNext/>
         <w:keepLines/>
       </w:pPr>
-      <w:bookmarkStart w:id="6" w:name="_Toc242619626"/>
+      <w:bookmarkStart w:id="6" w:name="_Toc242912112"/>
       <w:r>
         <w:t>1.5 Changes since version 1.0</w:t>
       </w:r>
@@ -5309,7 +5423,7 @@
         <w:pStyle w:val="Caption"/>
         <w:keepNext/>
       </w:pPr>
-      <w:bookmarkStart w:id="7" w:name="_Toc242619648"/>
+      <w:bookmarkStart w:id="7" w:name="_Toc242912134"/>
       <w:r>
         <w:t xml:space="preserve">Table </w:t>
       </w:r>
@@ -5351,7 +5465,7 @@
           <w:left w:w="10" w:type="dxa"/>
           <w:right w:w="10" w:type="dxa"/>
         </w:tblCellMar>
-        <w:tblLook w:val="04A0" w:firstRow="1" w:lastRow="0" w:firstColumn="1" w:lastColumn="0" w:noHBand="0" w:noVBand="1"/>
+        <w:tblLook w:val="0000" w:firstRow="0" w:lastRow="0" w:firstColumn="0" w:lastColumn="0" w:noHBand="0" w:noVBand="0"/>
       </w:tblPr>
       <w:tblGrid>
         <w:gridCol w:w="1410"/>
@@ -6234,7 +6348,7 @@
         <w:keepLines/>
         <w:pageBreakBefore/>
       </w:pPr>
-      <w:bookmarkStart w:id="8" w:name="_Toc242619627"/>
+      <w:bookmarkStart w:id="8" w:name="_Toc242912113"/>
       <w:r>
         <w:lastRenderedPageBreak/>
         <w:t>2 Business requirements</w:t>
@@ -6247,7 +6361,7 @@
         <w:keepNext/>
         <w:keepLines/>
       </w:pPr>
-      <w:bookmarkStart w:id="9" w:name="_Toc242619628"/>
+      <w:bookmarkStart w:id="9" w:name="_Toc242912114"/>
       <w:r>
         <w:t>2.1 Background</w:t>
       </w:r>
@@ -6322,7 +6436,7 @@
         <w:keepNext/>
         <w:keepLines/>
       </w:pPr>
-      <w:bookmarkStart w:id="10" w:name="_Toc242619629"/>
+      <w:bookmarkStart w:id="10" w:name="_Toc242912115"/>
       <w:r>
         <w:t>2.2 Business opportunity</w:t>
       </w:r>
@@ -6423,7 +6537,7 @@
         <w:keepNext/>
         <w:keepLines/>
       </w:pPr>
-      <w:bookmarkStart w:id="11" w:name="_Toc242619630"/>
+      <w:bookmarkStart w:id="11" w:name="_Toc242912116"/>
       <w:r>
         <w:t>2.3 Business objectives</w:t>
       </w:r>
@@ -6434,7 +6548,7 @@
         <w:pStyle w:val="Caption"/>
         <w:keepNext/>
       </w:pPr>
-      <w:bookmarkStart w:id="12" w:name="_Toc242619649"/>
+      <w:bookmarkStart w:id="12" w:name="_Toc242912135"/>
       <w:r>
         <w:t xml:space="preserve">Table </w:t>
       </w:r>
@@ -6476,7 +6590,7 @@
           <w:left w:w="10" w:type="dxa"/>
           <w:right w:w="10" w:type="dxa"/>
         </w:tblCellMar>
-        <w:tblLook w:val="04A0" w:firstRow="1" w:lastRow="0" w:firstColumn="1" w:lastColumn="0" w:noHBand="0" w:noVBand="1"/>
+        <w:tblLook w:val="0000" w:firstRow="0" w:lastRow="0" w:firstColumn="0" w:lastColumn="0" w:noHBand="0" w:noVBand="0"/>
       </w:tblPr>
       <w:tblGrid>
         <w:gridCol w:w="665"/>
@@ -7224,7 +7338,7 @@
         <w:keepNext/>
         <w:keepLines/>
       </w:pPr>
-      <w:bookmarkStart w:id="13" w:name="_Toc242619631"/>
+      <w:bookmarkStart w:id="13" w:name="_Toc242912117"/>
       <w:r>
         <w:t>2.4 Market size</w:t>
       </w:r>
@@ -7235,7 +7349,7 @@
         <w:pStyle w:val="Caption"/>
         <w:keepNext/>
       </w:pPr>
-      <w:bookmarkStart w:id="14" w:name="_Toc242619650"/>
+      <w:bookmarkStart w:id="14" w:name="_Toc242912136"/>
       <w:r>
         <w:t xml:space="preserve">Table </w:t>
       </w:r>
@@ -7277,7 +7391,7 @@
           <w:left w:w="10" w:type="dxa"/>
           <w:right w:w="10" w:type="dxa"/>
         </w:tblCellMar>
-        <w:tblLook w:val="04A0" w:firstRow="1" w:lastRow="0" w:firstColumn="1" w:lastColumn="0" w:noHBand="0" w:noVBand="1"/>
+        <w:tblLook w:val="0000" w:firstRow="0" w:lastRow="0" w:firstColumn="0" w:lastColumn="0" w:noHBand="0" w:noVBand="0"/>
       </w:tblPr>
       <w:tblGrid>
         <w:gridCol w:w="3109"/>
@@ -7716,7 +7830,7 @@
         <w:keepNext/>
         <w:keepLines/>
       </w:pPr>
-      <w:bookmarkStart w:id="15" w:name="_Toc242619632"/>
+      <w:bookmarkStart w:id="15" w:name="_Toc242912118"/>
       <w:r>
         <w:t>2.5 Success metrics</w:t>
       </w:r>
@@ -7828,7 +7942,7 @@
         <w:keepNext/>
         <w:keepLines/>
       </w:pPr>
-      <w:bookmarkStart w:id="16" w:name="_Toc242619633"/>
+      <w:bookmarkStart w:id="16" w:name="_Toc242912119"/>
       <w:r>
         <w:t>2.6 Vision statement</w:t>
       </w:r>
@@ -7913,7 +8027,7 @@
         <w:keepNext/>
         <w:keepLines/>
       </w:pPr>
-      <w:bookmarkStart w:id="17" w:name="_Toc242619634"/>
+      <w:bookmarkStart w:id="17" w:name="_Toc242912120"/>
       <w:r>
         <w:t>2.7 Business risks</w:t>
       </w:r>
@@ -7924,7 +8038,7 @@
         <w:pStyle w:val="Caption"/>
         <w:keepNext/>
       </w:pPr>
-      <w:bookmarkStart w:id="18" w:name="_Toc242619651"/>
+      <w:bookmarkStart w:id="18" w:name="_Toc242912137"/>
       <w:r>
         <w:t xml:space="preserve">Table </w:t>
       </w:r>
@@ -7966,7 +8080,7 @@
           <w:left w:w="10" w:type="dxa"/>
           <w:right w:w="10" w:type="dxa"/>
         </w:tblCellMar>
-        <w:tblLook w:val="04A0" w:firstRow="1" w:lastRow="0" w:firstColumn="1" w:lastColumn="0" w:noHBand="0" w:noVBand="1"/>
+        <w:tblLook w:val="0000" w:firstRow="0" w:lastRow="0" w:firstColumn="0" w:lastColumn="0" w:noHBand="0" w:noVBand="0"/>
       </w:tblPr>
       <w:tblGrid>
         <w:gridCol w:w="679"/>
@@ -9528,7 +9642,7 @@
         <w:keepNext/>
         <w:keepLines/>
       </w:pPr>
-      <w:bookmarkStart w:id="19" w:name="_Toc242619635"/>
+      <w:bookmarkStart w:id="19" w:name="_Toc242912121"/>
       <w:r>
         <w:t>2.8 Assumptions and dependencies</w:t>
       </w:r>
@@ -9539,7 +9653,7 @@
         <w:pStyle w:val="Caption"/>
         <w:keepNext/>
       </w:pPr>
-      <w:bookmarkStart w:id="20" w:name="_Toc242619652"/>
+      <w:bookmarkStart w:id="20" w:name="_Toc242912138"/>
       <w:r>
         <w:t xml:space="preserve">Table </w:t>
       </w:r>
@@ -9581,7 +9695,7 @@
           <w:left w:w="10" w:type="dxa"/>
           <w:right w:w="10" w:type="dxa"/>
         </w:tblCellMar>
-        <w:tblLook w:val="04A0" w:firstRow="1" w:lastRow="0" w:firstColumn="1" w:lastColumn="0" w:noHBand="0" w:noVBand="1"/>
+        <w:tblLook w:val="0000" w:firstRow="0" w:lastRow="0" w:firstColumn="0" w:lastColumn="0" w:noHBand="0" w:noVBand="0"/>
       </w:tblPr>
       <w:tblGrid>
         <w:gridCol w:w="803"/>
@@ -10183,7 +10297,7 @@
         <w:keepLines/>
         <w:pageBreakBefore/>
       </w:pPr>
-      <w:bookmarkStart w:id="21" w:name="_Toc242619636"/>
+      <w:bookmarkStart w:id="21" w:name="_Toc242912122"/>
       <w:r>
         <w:lastRenderedPageBreak/>
         <w:t>3 Scope and limitations</w:t>
@@ -10196,7 +10310,7 @@
         <w:keepNext/>
         <w:keepLines/>
       </w:pPr>
-      <w:bookmarkStart w:id="22" w:name="_Toc242619637"/>
+      <w:bookmarkStart w:id="22" w:name="_Toc242912123"/>
       <w:r>
         <w:t>3.1 Major features</w:t>
       </w:r>
@@ -10215,7 +10329,7 @@
         <w:pStyle w:val="Caption"/>
         <w:keepNext/>
       </w:pPr>
-      <w:bookmarkStart w:id="23" w:name="_Toc242619653"/>
+      <w:bookmarkStart w:id="23" w:name="_Toc242912139"/>
       <w:r>
         <w:t xml:space="preserve">Table </w:t>
       </w:r>
@@ -10257,7 +10371,7 @@
           <w:left w:w="10" w:type="dxa"/>
           <w:right w:w="10" w:type="dxa"/>
         </w:tblCellMar>
-        <w:tblLook w:val="04A0" w:firstRow="1" w:lastRow="0" w:firstColumn="1" w:lastColumn="0" w:noHBand="0" w:noVBand="1"/>
+        <w:tblLook w:val="0000" w:firstRow="0" w:lastRow="0" w:firstColumn="0" w:lastColumn="0" w:noHBand="0" w:noVBand="0"/>
       </w:tblPr>
       <w:tblGrid>
         <w:gridCol w:w="741"/>
@@ -11404,7 +11518,7 @@
         <w:keepNext/>
         <w:keepLines/>
       </w:pPr>
-      <w:bookmarkStart w:id="24" w:name="_Toc242619638"/>
+      <w:bookmarkStart w:id="24" w:name="_Toc242912124"/>
       <w:r>
         <w:t>3.2 Scope of initial and subsequent releases</w:t>
       </w:r>
@@ -11415,7 +11529,7 @@
         <w:pStyle w:val="Caption"/>
         <w:keepNext/>
       </w:pPr>
-      <w:bookmarkStart w:id="25" w:name="_Toc242619654"/>
+      <w:bookmarkStart w:id="25" w:name="_Toc242912140"/>
       <w:r>
         <w:t xml:space="preserve">Table </w:t>
       </w:r>
@@ -11457,7 +11571,7 @@
           <w:left w:w="10" w:type="dxa"/>
           <w:right w:w="10" w:type="dxa"/>
         </w:tblCellMar>
-        <w:tblLook w:val="04A0" w:firstRow="1" w:lastRow="0" w:firstColumn="1" w:lastColumn="0" w:noHBand="0" w:noVBand="1"/>
+        <w:tblLook w:val="0000" w:firstRow="0" w:lastRow="0" w:firstColumn="0" w:lastColumn="0" w:noHBand="0" w:noVBand="0"/>
       </w:tblPr>
       <w:tblGrid>
         <w:gridCol w:w="976"/>
@@ -12638,7 +12752,7 @@
           <w:noProof/>
         </w:rPr>
         <w:drawing>
-          <wp:inline distT="0" distB="0" distL="0" distR="0" wp14:anchorId="35BA54F1" wp14:editId="35BA54F2">
+          <wp:inline distT="0" distB="0" distL="0" distR="0" wp14:anchorId="0CC534E4" wp14:editId="0CC534E5">
             <wp:extent cx="6124575" cy="3848100"/>
             <wp:effectExtent l="0" t="0" r="0" b="0"/>
             <wp:docPr id="1" name="system-context.png" descr="ZedPath system context (C4 model, level 1)" title="ZedPath system context (C4 model, level 1)"/>
@@ -12681,7 +12795,7 @@
       <w:pPr>
         <w:pStyle w:val="Caption"/>
       </w:pPr>
-      <w:bookmarkStart w:id="26" w:name="_Toc242619646"/>
+      <w:bookmarkStart w:id="26" w:name="_Toc242912132"/>
       <w:r>
         <w:t xml:space="preserve">Figure </w:t>
       </w:r>
@@ -12737,7 +12851,7 @@
         <w:keepNext/>
         <w:keepLines/>
       </w:pPr>
-      <w:bookmarkStart w:id="27" w:name="_Toc242619639"/>
+      <w:bookmarkStart w:id="27" w:name="_Toc242912125"/>
       <w:r>
         <w:t>3.3 Limitations and exclusions</w:t>
       </w:r>
@@ -12920,7 +13034,7 @@
         <w:keepLines/>
         <w:pageBreakBefore/>
       </w:pPr>
-      <w:bookmarkStart w:id="28" w:name="_Toc242619640"/>
+      <w:bookmarkStart w:id="28" w:name="_Toc242912126"/>
       <w:r>
         <w:lastRenderedPageBreak/>
         <w:t>4 Business context</w:t>
@@ -12933,7 +13047,7 @@
         <w:keepNext/>
         <w:keepLines/>
       </w:pPr>
-      <w:bookmarkStart w:id="29" w:name="_Toc242619641"/>
+      <w:bookmarkStart w:id="29" w:name="_Toc242912127"/>
       <w:r>
         <w:t>4.1 Stakeholder profiles</w:t>
       </w:r>
@@ -12944,7 +13058,7 @@
         <w:pStyle w:val="Caption"/>
         <w:keepNext/>
       </w:pPr>
-      <w:bookmarkStart w:id="30" w:name="_Toc242619655"/>
+      <w:bookmarkStart w:id="30" w:name="_Toc242912141"/>
       <w:r>
         <w:t xml:space="preserve">Table </w:t>
       </w:r>
@@ -12986,7 +13100,7 @@
           <w:left w:w="10" w:type="dxa"/>
           <w:right w:w="10" w:type="dxa"/>
         </w:tblCellMar>
-        <w:tblLook w:val="04A0" w:firstRow="1" w:lastRow="0" w:firstColumn="1" w:lastColumn="0" w:noHBand="0" w:noVBand="1"/>
+        <w:tblLook w:val="0000" w:firstRow="0" w:lastRow="0" w:firstColumn="0" w:lastColumn="0" w:noHBand="0" w:noVBand="0"/>
       </w:tblPr>
       <w:tblGrid>
         <w:gridCol w:w="1762"/>
@@ -14083,7 +14197,7 @@
         <w:keepNext/>
         <w:keepLines/>
       </w:pPr>
-      <w:bookmarkStart w:id="31" w:name="_Toc242619642"/>
+      <w:bookmarkStart w:id="31" w:name="_Toc242912128"/>
       <w:r>
         <w:t>4.2 Project priorities</w:t>
       </w:r>
@@ -14094,7 +14208,7 @@
         <w:pStyle w:val="Caption"/>
         <w:keepNext/>
       </w:pPr>
-      <w:bookmarkStart w:id="32" w:name="_Toc242619656"/>
+      <w:bookmarkStart w:id="32" w:name="_Toc242912142"/>
       <w:r>
         <w:t xml:space="preserve">Table </w:t>
       </w:r>
@@ -14136,7 +14250,7 @@
           <w:left w:w="10" w:type="dxa"/>
           <w:right w:w="10" w:type="dxa"/>
         </w:tblCellMar>
-        <w:tblLook w:val="04A0" w:firstRow="1" w:lastRow="0" w:firstColumn="1" w:lastColumn="0" w:noHBand="0" w:noVBand="1"/>
+        <w:tblLook w:val="0000" w:firstRow="0" w:lastRow="0" w:firstColumn="0" w:lastColumn="0" w:noHBand="0" w:noVBand="0"/>
       </w:tblPr>
       <w:tblGrid>
         <w:gridCol w:w="1188"/>
@@ -14780,7 +14894,7 @@
         <w:keepNext/>
         <w:keepLines/>
       </w:pPr>
-      <w:bookmarkStart w:id="33" w:name="_Toc242619643"/>
+      <w:bookmarkStart w:id="33" w:name="_Toc242912129"/>
       <w:r>
         <w:t>4.3 Deployment considerations</w:t>
       </w:r>
@@ -14865,7 +14979,7 @@
         <w:keepLines/>
         <w:pageBreakBefore/>
       </w:pPr>
-      <w:bookmarkStart w:id="34" w:name="_Toc242619644"/>
+      <w:bookmarkStart w:id="34" w:name="_Toc242912130"/>
       <w:r>
         <w:lastRenderedPageBreak/>
         <w:t>Appendix A: Glossary</w:t>
@@ -14877,7 +14991,7 @@
         <w:pStyle w:val="Caption"/>
         <w:keepNext/>
       </w:pPr>
-      <w:bookmarkStart w:id="35" w:name="_Toc242619657"/>
+      <w:bookmarkStart w:id="35" w:name="_Toc242912143"/>
       <w:r>
         <w:t xml:space="preserve">Table </w:t>
       </w:r>
@@ -14919,7 +15033,7 @@
           <w:left w:w="10" w:type="dxa"/>
           <w:right w:w="10" w:type="dxa"/>
         </w:tblCellMar>
-        <w:tblLook w:val="04A0" w:firstRow="1" w:lastRow="0" w:firstColumn="1" w:lastColumn="0" w:noHBand="0" w:noVBand="1"/>
+        <w:tblLook w:val="0000" w:firstRow="0" w:lastRow="0" w:firstColumn="0" w:lastColumn="0" w:noHBand="0" w:noVBand="0"/>
       </w:tblPr>
       <w:tblGrid>
         <w:gridCol w:w="1843"/>
@@ -15521,7 +15635,7 @@
         <w:keepLines/>
         <w:pageBreakBefore/>
       </w:pPr>
-      <w:bookmarkStart w:id="36" w:name="_Toc242619645"/>
+      <w:bookmarkStart w:id="36" w:name="_Toc242912131"/>
       <w:r>
         <w:lastRenderedPageBreak/>
         <w:t>Appendix B: References</w:t>
@@ -15533,7 +15647,7 @@
         <w:pStyle w:val="Caption"/>
         <w:keepNext/>
       </w:pPr>
-      <w:bookmarkStart w:id="37" w:name="_Toc242619658"/>
+      <w:bookmarkStart w:id="37" w:name="_Toc242912144"/>
       <w:r>
         <w:t xml:space="preserve">Table </w:t>
       </w:r>
@@ -15575,7 +15689,7 @@
           <w:left w:w="10" w:type="dxa"/>
           <w:right w:w="10" w:type="dxa"/>
         </w:tblCellMar>
-        <w:tblLook w:val="04A0" w:firstRow="1" w:lastRow="0" w:firstColumn="1" w:lastColumn="0" w:noHBand="0" w:noVBand="1"/>
+        <w:tblLook w:val="0000" w:firstRow="0" w:lastRow="0" w:firstColumn="0" w:lastColumn="0" w:noHBand="0" w:noVBand="0"/>
       </w:tblPr>
       <w:tblGrid>
         <w:gridCol w:w="803"/>
@@ -16512,7 +16626,7 @@
         <w:sz w:val="16"/>
         <w:szCs w:val="16"/>
       </w:rPr>
-      <w:t>ZP-DOC-01  ·  v2.0 (draft)  ·  Under revision</w:t>
+      <w:t>ZP-DOC-01  ·  v2.0  ·  Approved</w:t>
     </w:r>
   </w:p>
 </w:hdr>
@@ -16521,72 +16635,10 @@
 <file path=word/numbering.xml><?xml version="1.0" encoding="utf-8"?>
 <w:numbering xmlns:wpc="http://schemas.microsoft.com/office/word/2010/wordprocessingCanvas" xmlns:cx="http://schemas.microsoft.com/office/drawing/2014/chartex" xmlns:cx1="http://schemas.microsoft.com/office/drawing/2015/9/8/chartex" xmlns:cx2="http://schemas.microsoft.com/office/drawing/2015/10/21/chartex" xmlns:cx3="http://schemas.microsoft.com/office/drawing/2016/5/9/chartex" xmlns:cx4="http://schemas.microsoft.com/office/drawing/2016/5/10/chartex" xmlns:cx5="http://schemas.microsoft.com/office/drawing/2016/5/11/chartex" xmlns:cx6="http://schemas.microsoft.com/office/drawing/2016/5/12/chartex" xmlns:cx7="http://schemas.microsoft.com/office/drawing/2016/5/13/chartex" xmlns:cx8="http://schemas.microsoft.com/office/drawing/2016/5/14/chartex" xmlns:mc="http://schemas.openxmlformats.org/markup-compatibility/2006" xmlns:aink="http://schemas.microsoft.com/office/drawing/2016/ink" xmlns:am3d="http://schemas.microsoft.com/office/drawing/2017/model3d" xmlns:o="urn:schemas-microsoft-com:office:office" xmlns:oel="http://schemas.microsoft.com/office/2019/extlst" xmlns:r="http://schemas.openxmlformats.org/officeDocument/2006/relationships" xmlns:m="http://schemas.openxmlformats.org/officeDocument/2006/math" xmlns:v="urn:schemas-microsoft-com:vml" xmlns:wp14="http://schemas.microsoft.com/office/word/2010/wordprocessingDrawing" xmlns:wp="http://schemas.openxmlformats.org/drawingml/2006/wordprocessingDrawing" xmlns:w10="urn:schemas-microsoft-com:office:word" xmlns:w="http://schemas.openxmlformats.org/wordprocessingml/2006/main" xmlns:w14="http://schemas.microsoft.com/office/word/2010/wordml" xmlns:w15="http://schemas.microsoft.com/office/word/2012/wordml" xmlns:w16cex="http://schemas.microsoft.com/office/word/2018/wordml/cex" xmlns:w16cid="http://schemas.microsoft.com/office/word/2016/wordml/cid" xmlns:w16="http://schemas.microsoft.com/office/word/2018/wordml" xmlns:w16du="http://schemas.microsoft.com/office/word/2023/wordml/word16du" xmlns:w16sdtdh="http://schemas.microsoft.com/office/word/2020/wordml/sdtdatahash" xmlns:w16sdtfl="http://schemas.microsoft.com/office/word/2024/wordml/sdtformatlock" xmlns:w16se="http://schemas.microsoft.com/office/word/2015/wordml/symex" xmlns:wpg="http://schemas.microsoft.com/office/word/2010/wordprocessingGroup" xmlns:wpi="http://schemas.microsoft.com/office/word/2010/wordprocessingInk" xmlns:wne="http://schemas.microsoft.com/office/word/2006/wordml" xmlns:wps="http://schemas.microsoft.com/office/word/2010/wordprocessingShape" mc:Ignorable="w14 w15 w16se w16cid w16 w16cex w16sdtdh w16sdtfl w16du wp14">
   <w:abstractNum w:abstractNumId="0" w15:restartNumberingAfterBreak="0">
-    <w:nsid w:val="2C7E2914"/>
+    <w:nsid w:val="0436493E"/>
     <w:multiLevelType w:val="hybridMultilevel"/>
-    <w:tmpl w:val="4A8C3454"/>
-    <w:lvl w:ilvl="0" w:tplc="E970F8D4">
-      <w:start w:val="1"/>
-      <w:numFmt w:val="bullet"/>
-      <w:lvlText w:val="•"/>
-      <w:lvlJc w:val="left"/>
-      <w:pPr>
-        <w:ind w:left="720" w:hanging="280"/>
-      </w:pPr>
-    </w:lvl>
-    <w:lvl w:ilvl="1" w:tplc="9286CAC4" w:tentative="1">
-      <w:start w:val="1"/>
-      <w:numFmt w:val="bullet"/>
-      <w:lvlText w:val="–"/>
-      <w:lvlJc w:val="left"/>
-      <w:pPr>
-        <w:ind w:left="1080" w:hanging="280"/>
-      </w:pPr>
-    </w:lvl>
-    <w:lvl w:ilvl="2" w:tplc="51A0DE68" w:tentative="1">
-      <w:start w:val="1"/>
-      <w:numFmt w:val="bullet"/>
-      <w:lvlText w:val="▪"/>
-      <w:lvlJc w:val="left"/>
-      <w:pPr>
-        <w:ind w:left="1440" w:hanging="280"/>
-      </w:pPr>
-    </w:lvl>
-    <w:lvl w:ilvl="3" w:tplc="FB2C73A6">
-      <w:numFmt w:val="decimal"/>
-      <w:lvlText w:val=""/>
-      <w:lvlJc w:val="left"/>
-    </w:lvl>
-    <w:lvl w:ilvl="4" w:tplc="0FB4B7B8">
-      <w:numFmt w:val="decimal"/>
-      <w:lvlText w:val=""/>
-      <w:lvlJc w:val="left"/>
-    </w:lvl>
-    <w:lvl w:ilvl="5" w:tplc="9E464D6E">
-      <w:numFmt w:val="decimal"/>
-      <w:lvlText w:val=""/>
-      <w:lvlJc w:val="left"/>
-    </w:lvl>
-    <w:lvl w:ilvl="6" w:tplc="0A00DD1A">
-      <w:numFmt w:val="decimal"/>
-      <w:lvlText w:val=""/>
-      <w:lvlJc w:val="left"/>
-    </w:lvl>
-    <w:lvl w:ilvl="7" w:tplc="E75C435E">
-      <w:numFmt w:val="decimal"/>
-      <w:lvlText w:val=""/>
-      <w:lvlJc w:val="left"/>
-    </w:lvl>
-    <w:lvl w:ilvl="8" w:tplc="E08A8E50">
-      <w:numFmt w:val="decimal"/>
-      <w:lvlText w:val=""/>
-      <w:lvlJc w:val="left"/>
-    </w:lvl>
-  </w:abstractNum>
-  <w:abstractNum w:abstractNumId="1" w15:restartNumberingAfterBreak="0">
-    <w:nsid w:val="480532FB"/>
-    <w:multiLevelType w:val="hybridMultilevel"/>
-    <w:tmpl w:val="0D6C5922"/>
-    <w:lvl w:ilvl="0" w:tplc="F9606188" w:tentative="1">
+    <w:tmpl w:val="349465FE"/>
+    <w:lvl w:ilvl="0" w:tplc="3E76AA50" w:tentative="1">
       <w:start w:val="1"/>
       <w:numFmt w:val="bullet"/>
       <w:lvlText w:val="●"/>
@@ -16595,7 +16647,7 @@
         <w:ind w:left="720" w:hanging="360"/>
       </w:pPr>
     </w:lvl>
-    <w:lvl w:ilvl="1" w:tplc="29CCBA9A" w:tentative="1">
+    <w:lvl w:ilvl="1" w:tplc="53A2F9B0" w:tentative="1">
       <w:start w:val="1"/>
       <w:numFmt w:val="bullet"/>
       <w:lvlText w:val="○"/>
@@ -16604,7 +16656,7 @@
         <w:ind w:left="1440" w:hanging="360"/>
       </w:pPr>
     </w:lvl>
-    <w:lvl w:ilvl="2" w:tplc="320668A2" w:tentative="1">
+    <w:lvl w:ilvl="2" w:tplc="83C6A514" w:tentative="1">
       <w:start w:val="1"/>
       <w:numFmt w:val="bullet"/>
       <w:lvlText w:val="■"/>
@@ -16613,7 +16665,7 @@
         <w:ind w:left="2160" w:hanging="360"/>
       </w:pPr>
     </w:lvl>
-    <w:lvl w:ilvl="3" w:tplc="6C325BF2" w:tentative="1">
+    <w:lvl w:ilvl="3" w:tplc="96C6CD28" w:tentative="1">
       <w:start w:val="1"/>
       <w:numFmt w:val="bullet"/>
       <w:lvlText w:val="●"/>
@@ -16622,7 +16674,7 @@
         <w:ind w:left="2880" w:hanging="360"/>
       </w:pPr>
     </w:lvl>
-    <w:lvl w:ilvl="4" w:tplc="B09A8338" w:tentative="1">
+    <w:lvl w:ilvl="4" w:tplc="2D2AF0B4" w:tentative="1">
       <w:start w:val="1"/>
       <w:numFmt w:val="bullet"/>
       <w:lvlText w:val="○"/>
@@ -16631,7 +16683,7 @@
         <w:ind w:left="3600" w:hanging="360"/>
       </w:pPr>
     </w:lvl>
-    <w:lvl w:ilvl="5" w:tplc="85B63A28" w:tentative="1">
+    <w:lvl w:ilvl="5" w:tplc="EC76F4F8" w:tentative="1">
       <w:start w:val="1"/>
       <w:numFmt w:val="bullet"/>
       <w:lvlText w:val="■"/>
@@ -16640,7 +16692,7 @@
         <w:ind w:left="4320" w:hanging="360"/>
       </w:pPr>
     </w:lvl>
-    <w:lvl w:ilvl="6" w:tplc="993CF6FE" w:tentative="1">
+    <w:lvl w:ilvl="6" w:tplc="76725AB8" w:tentative="1">
       <w:start w:val="1"/>
       <w:numFmt w:val="bullet"/>
       <w:lvlText w:val="●"/>
@@ -16649,7 +16701,7 @@
         <w:ind w:left="5040" w:hanging="360"/>
       </w:pPr>
     </w:lvl>
-    <w:lvl w:ilvl="7" w:tplc="3466A652" w:tentative="1">
+    <w:lvl w:ilvl="7" w:tplc="A532E600" w:tentative="1">
       <w:start w:val="1"/>
       <w:numFmt w:val="bullet"/>
       <w:lvlText w:val="●"/>
@@ -16658,7 +16710,7 @@
         <w:ind w:left="5760" w:hanging="360"/>
       </w:pPr>
     </w:lvl>
-    <w:lvl w:ilvl="8" w:tplc="37A62C6A" w:tentative="1">
+    <w:lvl w:ilvl="8" w:tplc="1868A034" w:tentative="1">
       <w:start w:val="1"/>
       <w:numFmt w:val="bullet"/>
       <w:lvlText w:val="●"/>
@@ -16668,11 +16720,73 @@
       </w:pPr>
     </w:lvl>
   </w:abstractNum>
+  <w:abstractNum w:abstractNumId="1" w15:restartNumberingAfterBreak="0">
+    <w:nsid w:val="1F3F5BD2"/>
+    <w:multiLevelType w:val="hybridMultilevel"/>
+    <w:tmpl w:val="836EB20E"/>
+    <w:lvl w:ilvl="0" w:tplc="53D47C14">
+      <w:start w:val="1"/>
+      <w:numFmt w:val="bullet"/>
+      <w:lvlText w:val="•"/>
+      <w:lvlJc w:val="left"/>
+      <w:pPr>
+        <w:ind w:left="720" w:hanging="280"/>
+      </w:pPr>
+    </w:lvl>
+    <w:lvl w:ilvl="1" w:tplc="B1DCDA9E" w:tentative="1">
+      <w:start w:val="1"/>
+      <w:numFmt w:val="bullet"/>
+      <w:lvlText w:val="–"/>
+      <w:lvlJc w:val="left"/>
+      <w:pPr>
+        <w:ind w:left="1080" w:hanging="280"/>
+      </w:pPr>
+    </w:lvl>
+    <w:lvl w:ilvl="2" w:tplc="871A4F1A" w:tentative="1">
+      <w:start w:val="1"/>
+      <w:numFmt w:val="bullet"/>
+      <w:lvlText w:val="▪"/>
+      <w:lvlJc w:val="left"/>
+      <w:pPr>
+        <w:ind w:left="1440" w:hanging="280"/>
+      </w:pPr>
+    </w:lvl>
+    <w:lvl w:ilvl="3" w:tplc="EB829BEA">
+      <w:numFmt w:val="decimal"/>
+      <w:lvlText w:val=""/>
+      <w:lvlJc w:val="left"/>
+    </w:lvl>
+    <w:lvl w:ilvl="4" w:tplc="FC60815C">
+      <w:numFmt w:val="decimal"/>
+      <w:lvlText w:val=""/>
+      <w:lvlJc w:val="left"/>
+    </w:lvl>
+    <w:lvl w:ilvl="5" w:tplc="29B2E32A">
+      <w:numFmt w:val="decimal"/>
+      <w:lvlText w:val=""/>
+      <w:lvlJc w:val="left"/>
+    </w:lvl>
+    <w:lvl w:ilvl="6" w:tplc="4DE0F9E4">
+      <w:numFmt w:val="decimal"/>
+      <w:lvlText w:val=""/>
+      <w:lvlJc w:val="left"/>
+    </w:lvl>
+    <w:lvl w:ilvl="7" w:tplc="6212C56E">
+      <w:numFmt w:val="decimal"/>
+      <w:lvlText w:val=""/>
+      <w:lvlJc w:val="left"/>
+    </w:lvl>
+    <w:lvl w:ilvl="8" w:tplc="BC60262C">
+      <w:numFmt w:val="decimal"/>
+      <w:lvlText w:val=""/>
+      <w:lvlJc w:val="left"/>
+    </w:lvl>
+  </w:abstractNum>
   <w:abstractNum w:abstractNumId="2" w15:restartNumberingAfterBreak="0">
-    <w:nsid w:val="54C43243"/>
+    <w:nsid w:val="363C65B4"/>
     <w:multiLevelType w:val="hybridMultilevel"/>
-    <w:tmpl w:val="EDAEAA24"/>
-    <w:lvl w:ilvl="0" w:tplc="9A30B4CE">
+    <w:tmpl w:val="F14A2FEE"/>
+    <w:lvl w:ilvl="0" w:tplc="2046917A">
       <w:start w:val="1"/>
       <w:numFmt w:val="decimal"/>
       <w:lvlText w:val="%1."/>
@@ -16681,7 +16795,7 @@
         <w:ind w:left="720" w:hanging="360"/>
       </w:pPr>
     </w:lvl>
-    <w:lvl w:ilvl="1" w:tplc="ECF2C02A" w:tentative="1">
+    <w:lvl w:ilvl="1" w:tplc="92D6C480" w:tentative="1">
       <w:start w:val="1"/>
       <w:numFmt w:val="lowerLetter"/>
       <w:lvlText w:val="%2."/>
@@ -16690,7 +16804,7 @@
         <w:ind w:left="1080" w:hanging="360"/>
       </w:pPr>
     </w:lvl>
-    <w:lvl w:ilvl="2" w:tplc="9D7658B4" w:tentative="1">
+    <w:lvl w:ilvl="2" w:tplc="D4B6C76E" w:tentative="1">
       <w:start w:val="1"/>
       <w:numFmt w:val="lowerRoman"/>
       <w:lvlText w:val="%3."/>
@@ -16699,63 +16813,63 @@
         <w:ind w:left="1440" w:hanging="360"/>
       </w:pPr>
     </w:lvl>
-    <w:lvl w:ilvl="3" w:tplc="709A23DE">
+    <w:lvl w:ilvl="3" w:tplc="7FB26D78">
       <w:numFmt w:val="decimal"/>
       <w:lvlText w:val=""/>
       <w:lvlJc w:val="left"/>
     </w:lvl>
-    <w:lvl w:ilvl="4" w:tplc="82E653C6">
+    <w:lvl w:ilvl="4" w:tplc="23DC149A">
       <w:numFmt w:val="decimal"/>
       <w:lvlText w:val=""/>
       <w:lvlJc w:val="left"/>
     </w:lvl>
-    <w:lvl w:ilvl="5" w:tplc="6A409C30">
+    <w:lvl w:ilvl="5" w:tplc="C8308BB2">
       <w:numFmt w:val="decimal"/>
       <w:lvlText w:val=""/>
       <w:lvlJc w:val="left"/>
     </w:lvl>
-    <w:lvl w:ilvl="6" w:tplc="7B000B30">
+    <w:lvl w:ilvl="6" w:tplc="987095F0">
       <w:numFmt w:val="decimal"/>
       <w:lvlText w:val=""/>
       <w:lvlJc w:val="left"/>
     </w:lvl>
-    <w:lvl w:ilvl="7" w:tplc="AB96190A">
+    <w:lvl w:ilvl="7" w:tplc="BE125462">
       <w:numFmt w:val="decimal"/>
       <w:lvlText w:val=""/>
       <w:lvlJc w:val="left"/>
     </w:lvl>
-    <w:lvl w:ilvl="8" w:tplc="0D04CEBA">
+    <w:lvl w:ilvl="8" w:tplc="B8F4F0AC">
       <w:numFmt w:val="decimal"/>
       <w:lvlText w:val=""/>
       <w:lvlJc w:val="left"/>
     </w:lvl>
   </w:abstractNum>
-  <w:num w:numId="1" w16cid:durableId="1932275828">
+  <w:num w:numId="1" w16cid:durableId="1164469399">
+    <w:abstractNumId w:val="0"/>
+    <w:lvlOverride w:ilvl="0">
+      <w:startOverride w:val="1"/>
+    </w:lvlOverride>
+  </w:num>
+  <w:num w:numId="2" w16cid:durableId="327294155">
+    <w:abstractNumId w:val="2"/>
+    <w:lvlOverride w:ilvl="0">
+      <w:startOverride w:val="1"/>
+    </w:lvlOverride>
+  </w:num>
+  <w:num w:numId="3" w16cid:durableId="436365188">
     <w:abstractNumId w:val="1"/>
     <w:lvlOverride w:ilvl="0">
       <w:startOverride w:val="1"/>
     </w:lvlOverride>
   </w:num>
-  <w:num w:numId="2" w16cid:durableId="1445079146">
-    <w:abstractNumId w:val="2"/>
+  <w:num w:numId="4" w16cid:durableId="1308244484">
+    <w:abstractNumId w:val="1"/>
     <w:lvlOverride w:ilvl="0">
       <w:startOverride w:val="1"/>
     </w:lvlOverride>
   </w:num>
-  <w:num w:numId="3" w16cid:durableId="1313290080">
-    <w:abstractNumId w:val="0"/>
-    <w:lvlOverride w:ilvl="0">
-      <w:startOverride w:val="1"/>
-    </w:lvlOverride>
-  </w:num>
-  <w:num w:numId="4" w16cid:durableId="1936786488">
-    <w:abstractNumId w:val="0"/>
-    <w:lvlOverride w:ilvl="0">
-      <w:startOverride w:val="1"/>
-    </w:lvlOverride>
-  </w:num>
-  <w:num w:numId="5" w16cid:durableId="2049180273">
-    <w:abstractNumId w:val="0"/>
+  <w:num w:numId="5" w16cid:durableId="1781294338">
+    <w:abstractNumId w:val="1"/>
     <w:lvlOverride w:ilvl="0">
       <w:startOverride w:val="1"/>
     </w:lvlOverride>
@@ -17459,7 +17573,7 @@
     <w:autoRedefine/>
     <w:uiPriority w:val="39"/>
     <w:unhideWhenUsed/>
-    <w:rsid w:val="005017E4"/>
+    <w:rsid w:val="002E0C05"/>
     <w:pPr>
       <w:spacing w:after="100"/>
     </w:pPr>
@@ -17471,7 +17585,7 @@
     <w:autoRedefine/>
     <w:uiPriority w:val="39"/>
     <w:unhideWhenUsed/>
-    <w:rsid w:val="005017E4"/>
+    <w:rsid w:val="002E0C05"/>
     <w:pPr>
       <w:spacing w:after="100"/>
       <w:ind w:left="210"/>
@@ -17483,7 +17597,7 @@
     <w:next w:val="Normal"/>
     <w:uiPriority w:val="99"/>
     <w:unhideWhenUsed/>
-    <w:rsid w:val="005017E4"/>
+    <w:rsid w:val="002E0C05"/>
   </w:style>
 </w:styles>
 </file>

</xml_diff>

<commit_message>
University facts: Mahapola/Bursary line removed (Praveen 2026-10-15; data kept in the extract); ETag reflects the facts; docs updated to match. ZP-DOC-01..04 v2.1 approved by B.M.P Banneka, Product Owner, 15 Oct 2026; README docs table
Co-Authored-By: Claude Opus 5.5 (1M context) <noreply@anthropic.com>
</commit_message>
<xml_diff>
--- a/docs/01-vision-and-scope/ZP-DOC-01_Vision-and-Scope.docx
+++ b/docs/01-vision-and-scope/ZP-DOC-01_Vision-and-Scope.docx
@@ -90,7 +90,7 @@
           <w:left w:w="10" w:type="dxa"/>
           <w:right w:w="10" w:type="dxa"/>
         </w:tblCellMar>
-        <w:tblLook w:val="04A0" w:firstRow="1" w:lastRow="0" w:firstColumn="1" w:lastColumn="0" w:noHBand="0" w:noVBand="1"/>
+        <w:tblLook w:val="0000" w:firstRow="0" w:lastRow="0" w:firstColumn="0" w:lastColumn="0" w:noHBand="0" w:noVBand="0"/>
       </w:tblPr>
       <w:tblGrid>
         <w:gridCol w:w="2600"/>
@@ -157,7 +157,7 @@
                 <w:sz w:val="19"/>
                 <w:szCs w:val="19"/>
               </w:rPr>
-              <w:t>2.1 (draft)</w:t>
+              <w:t>2.1</w:t>
             </w:r>
           </w:p>
         </w:tc>
@@ -223,7 +223,7 @@
                 <w:sz w:val="19"/>
                 <w:szCs w:val="19"/>
               </w:rPr>
-              <w:t>Under revision</w:t>
+              <w:t>Approved</w:t>
             </w:r>
           </w:p>
         </w:tc>
@@ -494,7 +494,7 @@
           <w:left w:w="10" w:type="dxa"/>
           <w:right w:w="10" w:type="dxa"/>
         </w:tblCellMar>
-        <w:tblLook w:val="04A0" w:firstRow="1" w:lastRow="0" w:firstColumn="1" w:lastColumn="0" w:noHBand="0" w:noVBand="1"/>
+        <w:tblLook w:val="0000" w:firstRow="0" w:lastRow="0" w:firstColumn="0" w:lastColumn="0" w:noHBand="0" w:noVBand="0"/>
       </w:tblPr>
       <w:tblGrid>
         <w:gridCol w:w="2600"/>
@@ -693,7 +693,7 @@
                 <w:sz w:val="19"/>
                 <w:szCs w:val="19"/>
               </w:rPr>
-              <w:t>2.1 (draft)</w:t>
+              <w:t>2.1</w:t>
             </w:r>
           </w:p>
         </w:tc>
@@ -759,7 +759,7 @@
                 <w:sz w:val="19"/>
                 <w:szCs w:val="19"/>
               </w:rPr>
-              <w:t>Under revision</w:t>
+              <w:t>Approved</w:t>
             </w:r>
           </w:p>
         </w:tc>
@@ -1189,7 +1189,7 @@
           <w:left w:w="10" w:type="dxa"/>
           <w:right w:w="10" w:type="dxa"/>
         </w:tblCellMar>
-        <w:tblLook w:val="04A0" w:firstRow="1" w:lastRow="0" w:firstColumn="1" w:lastColumn="0" w:noHBand="0" w:noVBand="1"/>
+        <w:tblLook w:val="0000" w:firstRow="0" w:lastRow="0" w:firstColumn="0" w:lastColumn="0" w:noHBand="0" w:noVBand="0"/>
       </w:tblPr>
       <w:tblGrid>
         <w:gridCol w:w="964"/>
@@ -1922,6 +1922,123 @@
           </w:p>
         </w:tc>
       </w:tr>
+      <w:tr>
+        <w:tblPrEx>
+          <w:tblCellMar>
+            <w:top w:w="0" w:type="dxa"/>
+            <w:bottom w:w="0" w:type="dxa"/>
+          </w:tblCellMar>
+        </w:tblPrEx>
+        <w:trPr>
+          <w:cantSplit/>
+          <w:trHeight w:val="420"/>
+        </w:trPr>
+        <w:tc>
+          <w:tcPr>
+            <w:tcW w:w="964" w:type="dxa"/>
+            <w:tcBorders>
+              <w:top w:val="single" w:sz="4" w:space="0" w:color="C9D3D0"/>
+              <w:left w:val="single" w:sz="4" w:space="0" w:color="C9D3D0"/>
+              <w:bottom w:val="single" w:sz="4" w:space="0" w:color="C9D3D0"/>
+              <w:right w:val="single" w:sz="4" w:space="0" w:color="C9D3D0"/>
+            </w:tcBorders>
+            <w:tcMar>
+              <w:top w:w="50" w:type="dxa"/>
+              <w:left w:w="100" w:type="dxa"/>
+              <w:bottom w:w="50" w:type="dxa"/>
+              <w:right w:w="100" w:type="dxa"/>
+            </w:tcMar>
+          </w:tcPr>
+          <w:p>
+            <w:r>
+              <w:rPr>
+                <w:sz w:val="19"/>
+                <w:szCs w:val="19"/>
+              </w:rPr>
+              <w:lastRenderedPageBreak/>
+              <w:t>2.1</w:t>
+            </w:r>
+          </w:p>
+        </w:tc>
+        <w:tc>
+          <w:tcPr>
+            <w:tcW w:w="1542" w:type="dxa"/>
+            <w:tcBorders>
+              <w:top w:val="single" w:sz="4" w:space="0" w:color="C9D3D0"/>
+              <w:left w:val="single" w:sz="4" w:space="0" w:color="C9D3D0"/>
+              <w:bottom w:val="single" w:sz="4" w:space="0" w:color="C9D3D0"/>
+              <w:right w:val="single" w:sz="4" w:space="0" w:color="C9D3D0"/>
+            </w:tcBorders>
+            <w:tcMar>
+              <w:top w:w="50" w:type="dxa"/>
+              <w:left w:w="100" w:type="dxa"/>
+              <w:bottom w:w="50" w:type="dxa"/>
+              <w:right w:w="100" w:type="dxa"/>
+            </w:tcMar>
+          </w:tcPr>
+          <w:p>
+            <w:r>
+              <w:rPr>
+                <w:sz w:val="19"/>
+                <w:szCs w:val="19"/>
+              </w:rPr>
+              <w:t>15 Oct 2026</w:t>
+            </w:r>
+          </w:p>
+        </w:tc>
+        <w:tc>
+          <w:tcPr>
+            <w:tcW w:w="1928" w:type="dxa"/>
+            <w:tcBorders>
+              <w:top w:val="single" w:sz="4" w:space="0" w:color="C9D3D0"/>
+              <w:left w:val="single" w:sz="4" w:space="0" w:color="C9D3D0"/>
+              <w:bottom w:val="single" w:sz="4" w:space="0" w:color="C9D3D0"/>
+              <w:right w:val="single" w:sz="4" w:space="0" w:color="C9D3D0"/>
+            </w:tcBorders>
+            <w:tcMar>
+              <w:top w:w="50" w:type="dxa"/>
+              <w:left w:w="100" w:type="dxa"/>
+              <w:bottom w:w="50" w:type="dxa"/>
+              <w:right w:w="100" w:type="dxa"/>
+            </w:tcMar>
+          </w:tcPr>
+          <w:p>
+            <w:r>
+              <w:rPr>
+                <w:sz w:val="19"/>
+                <w:szCs w:val="19"/>
+              </w:rPr>
+              <w:t>B.M.P Banneka</w:t>
+            </w:r>
+          </w:p>
+        </w:tc>
+        <w:tc>
+          <w:tcPr>
+            <w:tcW w:w="5204" w:type="dxa"/>
+            <w:tcBorders>
+              <w:top w:val="single" w:sz="4" w:space="0" w:color="C9D3D0"/>
+              <w:left w:val="single" w:sz="4" w:space="0" w:color="C9D3D0"/>
+              <w:bottom w:val="single" w:sz="4" w:space="0" w:color="C9D3D0"/>
+              <w:right w:val="single" w:sz="4" w:space="0" w:color="C9D3D0"/>
+            </w:tcBorders>
+            <w:tcMar>
+              <w:top w:w="50" w:type="dxa"/>
+              <w:left w:w="100" w:type="dxa"/>
+              <w:bottom w:w="50" w:type="dxa"/>
+              <w:right w:w="100" w:type="dxa"/>
+            </w:tcMar>
+          </w:tcPr>
+          <w:p>
+            <w:r>
+              <w:rPr>
+                <w:sz w:val="19"/>
+                <w:szCs w:val="19"/>
+              </w:rPr>
+              <w:t>Approved by the product owner; baselined. Supersedes 2.0. Mahapola/Bursary line removed from University facts before approval</w:t>
+            </w:r>
+          </w:p>
+        </w:tc>
+      </w:tr>
     </w:tbl>
     <w:p>
       <w:pPr>
@@ -1964,7 +2081,7 @@
           <w:left w:w="10" w:type="dxa"/>
           <w:right w:w="10" w:type="dxa"/>
         </w:tblCellMar>
-        <w:tblLook w:val="04A0" w:firstRow="1" w:lastRow="0" w:firstColumn="1" w:lastColumn="0" w:noHBand="0" w:noVBand="1"/>
+        <w:tblLook w:val="0000" w:firstRow="0" w:lastRow="0" w:firstColumn="0" w:lastColumn="0" w:noHBand="0" w:noVBand="0"/>
       </w:tblPr>
       <w:tblGrid>
         <w:gridCol w:w="2120"/>
@@ -2288,7 +2405,7 @@
                 <w:sz w:val="19"/>
                 <w:szCs w:val="19"/>
               </w:rPr>
-              <w:t>v2.0 approved in writing (project channel) on 14 Oct 2026 and v1.0 on 5 Oct 2026; this revision awaits approval</w:t>
+              <w:t>Approved in writing (project channel): v2.1 on 15 Oct 2026, v2.0 on 14 Oct 2026, v1.0 on 5 Oct 2026</w:t>
             </w:r>
           </w:p>
         </w:tc>
@@ -2314,7 +2431,7 @@
                 <w:sz w:val="19"/>
                 <w:szCs w:val="19"/>
               </w:rPr>
-              <w:t>14 Oct 2026 (v2.0); 5 Oct 2026 (v1.0)</w:t>
+              <w:t>15 Oct 2026 (v2.1); 14 Oct 2026 (v2.0); 5 Oct 2026 (v1.0)</w:t>
             </w:r>
           </w:p>
         </w:tc>
@@ -2337,7 +2454,7 @@
     <w:sdt>
       <w:sdtPr>
         <w:alias w:val="Contents"/>
-        <w:id w:val="-1354644744"/>
+        <w:id w:val="104314423"/>
       </w:sdtPr>
       <w:sdtEndPr/>
       <w:sdtContent>
@@ -2366,7 +2483,7 @@
           <w:r>
             <w:fldChar w:fldCharType="separate"/>
           </w:r>
-          <w:hyperlink w:anchor="_Toc242920248" w:history="1">
+          <w:hyperlink w:anchor="_Toc242943746" w:history="1">
             <w:r>
               <w:rPr>
                 <w:rStyle w:val="Hyperlink"/>
@@ -2390,7 +2507,7 @@
               <w:rPr>
                 <w:noProof/>
               </w:rPr>
-              <w:instrText xml:space="preserve"> PAGEREF _Toc242920248 \h </w:instrText>
+              <w:instrText xml:space="preserve"> PAGEREF _Toc242943746 \h </w:instrText>
             </w:r>
             <w:r>
               <w:rPr>
@@ -2433,7 +2550,7 @@
               <w14:ligatures w14:val="standardContextual"/>
             </w:rPr>
           </w:pPr>
-          <w:hyperlink w:anchor="_Toc242920249" w:history="1">
+          <w:hyperlink w:anchor="_Toc242943747" w:history="1">
             <w:r>
               <w:rPr>
                 <w:rStyle w:val="Hyperlink"/>
@@ -2457,7 +2574,7 @@
               <w:rPr>
                 <w:noProof/>
               </w:rPr>
-              <w:instrText xml:space="preserve"> PAGEREF _Toc242920249 \h </w:instrText>
+              <w:instrText xml:space="preserve"> PAGEREF _Toc242943747 \h </w:instrText>
             </w:r>
             <w:r>
               <w:rPr>
@@ -2500,7 +2617,7 @@
               <w14:ligatures w14:val="standardContextual"/>
             </w:rPr>
           </w:pPr>
-          <w:hyperlink w:anchor="_Toc242920250" w:history="1">
+          <w:hyperlink w:anchor="_Toc242943748" w:history="1">
             <w:r>
               <w:rPr>
                 <w:rStyle w:val="Hyperlink"/>
@@ -2524,7 +2641,7 @@
               <w:rPr>
                 <w:noProof/>
               </w:rPr>
-              <w:instrText xml:space="preserve"> PAGEREF _Toc242920250 \h </w:instrText>
+              <w:instrText xml:space="preserve"> PAGEREF _Toc242943748 \h </w:instrText>
             </w:r>
             <w:r>
               <w:rPr>
@@ -2567,7 +2684,7 @@
               <w14:ligatures w14:val="standardContextual"/>
             </w:rPr>
           </w:pPr>
-          <w:hyperlink w:anchor="_Toc242920251" w:history="1">
+          <w:hyperlink w:anchor="_Toc242943749" w:history="1">
             <w:r>
               <w:rPr>
                 <w:rStyle w:val="Hyperlink"/>
@@ -2591,7 +2708,7 @@
               <w:rPr>
                 <w:noProof/>
               </w:rPr>
-              <w:instrText xml:space="preserve"> PAGEREF _Toc242920251 \h </w:instrText>
+              <w:instrText xml:space="preserve"> PAGEREF _Toc242943749 \h </w:instrText>
             </w:r>
             <w:r>
               <w:rPr>
@@ -2634,7 +2751,7 @@
               <w14:ligatures w14:val="standardContextual"/>
             </w:rPr>
           </w:pPr>
-          <w:hyperlink w:anchor="_Toc242920252" w:history="1">
+          <w:hyperlink w:anchor="_Toc242943750" w:history="1">
             <w:r>
               <w:rPr>
                 <w:rStyle w:val="Hyperlink"/>
@@ -2658,7 +2775,7 @@
               <w:rPr>
                 <w:noProof/>
               </w:rPr>
-              <w:instrText xml:space="preserve"> PAGEREF _Toc242920252 \h </w:instrText>
+              <w:instrText xml:space="preserve"> PAGEREF _Toc242943750 \h </w:instrText>
             </w:r>
             <w:r>
               <w:rPr>
@@ -2701,7 +2818,7 @@
               <w14:ligatures w14:val="standardContextual"/>
             </w:rPr>
           </w:pPr>
-          <w:hyperlink w:anchor="_Toc242920253" w:history="1">
+          <w:hyperlink w:anchor="_Toc242943751" w:history="1">
             <w:r>
               <w:rPr>
                 <w:rStyle w:val="Hyperlink"/>
@@ -2725,7 +2842,7 @@
               <w:rPr>
                 <w:noProof/>
               </w:rPr>
-              <w:instrText xml:space="preserve"> PAGEREF _Toc242920253 \h </w:instrText>
+              <w:instrText xml:space="preserve"> PAGEREF _Toc242943751 \h </w:instrText>
             </w:r>
             <w:r>
               <w:rPr>
@@ -2768,7 +2885,7 @@
               <w14:ligatures w14:val="standardContextual"/>
             </w:rPr>
           </w:pPr>
-          <w:hyperlink w:anchor="_Toc242920254" w:history="1">
+          <w:hyperlink w:anchor="_Toc242943752" w:history="1">
             <w:r>
               <w:rPr>
                 <w:rStyle w:val="Hyperlink"/>
@@ -2792,7 +2909,7 @@
               <w:rPr>
                 <w:noProof/>
               </w:rPr>
-              <w:instrText xml:space="preserve"> PAGEREF _Toc242920254 \h </w:instrText>
+              <w:instrText xml:space="preserve"> PAGEREF _Toc242943752 \h </w:instrText>
             </w:r>
             <w:r>
               <w:rPr>
@@ -2835,7 +2952,7 @@
               <w14:ligatures w14:val="standardContextual"/>
             </w:rPr>
           </w:pPr>
-          <w:hyperlink w:anchor="_Toc242920255" w:history="1">
+          <w:hyperlink w:anchor="_Toc242943753" w:history="1">
             <w:r>
               <w:rPr>
                 <w:rStyle w:val="Hyperlink"/>
@@ -2859,7 +2976,7 @@
               <w:rPr>
                 <w:noProof/>
               </w:rPr>
-              <w:instrText xml:space="preserve"> PAGEREF _Toc242920255 \h </w:instrText>
+              <w:instrText xml:space="preserve"> PAGEREF _Toc242943753 \h </w:instrText>
             </w:r>
             <w:r>
               <w:rPr>
@@ -2902,7 +3019,7 @@
               <w14:ligatures w14:val="standardContextual"/>
             </w:rPr>
           </w:pPr>
-          <w:hyperlink w:anchor="_Toc242920256" w:history="1">
+          <w:hyperlink w:anchor="_Toc242943754" w:history="1">
             <w:r>
               <w:rPr>
                 <w:rStyle w:val="Hyperlink"/>
@@ -2926,7 +3043,7 @@
               <w:rPr>
                 <w:noProof/>
               </w:rPr>
-              <w:instrText xml:space="preserve"> PAGEREF _Toc242920256 \h </w:instrText>
+              <w:instrText xml:space="preserve"> PAGEREF _Toc242943754 \h </w:instrText>
             </w:r>
             <w:r>
               <w:rPr>
@@ -2969,7 +3086,7 @@
               <w14:ligatures w14:val="standardContextual"/>
             </w:rPr>
           </w:pPr>
-          <w:hyperlink w:anchor="_Toc242920257" w:history="1">
+          <w:hyperlink w:anchor="_Toc242943755" w:history="1">
             <w:r>
               <w:rPr>
                 <w:rStyle w:val="Hyperlink"/>
@@ -2993,7 +3110,7 @@
               <w:rPr>
                 <w:noProof/>
               </w:rPr>
-              <w:instrText xml:space="preserve"> PAGEREF _Toc242920257 \h </w:instrText>
+              <w:instrText xml:space="preserve"> PAGEREF _Toc242943755 \h </w:instrText>
             </w:r>
             <w:r>
               <w:rPr>
@@ -3036,7 +3153,7 @@
               <w14:ligatures w14:val="standardContextual"/>
             </w:rPr>
           </w:pPr>
-          <w:hyperlink w:anchor="_Toc242920258" w:history="1">
+          <w:hyperlink w:anchor="_Toc242943756" w:history="1">
             <w:r>
               <w:rPr>
                 <w:rStyle w:val="Hyperlink"/>
@@ -3060,7 +3177,7 @@
               <w:rPr>
                 <w:noProof/>
               </w:rPr>
-              <w:instrText xml:space="preserve"> PAGEREF _Toc242920258 \h </w:instrText>
+              <w:instrText xml:space="preserve"> PAGEREF _Toc242943756 \h </w:instrText>
             </w:r>
             <w:r>
               <w:rPr>
@@ -3103,7 +3220,7 @@
               <w14:ligatures w14:val="standardContextual"/>
             </w:rPr>
           </w:pPr>
-          <w:hyperlink w:anchor="_Toc242920259" w:history="1">
+          <w:hyperlink w:anchor="_Toc242943757" w:history="1">
             <w:r>
               <w:rPr>
                 <w:rStyle w:val="Hyperlink"/>
@@ -3127,7 +3244,7 @@
               <w:rPr>
                 <w:noProof/>
               </w:rPr>
-              <w:instrText xml:space="preserve"> PAGEREF _Toc242920259 \h </w:instrText>
+              <w:instrText xml:space="preserve"> PAGEREF _Toc242943757 \h </w:instrText>
             </w:r>
             <w:r>
               <w:rPr>
@@ -3170,7 +3287,7 @@
               <w14:ligatures w14:val="standardContextual"/>
             </w:rPr>
           </w:pPr>
-          <w:hyperlink w:anchor="_Toc242920260" w:history="1">
+          <w:hyperlink w:anchor="_Toc242943758" w:history="1">
             <w:r>
               <w:rPr>
                 <w:rStyle w:val="Hyperlink"/>
@@ -3194,7 +3311,7 @@
               <w:rPr>
                 <w:noProof/>
               </w:rPr>
-              <w:instrText xml:space="preserve"> PAGEREF _Toc242920260 \h </w:instrText>
+              <w:instrText xml:space="preserve"> PAGEREF _Toc242943758 \h </w:instrText>
             </w:r>
             <w:r>
               <w:rPr>
@@ -3237,7 +3354,7 @@
               <w14:ligatures w14:val="standardContextual"/>
             </w:rPr>
           </w:pPr>
-          <w:hyperlink w:anchor="_Toc242920261" w:history="1">
+          <w:hyperlink w:anchor="_Toc242943759" w:history="1">
             <w:r>
               <w:rPr>
                 <w:rStyle w:val="Hyperlink"/>
@@ -3261,7 +3378,7 @@
               <w:rPr>
                 <w:noProof/>
               </w:rPr>
-              <w:instrText xml:space="preserve"> PAGEREF _Toc242920261 \h </w:instrText>
+              <w:instrText xml:space="preserve"> PAGEREF _Toc242943759 \h </w:instrText>
             </w:r>
             <w:r>
               <w:rPr>
@@ -3304,7 +3421,7 @@
               <w14:ligatures w14:val="standardContextual"/>
             </w:rPr>
           </w:pPr>
-          <w:hyperlink w:anchor="_Toc242920262" w:history="1">
+          <w:hyperlink w:anchor="_Toc242943760" w:history="1">
             <w:r>
               <w:rPr>
                 <w:rStyle w:val="Hyperlink"/>
@@ -3328,7 +3445,7 @@
               <w:rPr>
                 <w:noProof/>
               </w:rPr>
-              <w:instrText xml:space="preserve"> PAGEREF _Toc242920262 \h </w:instrText>
+              <w:instrText xml:space="preserve"> PAGEREF _Toc242943760 \h </w:instrText>
             </w:r>
             <w:r>
               <w:rPr>
@@ -3371,7 +3488,7 @@
               <w14:ligatures w14:val="standardContextual"/>
             </w:rPr>
           </w:pPr>
-          <w:hyperlink w:anchor="_Toc242920263" w:history="1">
+          <w:hyperlink w:anchor="_Toc242943761" w:history="1">
             <w:r>
               <w:rPr>
                 <w:rStyle w:val="Hyperlink"/>
@@ -3395,7 +3512,7 @@
               <w:rPr>
                 <w:noProof/>
               </w:rPr>
-              <w:instrText xml:space="preserve"> PAGEREF _Toc242920263 \h </w:instrText>
+              <w:instrText xml:space="preserve"> PAGEREF _Toc242943761 \h </w:instrText>
             </w:r>
             <w:r>
               <w:rPr>
@@ -3438,7 +3555,7 @@
               <w14:ligatures w14:val="standardContextual"/>
             </w:rPr>
           </w:pPr>
-          <w:hyperlink w:anchor="_Toc242920264" w:history="1">
+          <w:hyperlink w:anchor="_Toc242943762" w:history="1">
             <w:r>
               <w:rPr>
                 <w:rStyle w:val="Hyperlink"/>
@@ -3462,7 +3579,7 @@
               <w:rPr>
                 <w:noProof/>
               </w:rPr>
-              <w:instrText xml:space="preserve"> PAGEREF _Toc242920264 \h </w:instrText>
+              <w:instrText xml:space="preserve"> PAGEREF _Toc242943762 \h </w:instrText>
             </w:r>
             <w:r>
               <w:rPr>
@@ -3505,7 +3622,7 @@
               <w14:ligatures w14:val="standardContextual"/>
             </w:rPr>
           </w:pPr>
-          <w:hyperlink w:anchor="_Toc242920265" w:history="1">
+          <w:hyperlink w:anchor="_Toc242943763" w:history="1">
             <w:r>
               <w:rPr>
                 <w:rStyle w:val="Hyperlink"/>
@@ -3529,7 +3646,7 @@
               <w:rPr>
                 <w:noProof/>
               </w:rPr>
-              <w:instrText xml:space="preserve"> PAGEREF _Toc242920265 \h </w:instrText>
+              <w:instrText xml:space="preserve"> PAGEREF _Toc242943763 \h </w:instrText>
             </w:r>
             <w:r>
               <w:rPr>
@@ -3572,7 +3689,7 @@
               <w14:ligatures w14:val="standardContextual"/>
             </w:rPr>
           </w:pPr>
-          <w:hyperlink w:anchor="_Toc242920266" w:history="1">
+          <w:hyperlink w:anchor="_Toc242943764" w:history="1">
             <w:r>
               <w:rPr>
                 <w:rStyle w:val="Hyperlink"/>
@@ -3596,7 +3713,7 @@
               <w:rPr>
                 <w:noProof/>
               </w:rPr>
-              <w:instrText xml:space="preserve"> PAGEREF _Toc242920266 \h </w:instrText>
+              <w:instrText xml:space="preserve"> PAGEREF _Toc242943764 \h </w:instrText>
             </w:r>
             <w:r>
               <w:rPr>
@@ -3639,7 +3756,7 @@
               <w14:ligatures w14:val="standardContextual"/>
             </w:rPr>
           </w:pPr>
-          <w:hyperlink w:anchor="_Toc242920267" w:history="1">
+          <w:hyperlink w:anchor="_Toc242943765" w:history="1">
             <w:r>
               <w:rPr>
                 <w:rStyle w:val="Hyperlink"/>
@@ -3663,7 +3780,7 @@
               <w:rPr>
                 <w:noProof/>
               </w:rPr>
-              <w:instrText xml:space="preserve"> PAGEREF _Toc242920267 \h </w:instrText>
+              <w:instrText xml:space="preserve"> PAGEREF _Toc242943765 \h </w:instrText>
             </w:r>
             <w:r>
               <w:rPr>
@@ -3706,7 +3823,7 @@
               <w14:ligatures w14:val="standardContextual"/>
             </w:rPr>
           </w:pPr>
-          <w:hyperlink w:anchor="_Toc242920268" w:history="1">
+          <w:hyperlink w:anchor="_Toc242943766" w:history="1">
             <w:r>
               <w:rPr>
                 <w:rStyle w:val="Hyperlink"/>
@@ -3730,7 +3847,7 @@
               <w:rPr>
                 <w:noProof/>
               </w:rPr>
-              <w:instrText xml:space="preserve"> PAGEREF _Toc242920268 \h </w:instrText>
+              <w:instrText xml:space="preserve"> PAGEREF _Toc242943766 \h </w:instrText>
             </w:r>
             <w:r>
               <w:rPr>
@@ -3773,7 +3890,7 @@
               <w14:ligatures w14:val="standardContextual"/>
             </w:rPr>
           </w:pPr>
-          <w:hyperlink w:anchor="_Toc242920269" w:history="1">
+          <w:hyperlink w:anchor="_Toc242943767" w:history="1">
             <w:r>
               <w:rPr>
                 <w:rStyle w:val="Hyperlink"/>
@@ -3797,7 +3914,7 @@
               <w:rPr>
                 <w:noProof/>
               </w:rPr>
-              <w:instrText xml:space="preserve"> PAGEREF _Toc242920269 \h </w:instrText>
+              <w:instrText xml:space="preserve"> PAGEREF _Toc242943767 \h </w:instrText>
             </w:r>
             <w:r>
               <w:rPr>
@@ -3840,7 +3957,7 @@
               <w14:ligatures w14:val="standardContextual"/>
             </w:rPr>
           </w:pPr>
-          <w:hyperlink w:anchor="_Toc242920270" w:history="1">
+          <w:hyperlink w:anchor="_Toc242943768" w:history="1">
             <w:r>
               <w:rPr>
                 <w:rStyle w:val="Hyperlink"/>
@@ -3864,7 +3981,7 @@
               <w:rPr>
                 <w:noProof/>
               </w:rPr>
-              <w:instrText xml:space="preserve"> PAGEREF _Toc242920270 \h </w:instrText>
+              <w:instrText xml:space="preserve"> PAGEREF _Toc242943768 \h </w:instrText>
             </w:r>
             <w:r>
               <w:rPr>
@@ -3907,7 +4024,7 @@
               <w14:ligatures w14:val="standardContextual"/>
             </w:rPr>
           </w:pPr>
-          <w:hyperlink w:anchor="_Toc242920271" w:history="1">
+          <w:hyperlink w:anchor="_Toc242943769" w:history="1">
             <w:r>
               <w:rPr>
                 <w:rStyle w:val="Hyperlink"/>
@@ -3931,7 +4048,7 @@
               <w:rPr>
                 <w:noProof/>
               </w:rPr>
-              <w:instrText xml:space="preserve"> PAGEREF _Toc242920271 \h </w:instrText>
+              <w:instrText xml:space="preserve"> PAGEREF _Toc242943769 \h </w:instrText>
             </w:r>
             <w:r>
               <w:rPr>
@@ -3974,7 +4091,7 @@
               <w14:ligatures w14:val="standardContextual"/>
             </w:rPr>
           </w:pPr>
-          <w:hyperlink w:anchor="_Toc242920272" w:history="1">
+          <w:hyperlink w:anchor="_Toc242943770" w:history="1">
             <w:r>
               <w:rPr>
                 <w:rStyle w:val="Hyperlink"/>
@@ -3998,7 +4115,7 @@
               <w:rPr>
                 <w:noProof/>
               </w:rPr>
-              <w:instrText xml:space="preserve"> PAGEREF _Toc242920272 \h </w:instrText>
+              <w:instrText xml:space="preserve"> PAGEREF _Toc242943770 \h </w:instrText>
             </w:r>
             <w:r>
               <w:rPr>
@@ -4041,7 +4158,7 @@
               <w14:ligatures w14:val="standardContextual"/>
             </w:rPr>
           </w:pPr>
-          <w:hyperlink w:anchor="_Toc242920273" w:history="1">
+          <w:hyperlink w:anchor="_Toc242943771" w:history="1">
             <w:r>
               <w:rPr>
                 <w:rStyle w:val="Hyperlink"/>
@@ -4065,7 +4182,7 @@
               <w:rPr>
                 <w:noProof/>
               </w:rPr>
-              <w:instrText xml:space="preserve"> PAGEREF _Toc242920273 \h </w:instrText>
+              <w:instrText xml:space="preserve"> PAGEREF _Toc242943771 \h </w:instrText>
             </w:r>
             <w:r>
               <w:rPr>
@@ -4111,7 +4228,7 @@
     <w:sdt>
       <w:sdtPr>
         <w:alias w:val="Figures"/>
-        <w:id w:val="122053563"/>
+        <w:id w:val="-1196623515"/>
       </w:sdtPr>
       <w:sdtEndPr/>
       <w:sdtContent>
@@ -4140,7 +4257,7 @@
           <w:r>
             <w:fldChar w:fldCharType="separate"/>
           </w:r>
-          <w:hyperlink w:anchor="_Toc242920274" w:history="1">
+          <w:hyperlink w:anchor="_Toc242943772" w:history="1">
             <w:r>
               <w:rPr>
                 <w:rStyle w:val="Hyperlink"/>
@@ -4164,7 +4281,7 @@
               <w:rPr>
                 <w:noProof/>
               </w:rPr>
-              <w:instrText xml:space="preserve"> PAGEREF _Toc242920274 \h </w:instrText>
+              <w:instrText xml:space="preserve"> PAGEREF _Toc242943772 \h </w:instrText>
             </w:r>
             <w:r>
               <w:rPr>
@@ -4210,7 +4327,7 @@
     <w:sdt>
       <w:sdtPr>
         <w:alias w:val="Tables"/>
-        <w:id w:val="1542324753"/>
+        <w:id w:val="-107664045"/>
       </w:sdtPr>
       <w:sdtEndPr/>
       <w:sdtContent>
@@ -4239,7 +4356,7 @@
           <w:r>
             <w:fldChar w:fldCharType="separate"/>
           </w:r>
-          <w:hyperlink w:anchor="_Toc242920275" w:history="1">
+          <w:hyperlink w:anchor="_Toc242943773" w:history="1">
             <w:r>
               <w:rPr>
                 <w:rStyle w:val="Hyperlink"/>
@@ -4263,7 +4380,7 @@
               <w:rPr>
                 <w:noProof/>
               </w:rPr>
-              <w:instrText xml:space="preserve"> PAGEREF _Toc242920275 \h </w:instrText>
+              <w:instrText xml:space="preserve"> PAGEREF _Toc242943773 \h </w:instrText>
             </w:r>
             <w:r>
               <w:rPr>
@@ -4306,7 +4423,7 @@
               <w14:ligatures w14:val="standardContextual"/>
             </w:rPr>
           </w:pPr>
-          <w:hyperlink w:anchor="_Toc242920276" w:history="1">
+          <w:hyperlink w:anchor="_Toc242943774" w:history="1">
             <w:r>
               <w:rPr>
                 <w:rStyle w:val="Hyperlink"/>
@@ -4330,7 +4447,7 @@
               <w:rPr>
                 <w:noProof/>
               </w:rPr>
-              <w:instrText xml:space="preserve"> PAGEREF _Toc242920276 \h </w:instrText>
+              <w:instrText xml:space="preserve"> PAGEREF _Toc242943774 \h </w:instrText>
             </w:r>
             <w:r>
               <w:rPr>
@@ -4373,7 +4490,7 @@
               <w14:ligatures w14:val="standardContextual"/>
             </w:rPr>
           </w:pPr>
-          <w:hyperlink w:anchor="_Toc242920277" w:history="1">
+          <w:hyperlink w:anchor="_Toc242943775" w:history="1">
             <w:r>
               <w:rPr>
                 <w:rStyle w:val="Hyperlink"/>
@@ -4397,7 +4514,7 @@
               <w:rPr>
                 <w:noProof/>
               </w:rPr>
-              <w:instrText xml:space="preserve"> PAGEREF _Toc242920277 \h </w:instrText>
+              <w:instrText xml:space="preserve"> PAGEREF _Toc242943775 \h </w:instrText>
             </w:r>
             <w:r>
               <w:rPr>
@@ -4440,7 +4557,7 @@
               <w14:ligatures w14:val="standardContextual"/>
             </w:rPr>
           </w:pPr>
-          <w:hyperlink w:anchor="_Toc242920278" w:history="1">
+          <w:hyperlink w:anchor="_Toc242943776" w:history="1">
             <w:r>
               <w:rPr>
                 <w:rStyle w:val="Hyperlink"/>
@@ -4464,7 +4581,7 @@
               <w:rPr>
                 <w:noProof/>
               </w:rPr>
-              <w:instrText xml:space="preserve"> PAGEREF _Toc242920278 \h </w:instrText>
+              <w:instrText xml:space="preserve"> PAGEREF _Toc242943776 \h </w:instrText>
             </w:r>
             <w:r>
               <w:rPr>
@@ -4507,7 +4624,7 @@
               <w14:ligatures w14:val="standardContextual"/>
             </w:rPr>
           </w:pPr>
-          <w:hyperlink w:anchor="_Toc242920279" w:history="1">
+          <w:hyperlink w:anchor="_Toc242943777" w:history="1">
             <w:r>
               <w:rPr>
                 <w:rStyle w:val="Hyperlink"/>
@@ -4531,7 +4648,7 @@
               <w:rPr>
                 <w:noProof/>
               </w:rPr>
-              <w:instrText xml:space="preserve"> PAGEREF _Toc242920279 \h </w:instrText>
+              <w:instrText xml:space="preserve"> PAGEREF _Toc242943777 \h </w:instrText>
             </w:r>
             <w:r>
               <w:rPr>
@@ -4574,7 +4691,7 @@
               <w14:ligatures w14:val="standardContextual"/>
             </w:rPr>
           </w:pPr>
-          <w:hyperlink w:anchor="_Toc242920280" w:history="1">
+          <w:hyperlink w:anchor="_Toc242943778" w:history="1">
             <w:r>
               <w:rPr>
                 <w:rStyle w:val="Hyperlink"/>
@@ -4598,7 +4715,7 @@
               <w:rPr>
                 <w:noProof/>
               </w:rPr>
-              <w:instrText xml:space="preserve"> PAGEREF _Toc242920280 \h </w:instrText>
+              <w:instrText xml:space="preserve"> PAGEREF _Toc242943778 \h </w:instrText>
             </w:r>
             <w:r>
               <w:rPr>
@@ -4641,7 +4758,7 @@
               <w14:ligatures w14:val="standardContextual"/>
             </w:rPr>
           </w:pPr>
-          <w:hyperlink w:anchor="_Toc242920281" w:history="1">
+          <w:hyperlink w:anchor="_Toc242943779" w:history="1">
             <w:r>
               <w:rPr>
                 <w:rStyle w:val="Hyperlink"/>
@@ -4665,7 +4782,7 @@
               <w:rPr>
                 <w:noProof/>
               </w:rPr>
-              <w:instrText xml:space="preserve"> PAGEREF _Toc242920281 \h </w:instrText>
+              <w:instrText xml:space="preserve"> PAGEREF _Toc242943779 \h </w:instrText>
             </w:r>
             <w:r>
               <w:rPr>
@@ -4708,7 +4825,7 @@
               <w14:ligatures w14:val="standardContextual"/>
             </w:rPr>
           </w:pPr>
-          <w:hyperlink w:anchor="_Toc242920282" w:history="1">
+          <w:hyperlink w:anchor="_Toc242943780" w:history="1">
             <w:r>
               <w:rPr>
                 <w:rStyle w:val="Hyperlink"/>
@@ -4732,7 +4849,7 @@
               <w:rPr>
                 <w:noProof/>
               </w:rPr>
-              <w:instrText xml:space="preserve"> PAGEREF _Toc242920282 \h </w:instrText>
+              <w:instrText xml:space="preserve"> PAGEREF _Toc242943780 \h </w:instrText>
             </w:r>
             <w:r>
               <w:rPr>
@@ -4775,7 +4892,7 @@
               <w14:ligatures w14:val="standardContextual"/>
             </w:rPr>
           </w:pPr>
-          <w:hyperlink w:anchor="_Toc242920283" w:history="1">
+          <w:hyperlink w:anchor="_Toc242943781" w:history="1">
             <w:r>
               <w:rPr>
                 <w:rStyle w:val="Hyperlink"/>
@@ -4799,7 +4916,7 @@
               <w:rPr>
                 <w:noProof/>
               </w:rPr>
-              <w:instrText xml:space="preserve"> PAGEREF _Toc242920283 \h </w:instrText>
+              <w:instrText xml:space="preserve"> PAGEREF _Toc242943781 \h </w:instrText>
             </w:r>
             <w:r>
               <w:rPr>
@@ -4842,7 +4959,7 @@
               <w14:ligatures w14:val="standardContextual"/>
             </w:rPr>
           </w:pPr>
-          <w:hyperlink w:anchor="_Toc242920284" w:history="1">
+          <w:hyperlink w:anchor="_Toc242943782" w:history="1">
             <w:r>
               <w:rPr>
                 <w:rStyle w:val="Hyperlink"/>
@@ -4866,7 +4983,7 @@
               <w:rPr>
                 <w:noProof/>
               </w:rPr>
-              <w:instrText xml:space="preserve"> PAGEREF _Toc242920284 \h </w:instrText>
+              <w:instrText xml:space="preserve"> PAGEREF _Toc242943782 \h </w:instrText>
             </w:r>
             <w:r>
               <w:rPr>
@@ -4909,7 +5026,7 @@
               <w14:ligatures w14:val="standardContextual"/>
             </w:rPr>
           </w:pPr>
-          <w:hyperlink w:anchor="_Toc242920285" w:history="1">
+          <w:hyperlink w:anchor="_Toc242943783" w:history="1">
             <w:r>
               <w:rPr>
                 <w:rStyle w:val="Hyperlink"/>
@@ -4933,7 +5050,7 @@
               <w:rPr>
                 <w:noProof/>
               </w:rPr>
-              <w:instrText xml:space="preserve"> PAGEREF _Toc242920285 \h </w:instrText>
+              <w:instrText xml:space="preserve"> PAGEREF _Toc242943783 \h </w:instrText>
             </w:r>
             <w:r>
               <w:rPr>
@@ -4976,7 +5093,7 @@
               <w14:ligatures w14:val="standardContextual"/>
             </w:rPr>
           </w:pPr>
-          <w:hyperlink w:anchor="_Toc242920286" w:history="1">
+          <w:hyperlink w:anchor="_Toc242943784" w:history="1">
             <w:r>
               <w:rPr>
                 <w:rStyle w:val="Hyperlink"/>
@@ -5000,7 +5117,7 @@
               <w:rPr>
                 <w:noProof/>
               </w:rPr>
-              <w:instrText xml:space="preserve"> PAGEREF _Toc242920286 \h </w:instrText>
+              <w:instrText xml:space="preserve"> PAGEREF _Toc242943784 \h </w:instrText>
             </w:r>
             <w:r>
               <w:rPr>
@@ -5043,7 +5160,7 @@
               <w14:ligatures w14:val="standardContextual"/>
             </w:rPr>
           </w:pPr>
-          <w:hyperlink w:anchor="_Toc242920287" w:history="1">
+          <w:hyperlink w:anchor="_Toc242943785" w:history="1">
             <w:r>
               <w:rPr>
                 <w:rStyle w:val="Hyperlink"/>
@@ -5067,7 +5184,7 @@
               <w:rPr>
                 <w:noProof/>
               </w:rPr>
-              <w:instrText xml:space="preserve"> PAGEREF _Toc242920287 \h </w:instrText>
+              <w:instrText xml:space="preserve"> PAGEREF _Toc242943785 \h </w:instrText>
             </w:r>
             <w:r>
               <w:rPr>
@@ -5108,7 +5225,7 @@
         <w:keepLines/>
         <w:pageBreakBefore/>
       </w:pPr>
-      <w:bookmarkStart w:id="0" w:name="_Toc242920248"/>
+      <w:bookmarkStart w:id="0" w:name="_Toc242943746"/>
       <w:r>
         <w:lastRenderedPageBreak/>
         <w:t>1 Introduction</w:t>
@@ -5121,7 +5238,7 @@
         <w:keepNext/>
         <w:keepLines/>
       </w:pPr>
-      <w:bookmarkStart w:id="1" w:name="_Toc242920249"/>
+      <w:bookmarkStart w:id="1" w:name="_Toc242943747"/>
       <w:r>
         <w:t>1.1 Purpose</w:t>
       </w:r>
@@ -5162,7 +5279,10 @@
         <w:t>how</w:t>
       </w:r>
       <w:r>
-        <w:t xml:space="preserve"> its success will be judged. It is the parent of every other ZedPath document: user stories (ZP-DOC-02) refine its features, and the requirements specification (ZP-DOC-03) makes them precise.</w:t>
+        <w:t xml:space="preserve"> its success </w:t>
+      </w:r>
+      <w:r>
+        <w:t>will be judged. It is the parent of every other ZedPath document: user stories (ZP-DOC-02) refine its features, and the requirements specification (ZP-DOC-03) makes them precise.</w:t>
       </w:r>
     </w:p>
     <w:p>
@@ -5171,7 +5291,7 @@
         <w:keepNext/>
         <w:keepLines/>
       </w:pPr>
-      <w:bookmarkStart w:id="2" w:name="_Toc242920250"/>
+      <w:bookmarkStart w:id="2" w:name="_Toc242943748"/>
       <w:r>
         <w:t>1.2 Scope</w:t>
       </w:r>
@@ -5182,10 +5302,7 @@
         <w:spacing w:after="120"/>
       </w:pPr>
       <w:r>
-        <w:t xml:space="preserve">It covers the business requirements, the product vision, the scope of the first two releases, and the </w:t>
-      </w:r>
-      <w:r>
-        <w:t>business context (stakeholders, priorities, risks and deployment constraints). Technical design is out of scope.</w:t>
+        <w:t>It covers the business requirements, the product vision, the scope of the first two releases, and the business context (stakeholders, priorities, risks and deployment constraints). Technical design is out of scope.</w:t>
       </w:r>
     </w:p>
     <w:p>
@@ -5194,7 +5311,7 @@
         <w:keepNext/>
         <w:keepLines/>
       </w:pPr>
-      <w:bookmarkStart w:id="3" w:name="_Toc242920251"/>
+      <w:bookmarkStart w:id="3" w:name="_Toc242943749"/>
       <w:r>
         <w:t>1.3 Intended audience</w:t>
       </w:r>
@@ -5214,7 +5331,7 @@
         <w:keepNext/>
         <w:keepLines/>
       </w:pPr>
-      <w:bookmarkStart w:id="4" w:name="_Toc242920252"/>
+      <w:bookmarkStart w:id="4" w:name="_Toc242943750"/>
       <w:r>
         <w:t>1.4 Relationship to other documents</w:t>
       </w:r>
@@ -5225,7 +5342,7 @@
         <w:pStyle w:val="Caption"/>
         <w:keepNext/>
       </w:pPr>
-      <w:bookmarkStart w:id="5" w:name="_Toc242920275"/>
+      <w:bookmarkStart w:id="5" w:name="_Toc242943773"/>
       <w:r>
         <w:t xml:space="preserve">Table </w:t>
       </w:r>
@@ -5267,7 +5384,7 @@
           <w:left w:w="10" w:type="dxa"/>
           <w:right w:w="10" w:type="dxa"/>
         </w:tblCellMar>
-        <w:tblLook w:val="04A0" w:firstRow="1" w:lastRow="0" w:firstColumn="1" w:lastColumn="0" w:noHBand="0" w:noVBand="1"/>
+        <w:tblLook w:val="0000" w:firstRow="0" w:lastRow="0" w:firstColumn="0" w:lastColumn="0" w:noHBand="0" w:noVBand="0"/>
       </w:tblPr>
       <w:tblGrid>
         <w:gridCol w:w="4337"/>
@@ -5653,7 +5770,7 @@
         <w:keepNext/>
         <w:keepLines/>
       </w:pPr>
-      <w:bookmarkStart w:id="6" w:name="_Toc242920253"/>
+      <w:bookmarkStart w:id="6" w:name="_Toc242943751"/>
       <w:r>
         <w:t>1.5 Changes since version 1.0</w:t>
       </w:r>
@@ -5682,7 +5799,7 @@
         <w:pStyle w:val="Caption"/>
         <w:keepNext/>
       </w:pPr>
-      <w:bookmarkStart w:id="7" w:name="_Toc242920276"/>
+      <w:bookmarkStart w:id="7" w:name="_Toc242943774"/>
       <w:r>
         <w:t xml:space="preserve">Table </w:t>
       </w:r>
@@ -5724,7 +5841,7 @@
           <w:left w:w="10" w:type="dxa"/>
           <w:right w:w="10" w:type="dxa"/>
         </w:tblCellMar>
-        <w:tblLook w:val="04A0" w:firstRow="1" w:lastRow="0" w:firstColumn="1" w:lastColumn="0" w:noHBand="0" w:noVBand="1"/>
+        <w:tblLook w:val="0000" w:firstRow="0" w:lastRow="0" w:firstColumn="0" w:lastColumn="0" w:noHBand="0" w:noVBand="0"/>
       </w:tblPr>
       <w:tblGrid>
         <w:gridCol w:w="1410"/>
@@ -6606,7 +6723,7 @@
         <w:keepNext/>
         <w:keepLines/>
       </w:pPr>
-      <w:bookmarkStart w:id="8" w:name="_Toc242920254"/>
+      <w:bookmarkStart w:id="8" w:name="_Toc242943752"/>
       <w:r>
         <w:t>1.6 Changes since version 2.0</w:t>
       </w:r>
@@ -6655,7 +6772,7 @@
         <w:pStyle w:val="Caption"/>
         <w:keepNext/>
       </w:pPr>
-      <w:bookmarkStart w:id="9" w:name="_Toc242920277"/>
+      <w:bookmarkStart w:id="9" w:name="_Toc242943775"/>
       <w:r>
         <w:t xml:space="preserve">Table </w:t>
       </w:r>
@@ -6697,7 +6814,7 @@
           <w:left w:w="10" w:type="dxa"/>
           <w:right w:w="10" w:type="dxa"/>
         </w:tblCellMar>
-        <w:tblLook w:val="04A0" w:firstRow="1" w:lastRow="0" w:firstColumn="1" w:lastColumn="0" w:noHBand="0" w:noVBand="1"/>
+        <w:tblLook w:val="0000" w:firstRow="0" w:lastRow="0" w:firstColumn="0" w:lastColumn="0" w:noHBand="0" w:noVBand="0"/>
       </w:tblPr>
       <w:tblGrid>
         <w:gridCol w:w="878"/>
@@ -7201,7 +7318,7 @@
                 <w:sz w:val="19"/>
                 <w:szCs w:val="19"/>
               </w:rPr>
-              <w:t>: students admitted 2023/24, undergraduates 2024, permanent hostel places, Mahapola and Bursary recipients, graduates 2024 (provisional), each citing its table and page</w:t>
+              <w:t>: students admitted 2023/24, undergraduates 2024, permanent hostel places, graduates 2024 (provisional), each citing its table and page</w:t>
             </w:r>
           </w:p>
         </w:tc>
@@ -7431,7 +7548,7 @@
         <w:keepLines/>
         <w:pageBreakBefore/>
       </w:pPr>
-      <w:bookmarkStart w:id="10" w:name="_Toc242920255"/>
+      <w:bookmarkStart w:id="10" w:name="_Toc242943753"/>
       <w:r>
         <w:lastRenderedPageBreak/>
         <w:t>2 Business requirements</w:t>
@@ -7444,7 +7561,7 @@
         <w:keepNext/>
         <w:keepLines/>
       </w:pPr>
-      <w:bookmarkStart w:id="11" w:name="_Toc242920256"/>
+      <w:bookmarkStart w:id="11" w:name="_Toc242943754"/>
       <w:r>
         <w:t>2.1 Background</w:t>
       </w:r>
@@ -7513,7 +7630,7 @@
         <w:keepNext/>
         <w:keepLines/>
       </w:pPr>
-      <w:bookmarkStart w:id="12" w:name="_Toc242920257"/>
+      <w:bookmarkStart w:id="12" w:name="_Toc242943755"/>
       <w:r>
         <w:t>2.2 Business opportunity</w:t>
       </w:r>
@@ -7614,7 +7731,7 @@
         <w:keepNext/>
         <w:keepLines/>
       </w:pPr>
-      <w:bookmarkStart w:id="13" w:name="_Toc242920258"/>
+      <w:bookmarkStart w:id="13" w:name="_Toc242943756"/>
       <w:r>
         <w:t>2.3 Business objectives</w:t>
       </w:r>
@@ -7625,7 +7742,7 @@
         <w:pStyle w:val="Caption"/>
         <w:keepNext/>
       </w:pPr>
-      <w:bookmarkStart w:id="14" w:name="_Toc242920278"/>
+      <w:bookmarkStart w:id="14" w:name="_Toc242943776"/>
       <w:r>
         <w:t xml:space="preserve">Table </w:t>
       </w:r>
@@ -7667,7 +7784,7 @@
           <w:left w:w="10" w:type="dxa"/>
           <w:right w:w="10" w:type="dxa"/>
         </w:tblCellMar>
-        <w:tblLook w:val="04A0" w:firstRow="1" w:lastRow="0" w:firstColumn="1" w:lastColumn="0" w:noHBand="0" w:noVBand="1"/>
+        <w:tblLook w:val="0000" w:firstRow="0" w:lastRow="0" w:firstColumn="0" w:lastColumn="0" w:noHBand="0" w:noVBand="0"/>
       </w:tblPr>
       <w:tblGrid>
         <w:gridCol w:w="665"/>
@@ -8415,7 +8532,7 @@
         <w:keepNext/>
         <w:keepLines/>
       </w:pPr>
-      <w:bookmarkStart w:id="15" w:name="_Toc242920259"/>
+      <w:bookmarkStart w:id="15" w:name="_Toc242943757"/>
       <w:r>
         <w:t>2.4 Market size</w:t>
       </w:r>
@@ -8426,7 +8543,7 @@
         <w:pStyle w:val="Caption"/>
         <w:keepNext/>
       </w:pPr>
-      <w:bookmarkStart w:id="16" w:name="_Toc242920279"/>
+      <w:bookmarkStart w:id="16" w:name="_Toc242943777"/>
       <w:r>
         <w:t xml:space="preserve">Table </w:t>
       </w:r>
@@ -8468,7 +8585,7 @@
           <w:left w:w="10" w:type="dxa"/>
           <w:right w:w="10" w:type="dxa"/>
         </w:tblCellMar>
-        <w:tblLook w:val="04A0" w:firstRow="1" w:lastRow="0" w:firstColumn="1" w:lastColumn="0" w:noHBand="0" w:noVBand="1"/>
+        <w:tblLook w:val="0000" w:firstRow="0" w:lastRow="0" w:firstColumn="0" w:lastColumn="0" w:noHBand="0" w:noVBand="0"/>
       </w:tblPr>
       <w:tblGrid>
         <w:gridCol w:w="3109"/>
@@ -8907,7 +9024,7 @@
         <w:keepNext/>
         <w:keepLines/>
       </w:pPr>
-      <w:bookmarkStart w:id="17" w:name="_Toc242920260"/>
+      <w:bookmarkStart w:id="17" w:name="_Toc242943758"/>
       <w:r>
         <w:t>2.5 Success metrics</w:t>
       </w:r>
@@ -9019,7 +9136,7 @@
         <w:keepNext/>
         <w:keepLines/>
       </w:pPr>
-      <w:bookmarkStart w:id="18" w:name="_Toc242920261"/>
+      <w:bookmarkStart w:id="18" w:name="_Toc242943759"/>
       <w:r>
         <w:t>2.6 Vision statement</w:t>
       </w:r>
@@ -9101,7 +9218,7 @@
         <w:keepNext/>
         <w:keepLines/>
       </w:pPr>
-      <w:bookmarkStart w:id="19" w:name="_Toc242920262"/>
+      <w:bookmarkStart w:id="19" w:name="_Toc242943760"/>
       <w:r>
         <w:t>2.7 Business risks</w:t>
       </w:r>
@@ -9112,7 +9229,7 @@
         <w:pStyle w:val="Caption"/>
         <w:keepNext/>
       </w:pPr>
-      <w:bookmarkStart w:id="20" w:name="_Toc242920280"/>
+      <w:bookmarkStart w:id="20" w:name="_Toc242943778"/>
       <w:r>
         <w:t xml:space="preserve">Table </w:t>
       </w:r>
@@ -9154,7 +9271,7 @@
           <w:left w:w="10" w:type="dxa"/>
           <w:right w:w="10" w:type="dxa"/>
         </w:tblCellMar>
-        <w:tblLook w:val="04A0" w:firstRow="1" w:lastRow="0" w:firstColumn="1" w:lastColumn="0" w:noHBand="0" w:noVBand="1"/>
+        <w:tblLook w:val="0000" w:firstRow="0" w:lastRow="0" w:firstColumn="0" w:lastColumn="0" w:noHBand="0" w:noVBand="0"/>
       </w:tblPr>
       <w:tblGrid>
         <w:gridCol w:w="679"/>
@@ -10732,7 +10849,7 @@
         <w:keepNext/>
         <w:keepLines/>
       </w:pPr>
-      <w:bookmarkStart w:id="21" w:name="_Toc242920263"/>
+      <w:bookmarkStart w:id="21" w:name="_Toc242943761"/>
       <w:r>
         <w:t>2.8 Assumptions and dependencies</w:t>
       </w:r>
@@ -10743,7 +10860,7 @@
         <w:pStyle w:val="Caption"/>
         <w:keepNext/>
       </w:pPr>
-      <w:bookmarkStart w:id="22" w:name="_Toc242920281"/>
+      <w:bookmarkStart w:id="22" w:name="_Toc242943779"/>
       <w:r>
         <w:t xml:space="preserve">Table </w:t>
       </w:r>
@@ -10785,7 +10902,7 @@
           <w:left w:w="10" w:type="dxa"/>
           <w:right w:w="10" w:type="dxa"/>
         </w:tblCellMar>
-        <w:tblLook w:val="04A0" w:firstRow="1" w:lastRow="0" w:firstColumn="1" w:lastColumn="0" w:noHBand="0" w:noVBand="1"/>
+        <w:tblLook w:val="0000" w:firstRow="0" w:lastRow="0" w:firstColumn="0" w:lastColumn="0" w:noHBand="0" w:noVBand="0"/>
       </w:tblPr>
       <w:tblGrid>
         <w:gridCol w:w="803"/>
@@ -11387,7 +11504,7 @@
         <w:keepLines/>
         <w:pageBreakBefore/>
       </w:pPr>
-      <w:bookmarkStart w:id="23" w:name="_Toc242920264"/>
+      <w:bookmarkStart w:id="23" w:name="_Toc242943762"/>
       <w:r>
         <w:lastRenderedPageBreak/>
         <w:t>3 Scope and limitations</w:t>
@@ -11400,7 +11517,7 @@
         <w:keepNext/>
         <w:keepLines/>
       </w:pPr>
-      <w:bookmarkStart w:id="24" w:name="_Toc242920265"/>
+      <w:bookmarkStart w:id="24" w:name="_Toc242943763"/>
       <w:r>
         <w:t>3.1 Major features</w:t>
       </w:r>
@@ -11419,7 +11536,7 @@
         <w:pStyle w:val="Caption"/>
         <w:keepNext/>
       </w:pPr>
-      <w:bookmarkStart w:id="25" w:name="_Toc242920282"/>
+      <w:bookmarkStart w:id="25" w:name="_Toc242943780"/>
       <w:r>
         <w:t xml:space="preserve">Table </w:t>
       </w:r>
@@ -11461,7 +11578,7 @@
           <w:left w:w="10" w:type="dxa"/>
           <w:right w:w="10" w:type="dxa"/>
         </w:tblCellMar>
-        <w:tblLook w:val="04A0" w:firstRow="1" w:lastRow="0" w:firstColumn="1" w:lastColumn="0" w:noHBand="0" w:noVBand="1"/>
+        <w:tblLook w:val="0000" w:firstRow="0" w:lastRow="0" w:firstColumn="0" w:lastColumn="0" w:noHBand="0" w:noVBand="0"/>
       </w:tblPr>
       <w:tblGrid>
         <w:gridCol w:w="741"/>
@@ -12642,7 +12759,7 @@
         <w:keepNext/>
         <w:keepLines/>
       </w:pPr>
-      <w:bookmarkStart w:id="26" w:name="_Toc242920266"/>
+      <w:bookmarkStart w:id="26" w:name="_Toc242943764"/>
       <w:r>
         <w:t>3.2 Scope of initial and subsequent releases</w:t>
       </w:r>
@@ -12653,7 +12770,7 @@
         <w:pStyle w:val="Caption"/>
         <w:keepNext/>
       </w:pPr>
-      <w:bookmarkStart w:id="27" w:name="_Toc242920283"/>
+      <w:bookmarkStart w:id="27" w:name="_Toc242943781"/>
       <w:r>
         <w:t xml:space="preserve">Table </w:t>
       </w:r>
@@ -12695,7 +12812,7 @@
           <w:left w:w="10" w:type="dxa"/>
           <w:right w:w="10" w:type="dxa"/>
         </w:tblCellMar>
-        <w:tblLook w:val="04A0" w:firstRow="1" w:lastRow="0" w:firstColumn="1" w:lastColumn="0" w:noHBand="0" w:noVBand="1"/>
+        <w:tblLook w:val="0000" w:firstRow="0" w:lastRow="0" w:firstColumn="0" w:lastColumn="0" w:noHBand="0" w:noVBand="0"/>
       </w:tblPr>
       <w:tblGrid>
         <w:gridCol w:w="968"/>
@@ -13933,7 +14050,7 @@
           <w:noProof/>
         </w:rPr>
         <w:drawing>
-          <wp:inline distT="0" distB="0" distL="0" distR="0" wp14:anchorId="5E89B7E8" wp14:editId="5E89B7E9">
+          <wp:inline distT="0" distB="0" distL="0" distR="0" wp14:anchorId="2F04FC3F" wp14:editId="2F04FC40">
             <wp:extent cx="6124575" cy="3848100"/>
             <wp:effectExtent l="0" t="0" r="0" b="0"/>
             <wp:docPr id="1" name="system-context.png" descr="ZedPath system context (C4 model, level 1)" title="ZedPath system context (C4 model, level 1)"/>
@@ -13976,7 +14093,7 @@
       <w:pPr>
         <w:pStyle w:val="Caption"/>
       </w:pPr>
-      <w:bookmarkStart w:id="28" w:name="_Toc242920274"/>
+      <w:bookmarkStart w:id="28" w:name="_Toc242943772"/>
       <w:r>
         <w:t xml:space="preserve">Figure </w:t>
       </w:r>
@@ -14029,7 +14146,7 @@
         <w:keepNext/>
         <w:keepLines/>
       </w:pPr>
-      <w:bookmarkStart w:id="29" w:name="_Toc242920267"/>
+      <w:bookmarkStart w:id="29" w:name="_Toc242943765"/>
       <w:r>
         <w:lastRenderedPageBreak/>
         <w:t>3.3 Limitations and exclusions</w:t>
@@ -14228,7 +14345,7 @@
         <w:keepLines/>
         <w:pageBreakBefore/>
       </w:pPr>
-      <w:bookmarkStart w:id="30" w:name="_Toc242920268"/>
+      <w:bookmarkStart w:id="30" w:name="_Toc242943766"/>
       <w:r>
         <w:lastRenderedPageBreak/>
         <w:t>4 Business context</w:t>
@@ -14241,7 +14358,7 @@
         <w:keepNext/>
         <w:keepLines/>
       </w:pPr>
-      <w:bookmarkStart w:id="31" w:name="_Toc242920269"/>
+      <w:bookmarkStart w:id="31" w:name="_Toc242943767"/>
       <w:r>
         <w:t>4.1 Stakeholder profiles</w:t>
       </w:r>
@@ -14252,7 +14369,7 @@
         <w:pStyle w:val="Caption"/>
         <w:keepNext/>
       </w:pPr>
-      <w:bookmarkStart w:id="32" w:name="_Toc242920284"/>
+      <w:bookmarkStart w:id="32" w:name="_Toc242943782"/>
       <w:r>
         <w:t xml:space="preserve">Table </w:t>
       </w:r>
@@ -14294,7 +14411,7 @@
           <w:left w:w="10" w:type="dxa"/>
           <w:right w:w="10" w:type="dxa"/>
         </w:tblCellMar>
-        <w:tblLook w:val="04A0" w:firstRow="1" w:lastRow="0" w:firstColumn="1" w:lastColumn="0" w:noHBand="0" w:noVBand="1"/>
+        <w:tblLook w:val="0000" w:firstRow="0" w:lastRow="0" w:firstColumn="0" w:lastColumn="0" w:noHBand="0" w:noVBand="0"/>
       </w:tblPr>
       <w:tblGrid>
         <w:gridCol w:w="1762"/>
@@ -15391,7 +15508,7 @@
         <w:keepNext/>
         <w:keepLines/>
       </w:pPr>
-      <w:bookmarkStart w:id="33" w:name="_Toc242920270"/>
+      <w:bookmarkStart w:id="33" w:name="_Toc242943768"/>
       <w:r>
         <w:t>4.2 Project priorities</w:t>
       </w:r>
@@ -15402,7 +15519,7 @@
         <w:pStyle w:val="Caption"/>
         <w:keepNext/>
       </w:pPr>
-      <w:bookmarkStart w:id="34" w:name="_Toc242920285"/>
+      <w:bookmarkStart w:id="34" w:name="_Toc242943783"/>
       <w:r>
         <w:t xml:space="preserve">Table </w:t>
       </w:r>
@@ -15444,7 +15561,7 @@
           <w:left w:w="10" w:type="dxa"/>
           <w:right w:w="10" w:type="dxa"/>
         </w:tblCellMar>
-        <w:tblLook w:val="04A0" w:firstRow="1" w:lastRow="0" w:firstColumn="1" w:lastColumn="0" w:noHBand="0" w:noVBand="1"/>
+        <w:tblLook w:val="0000" w:firstRow="0" w:lastRow="0" w:firstColumn="0" w:lastColumn="0" w:noHBand="0" w:noVBand="0"/>
       </w:tblPr>
       <w:tblGrid>
         <w:gridCol w:w="1188"/>
@@ -16088,7 +16205,7 @@
         <w:keepNext/>
         <w:keepLines/>
       </w:pPr>
-      <w:bookmarkStart w:id="35" w:name="_Toc242920271"/>
+      <w:bookmarkStart w:id="35" w:name="_Toc242943769"/>
       <w:r>
         <w:t>4.3 Deployment considerations</w:t>
       </w:r>
@@ -16176,7 +16293,7 @@
         <w:keepLines/>
         <w:pageBreakBefore/>
       </w:pPr>
-      <w:bookmarkStart w:id="36" w:name="_Toc242920272"/>
+      <w:bookmarkStart w:id="36" w:name="_Toc242943770"/>
       <w:r>
         <w:lastRenderedPageBreak/>
         <w:t>Appendix A: Glossary</w:t>
@@ -16188,7 +16305,7 @@
         <w:pStyle w:val="Caption"/>
         <w:keepNext/>
       </w:pPr>
-      <w:bookmarkStart w:id="37" w:name="_Toc242920286"/>
+      <w:bookmarkStart w:id="37" w:name="_Toc242943784"/>
       <w:r>
         <w:t xml:space="preserve">Table </w:t>
       </w:r>
@@ -16230,7 +16347,7 @@
           <w:left w:w="10" w:type="dxa"/>
           <w:right w:w="10" w:type="dxa"/>
         </w:tblCellMar>
-        <w:tblLook w:val="04A0" w:firstRow="1" w:lastRow="0" w:firstColumn="1" w:lastColumn="0" w:noHBand="0" w:noVBand="1"/>
+        <w:tblLook w:val="0000" w:firstRow="0" w:lastRow="0" w:firstColumn="0" w:lastColumn="0" w:noHBand="0" w:noVBand="0"/>
       </w:tblPr>
       <w:tblGrid>
         <w:gridCol w:w="1843"/>
@@ -17065,7 +17182,7 @@
         <w:keepLines/>
         <w:pageBreakBefore/>
       </w:pPr>
-      <w:bookmarkStart w:id="38" w:name="_Toc242920273"/>
+      <w:bookmarkStart w:id="38" w:name="_Toc242943771"/>
       <w:r>
         <w:lastRenderedPageBreak/>
         <w:t>Appendix B: References</w:t>
@@ -17077,7 +17194,7 @@
         <w:pStyle w:val="Caption"/>
         <w:keepNext/>
       </w:pPr>
-      <w:bookmarkStart w:id="39" w:name="_Toc242920287"/>
+      <w:bookmarkStart w:id="39" w:name="_Toc242943785"/>
       <w:r>
         <w:t xml:space="preserve">Table </w:t>
       </w:r>
@@ -17119,7 +17236,7 @@
           <w:left w:w="10" w:type="dxa"/>
           <w:right w:w="10" w:type="dxa"/>
         </w:tblCellMar>
-        <w:tblLook w:val="04A0" w:firstRow="1" w:lastRow="0" w:firstColumn="1" w:lastColumn="0" w:noHBand="0" w:noVBand="1"/>
+        <w:tblLook w:val="0000" w:firstRow="0" w:lastRow="0" w:firstColumn="0" w:lastColumn="0" w:noHBand="0" w:noVBand="0"/>
       </w:tblPr>
       <w:tblGrid>
         <w:gridCol w:w="803"/>
@@ -18232,7 +18349,7 @@
         <w:sz w:val="16"/>
         <w:szCs w:val="16"/>
       </w:rPr>
-      <w:t>ZP-DOC-01  ·  v2.1 (draft)  ·  Under revision</w:t>
+      <w:t>ZP-DOC-01  ·  v2.1  ·  Approved</w:t>
     </w:r>
   </w:p>
 </w:hdr>
@@ -18241,10 +18358,10 @@
 <file path=word/numbering.xml><?xml version="1.0" encoding="utf-8"?>
 <w:numbering xmlns:wpc="http://schemas.microsoft.com/office/word/2010/wordprocessingCanvas" xmlns:cx="http://schemas.microsoft.com/office/drawing/2014/chartex" xmlns:cx1="http://schemas.microsoft.com/office/drawing/2015/9/8/chartex" xmlns:cx2="http://schemas.microsoft.com/office/drawing/2015/10/21/chartex" xmlns:cx3="http://schemas.microsoft.com/office/drawing/2016/5/9/chartex" xmlns:cx4="http://schemas.microsoft.com/office/drawing/2016/5/10/chartex" xmlns:cx5="http://schemas.microsoft.com/office/drawing/2016/5/11/chartex" xmlns:cx6="http://schemas.microsoft.com/office/drawing/2016/5/12/chartex" xmlns:cx7="http://schemas.microsoft.com/office/drawing/2016/5/13/chartex" xmlns:cx8="http://schemas.microsoft.com/office/drawing/2016/5/14/chartex" xmlns:mc="http://schemas.openxmlformats.org/markup-compatibility/2006" xmlns:aink="http://schemas.microsoft.com/office/drawing/2016/ink" xmlns:am3d="http://schemas.microsoft.com/office/drawing/2017/model3d" xmlns:o="urn:schemas-microsoft-com:office:office" xmlns:oel="http://schemas.microsoft.com/office/2019/extlst" xmlns:r="http://schemas.openxmlformats.org/officeDocument/2006/relationships" xmlns:m="http://schemas.openxmlformats.org/officeDocument/2006/math" xmlns:v="urn:schemas-microsoft-com:vml" xmlns:wp14="http://schemas.microsoft.com/office/word/2010/wordprocessingDrawing" xmlns:wp="http://schemas.openxmlformats.org/drawingml/2006/wordprocessingDrawing" xmlns:w10="urn:schemas-microsoft-com:office:word" xmlns:w="http://schemas.openxmlformats.org/wordprocessingml/2006/main" xmlns:w14="http://schemas.microsoft.com/office/word/2010/wordml" xmlns:w15="http://schemas.microsoft.com/office/word/2012/wordml" xmlns:w16cex="http://schemas.microsoft.com/office/word/2018/wordml/cex" xmlns:w16cid="http://schemas.microsoft.com/office/word/2016/wordml/cid" xmlns:w16="http://schemas.microsoft.com/office/word/2018/wordml" xmlns:w16du="http://schemas.microsoft.com/office/word/2023/wordml/word16du" xmlns:w16sdtdh="http://schemas.microsoft.com/office/word/2020/wordml/sdtdatahash" xmlns:w16sdtfl="http://schemas.microsoft.com/office/word/2024/wordml/sdtformatlock" xmlns:w16se="http://schemas.microsoft.com/office/word/2015/wordml/symex" xmlns:wpg="http://schemas.microsoft.com/office/word/2010/wordprocessingGroup" xmlns:wpi="http://schemas.microsoft.com/office/word/2010/wordprocessingInk" xmlns:wne="http://schemas.microsoft.com/office/word/2006/wordml" xmlns:wps="http://schemas.microsoft.com/office/word/2010/wordprocessingShape" mc:Ignorable="w14 w15 w16se w16cid w16 w16cex w16sdtdh w16sdtfl w16du wp14">
   <w:abstractNum w:abstractNumId="0" w15:restartNumberingAfterBreak="0">
-    <w:nsid w:val="0B9D255F"/>
+    <w:nsid w:val="6238471F"/>
     <w:multiLevelType w:val="hybridMultilevel"/>
-    <w:tmpl w:val="EFBA575C"/>
-    <w:lvl w:ilvl="0" w:tplc="C46011A8">
+    <w:tmpl w:val="58F041AA"/>
+    <w:lvl w:ilvl="0" w:tplc="A156018E">
       <w:start w:val="1"/>
       <w:numFmt w:val="decimal"/>
       <w:lvlText w:val="%1."/>
@@ -18253,7 +18370,7 @@
         <w:ind w:left="720" w:hanging="360"/>
       </w:pPr>
     </w:lvl>
-    <w:lvl w:ilvl="1" w:tplc="D602AF60" w:tentative="1">
+    <w:lvl w:ilvl="1" w:tplc="E5523A34" w:tentative="1">
       <w:start w:val="1"/>
       <w:numFmt w:val="lowerLetter"/>
       <w:lvlText w:val="%2."/>
@@ -18262,7 +18379,7 @@
         <w:ind w:left="1080" w:hanging="360"/>
       </w:pPr>
     </w:lvl>
-    <w:lvl w:ilvl="2" w:tplc="A4B67E8A" w:tentative="1">
+    <w:lvl w:ilvl="2" w:tplc="2B7CB7E6" w:tentative="1">
       <w:start w:val="1"/>
       <w:numFmt w:val="lowerRoman"/>
       <w:lvlText w:val="%3."/>
@@ -18271,104 +18388,42 @@
         <w:ind w:left="1440" w:hanging="360"/>
       </w:pPr>
     </w:lvl>
-    <w:lvl w:ilvl="3" w:tplc="FE94FB3A">
+    <w:lvl w:ilvl="3" w:tplc="7E74CDA8">
       <w:numFmt w:val="decimal"/>
       <w:lvlText w:val=""/>
       <w:lvlJc w:val="left"/>
     </w:lvl>
-    <w:lvl w:ilvl="4" w:tplc="713ED480">
+    <w:lvl w:ilvl="4" w:tplc="3A2E62BE">
       <w:numFmt w:val="decimal"/>
       <w:lvlText w:val=""/>
       <w:lvlJc w:val="left"/>
     </w:lvl>
-    <w:lvl w:ilvl="5" w:tplc="BC52189C">
+    <w:lvl w:ilvl="5" w:tplc="7888990A">
       <w:numFmt w:val="decimal"/>
       <w:lvlText w:val=""/>
       <w:lvlJc w:val="left"/>
     </w:lvl>
-    <w:lvl w:ilvl="6" w:tplc="61A8F96C">
+    <w:lvl w:ilvl="6" w:tplc="B6127FBC">
       <w:numFmt w:val="decimal"/>
       <w:lvlText w:val=""/>
       <w:lvlJc w:val="left"/>
     </w:lvl>
-    <w:lvl w:ilvl="7" w:tplc="60786D5E">
+    <w:lvl w:ilvl="7" w:tplc="BA421548">
       <w:numFmt w:val="decimal"/>
       <w:lvlText w:val=""/>
       <w:lvlJc w:val="left"/>
     </w:lvl>
-    <w:lvl w:ilvl="8" w:tplc="106A009C">
+    <w:lvl w:ilvl="8" w:tplc="ADAE586E">
       <w:numFmt w:val="decimal"/>
       <w:lvlText w:val=""/>
       <w:lvlJc w:val="left"/>
     </w:lvl>
   </w:abstractNum>
   <w:abstractNum w:abstractNumId="1" w15:restartNumberingAfterBreak="0">
-    <w:nsid w:val="249404B5"/>
+    <w:nsid w:val="6CF11AB2"/>
     <w:multiLevelType w:val="hybridMultilevel"/>
-    <w:tmpl w:val="7BF037B0"/>
-    <w:lvl w:ilvl="0" w:tplc="B6DA5CBC">
-      <w:start w:val="1"/>
-      <w:numFmt w:val="bullet"/>
-      <w:lvlText w:val="•"/>
-      <w:lvlJc w:val="left"/>
-      <w:pPr>
-        <w:ind w:left="720" w:hanging="280"/>
-      </w:pPr>
-    </w:lvl>
-    <w:lvl w:ilvl="1" w:tplc="039CB844" w:tentative="1">
-      <w:start w:val="1"/>
-      <w:numFmt w:val="bullet"/>
-      <w:lvlText w:val="–"/>
-      <w:lvlJc w:val="left"/>
-      <w:pPr>
-        <w:ind w:left="1080" w:hanging="280"/>
-      </w:pPr>
-    </w:lvl>
-    <w:lvl w:ilvl="2" w:tplc="A81A9EDA" w:tentative="1">
-      <w:start w:val="1"/>
-      <w:numFmt w:val="bullet"/>
-      <w:lvlText w:val="▪"/>
-      <w:lvlJc w:val="left"/>
-      <w:pPr>
-        <w:ind w:left="1440" w:hanging="280"/>
-      </w:pPr>
-    </w:lvl>
-    <w:lvl w:ilvl="3" w:tplc="B79A3478">
-      <w:numFmt w:val="decimal"/>
-      <w:lvlText w:val=""/>
-      <w:lvlJc w:val="left"/>
-    </w:lvl>
-    <w:lvl w:ilvl="4" w:tplc="2C9CB574">
-      <w:numFmt w:val="decimal"/>
-      <w:lvlText w:val=""/>
-      <w:lvlJc w:val="left"/>
-    </w:lvl>
-    <w:lvl w:ilvl="5" w:tplc="D5024E1C">
-      <w:numFmt w:val="decimal"/>
-      <w:lvlText w:val=""/>
-      <w:lvlJc w:val="left"/>
-    </w:lvl>
-    <w:lvl w:ilvl="6" w:tplc="01B85838">
-      <w:numFmt w:val="decimal"/>
-      <w:lvlText w:val=""/>
-      <w:lvlJc w:val="left"/>
-    </w:lvl>
-    <w:lvl w:ilvl="7" w:tplc="BFA6F18A">
-      <w:numFmt w:val="decimal"/>
-      <w:lvlText w:val=""/>
-      <w:lvlJc w:val="left"/>
-    </w:lvl>
-    <w:lvl w:ilvl="8" w:tplc="F5488D42">
-      <w:numFmt w:val="decimal"/>
-      <w:lvlText w:val=""/>
-      <w:lvlJc w:val="left"/>
-    </w:lvl>
-  </w:abstractNum>
-  <w:abstractNum w:abstractNumId="2" w15:restartNumberingAfterBreak="0">
-    <w:nsid w:val="6405549B"/>
-    <w:multiLevelType w:val="hybridMultilevel"/>
-    <w:tmpl w:val="4D5C4CEC"/>
-    <w:lvl w:ilvl="0" w:tplc="7772D8F2" w:tentative="1">
+    <w:tmpl w:val="EE26CF58"/>
+    <w:lvl w:ilvl="0" w:tplc="D798822E" w:tentative="1">
       <w:start w:val="1"/>
       <w:numFmt w:val="bullet"/>
       <w:lvlText w:val="●"/>
@@ -18377,7 +18432,7 @@
         <w:ind w:left="720" w:hanging="360"/>
       </w:pPr>
     </w:lvl>
-    <w:lvl w:ilvl="1" w:tplc="37DC678C" w:tentative="1">
+    <w:lvl w:ilvl="1" w:tplc="822446E2" w:tentative="1">
       <w:start w:val="1"/>
       <w:numFmt w:val="bullet"/>
       <w:lvlText w:val="○"/>
@@ -18386,7 +18441,7 @@
         <w:ind w:left="1440" w:hanging="360"/>
       </w:pPr>
     </w:lvl>
-    <w:lvl w:ilvl="2" w:tplc="F6B8BB0C" w:tentative="1">
+    <w:lvl w:ilvl="2" w:tplc="C1E2B146" w:tentative="1">
       <w:start w:val="1"/>
       <w:numFmt w:val="bullet"/>
       <w:lvlText w:val="■"/>
@@ -18395,7 +18450,7 @@
         <w:ind w:left="2160" w:hanging="360"/>
       </w:pPr>
     </w:lvl>
-    <w:lvl w:ilvl="3" w:tplc="65F6EE98" w:tentative="1">
+    <w:lvl w:ilvl="3" w:tplc="451CD5A0" w:tentative="1">
       <w:start w:val="1"/>
       <w:numFmt w:val="bullet"/>
       <w:lvlText w:val="●"/>
@@ -18404,7 +18459,7 @@
         <w:ind w:left="2880" w:hanging="360"/>
       </w:pPr>
     </w:lvl>
-    <w:lvl w:ilvl="4" w:tplc="DCA65316" w:tentative="1">
+    <w:lvl w:ilvl="4" w:tplc="F0FEF090" w:tentative="1">
       <w:start w:val="1"/>
       <w:numFmt w:val="bullet"/>
       <w:lvlText w:val="○"/>
@@ -18413,7 +18468,7 @@
         <w:ind w:left="3600" w:hanging="360"/>
       </w:pPr>
     </w:lvl>
-    <w:lvl w:ilvl="5" w:tplc="CA06F2C8" w:tentative="1">
+    <w:lvl w:ilvl="5" w:tplc="896670A4" w:tentative="1">
       <w:start w:val="1"/>
       <w:numFmt w:val="bullet"/>
       <w:lvlText w:val="■"/>
@@ -18422,7 +18477,7 @@
         <w:ind w:left="4320" w:hanging="360"/>
       </w:pPr>
     </w:lvl>
-    <w:lvl w:ilvl="6" w:tplc="85D4AB66" w:tentative="1">
+    <w:lvl w:ilvl="6" w:tplc="AF142F7E" w:tentative="1">
       <w:start w:val="1"/>
       <w:numFmt w:val="bullet"/>
       <w:lvlText w:val="●"/>
@@ -18431,7 +18486,7 @@
         <w:ind w:left="5040" w:hanging="360"/>
       </w:pPr>
     </w:lvl>
-    <w:lvl w:ilvl="7" w:tplc="F27879D8" w:tentative="1">
+    <w:lvl w:ilvl="7" w:tplc="50764B96" w:tentative="1">
       <w:start w:val="1"/>
       <w:numFmt w:val="bullet"/>
       <w:lvlText w:val="●"/>
@@ -18440,7 +18495,7 @@
         <w:ind w:left="5760" w:hanging="360"/>
       </w:pPr>
     </w:lvl>
-    <w:lvl w:ilvl="8" w:tplc="D0CA81BC" w:tentative="1">
+    <w:lvl w:ilvl="8" w:tplc="3E4A1E5A" w:tentative="1">
       <w:start w:val="1"/>
       <w:numFmt w:val="bullet"/>
       <w:lvlText w:val="●"/>
@@ -18450,32 +18505,94 @@
       </w:pPr>
     </w:lvl>
   </w:abstractNum>
-  <w:num w:numId="1" w16cid:durableId="1265067606">
+  <w:abstractNum w:abstractNumId="2" w15:restartNumberingAfterBreak="0">
+    <w:nsid w:val="70733781"/>
+    <w:multiLevelType w:val="hybridMultilevel"/>
+    <w:tmpl w:val="FDC8A4A8"/>
+    <w:lvl w:ilvl="0" w:tplc="404281C2">
+      <w:start w:val="1"/>
+      <w:numFmt w:val="bullet"/>
+      <w:lvlText w:val="•"/>
+      <w:lvlJc w:val="left"/>
+      <w:pPr>
+        <w:ind w:left="720" w:hanging="280"/>
+      </w:pPr>
+    </w:lvl>
+    <w:lvl w:ilvl="1" w:tplc="91481F2A" w:tentative="1">
+      <w:start w:val="1"/>
+      <w:numFmt w:val="bullet"/>
+      <w:lvlText w:val="–"/>
+      <w:lvlJc w:val="left"/>
+      <w:pPr>
+        <w:ind w:left="1080" w:hanging="280"/>
+      </w:pPr>
+    </w:lvl>
+    <w:lvl w:ilvl="2" w:tplc="D5EC6E1E" w:tentative="1">
+      <w:start w:val="1"/>
+      <w:numFmt w:val="bullet"/>
+      <w:lvlText w:val="▪"/>
+      <w:lvlJc w:val="left"/>
+      <w:pPr>
+        <w:ind w:left="1440" w:hanging="280"/>
+      </w:pPr>
+    </w:lvl>
+    <w:lvl w:ilvl="3" w:tplc="1256F4DA">
+      <w:numFmt w:val="decimal"/>
+      <w:lvlText w:val=""/>
+      <w:lvlJc w:val="left"/>
+    </w:lvl>
+    <w:lvl w:ilvl="4" w:tplc="D50487A6">
+      <w:numFmt w:val="decimal"/>
+      <w:lvlText w:val=""/>
+      <w:lvlJc w:val="left"/>
+    </w:lvl>
+    <w:lvl w:ilvl="5" w:tplc="88CA3B0C">
+      <w:numFmt w:val="decimal"/>
+      <w:lvlText w:val=""/>
+      <w:lvlJc w:val="left"/>
+    </w:lvl>
+    <w:lvl w:ilvl="6" w:tplc="91D63C1C">
+      <w:numFmt w:val="decimal"/>
+      <w:lvlText w:val=""/>
+      <w:lvlJc w:val="left"/>
+    </w:lvl>
+    <w:lvl w:ilvl="7" w:tplc="896EBD7A">
+      <w:numFmt w:val="decimal"/>
+      <w:lvlText w:val=""/>
+      <w:lvlJc w:val="left"/>
+    </w:lvl>
+    <w:lvl w:ilvl="8" w:tplc="785842DC">
+      <w:numFmt w:val="decimal"/>
+      <w:lvlText w:val=""/>
+      <w:lvlJc w:val="left"/>
+    </w:lvl>
+  </w:abstractNum>
+  <w:num w:numId="1" w16cid:durableId="986974028">
+    <w:abstractNumId w:val="1"/>
+    <w:lvlOverride w:ilvl="0">
+      <w:startOverride w:val="1"/>
+    </w:lvlOverride>
+  </w:num>
+  <w:num w:numId="2" w16cid:durableId="1994023839">
+    <w:abstractNumId w:val="0"/>
+    <w:lvlOverride w:ilvl="0">
+      <w:startOverride w:val="1"/>
+    </w:lvlOverride>
+  </w:num>
+  <w:num w:numId="3" w16cid:durableId="2083985043">
     <w:abstractNumId w:val="2"/>
     <w:lvlOverride w:ilvl="0">
       <w:startOverride w:val="1"/>
     </w:lvlOverride>
   </w:num>
-  <w:num w:numId="2" w16cid:durableId="1619989067">
-    <w:abstractNumId w:val="0"/>
+  <w:num w:numId="4" w16cid:durableId="693117616">
+    <w:abstractNumId w:val="2"/>
     <w:lvlOverride w:ilvl="0">
       <w:startOverride w:val="1"/>
     </w:lvlOverride>
   </w:num>
-  <w:num w:numId="3" w16cid:durableId="2078018539">
-    <w:abstractNumId w:val="1"/>
-    <w:lvlOverride w:ilvl="0">
-      <w:startOverride w:val="1"/>
-    </w:lvlOverride>
-  </w:num>
-  <w:num w:numId="4" w16cid:durableId="1409963813">
-    <w:abstractNumId w:val="1"/>
-    <w:lvlOverride w:ilvl="0">
-      <w:startOverride w:val="1"/>
-    </w:lvlOverride>
-  </w:num>
-  <w:num w:numId="5" w16cid:durableId="1401824263">
-    <w:abstractNumId w:val="1"/>
+  <w:num w:numId="5" w16cid:durableId="2033531064">
+    <w:abstractNumId w:val="2"/>
     <w:lvlOverride w:ilvl="0">
       <w:startOverride w:val="1"/>
     </w:lvlOverride>
@@ -19179,7 +19296,7 @@
     <w:autoRedefine/>
     <w:uiPriority w:val="39"/>
     <w:unhideWhenUsed/>
-    <w:rsid w:val="007C6D8E"/>
+    <w:rsid w:val="00B47AA2"/>
     <w:pPr>
       <w:spacing w:after="100"/>
     </w:pPr>
@@ -19191,7 +19308,7 @@
     <w:autoRedefine/>
     <w:uiPriority w:val="39"/>
     <w:unhideWhenUsed/>
-    <w:rsid w:val="007C6D8E"/>
+    <w:rsid w:val="00B47AA2"/>
     <w:pPr>
       <w:spacing w:after="100"/>
       <w:ind w:left="210"/>
@@ -19203,7 +19320,7 @@
     <w:next w:val="Normal"/>
     <w:uiPriority w:val="99"/>
     <w:unhideWhenUsed/>
-    <w:rsid w:val="007C6D8E"/>
+    <w:rsid w:val="00B47AA2"/>
   </w:style>
 </w:styles>
 </file>

</xml_diff>

<commit_message>
Docs for CR-011: ZP-DOC-01..04 2.2 (draft, awaiting approval: US-302 rewritten, FR-303/304 and BR-041/042 reworded, FR-305 withdrawn, FR-312 added); ZP-DOC-07 and 08 (TC-141, 543 passed); Test Summary Report; README; all rebuilt
Co-Authored-By: Claude Opus 5.5 (1M context) <noreply@anthropic.com>
</commit_message>
<xml_diff>
--- a/docs/01-vision-and-scope/ZP-DOC-01_Vision-and-Scope.docx
+++ b/docs/01-vision-and-scope/ZP-DOC-01_Vision-and-Scope.docx
@@ -90,7 +90,7 @@
           <w:left w:w="10" w:type="dxa"/>
           <w:right w:w="10" w:type="dxa"/>
         </w:tblCellMar>
-        <w:tblLook w:val="0000" w:firstRow="0" w:lastRow="0" w:firstColumn="0" w:lastColumn="0" w:noHBand="0" w:noVBand="0"/>
+        <w:tblLook w:val="04A0" w:firstRow="1" w:lastRow="0" w:firstColumn="1" w:lastColumn="0" w:noHBand="0" w:noVBand="1"/>
       </w:tblPr>
       <w:tblGrid>
         <w:gridCol w:w="2600"/>
@@ -157,7 +157,7 @@
                 <w:sz w:val="19"/>
                 <w:szCs w:val="19"/>
               </w:rPr>
-              <w:t>2.1</w:t>
+              <w:t>2.2</w:t>
             </w:r>
           </w:p>
         </w:tc>
@@ -223,7 +223,7 @@
                 <w:sz w:val="19"/>
                 <w:szCs w:val="19"/>
               </w:rPr>
-              <w:t>Approved</w:t>
+              <w:t>In review</w:t>
             </w:r>
           </w:p>
         </w:tc>
@@ -289,7 +289,7 @@
                 <w:sz w:val="19"/>
                 <w:szCs w:val="19"/>
               </w:rPr>
-              <w:t>15 October 2026</w:t>
+              <w:t>23 October 2026</w:t>
             </w:r>
           </w:p>
         </w:tc>
@@ -494,7 +494,7 @@
           <w:left w:w="10" w:type="dxa"/>
           <w:right w:w="10" w:type="dxa"/>
         </w:tblCellMar>
-        <w:tblLook w:val="0000" w:firstRow="0" w:lastRow="0" w:firstColumn="0" w:lastColumn="0" w:noHBand="0" w:noVBand="0"/>
+        <w:tblLook w:val="04A0" w:firstRow="1" w:lastRow="0" w:firstColumn="1" w:lastColumn="0" w:noHBand="0" w:noVBand="1"/>
       </w:tblPr>
       <w:tblGrid>
         <w:gridCol w:w="2600"/>
@@ -693,7 +693,7 @@
                 <w:sz w:val="19"/>
                 <w:szCs w:val="19"/>
               </w:rPr>
-              <w:t>2.1</w:t>
+              <w:t>2.2</w:t>
             </w:r>
           </w:p>
         </w:tc>
@@ -759,7 +759,7 @@
                 <w:sz w:val="19"/>
                 <w:szCs w:val="19"/>
               </w:rPr>
-              <w:t>Approved</w:t>
+              <w:t>In review</w:t>
             </w:r>
           </w:p>
         </w:tc>
@@ -1189,7 +1189,7 @@
           <w:left w:w="10" w:type="dxa"/>
           <w:right w:w="10" w:type="dxa"/>
         </w:tblCellMar>
-        <w:tblLook w:val="0000" w:firstRow="0" w:lastRow="0" w:firstColumn="0" w:lastColumn="0" w:noHBand="0" w:noVBand="0"/>
+        <w:tblLook w:val="04A0" w:firstRow="1" w:lastRow="0" w:firstColumn="1" w:lastColumn="0" w:noHBand="0" w:noVBand="1"/>
       </w:tblPr>
       <w:tblGrid>
         <w:gridCol w:w="964"/>
@@ -2039,6 +2039,122 @@
           </w:p>
         </w:tc>
       </w:tr>
+      <w:tr>
+        <w:tblPrEx>
+          <w:tblCellMar>
+            <w:top w:w="0" w:type="dxa"/>
+            <w:bottom w:w="0" w:type="dxa"/>
+          </w:tblCellMar>
+        </w:tblPrEx>
+        <w:trPr>
+          <w:cantSplit/>
+          <w:trHeight w:val="420"/>
+        </w:trPr>
+        <w:tc>
+          <w:tcPr>
+            <w:tcW w:w="964" w:type="dxa"/>
+            <w:tcBorders>
+              <w:top w:val="single" w:sz="4" w:space="0" w:color="C9D3D0"/>
+              <w:left w:val="single" w:sz="4" w:space="0" w:color="C9D3D0"/>
+              <w:bottom w:val="single" w:sz="4" w:space="0" w:color="C9D3D0"/>
+              <w:right w:val="single" w:sz="4" w:space="0" w:color="C9D3D0"/>
+            </w:tcBorders>
+            <w:tcMar>
+              <w:top w:w="50" w:type="dxa"/>
+              <w:left w:w="100" w:type="dxa"/>
+              <w:bottom w:w="50" w:type="dxa"/>
+              <w:right w:w="100" w:type="dxa"/>
+            </w:tcMar>
+          </w:tcPr>
+          <w:p>
+            <w:r>
+              <w:rPr>
+                <w:sz w:val="19"/>
+                <w:szCs w:val="19"/>
+              </w:rPr>
+              <w:t>2.2 (draft)</w:t>
+            </w:r>
+          </w:p>
+        </w:tc>
+        <w:tc>
+          <w:tcPr>
+            <w:tcW w:w="1542" w:type="dxa"/>
+            <w:tcBorders>
+              <w:top w:val="single" w:sz="4" w:space="0" w:color="C9D3D0"/>
+              <w:left w:val="single" w:sz="4" w:space="0" w:color="C9D3D0"/>
+              <w:bottom w:val="single" w:sz="4" w:space="0" w:color="C9D3D0"/>
+              <w:right w:val="single" w:sz="4" w:space="0" w:color="C9D3D0"/>
+            </w:tcBorders>
+            <w:tcMar>
+              <w:top w:w="50" w:type="dxa"/>
+              <w:left w:w="100" w:type="dxa"/>
+              <w:bottom w:w="50" w:type="dxa"/>
+              <w:right w:w="100" w:type="dxa"/>
+            </w:tcMar>
+          </w:tcPr>
+          <w:p>
+            <w:r>
+              <w:rPr>
+                <w:sz w:val="19"/>
+                <w:szCs w:val="19"/>
+              </w:rPr>
+              <w:t>23 Oct 2026</w:t>
+            </w:r>
+          </w:p>
+        </w:tc>
+        <w:tc>
+          <w:tcPr>
+            <w:tcW w:w="1928" w:type="dxa"/>
+            <w:tcBorders>
+              <w:top w:val="single" w:sz="4" w:space="0" w:color="C9D3D0"/>
+              <w:left w:val="single" w:sz="4" w:space="0" w:color="C9D3D0"/>
+              <w:bottom w:val="single" w:sz="4" w:space="0" w:color="C9D3D0"/>
+              <w:right w:val="single" w:sz="4" w:space="0" w:color="C9D3D0"/>
+            </w:tcBorders>
+            <w:tcMar>
+              <w:top w:w="50" w:type="dxa"/>
+              <w:left w:w="100" w:type="dxa"/>
+              <w:bottom w:w="50" w:type="dxa"/>
+              <w:right w:w="100" w:type="dxa"/>
+            </w:tcMar>
+          </w:tcPr>
+          <w:p>
+            <w:r>
+              <w:rPr>
+                <w:sz w:val="19"/>
+                <w:szCs w:val="19"/>
+              </w:rPr>
+              <w:t>Team Kestrel</w:t>
+            </w:r>
+          </w:p>
+        </w:tc>
+        <w:tc>
+          <w:tcPr>
+            <w:tcW w:w="5204" w:type="dxa"/>
+            <w:tcBorders>
+              <w:top w:val="single" w:sz="4" w:space="0" w:color="C9D3D0"/>
+              <w:left w:val="single" w:sz="4" w:space="0" w:color="C9D3D0"/>
+              <w:bottom w:val="single" w:sz="4" w:space="0" w:color="C9D3D0"/>
+              <w:right w:val="single" w:sz="4" w:space="0" w:color="C9D3D0"/>
+            </w:tcBorders>
+            <w:tcMar>
+              <w:top w:w="50" w:type="dxa"/>
+              <w:left w:w="100" w:type="dxa"/>
+              <w:bottom w:w="50" w:type="dxa"/>
+              <w:right w:w="100" w:type="dxa"/>
+            </w:tcMar>
+          </w:tcPr>
+          <w:p>
+            <w:r>
+              <w:rPr>
+                <w:sz w:val="19"/>
+                <w:szCs w:val="19"/>
+              </w:rPr>
+              <w:t>Under revision for CR-011 (preference-list guidance follows the UGC handbook); awaiting approval</w:t>
+            </w:r>
+          </w:p>
+        </w:tc>
+      </w:tr>
     </w:tbl>
     <w:p>
       <w:pPr>
@@ -2081,7 +2197,7 @@
           <w:left w:w="10" w:type="dxa"/>
           <w:right w:w="10" w:type="dxa"/>
         </w:tblCellMar>
-        <w:tblLook w:val="0000" w:firstRow="0" w:lastRow="0" w:firstColumn="0" w:lastColumn="0" w:noHBand="0" w:noVBand="0"/>
+        <w:tblLook w:val="04A0" w:firstRow="1" w:lastRow="0" w:firstColumn="1" w:lastColumn="0" w:noHBand="0" w:noVBand="1"/>
       </w:tblPr>
       <w:tblGrid>
         <w:gridCol w:w="2120"/>
@@ -2454,7 +2570,7 @@
     <w:sdt>
       <w:sdtPr>
         <w:alias w:val="Contents"/>
-        <w:id w:val="104314423"/>
+        <w:id w:val="803580567"/>
       </w:sdtPr>
       <w:sdtEndPr/>
       <w:sdtContent>
@@ -2483,7 +2599,7 @@
           <w:r>
             <w:fldChar w:fldCharType="separate"/>
           </w:r>
-          <w:hyperlink w:anchor="_Toc242943746" w:history="1">
+          <w:hyperlink w:anchor="_Toc243647754" w:history="1">
             <w:r>
               <w:rPr>
                 <w:rStyle w:val="Hyperlink"/>
@@ -2507,7 +2623,7 @@
               <w:rPr>
                 <w:noProof/>
               </w:rPr>
-              <w:instrText xml:space="preserve"> PAGEREF _Toc242943746 \h </w:instrText>
+              <w:instrText xml:space="preserve"> PAGEREF _Toc243647754 \h </w:instrText>
             </w:r>
             <w:r>
               <w:rPr>
@@ -2550,7 +2666,7 @@
               <w14:ligatures w14:val="standardContextual"/>
             </w:rPr>
           </w:pPr>
-          <w:hyperlink w:anchor="_Toc242943747" w:history="1">
+          <w:hyperlink w:anchor="_Toc243647755" w:history="1">
             <w:r>
               <w:rPr>
                 <w:rStyle w:val="Hyperlink"/>
@@ -2574,7 +2690,7 @@
               <w:rPr>
                 <w:noProof/>
               </w:rPr>
-              <w:instrText xml:space="preserve"> PAGEREF _Toc242943747 \h </w:instrText>
+              <w:instrText xml:space="preserve"> PAGEREF _Toc243647755 \h </w:instrText>
             </w:r>
             <w:r>
               <w:rPr>
@@ -2617,7 +2733,7 @@
               <w14:ligatures w14:val="standardContextual"/>
             </w:rPr>
           </w:pPr>
-          <w:hyperlink w:anchor="_Toc242943748" w:history="1">
+          <w:hyperlink w:anchor="_Toc243647756" w:history="1">
             <w:r>
               <w:rPr>
                 <w:rStyle w:val="Hyperlink"/>
@@ -2641,7 +2757,7 @@
               <w:rPr>
                 <w:noProof/>
               </w:rPr>
-              <w:instrText xml:space="preserve"> PAGEREF _Toc242943748 \h </w:instrText>
+              <w:instrText xml:space="preserve"> PAGEREF _Toc243647756 \h </w:instrText>
             </w:r>
             <w:r>
               <w:rPr>
@@ -2684,7 +2800,7 @@
               <w14:ligatures w14:val="standardContextual"/>
             </w:rPr>
           </w:pPr>
-          <w:hyperlink w:anchor="_Toc242943749" w:history="1">
+          <w:hyperlink w:anchor="_Toc243647757" w:history="1">
             <w:r>
               <w:rPr>
                 <w:rStyle w:val="Hyperlink"/>
@@ -2708,7 +2824,7 @@
               <w:rPr>
                 <w:noProof/>
               </w:rPr>
-              <w:instrText xml:space="preserve"> PAGEREF _Toc242943749 \h </w:instrText>
+              <w:instrText xml:space="preserve"> PAGEREF _Toc243647757 \h </w:instrText>
             </w:r>
             <w:r>
               <w:rPr>
@@ -2751,7 +2867,7 @@
               <w14:ligatures w14:val="standardContextual"/>
             </w:rPr>
           </w:pPr>
-          <w:hyperlink w:anchor="_Toc242943750" w:history="1">
+          <w:hyperlink w:anchor="_Toc243647758" w:history="1">
             <w:r>
               <w:rPr>
                 <w:rStyle w:val="Hyperlink"/>
@@ -2775,7 +2891,7 @@
               <w:rPr>
                 <w:noProof/>
               </w:rPr>
-              <w:instrText xml:space="preserve"> PAGEREF _Toc242943750 \h </w:instrText>
+              <w:instrText xml:space="preserve"> PAGEREF _Toc243647758 \h </w:instrText>
             </w:r>
             <w:r>
               <w:rPr>
@@ -2818,7 +2934,7 @@
               <w14:ligatures w14:val="standardContextual"/>
             </w:rPr>
           </w:pPr>
-          <w:hyperlink w:anchor="_Toc242943751" w:history="1">
+          <w:hyperlink w:anchor="_Toc243647759" w:history="1">
             <w:r>
               <w:rPr>
                 <w:rStyle w:val="Hyperlink"/>
@@ -2842,7 +2958,7 @@
               <w:rPr>
                 <w:noProof/>
               </w:rPr>
-              <w:instrText xml:space="preserve"> PAGEREF _Toc242943751 \h </w:instrText>
+              <w:instrText xml:space="preserve"> PAGEREF _Toc243647759 \h </w:instrText>
             </w:r>
             <w:r>
               <w:rPr>
@@ -2885,7 +3001,7 @@
               <w14:ligatures w14:val="standardContextual"/>
             </w:rPr>
           </w:pPr>
-          <w:hyperlink w:anchor="_Toc242943752" w:history="1">
+          <w:hyperlink w:anchor="_Toc243647760" w:history="1">
             <w:r>
               <w:rPr>
                 <w:rStyle w:val="Hyperlink"/>
@@ -2909,7 +3025,7 @@
               <w:rPr>
                 <w:noProof/>
               </w:rPr>
-              <w:instrText xml:space="preserve"> PAGEREF _Toc242943752 \h </w:instrText>
+              <w:instrText xml:space="preserve"> PAGEREF _Toc243647760 \h </w:instrText>
             </w:r>
             <w:r>
               <w:rPr>
@@ -2952,7 +3068,7 @@
               <w14:ligatures w14:val="standardContextual"/>
             </w:rPr>
           </w:pPr>
-          <w:hyperlink w:anchor="_Toc242943753" w:history="1">
+          <w:hyperlink w:anchor="_Toc243647761" w:history="1">
             <w:r>
               <w:rPr>
                 <w:rStyle w:val="Hyperlink"/>
@@ -2976,7 +3092,7 @@
               <w:rPr>
                 <w:noProof/>
               </w:rPr>
-              <w:instrText xml:space="preserve"> PAGEREF _Toc242943753 \h </w:instrText>
+              <w:instrText xml:space="preserve"> PAGEREF _Toc243647761 \h </w:instrText>
             </w:r>
             <w:r>
               <w:rPr>
@@ -3019,7 +3135,7 @@
               <w14:ligatures w14:val="standardContextual"/>
             </w:rPr>
           </w:pPr>
-          <w:hyperlink w:anchor="_Toc242943754" w:history="1">
+          <w:hyperlink w:anchor="_Toc243647762" w:history="1">
             <w:r>
               <w:rPr>
                 <w:rStyle w:val="Hyperlink"/>
@@ -3043,7 +3159,7 @@
               <w:rPr>
                 <w:noProof/>
               </w:rPr>
-              <w:instrText xml:space="preserve"> PAGEREF _Toc242943754 \h </w:instrText>
+              <w:instrText xml:space="preserve"> PAGEREF _Toc243647762 \h </w:instrText>
             </w:r>
             <w:r>
               <w:rPr>
@@ -3086,7 +3202,7 @@
               <w14:ligatures w14:val="standardContextual"/>
             </w:rPr>
           </w:pPr>
-          <w:hyperlink w:anchor="_Toc242943755" w:history="1">
+          <w:hyperlink w:anchor="_Toc243647763" w:history="1">
             <w:r>
               <w:rPr>
                 <w:rStyle w:val="Hyperlink"/>
@@ -3110,7 +3226,7 @@
               <w:rPr>
                 <w:noProof/>
               </w:rPr>
-              <w:instrText xml:space="preserve"> PAGEREF _Toc242943755 \h </w:instrText>
+              <w:instrText xml:space="preserve"> PAGEREF _Toc243647763 \h </w:instrText>
             </w:r>
             <w:r>
               <w:rPr>
@@ -3153,7 +3269,7 @@
               <w14:ligatures w14:val="standardContextual"/>
             </w:rPr>
           </w:pPr>
-          <w:hyperlink w:anchor="_Toc242943756" w:history="1">
+          <w:hyperlink w:anchor="_Toc243647764" w:history="1">
             <w:r>
               <w:rPr>
                 <w:rStyle w:val="Hyperlink"/>
@@ -3177,7 +3293,7 @@
               <w:rPr>
                 <w:noProof/>
               </w:rPr>
-              <w:instrText xml:space="preserve"> PAGEREF _Toc242943756 \h </w:instrText>
+              <w:instrText xml:space="preserve"> PAGEREF _Toc243647764 \h </w:instrText>
             </w:r>
             <w:r>
               <w:rPr>
@@ -3220,7 +3336,7 @@
               <w14:ligatures w14:val="standardContextual"/>
             </w:rPr>
           </w:pPr>
-          <w:hyperlink w:anchor="_Toc242943757" w:history="1">
+          <w:hyperlink w:anchor="_Toc243647765" w:history="1">
             <w:r>
               <w:rPr>
                 <w:rStyle w:val="Hyperlink"/>
@@ -3244,7 +3360,7 @@
               <w:rPr>
                 <w:noProof/>
               </w:rPr>
-              <w:instrText xml:space="preserve"> PAGEREF _Toc242943757 \h </w:instrText>
+              <w:instrText xml:space="preserve"> PAGEREF _Toc243647765 \h </w:instrText>
             </w:r>
             <w:r>
               <w:rPr>
@@ -3287,7 +3403,7 @@
               <w14:ligatures w14:val="standardContextual"/>
             </w:rPr>
           </w:pPr>
-          <w:hyperlink w:anchor="_Toc242943758" w:history="1">
+          <w:hyperlink w:anchor="_Toc243647766" w:history="1">
             <w:r>
               <w:rPr>
                 <w:rStyle w:val="Hyperlink"/>
@@ -3311,7 +3427,7 @@
               <w:rPr>
                 <w:noProof/>
               </w:rPr>
-              <w:instrText xml:space="preserve"> PAGEREF _Toc242943758 \h </w:instrText>
+              <w:instrText xml:space="preserve"> PAGEREF _Toc243647766 \h </w:instrText>
             </w:r>
             <w:r>
               <w:rPr>
@@ -3354,7 +3470,7 @@
               <w14:ligatures w14:val="standardContextual"/>
             </w:rPr>
           </w:pPr>
-          <w:hyperlink w:anchor="_Toc242943759" w:history="1">
+          <w:hyperlink w:anchor="_Toc243647767" w:history="1">
             <w:r>
               <w:rPr>
                 <w:rStyle w:val="Hyperlink"/>
@@ -3378,7 +3494,7 @@
               <w:rPr>
                 <w:noProof/>
               </w:rPr>
-              <w:instrText xml:space="preserve"> PAGEREF _Toc242943759 \h </w:instrText>
+              <w:instrText xml:space="preserve"> PAGEREF _Toc243647767 \h </w:instrText>
             </w:r>
             <w:r>
               <w:rPr>
@@ -3421,7 +3537,7 @@
               <w14:ligatures w14:val="standardContextual"/>
             </w:rPr>
           </w:pPr>
-          <w:hyperlink w:anchor="_Toc242943760" w:history="1">
+          <w:hyperlink w:anchor="_Toc243647768" w:history="1">
             <w:r>
               <w:rPr>
                 <w:rStyle w:val="Hyperlink"/>
@@ -3445,7 +3561,7 @@
               <w:rPr>
                 <w:noProof/>
               </w:rPr>
-              <w:instrText xml:space="preserve"> PAGEREF _Toc242943760 \h </w:instrText>
+              <w:instrText xml:space="preserve"> PAGEREF _Toc243647768 \h </w:instrText>
             </w:r>
             <w:r>
               <w:rPr>
@@ -3488,7 +3604,7 @@
               <w14:ligatures w14:val="standardContextual"/>
             </w:rPr>
           </w:pPr>
-          <w:hyperlink w:anchor="_Toc242943761" w:history="1">
+          <w:hyperlink w:anchor="_Toc243647769" w:history="1">
             <w:r>
               <w:rPr>
                 <w:rStyle w:val="Hyperlink"/>
@@ -3512,7 +3628,7 @@
               <w:rPr>
                 <w:noProof/>
               </w:rPr>
-              <w:instrText xml:space="preserve"> PAGEREF _Toc242943761 \h </w:instrText>
+              <w:instrText xml:space="preserve"> PAGEREF _Toc243647769 \h </w:instrText>
             </w:r>
             <w:r>
               <w:rPr>
@@ -3555,7 +3671,7 @@
               <w14:ligatures w14:val="standardContextual"/>
             </w:rPr>
           </w:pPr>
-          <w:hyperlink w:anchor="_Toc242943762" w:history="1">
+          <w:hyperlink w:anchor="_Toc243647770" w:history="1">
             <w:r>
               <w:rPr>
                 <w:rStyle w:val="Hyperlink"/>
@@ -3579,7 +3695,7 @@
               <w:rPr>
                 <w:noProof/>
               </w:rPr>
-              <w:instrText xml:space="preserve"> PAGEREF _Toc242943762 \h </w:instrText>
+              <w:instrText xml:space="preserve"> PAGEREF _Toc243647770 \h </w:instrText>
             </w:r>
             <w:r>
               <w:rPr>
@@ -3622,7 +3738,7 @@
               <w14:ligatures w14:val="standardContextual"/>
             </w:rPr>
           </w:pPr>
-          <w:hyperlink w:anchor="_Toc242943763" w:history="1">
+          <w:hyperlink w:anchor="_Toc243647771" w:history="1">
             <w:r>
               <w:rPr>
                 <w:rStyle w:val="Hyperlink"/>
@@ -3646,7 +3762,7 @@
               <w:rPr>
                 <w:noProof/>
               </w:rPr>
-              <w:instrText xml:space="preserve"> PAGEREF _Toc242943763 \h </w:instrText>
+              <w:instrText xml:space="preserve"> PAGEREF _Toc243647771 \h </w:instrText>
             </w:r>
             <w:r>
               <w:rPr>
@@ -3689,7 +3805,7 @@
               <w14:ligatures w14:val="standardContextual"/>
             </w:rPr>
           </w:pPr>
-          <w:hyperlink w:anchor="_Toc242943764" w:history="1">
+          <w:hyperlink w:anchor="_Toc243647772" w:history="1">
             <w:r>
               <w:rPr>
                 <w:rStyle w:val="Hyperlink"/>
@@ -3713,7 +3829,7 @@
               <w:rPr>
                 <w:noProof/>
               </w:rPr>
-              <w:instrText xml:space="preserve"> PAGEREF _Toc242943764 \h </w:instrText>
+              <w:instrText xml:space="preserve"> PAGEREF _Toc243647772 \h </w:instrText>
             </w:r>
             <w:r>
               <w:rPr>
@@ -3756,7 +3872,7 @@
               <w14:ligatures w14:val="standardContextual"/>
             </w:rPr>
           </w:pPr>
-          <w:hyperlink w:anchor="_Toc242943765" w:history="1">
+          <w:hyperlink w:anchor="_Toc243647773" w:history="1">
             <w:r>
               <w:rPr>
                 <w:rStyle w:val="Hyperlink"/>
@@ -3780,7 +3896,7 @@
               <w:rPr>
                 <w:noProof/>
               </w:rPr>
-              <w:instrText xml:space="preserve"> PAGEREF _Toc242943765 \h </w:instrText>
+              <w:instrText xml:space="preserve"> PAGEREF _Toc243647773 \h </w:instrText>
             </w:r>
             <w:r>
               <w:rPr>
@@ -3823,7 +3939,7 @@
               <w14:ligatures w14:val="standardContextual"/>
             </w:rPr>
           </w:pPr>
-          <w:hyperlink w:anchor="_Toc242943766" w:history="1">
+          <w:hyperlink w:anchor="_Toc243647774" w:history="1">
             <w:r>
               <w:rPr>
                 <w:rStyle w:val="Hyperlink"/>
@@ -3847,7 +3963,7 @@
               <w:rPr>
                 <w:noProof/>
               </w:rPr>
-              <w:instrText xml:space="preserve"> PAGEREF _Toc242943766 \h </w:instrText>
+              <w:instrText xml:space="preserve"> PAGEREF _Toc243647774 \h </w:instrText>
             </w:r>
             <w:r>
               <w:rPr>
@@ -3890,7 +4006,7 @@
               <w14:ligatures w14:val="standardContextual"/>
             </w:rPr>
           </w:pPr>
-          <w:hyperlink w:anchor="_Toc242943767" w:history="1">
+          <w:hyperlink w:anchor="_Toc243647775" w:history="1">
             <w:r>
               <w:rPr>
                 <w:rStyle w:val="Hyperlink"/>
@@ -3914,7 +4030,7 @@
               <w:rPr>
                 <w:noProof/>
               </w:rPr>
-              <w:instrText xml:space="preserve"> PAGEREF _Toc242943767 \h </w:instrText>
+              <w:instrText xml:space="preserve"> PAGEREF _Toc243647775 \h </w:instrText>
             </w:r>
             <w:r>
               <w:rPr>
@@ -3957,7 +4073,7 @@
               <w14:ligatures w14:val="standardContextual"/>
             </w:rPr>
           </w:pPr>
-          <w:hyperlink w:anchor="_Toc242943768" w:history="1">
+          <w:hyperlink w:anchor="_Toc243647776" w:history="1">
             <w:r>
               <w:rPr>
                 <w:rStyle w:val="Hyperlink"/>
@@ -3981,7 +4097,7 @@
               <w:rPr>
                 <w:noProof/>
               </w:rPr>
-              <w:instrText xml:space="preserve"> PAGEREF _Toc242943768 \h </w:instrText>
+              <w:instrText xml:space="preserve"> PAGEREF _Toc243647776 \h </w:instrText>
             </w:r>
             <w:r>
               <w:rPr>
@@ -4024,7 +4140,7 @@
               <w14:ligatures w14:val="standardContextual"/>
             </w:rPr>
           </w:pPr>
-          <w:hyperlink w:anchor="_Toc242943769" w:history="1">
+          <w:hyperlink w:anchor="_Toc243647777" w:history="1">
             <w:r>
               <w:rPr>
                 <w:rStyle w:val="Hyperlink"/>
@@ -4048,7 +4164,7 @@
               <w:rPr>
                 <w:noProof/>
               </w:rPr>
-              <w:instrText xml:space="preserve"> PAGEREF _Toc242943769 \h </w:instrText>
+              <w:instrText xml:space="preserve"> PAGEREF _Toc243647777 \h </w:instrText>
             </w:r>
             <w:r>
               <w:rPr>
@@ -4091,7 +4207,7 @@
               <w14:ligatures w14:val="standardContextual"/>
             </w:rPr>
           </w:pPr>
-          <w:hyperlink w:anchor="_Toc242943770" w:history="1">
+          <w:hyperlink w:anchor="_Toc243647778" w:history="1">
             <w:r>
               <w:rPr>
                 <w:rStyle w:val="Hyperlink"/>
@@ -4115,7 +4231,7 @@
               <w:rPr>
                 <w:noProof/>
               </w:rPr>
-              <w:instrText xml:space="preserve"> PAGEREF _Toc242943770 \h </w:instrText>
+              <w:instrText xml:space="preserve"> PAGEREF _Toc243647778 \h </w:instrText>
             </w:r>
             <w:r>
               <w:rPr>
@@ -4158,7 +4274,7 @@
               <w14:ligatures w14:val="standardContextual"/>
             </w:rPr>
           </w:pPr>
-          <w:hyperlink w:anchor="_Toc242943771" w:history="1">
+          <w:hyperlink w:anchor="_Toc243647779" w:history="1">
             <w:r>
               <w:rPr>
                 <w:rStyle w:val="Hyperlink"/>
@@ -4182,7 +4298,7 @@
               <w:rPr>
                 <w:noProof/>
               </w:rPr>
-              <w:instrText xml:space="preserve"> PAGEREF _Toc242943771 \h </w:instrText>
+              <w:instrText xml:space="preserve"> PAGEREF _Toc243647779 \h </w:instrText>
             </w:r>
             <w:r>
               <w:rPr>
@@ -4228,7 +4344,7 @@
     <w:sdt>
       <w:sdtPr>
         <w:alias w:val="Figures"/>
-        <w:id w:val="-1196623515"/>
+        <w:id w:val="-894895529"/>
       </w:sdtPr>
       <w:sdtEndPr/>
       <w:sdtContent>
@@ -4257,7 +4373,7 @@
           <w:r>
             <w:fldChar w:fldCharType="separate"/>
           </w:r>
-          <w:hyperlink w:anchor="_Toc242943772" w:history="1">
+          <w:hyperlink w:anchor="_Toc243647780" w:history="1">
             <w:r>
               <w:rPr>
                 <w:rStyle w:val="Hyperlink"/>
@@ -4281,7 +4397,7 @@
               <w:rPr>
                 <w:noProof/>
               </w:rPr>
-              <w:instrText xml:space="preserve"> PAGEREF _Toc242943772 \h </w:instrText>
+              <w:instrText xml:space="preserve"> PAGEREF _Toc243647780 \h </w:instrText>
             </w:r>
             <w:r>
               <w:rPr>
@@ -4327,7 +4443,7 @@
     <w:sdt>
       <w:sdtPr>
         <w:alias w:val="Tables"/>
-        <w:id w:val="-107664045"/>
+        <w:id w:val="1258176515"/>
       </w:sdtPr>
       <w:sdtEndPr/>
       <w:sdtContent>
@@ -4356,7 +4472,7 @@
           <w:r>
             <w:fldChar w:fldCharType="separate"/>
           </w:r>
-          <w:hyperlink w:anchor="_Toc242943773" w:history="1">
+          <w:hyperlink w:anchor="_Toc243647781" w:history="1">
             <w:r>
               <w:rPr>
                 <w:rStyle w:val="Hyperlink"/>
@@ -4380,7 +4496,7 @@
               <w:rPr>
                 <w:noProof/>
               </w:rPr>
-              <w:instrText xml:space="preserve"> PAGEREF _Toc242943773 \h </w:instrText>
+              <w:instrText xml:space="preserve"> PAGEREF _Toc243647781 \h </w:instrText>
             </w:r>
             <w:r>
               <w:rPr>
@@ -4423,7 +4539,7 @@
               <w14:ligatures w14:val="standardContextual"/>
             </w:rPr>
           </w:pPr>
-          <w:hyperlink w:anchor="_Toc242943774" w:history="1">
+          <w:hyperlink w:anchor="_Toc243647782" w:history="1">
             <w:r>
               <w:rPr>
                 <w:rStyle w:val="Hyperlink"/>
@@ -4447,7 +4563,7 @@
               <w:rPr>
                 <w:noProof/>
               </w:rPr>
-              <w:instrText xml:space="preserve"> PAGEREF _Toc242943774 \h </w:instrText>
+              <w:instrText xml:space="preserve"> PAGEREF _Toc243647782 \h </w:instrText>
             </w:r>
             <w:r>
               <w:rPr>
@@ -4490,7 +4606,7 @@
               <w14:ligatures w14:val="standardContextual"/>
             </w:rPr>
           </w:pPr>
-          <w:hyperlink w:anchor="_Toc242943775" w:history="1">
+          <w:hyperlink w:anchor="_Toc243647783" w:history="1">
             <w:r>
               <w:rPr>
                 <w:rStyle w:val="Hyperlink"/>
@@ -4514,7 +4630,7 @@
               <w:rPr>
                 <w:noProof/>
               </w:rPr>
-              <w:instrText xml:space="preserve"> PAGEREF _Toc242943775 \h </w:instrText>
+              <w:instrText xml:space="preserve"> PAGEREF _Toc243647783 \h </w:instrText>
             </w:r>
             <w:r>
               <w:rPr>
@@ -4557,7 +4673,7 @@
               <w14:ligatures w14:val="standardContextual"/>
             </w:rPr>
           </w:pPr>
-          <w:hyperlink w:anchor="_Toc242943776" w:history="1">
+          <w:hyperlink w:anchor="_Toc243647784" w:history="1">
             <w:r>
               <w:rPr>
                 <w:rStyle w:val="Hyperlink"/>
@@ -4581,7 +4697,7 @@
               <w:rPr>
                 <w:noProof/>
               </w:rPr>
-              <w:instrText xml:space="preserve"> PAGEREF _Toc242943776 \h </w:instrText>
+              <w:instrText xml:space="preserve"> PAGEREF _Toc243647784 \h </w:instrText>
             </w:r>
             <w:r>
               <w:rPr>
@@ -4624,7 +4740,7 @@
               <w14:ligatures w14:val="standardContextual"/>
             </w:rPr>
           </w:pPr>
-          <w:hyperlink w:anchor="_Toc242943777" w:history="1">
+          <w:hyperlink w:anchor="_Toc243647785" w:history="1">
             <w:r>
               <w:rPr>
                 <w:rStyle w:val="Hyperlink"/>
@@ -4648,7 +4764,7 @@
               <w:rPr>
                 <w:noProof/>
               </w:rPr>
-              <w:instrText xml:space="preserve"> PAGEREF _Toc242943777 \h </w:instrText>
+              <w:instrText xml:space="preserve"> PAGEREF _Toc243647785 \h </w:instrText>
             </w:r>
             <w:r>
               <w:rPr>
@@ -4691,7 +4807,7 @@
               <w14:ligatures w14:val="standardContextual"/>
             </w:rPr>
           </w:pPr>
-          <w:hyperlink w:anchor="_Toc242943778" w:history="1">
+          <w:hyperlink w:anchor="_Toc243647786" w:history="1">
             <w:r>
               <w:rPr>
                 <w:rStyle w:val="Hyperlink"/>
@@ -4715,7 +4831,7 @@
               <w:rPr>
                 <w:noProof/>
               </w:rPr>
-              <w:instrText xml:space="preserve"> PAGEREF _Toc242943778 \h </w:instrText>
+              <w:instrText xml:space="preserve"> PAGEREF _Toc243647786 \h </w:instrText>
             </w:r>
             <w:r>
               <w:rPr>
@@ -4758,7 +4874,7 @@
               <w14:ligatures w14:val="standardContextual"/>
             </w:rPr>
           </w:pPr>
-          <w:hyperlink w:anchor="_Toc242943779" w:history="1">
+          <w:hyperlink w:anchor="_Toc243647787" w:history="1">
             <w:r>
               <w:rPr>
                 <w:rStyle w:val="Hyperlink"/>
@@ -4782,7 +4898,7 @@
               <w:rPr>
                 <w:noProof/>
               </w:rPr>
-              <w:instrText xml:space="preserve"> PAGEREF _Toc242943779 \h </w:instrText>
+              <w:instrText xml:space="preserve"> PAGEREF _Toc243647787 \h </w:instrText>
             </w:r>
             <w:r>
               <w:rPr>
@@ -4825,7 +4941,7 @@
               <w14:ligatures w14:val="standardContextual"/>
             </w:rPr>
           </w:pPr>
-          <w:hyperlink w:anchor="_Toc242943780" w:history="1">
+          <w:hyperlink w:anchor="_Toc243647788" w:history="1">
             <w:r>
               <w:rPr>
                 <w:rStyle w:val="Hyperlink"/>
@@ -4849,7 +4965,7 @@
               <w:rPr>
                 <w:noProof/>
               </w:rPr>
-              <w:instrText xml:space="preserve"> PAGEREF _Toc242943780 \h </w:instrText>
+              <w:instrText xml:space="preserve"> PAGEREF _Toc243647788 \h </w:instrText>
             </w:r>
             <w:r>
               <w:rPr>
@@ -4892,7 +5008,7 @@
               <w14:ligatures w14:val="standardContextual"/>
             </w:rPr>
           </w:pPr>
-          <w:hyperlink w:anchor="_Toc242943781" w:history="1">
+          <w:hyperlink w:anchor="_Toc243647789" w:history="1">
             <w:r>
               <w:rPr>
                 <w:rStyle w:val="Hyperlink"/>
@@ -4916,7 +5032,7 @@
               <w:rPr>
                 <w:noProof/>
               </w:rPr>
-              <w:instrText xml:space="preserve"> PAGEREF _Toc242943781 \h </w:instrText>
+              <w:instrText xml:space="preserve"> PAGEREF _Toc243647789 \h </w:instrText>
             </w:r>
             <w:r>
               <w:rPr>
@@ -4959,7 +5075,7 @@
               <w14:ligatures w14:val="standardContextual"/>
             </w:rPr>
           </w:pPr>
-          <w:hyperlink w:anchor="_Toc242943782" w:history="1">
+          <w:hyperlink w:anchor="_Toc243647790" w:history="1">
             <w:r>
               <w:rPr>
                 <w:rStyle w:val="Hyperlink"/>
@@ -4983,7 +5099,7 @@
               <w:rPr>
                 <w:noProof/>
               </w:rPr>
-              <w:instrText xml:space="preserve"> PAGEREF _Toc242943782 \h </w:instrText>
+              <w:instrText xml:space="preserve"> PAGEREF _Toc243647790 \h </w:instrText>
             </w:r>
             <w:r>
               <w:rPr>
@@ -5026,7 +5142,7 @@
               <w14:ligatures w14:val="standardContextual"/>
             </w:rPr>
           </w:pPr>
-          <w:hyperlink w:anchor="_Toc242943783" w:history="1">
+          <w:hyperlink w:anchor="_Toc243647791" w:history="1">
             <w:r>
               <w:rPr>
                 <w:rStyle w:val="Hyperlink"/>
@@ -5050,7 +5166,7 @@
               <w:rPr>
                 <w:noProof/>
               </w:rPr>
-              <w:instrText xml:space="preserve"> PAGEREF _Toc242943783 \h </w:instrText>
+              <w:instrText xml:space="preserve"> PAGEREF _Toc243647791 \h </w:instrText>
             </w:r>
             <w:r>
               <w:rPr>
@@ -5093,7 +5209,7 @@
               <w14:ligatures w14:val="standardContextual"/>
             </w:rPr>
           </w:pPr>
-          <w:hyperlink w:anchor="_Toc242943784" w:history="1">
+          <w:hyperlink w:anchor="_Toc243647792" w:history="1">
             <w:r>
               <w:rPr>
                 <w:rStyle w:val="Hyperlink"/>
@@ -5117,7 +5233,7 @@
               <w:rPr>
                 <w:noProof/>
               </w:rPr>
-              <w:instrText xml:space="preserve"> PAGEREF _Toc242943784 \h </w:instrText>
+              <w:instrText xml:space="preserve"> PAGEREF _Toc243647792 \h </w:instrText>
             </w:r>
             <w:r>
               <w:rPr>
@@ -5160,7 +5276,7 @@
               <w14:ligatures w14:val="standardContextual"/>
             </w:rPr>
           </w:pPr>
-          <w:hyperlink w:anchor="_Toc242943785" w:history="1">
+          <w:hyperlink w:anchor="_Toc243647793" w:history="1">
             <w:r>
               <w:rPr>
                 <w:rStyle w:val="Hyperlink"/>
@@ -5184,7 +5300,7 @@
               <w:rPr>
                 <w:noProof/>
               </w:rPr>
-              <w:instrText xml:space="preserve"> PAGEREF _Toc242943785 \h </w:instrText>
+              <w:instrText xml:space="preserve"> PAGEREF _Toc243647793 \h </w:instrText>
             </w:r>
             <w:r>
               <w:rPr>
@@ -5225,7 +5341,7 @@
         <w:keepLines/>
         <w:pageBreakBefore/>
       </w:pPr>
-      <w:bookmarkStart w:id="0" w:name="_Toc242943746"/>
+      <w:bookmarkStart w:id="0" w:name="_Toc243647754"/>
       <w:r>
         <w:lastRenderedPageBreak/>
         <w:t>1 Introduction</w:t>
@@ -5238,7 +5354,7 @@
         <w:keepNext/>
         <w:keepLines/>
       </w:pPr>
-      <w:bookmarkStart w:id="1" w:name="_Toc242943747"/>
+      <w:bookmarkStart w:id="1" w:name="_Toc243647755"/>
       <w:r>
         <w:t>1.1 Purpose</w:t>
       </w:r>
@@ -5291,7 +5407,7 @@
         <w:keepNext/>
         <w:keepLines/>
       </w:pPr>
-      <w:bookmarkStart w:id="2" w:name="_Toc242943748"/>
+      <w:bookmarkStart w:id="2" w:name="_Toc243647756"/>
       <w:r>
         <w:t>1.2 Scope</w:t>
       </w:r>
@@ -5311,7 +5427,7 @@
         <w:keepNext/>
         <w:keepLines/>
       </w:pPr>
-      <w:bookmarkStart w:id="3" w:name="_Toc242943749"/>
+      <w:bookmarkStart w:id="3" w:name="_Toc243647757"/>
       <w:r>
         <w:t>1.3 Intended audience</w:t>
       </w:r>
@@ -5331,7 +5447,7 @@
         <w:keepNext/>
         <w:keepLines/>
       </w:pPr>
-      <w:bookmarkStart w:id="4" w:name="_Toc242943750"/>
+      <w:bookmarkStart w:id="4" w:name="_Toc243647758"/>
       <w:r>
         <w:t>1.4 Relationship to other documents</w:t>
       </w:r>
@@ -5342,7 +5458,7 @@
         <w:pStyle w:val="Caption"/>
         <w:keepNext/>
       </w:pPr>
-      <w:bookmarkStart w:id="5" w:name="_Toc242943773"/>
+      <w:bookmarkStart w:id="5" w:name="_Toc243647781"/>
       <w:r>
         <w:t xml:space="preserve">Table </w:t>
       </w:r>
@@ -5384,7 +5500,7 @@
           <w:left w:w="10" w:type="dxa"/>
           <w:right w:w="10" w:type="dxa"/>
         </w:tblCellMar>
-        <w:tblLook w:val="0000" w:firstRow="0" w:lastRow="0" w:firstColumn="0" w:lastColumn="0" w:noHBand="0" w:noVBand="0"/>
+        <w:tblLook w:val="04A0" w:firstRow="1" w:lastRow="0" w:firstColumn="1" w:lastColumn="0" w:noHBand="0" w:noVBand="1"/>
       </w:tblPr>
       <w:tblGrid>
         <w:gridCol w:w="4337"/>
@@ -5770,7 +5886,7 @@
         <w:keepNext/>
         <w:keepLines/>
       </w:pPr>
-      <w:bookmarkStart w:id="6" w:name="_Toc242943751"/>
+      <w:bookmarkStart w:id="6" w:name="_Toc243647759"/>
       <w:r>
         <w:t>1.5 Changes since version 1.0</w:t>
       </w:r>
@@ -5799,7 +5915,7 @@
         <w:pStyle w:val="Caption"/>
         <w:keepNext/>
       </w:pPr>
-      <w:bookmarkStart w:id="7" w:name="_Toc242943774"/>
+      <w:bookmarkStart w:id="7" w:name="_Toc243647782"/>
       <w:r>
         <w:t xml:space="preserve">Table </w:t>
       </w:r>
@@ -5841,7 +5957,7 @@
           <w:left w:w="10" w:type="dxa"/>
           <w:right w:w="10" w:type="dxa"/>
         </w:tblCellMar>
-        <w:tblLook w:val="0000" w:firstRow="0" w:lastRow="0" w:firstColumn="0" w:lastColumn="0" w:noHBand="0" w:noVBand="0"/>
+        <w:tblLook w:val="04A0" w:firstRow="1" w:lastRow="0" w:firstColumn="1" w:lastColumn="0" w:noHBand="0" w:noVBand="1"/>
       </w:tblPr>
       <w:tblGrid>
         <w:gridCol w:w="1410"/>
@@ -6723,7 +6839,7 @@
         <w:keepNext/>
         <w:keepLines/>
       </w:pPr>
-      <w:bookmarkStart w:id="8" w:name="_Toc242943752"/>
+      <w:bookmarkStart w:id="8" w:name="_Toc243647760"/>
       <w:r>
         <w:t>1.6 Changes since version 2.0</w:t>
       </w:r>
@@ -6772,7 +6888,7 @@
         <w:pStyle w:val="Caption"/>
         <w:keepNext/>
       </w:pPr>
-      <w:bookmarkStart w:id="9" w:name="_Toc242943775"/>
+      <w:bookmarkStart w:id="9" w:name="_Toc243647783"/>
       <w:r>
         <w:t xml:space="preserve">Table </w:t>
       </w:r>
@@ -6814,7 +6930,7 @@
           <w:left w:w="10" w:type="dxa"/>
           <w:right w:w="10" w:type="dxa"/>
         </w:tblCellMar>
-        <w:tblLook w:val="0000" w:firstRow="0" w:lastRow="0" w:firstColumn="0" w:lastColumn="0" w:noHBand="0" w:noVBand="0"/>
+        <w:tblLook w:val="04A0" w:firstRow="1" w:lastRow="0" w:firstColumn="1" w:lastColumn="0" w:noHBand="0" w:noVBand="1"/>
       </w:tblPr>
       <w:tblGrid>
         <w:gridCol w:w="878"/>
@@ -7535,6 +7651,110 @@
           </w:p>
         </w:tc>
       </w:tr>
+      <w:tr>
+        <w:tblPrEx>
+          <w:tblCellMar>
+            <w:top w:w="0" w:type="dxa"/>
+            <w:bottom w:w="0" w:type="dxa"/>
+          </w:tblCellMar>
+        </w:tblPrEx>
+        <w:trPr>
+          <w:cantSplit/>
+        </w:trPr>
+        <w:tc>
+          <w:tcPr>
+            <w:tcW w:w="878" w:type="dxa"/>
+            <w:tcBorders>
+              <w:top w:val="single" w:sz="4" w:space="0" w:color="C9D3D0"/>
+              <w:left w:val="single" w:sz="4" w:space="0" w:color="C9D3D0"/>
+              <w:bottom w:val="single" w:sz="4" w:space="0" w:color="C9D3D0"/>
+              <w:right w:val="single" w:sz="4" w:space="0" w:color="C9D3D0"/>
+            </w:tcBorders>
+            <w:shd w:val="clear" w:color="auto" w:fill="F3F8F6"/>
+            <w:tcMar>
+              <w:top w:w="50" w:type="dxa"/>
+              <w:left w:w="100" w:type="dxa"/>
+              <w:bottom w:w="50" w:type="dxa"/>
+              <w:right w:w="100" w:type="dxa"/>
+            </w:tcMar>
+            <w:vAlign w:val="center"/>
+          </w:tcPr>
+          <w:p>
+            <w:pPr>
+              <w:spacing w:line="252" w:lineRule="auto"/>
+            </w:pPr>
+            <w:r>
+              <w:rPr>
+                <w:sz w:val="19"/>
+                <w:szCs w:val="19"/>
+              </w:rPr>
+              <w:t>CR-011</w:t>
+            </w:r>
+          </w:p>
+        </w:tc>
+        <w:tc>
+          <w:tcPr>
+            <w:tcW w:w="1877" w:type="dxa"/>
+            <w:tcBorders>
+              <w:top w:val="single" w:sz="4" w:space="0" w:color="C9D3D0"/>
+              <w:left w:val="single" w:sz="4" w:space="0" w:color="C9D3D0"/>
+              <w:bottom w:val="single" w:sz="4" w:space="0" w:color="C9D3D0"/>
+              <w:right w:val="single" w:sz="4" w:space="0" w:color="C9D3D0"/>
+            </w:tcBorders>
+            <w:shd w:val="clear" w:color="auto" w:fill="F3F8F6"/>
+            <w:tcMar>
+              <w:top w:w="50" w:type="dxa"/>
+              <w:left w:w="100" w:type="dxa"/>
+              <w:bottom w:w="50" w:type="dxa"/>
+              <w:right w:w="100" w:type="dxa"/>
+            </w:tcMar>
+            <w:vAlign w:val="center"/>
+          </w:tcPr>
+          <w:p>
+            <w:pPr>
+              <w:spacing w:line="252" w:lineRule="auto"/>
+            </w:pPr>
+            <w:r>
+              <w:rPr>
+                <w:sz w:val="19"/>
+                <w:szCs w:val="19"/>
+              </w:rPr>
+              <w:t>23 October 2026</w:t>
+            </w:r>
+          </w:p>
+        </w:tc>
+        <w:tc>
+          <w:tcPr>
+            <w:tcW w:w="6883" w:type="dxa"/>
+            <w:tcBorders>
+              <w:top w:val="single" w:sz="4" w:space="0" w:color="C9D3D0"/>
+              <w:left w:val="single" w:sz="4" w:space="0" w:color="C9D3D0"/>
+              <w:bottom w:val="single" w:sz="4" w:space="0" w:color="C9D3D0"/>
+              <w:right w:val="single" w:sz="4" w:space="0" w:color="C9D3D0"/>
+            </w:tcBorders>
+            <w:shd w:val="clear" w:color="auto" w:fill="F3F8F6"/>
+            <w:tcMar>
+              <w:top w:w="50" w:type="dxa"/>
+              <w:left w:w="100" w:type="dxa"/>
+              <w:bottom w:w="50" w:type="dxa"/>
+              <w:right w:w="100" w:type="dxa"/>
+            </w:tcMar>
+            <w:vAlign w:val="center"/>
+          </w:tcPr>
+          <w:p>
+            <w:pPr>
+              <w:spacing w:line="252" w:lineRule="auto"/>
+            </w:pPr>
+            <w:r>
+              <w:rPr>
+                <w:sz w:val="19"/>
+                <w:szCs w:val="19"/>
+              </w:rPr>
+              <w:t>Preference-list guidance corrected after the product owner checked how selection really works: the order follows the student's own preference (UGC handbook 2025/26, p.112), so ZedPath no longer calls a Safe-first order a mistake or proposes moving Safe courses last; it explains what the order means and lists the UGC's rules, each with its handbook page</w:t>
+            </w:r>
+          </w:p>
+        </w:tc>
+      </w:tr>
     </w:tbl>
     <w:p>
       <w:pPr>
@@ -7548,7 +7768,7 @@
         <w:keepLines/>
         <w:pageBreakBefore/>
       </w:pPr>
-      <w:bookmarkStart w:id="10" w:name="_Toc242943753"/>
+      <w:bookmarkStart w:id="10" w:name="_Toc243647761"/>
       <w:r>
         <w:lastRenderedPageBreak/>
         <w:t>2 Business requirements</w:t>
@@ -7561,7 +7781,7 @@
         <w:keepNext/>
         <w:keepLines/>
       </w:pPr>
-      <w:bookmarkStart w:id="11" w:name="_Toc242943754"/>
+      <w:bookmarkStart w:id="11" w:name="_Toc243647762"/>
       <w:r>
         <w:t>2.1 Background</w:t>
       </w:r>
@@ -7610,10 +7830,10 @@
         <w:spacing w:after="120"/>
       </w:pPr>
       <w:r>
-        <w:t xml:space="preserve">Within a few weeks of results, each student must decide. Students aiming for a state university must choose </w:t>
-      </w:r>
-      <w:r>
-        <w:t>and rank up to 125 course preferences under rules published in a handbook of more than 200 pages that changes every year, inside a three-week application window. Because places are limited, most also need a backup: a private or non-state degree, study abroad, a government job examination announced in the Gazette, a vocational course, or sitting the examination again. Each path has its own rules, calendar and website.</w:t>
+        <w:t xml:space="preserve">Within a few weeks of results, each student must decide. Students aiming for a state university must choose and rank up to 125 course preferences under rules published in a handbook of more than 200 pages that changes </w:t>
+      </w:r>
+      <w:r>
+        <w:t>every year, inside a three-week application window. Because places are limited, most also need a backup: a private or non-state degree, study abroad, a government job examination announced in the Gazette, a vocational course, or sitting the examination again. Each path has its own rules, calendar and website.</w:t>
       </w:r>
     </w:p>
     <w:p>
@@ -7621,7 +7841,10 @@
         <w:spacing w:after="120"/>
       </w:pPr>
       <w:r>
-        <w:t>Gate 1 research (six interviews, E1 to E6, and a hands-on test of four existing tools, T1) found one pattern: students decide mostly on hearsay from tuition teachers, seniors and social-media groups. A badly ordered preference list, an ineligible choice, a missed deadline or a path never heard of can cost a year. The National Education Commission reached the same conclusion: most students and parents are unaware of alternative education and career options [3].</w:t>
+        <w:t xml:space="preserve">Gate 1 research (six interviews, E1 to E6, and a hands-on test of four existing tools, T1) found one pattern: </w:t>
+      </w:r>
+      <w:r>
+        <w:t>students decide mostly on hearsay from tuition teachers, seniors and social-media groups. A badly ordered preference list, an ineligible choice, a missed deadline or a path never heard of can cost a year. The National Education Commission reached the same conclusion: most students and parents are unaware of alternative education and career options [3].</w:t>
       </w:r>
     </w:p>
     <w:p>
@@ -7630,7 +7853,7 @@
         <w:keepNext/>
         <w:keepLines/>
       </w:pPr>
-      <w:bookmarkStart w:id="12" w:name="_Toc242943755"/>
+      <w:bookmarkStart w:id="12" w:name="_Toc243647763"/>
       <w:r>
         <w:t>2.2 Business opportunity</w:t>
       </w:r>
@@ -7699,10 +7922,7 @@
         <w:t>AI that reads documents.</w:t>
       </w:r>
       <w:r>
-        <w:t xml:space="preserve"> Language models can turn a 200-page handbook and weekly Gazette PDFs into </w:t>
-      </w:r>
-      <w:r>
-        <w:t>structured, page-cited rules, which previously needed manual re-coding every year.</w:t>
+        <w:t xml:space="preserve"> Language models can turn a 200-page handbook and weekly Gazette PDFs into structured, page-cited rules, which previously needed manual re-coding every year.</w:t>
       </w:r>
     </w:p>
     <w:p>
@@ -7731,7 +7951,7 @@
         <w:keepNext/>
         <w:keepLines/>
       </w:pPr>
-      <w:bookmarkStart w:id="13" w:name="_Toc242943756"/>
+      <w:bookmarkStart w:id="13" w:name="_Toc243647764"/>
       <w:r>
         <w:t>2.3 Business objectives</w:t>
       </w:r>
@@ -7742,7 +7962,7 @@
         <w:pStyle w:val="Caption"/>
         <w:keepNext/>
       </w:pPr>
-      <w:bookmarkStart w:id="14" w:name="_Toc242943776"/>
+      <w:bookmarkStart w:id="14" w:name="_Toc243647784"/>
       <w:r>
         <w:t xml:space="preserve">Table </w:t>
       </w:r>
@@ -7784,7 +8004,7 @@
           <w:left w:w="10" w:type="dxa"/>
           <w:right w:w="10" w:type="dxa"/>
         </w:tblCellMar>
-        <w:tblLook w:val="0000" w:firstRow="0" w:lastRow="0" w:firstColumn="0" w:lastColumn="0" w:noHBand="0" w:noVBand="0"/>
+        <w:tblLook w:val="04A0" w:firstRow="1" w:lastRow="0" w:firstColumn="1" w:lastColumn="0" w:noHBand="0" w:noVBand="1"/>
       </w:tblPr>
       <w:tblGrid>
         <w:gridCol w:w="665"/>
@@ -8532,7 +8752,7 @@
         <w:keepNext/>
         <w:keepLines/>
       </w:pPr>
-      <w:bookmarkStart w:id="15" w:name="_Toc242943757"/>
+      <w:bookmarkStart w:id="15" w:name="_Toc243647765"/>
       <w:r>
         <w:t>2.4 Market size</w:t>
       </w:r>
@@ -8543,7 +8763,7 @@
         <w:pStyle w:val="Caption"/>
         <w:keepNext/>
       </w:pPr>
-      <w:bookmarkStart w:id="16" w:name="_Toc242943777"/>
+      <w:bookmarkStart w:id="16" w:name="_Toc243647785"/>
       <w:r>
         <w:t xml:space="preserve">Table </w:t>
       </w:r>
@@ -8585,7 +8805,7 @@
           <w:left w:w="10" w:type="dxa"/>
           <w:right w:w="10" w:type="dxa"/>
         </w:tblCellMar>
-        <w:tblLook w:val="0000" w:firstRow="0" w:lastRow="0" w:firstColumn="0" w:lastColumn="0" w:noHBand="0" w:noVBand="0"/>
+        <w:tblLook w:val="04A0" w:firstRow="1" w:lastRow="0" w:firstColumn="1" w:lastColumn="0" w:noHBand="0" w:noVBand="1"/>
       </w:tblPr>
       <w:tblGrid>
         <w:gridCol w:w="3109"/>
@@ -9024,7 +9244,7 @@
         <w:keepNext/>
         <w:keepLines/>
       </w:pPr>
-      <w:bookmarkStart w:id="17" w:name="_Toc242943758"/>
+      <w:bookmarkStart w:id="17" w:name="_Toc243647766"/>
       <w:r>
         <w:t>2.5 Success metrics</w:t>
       </w:r>
@@ -9136,7 +9356,7 @@
         <w:keepNext/>
         <w:keepLines/>
       </w:pPr>
-      <w:bookmarkStart w:id="18" w:name="_Toc242943759"/>
+      <w:bookmarkStart w:id="18" w:name="_Toc243647767"/>
       <w:r>
         <w:t>2.6 Vision statement</w:t>
       </w:r>
@@ -9218,7 +9438,7 @@
         <w:keepNext/>
         <w:keepLines/>
       </w:pPr>
-      <w:bookmarkStart w:id="19" w:name="_Toc242943760"/>
+      <w:bookmarkStart w:id="19" w:name="_Toc243647768"/>
       <w:r>
         <w:t>2.7 Business risks</w:t>
       </w:r>
@@ -9229,7 +9449,7 @@
         <w:pStyle w:val="Caption"/>
         <w:keepNext/>
       </w:pPr>
-      <w:bookmarkStart w:id="20" w:name="_Toc242943778"/>
+      <w:bookmarkStart w:id="20" w:name="_Toc243647786"/>
       <w:r>
         <w:t xml:space="preserve">Table </w:t>
       </w:r>
@@ -9271,7 +9491,7 @@
           <w:left w:w="10" w:type="dxa"/>
           <w:right w:w="10" w:type="dxa"/>
         </w:tblCellMar>
-        <w:tblLook w:val="0000" w:firstRow="0" w:lastRow="0" w:firstColumn="0" w:lastColumn="0" w:noHBand="0" w:noVBand="0"/>
+        <w:tblLook w:val="04A0" w:firstRow="1" w:lastRow="0" w:firstColumn="1" w:lastColumn="0" w:noHBand="0" w:noVBand="1"/>
       </w:tblPr>
       <w:tblGrid>
         <w:gridCol w:w="679"/>
@@ -10849,7 +11069,7 @@
         <w:keepNext/>
         <w:keepLines/>
       </w:pPr>
-      <w:bookmarkStart w:id="21" w:name="_Toc242943761"/>
+      <w:bookmarkStart w:id="21" w:name="_Toc243647769"/>
       <w:r>
         <w:t>2.8 Assumptions and dependencies</w:t>
       </w:r>
@@ -10860,7 +11080,7 @@
         <w:pStyle w:val="Caption"/>
         <w:keepNext/>
       </w:pPr>
-      <w:bookmarkStart w:id="22" w:name="_Toc242943779"/>
+      <w:bookmarkStart w:id="22" w:name="_Toc243647787"/>
       <w:r>
         <w:t xml:space="preserve">Table </w:t>
       </w:r>
@@ -10902,7 +11122,7 @@
           <w:left w:w="10" w:type="dxa"/>
           <w:right w:w="10" w:type="dxa"/>
         </w:tblCellMar>
-        <w:tblLook w:val="0000" w:firstRow="0" w:lastRow="0" w:firstColumn="0" w:lastColumn="0" w:noHBand="0" w:noVBand="0"/>
+        <w:tblLook w:val="04A0" w:firstRow="1" w:lastRow="0" w:firstColumn="1" w:lastColumn="0" w:noHBand="0" w:noVBand="1"/>
       </w:tblPr>
       <w:tblGrid>
         <w:gridCol w:w="803"/>
@@ -11504,7 +11724,7 @@
         <w:keepLines/>
         <w:pageBreakBefore/>
       </w:pPr>
-      <w:bookmarkStart w:id="23" w:name="_Toc242943762"/>
+      <w:bookmarkStart w:id="23" w:name="_Toc243647770"/>
       <w:r>
         <w:lastRenderedPageBreak/>
         <w:t>3 Scope and limitations</w:t>
@@ -11517,7 +11737,7 @@
         <w:keepNext/>
         <w:keepLines/>
       </w:pPr>
-      <w:bookmarkStart w:id="24" w:name="_Toc242943763"/>
+      <w:bookmarkStart w:id="24" w:name="_Toc243647771"/>
       <w:r>
         <w:t>3.1 Major features</w:t>
       </w:r>
@@ -11536,7 +11756,7 @@
         <w:pStyle w:val="Caption"/>
         <w:keepNext/>
       </w:pPr>
-      <w:bookmarkStart w:id="25" w:name="_Toc242943780"/>
+      <w:bookmarkStart w:id="25" w:name="_Toc243647788"/>
       <w:r>
         <w:t xml:space="preserve">Table </w:t>
       </w:r>
@@ -11578,7 +11798,7 @@
           <w:left w:w="10" w:type="dxa"/>
           <w:right w:w="10" w:type="dxa"/>
         </w:tblCellMar>
-        <w:tblLook w:val="0000" w:firstRow="0" w:lastRow="0" w:firstColumn="0" w:lastColumn="0" w:noHBand="0" w:noVBand="0"/>
+        <w:tblLook w:val="04A0" w:firstRow="1" w:lastRow="0" w:firstColumn="1" w:lastColumn="0" w:noHBand="0" w:noVBand="1"/>
       </w:tblPr>
       <w:tblGrid>
         <w:gridCol w:w="741"/>
@@ -12759,7 +12979,7 @@
         <w:keepNext/>
         <w:keepLines/>
       </w:pPr>
-      <w:bookmarkStart w:id="26" w:name="_Toc242943764"/>
+      <w:bookmarkStart w:id="26" w:name="_Toc243647772"/>
       <w:r>
         <w:t>3.2 Scope of initial and subsequent releases</w:t>
       </w:r>
@@ -12770,7 +12990,7 @@
         <w:pStyle w:val="Caption"/>
         <w:keepNext/>
       </w:pPr>
-      <w:bookmarkStart w:id="27" w:name="_Toc242943781"/>
+      <w:bookmarkStart w:id="27" w:name="_Toc243647789"/>
       <w:r>
         <w:t xml:space="preserve">Table </w:t>
       </w:r>
@@ -12812,7 +13032,7 @@
           <w:left w:w="10" w:type="dxa"/>
           <w:right w:w="10" w:type="dxa"/>
         </w:tblCellMar>
-        <w:tblLook w:val="0000" w:firstRow="0" w:lastRow="0" w:firstColumn="0" w:lastColumn="0" w:noHBand="0" w:noVBand="0"/>
+        <w:tblLook w:val="04A0" w:firstRow="1" w:lastRow="0" w:firstColumn="1" w:lastColumn="0" w:noHBand="0" w:noVBand="1"/>
       </w:tblPr>
       <w:tblGrid>
         <w:gridCol w:w="968"/>
@@ -14050,7 +14270,7 @@
           <w:noProof/>
         </w:rPr>
         <w:drawing>
-          <wp:inline distT="0" distB="0" distL="0" distR="0" wp14:anchorId="2F04FC3F" wp14:editId="2F04FC40">
+          <wp:inline distT="0" distB="0" distL="0" distR="0" wp14:anchorId="24DFECDB" wp14:editId="24DFECDC">
             <wp:extent cx="6124575" cy="3848100"/>
             <wp:effectExtent l="0" t="0" r="0" b="0"/>
             <wp:docPr id="1" name="system-context.png" descr="ZedPath system context (C4 model, level 1)" title="ZedPath system context (C4 model, level 1)"/>
@@ -14093,7 +14313,7 @@
       <w:pPr>
         <w:pStyle w:val="Caption"/>
       </w:pPr>
-      <w:bookmarkStart w:id="28" w:name="_Toc242943772"/>
+      <w:bookmarkStart w:id="28" w:name="_Toc243647780"/>
       <w:r>
         <w:t xml:space="preserve">Figure </w:t>
       </w:r>
@@ -14146,7 +14366,7 @@
         <w:keepNext/>
         <w:keepLines/>
       </w:pPr>
-      <w:bookmarkStart w:id="29" w:name="_Toc242943765"/>
+      <w:bookmarkStart w:id="29" w:name="_Toc243647773"/>
       <w:r>
         <w:lastRenderedPageBreak/>
         <w:t>3.3 Limitations and exclusions</w:t>
@@ -14345,7 +14565,7 @@
         <w:keepLines/>
         <w:pageBreakBefore/>
       </w:pPr>
-      <w:bookmarkStart w:id="30" w:name="_Toc242943766"/>
+      <w:bookmarkStart w:id="30" w:name="_Toc243647774"/>
       <w:r>
         <w:lastRenderedPageBreak/>
         <w:t>4 Business context</w:t>
@@ -14358,7 +14578,7 @@
         <w:keepNext/>
         <w:keepLines/>
       </w:pPr>
-      <w:bookmarkStart w:id="31" w:name="_Toc242943767"/>
+      <w:bookmarkStart w:id="31" w:name="_Toc243647775"/>
       <w:r>
         <w:t>4.1 Stakeholder profiles</w:t>
       </w:r>
@@ -14369,7 +14589,7 @@
         <w:pStyle w:val="Caption"/>
         <w:keepNext/>
       </w:pPr>
-      <w:bookmarkStart w:id="32" w:name="_Toc242943782"/>
+      <w:bookmarkStart w:id="32" w:name="_Toc243647790"/>
       <w:r>
         <w:t xml:space="preserve">Table </w:t>
       </w:r>
@@ -14411,7 +14631,7 @@
           <w:left w:w="10" w:type="dxa"/>
           <w:right w:w="10" w:type="dxa"/>
         </w:tblCellMar>
-        <w:tblLook w:val="0000" w:firstRow="0" w:lastRow="0" w:firstColumn="0" w:lastColumn="0" w:noHBand="0" w:noVBand="0"/>
+        <w:tblLook w:val="04A0" w:firstRow="1" w:lastRow="0" w:firstColumn="1" w:lastColumn="0" w:noHBand="0" w:noVBand="1"/>
       </w:tblPr>
       <w:tblGrid>
         <w:gridCol w:w="1762"/>
@@ -15508,7 +15728,7 @@
         <w:keepNext/>
         <w:keepLines/>
       </w:pPr>
-      <w:bookmarkStart w:id="33" w:name="_Toc242943768"/>
+      <w:bookmarkStart w:id="33" w:name="_Toc243647776"/>
       <w:r>
         <w:t>4.2 Project priorities</w:t>
       </w:r>
@@ -15519,7 +15739,7 @@
         <w:pStyle w:val="Caption"/>
         <w:keepNext/>
       </w:pPr>
-      <w:bookmarkStart w:id="34" w:name="_Toc242943783"/>
+      <w:bookmarkStart w:id="34" w:name="_Toc243647791"/>
       <w:r>
         <w:t xml:space="preserve">Table </w:t>
       </w:r>
@@ -15561,7 +15781,7 @@
           <w:left w:w="10" w:type="dxa"/>
           <w:right w:w="10" w:type="dxa"/>
         </w:tblCellMar>
-        <w:tblLook w:val="0000" w:firstRow="0" w:lastRow="0" w:firstColumn="0" w:lastColumn="0" w:noHBand="0" w:noVBand="0"/>
+        <w:tblLook w:val="04A0" w:firstRow="1" w:lastRow="0" w:firstColumn="1" w:lastColumn="0" w:noHBand="0" w:noVBand="1"/>
       </w:tblPr>
       <w:tblGrid>
         <w:gridCol w:w="1188"/>
@@ -16205,7 +16425,7 @@
         <w:keepNext/>
         <w:keepLines/>
       </w:pPr>
-      <w:bookmarkStart w:id="35" w:name="_Toc242943769"/>
+      <w:bookmarkStart w:id="35" w:name="_Toc243647777"/>
       <w:r>
         <w:t>4.3 Deployment considerations</w:t>
       </w:r>
@@ -16293,7 +16513,7 @@
         <w:keepLines/>
         <w:pageBreakBefore/>
       </w:pPr>
-      <w:bookmarkStart w:id="36" w:name="_Toc242943770"/>
+      <w:bookmarkStart w:id="36" w:name="_Toc243647778"/>
       <w:r>
         <w:lastRenderedPageBreak/>
         <w:t>Appendix A: Glossary</w:t>
@@ -16305,7 +16525,7 @@
         <w:pStyle w:val="Caption"/>
         <w:keepNext/>
       </w:pPr>
-      <w:bookmarkStart w:id="37" w:name="_Toc242943784"/>
+      <w:bookmarkStart w:id="37" w:name="_Toc243647792"/>
       <w:r>
         <w:t xml:space="preserve">Table </w:t>
       </w:r>
@@ -16347,7 +16567,7 @@
           <w:left w:w="10" w:type="dxa"/>
           <w:right w:w="10" w:type="dxa"/>
         </w:tblCellMar>
-        <w:tblLook w:val="0000" w:firstRow="0" w:lastRow="0" w:firstColumn="0" w:lastColumn="0" w:noHBand="0" w:noVBand="0"/>
+        <w:tblLook w:val="04A0" w:firstRow="1" w:lastRow="0" w:firstColumn="1" w:lastColumn="0" w:noHBand="0" w:noVBand="1"/>
       </w:tblPr>
       <w:tblGrid>
         <w:gridCol w:w="1843"/>
@@ -17182,7 +17402,7 @@
         <w:keepLines/>
         <w:pageBreakBefore/>
       </w:pPr>
-      <w:bookmarkStart w:id="38" w:name="_Toc242943771"/>
+      <w:bookmarkStart w:id="38" w:name="_Toc243647779"/>
       <w:r>
         <w:lastRenderedPageBreak/>
         <w:t>Appendix B: References</w:t>
@@ -17194,7 +17414,7 @@
         <w:pStyle w:val="Caption"/>
         <w:keepNext/>
       </w:pPr>
-      <w:bookmarkStart w:id="39" w:name="_Toc242943785"/>
+      <w:bookmarkStart w:id="39" w:name="_Toc243647793"/>
       <w:r>
         <w:t xml:space="preserve">Table </w:t>
       </w:r>
@@ -17236,7 +17456,7 @@
           <w:left w:w="10" w:type="dxa"/>
           <w:right w:w="10" w:type="dxa"/>
         </w:tblCellMar>
-        <w:tblLook w:val="0000" w:firstRow="0" w:lastRow="0" w:firstColumn="0" w:lastColumn="0" w:noHBand="0" w:noVBand="0"/>
+        <w:tblLook w:val="04A0" w:firstRow="1" w:lastRow="0" w:firstColumn="1" w:lastColumn="0" w:noHBand="0" w:noVBand="1"/>
       </w:tblPr>
       <w:tblGrid>
         <w:gridCol w:w="803"/>
@@ -18349,7 +18569,7 @@
         <w:sz w:val="16"/>
         <w:szCs w:val="16"/>
       </w:rPr>
-      <w:t>ZP-DOC-01  ·  v2.1  ·  Approved</w:t>
+      <w:t>ZP-DOC-01  ·  v2.2  ·  In review</w:t>
     </w:r>
   </w:p>
 </w:hdr>
@@ -18358,10 +18578,10 @@
 <file path=word/numbering.xml><?xml version="1.0" encoding="utf-8"?>
 <w:numbering xmlns:wpc="http://schemas.microsoft.com/office/word/2010/wordprocessingCanvas" xmlns:cx="http://schemas.microsoft.com/office/drawing/2014/chartex" xmlns:cx1="http://schemas.microsoft.com/office/drawing/2015/9/8/chartex" xmlns:cx2="http://schemas.microsoft.com/office/drawing/2015/10/21/chartex" xmlns:cx3="http://schemas.microsoft.com/office/drawing/2016/5/9/chartex" xmlns:cx4="http://schemas.microsoft.com/office/drawing/2016/5/10/chartex" xmlns:cx5="http://schemas.microsoft.com/office/drawing/2016/5/11/chartex" xmlns:cx6="http://schemas.microsoft.com/office/drawing/2016/5/12/chartex" xmlns:cx7="http://schemas.microsoft.com/office/drawing/2016/5/13/chartex" xmlns:cx8="http://schemas.microsoft.com/office/drawing/2016/5/14/chartex" xmlns:mc="http://schemas.openxmlformats.org/markup-compatibility/2006" xmlns:aink="http://schemas.microsoft.com/office/drawing/2016/ink" xmlns:am3d="http://schemas.microsoft.com/office/drawing/2017/model3d" xmlns:o="urn:schemas-microsoft-com:office:office" xmlns:oel="http://schemas.microsoft.com/office/2019/extlst" xmlns:r="http://schemas.openxmlformats.org/officeDocument/2006/relationships" xmlns:m="http://schemas.openxmlformats.org/officeDocument/2006/math" xmlns:v="urn:schemas-microsoft-com:vml" xmlns:wp14="http://schemas.microsoft.com/office/word/2010/wordprocessingDrawing" xmlns:wp="http://schemas.openxmlformats.org/drawingml/2006/wordprocessingDrawing" xmlns:w10="urn:schemas-microsoft-com:office:word" xmlns:w="http://schemas.openxmlformats.org/wordprocessingml/2006/main" xmlns:w14="http://schemas.microsoft.com/office/word/2010/wordml" xmlns:w15="http://schemas.microsoft.com/office/word/2012/wordml" xmlns:w16cex="http://schemas.microsoft.com/office/word/2018/wordml/cex" xmlns:w16cid="http://schemas.microsoft.com/office/word/2016/wordml/cid" xmlns:w16="http://schemas.microsoft.com/office/word/2018/wordml" xmlns:w16du="http://schemas.microsoft.com/office/word/2023/wordml/word16du" xmlns:w16sdtdh="http://schemas.microsoft.com/office/word/2020/wordml/sdtdatahash" xmlns:w16sdtfl="http://schemas.microsoft.com/office/word/2024/wordml/sdtformatlock" xmlns:w16se="http://schemas.microsoft.com/office/word/2015/wordml/symex" xmlns:wpg="http://schemas.microsoft.com/office/word/2010/wordprocessingGroup" xmlns:wpi="http://schemas.microsoft.com/office/word/2010/wordprocessingInk" xmlns:wne="http://schemas.microsoft.com/office/word/2006/wordml" xmlns:wps="http://schemas.microsoft.com/office/word/2010/wordprocessingShape" mc:Ignorable="w14 w15 w16se w16cid w16 w16cex w16sdtdh w16sdtfl w16du wp14">
   <w:abstractNum w:abstractNumId="0" w15:restartNumberingAfterBreak="0">
-    <w:nsid w:val="6238471F"/>
+    <w:nsid w:val="11A63459"/>
     <w:multiLevelType w:val="hybridMultilevel"/>
-    <w:tmpl w:val="58F041AA"/>
-    <w:lvl w:ilvl="0" w:tplc="A156018E">
+    <w:tmpl w:val="CCE27FF6"/>
+    <w:lvl w:ilvl="0" w:tplc="84E00182">
       <w:start w:val="1"/>
       <w:numFmt w:val="decimal"/>
       <w:lvlText w:val="%1."/>
@@ -18370,7 +18590,7 @@
         <w:ind w:left="720" w:hanging="360"/>
       </w:pPr>
     </w:lvl>
-    <w:lvl w:ilvl="1" w:tplc="E5523A34" w:tentative="1">
+    <w:lvl w:ilvl="1" w:tplc="2724FE60" w:tentative="1">
       <w:start w:val="1"/>
       <w:numFmt w:val="lowerLetter"/>
       <w:lvlText w:val="%2."/>
@@ -18379,7 +18599,7 @@
         <w:ind w:left="1080" w:hanging="360"/>
       </w:pPr>
     </w:lvl>
-    <w:lvl w:ilvl="2" w:tplc="2B7CB7E6" w:tentative="1">
+    <w:lvl w:ilvl="2" w:tplc="625A8F64" w:tentative="1">
       <w:start w:val="1"/>
       <w:numFmt w:val="lowerRoman"/>
       <w:lvlText w:val="%3."/>
@@ -18388,42 +18608,42 @@
         <w:ind w:left="1440" w:hanging="360"/>
       </w:pPr>
     </w:lvl>
-    <w:lvl w:ilvl="3" w:tplc="7E74CDA8">
+    <w:lvl w:ilvl="3" w:tplc="6F78D640">
       <w:numFmt w:val="decimal"/>
       <w:lvlText w:val=""/>
       <w:lvlJc w:val="left"/>
     </w:lvl>
-    <w:lvl w:ilvl="4" w:tplc="3A2E62BE">
+    <w:lvl w:ilvl="4" w:tplc="09985DC6">
       <w:numFmt w:val="decimal"/>
       <w:lvlText w:val=""/>
       <w:lvlJc w:val="left"/>
     </w:lvl>
-    <w:lvl w:ilvl="5" w:tplc="7888990A">
+    <w:lvl w:ilvl="5" w:tplc="D24C5D12">
       <w:numFmt w:val="decimal"/>
       <w:lvlText w:val=""/>
       <w:lvlJc w:val="left"/>
     </w:lvl>
-    <w:lvl w:ilvl="6" w:tplc="B6127FBC">
+    <w:lvl w:ilvl="6" w:tplc="E3E8EDB8">
       <w:numFmt w:val="decimal"/>
       <w:lvlText w:val=""/>
       <w:lvlJc w:val="left"/>
     </w:lvl>
-    <w:lvl w:ilvl="7" w:tplc="BA421548">
+    <w:lvl w:ilvl="7" w:tplc="392A7E22">
       <w:numFmt w:val="decimal"/>
       <w:lvlText w:val=""/>
       <w:lvlJc w:val="left"/>
     </w:lvl>
-    <w:lvl w:ilvl="8" w:tplc="ADAE586E">
+    <w:lvl w:ilvl="8" w:tplc="602849A2">
       <w:numFmt w:val="decimal"/>
       <w:lvlText w:val=""/>
       <w:lvlJc w:val="left"/>
     </w:lvl>
   </w:abstractNum>
   <w:abstractNum w:abstractNumId="1" w15:restartNumberingAfterBreak="0">
-    <w:nsid w:val="6CF11AB2"/>
+    <w:nsid w:val="3D302281"/>
     <w:multiLevelType w:val="hybridMultilevel"/>
-    <w:tmpl w:val="EE26CF58"/>
-    <w:lvl w:ilvl="0" w:tplc="D798822E" w:tentative="1">
+    <w:tmpl w:val="AD182040"/>
+    <w:lvl w:ilvl="0" w:tplc="96A00B8E" w:tentative="1">
       <w:start w:val="1"/>
       <w:numFmt w:val="bullet"/>
       <w:lvlText w:val="●"/>
@@ -18432,7 +18652,7 @@
         <w:ind w:left="720" w:hanging="360"/>
       </w:pPr>
     </w:lvl>
-    <w:lvl w:ilvl="1" w:tplc="822446E2" w:tentative="1">
+    <w:lvl w:ilvl="1" w:tplc="9F983A1C" w:tentative="1">
       <w:start w:val="1"/>
       <w:numFmt w:val="bullet"/>
       <w:lvlText w:val="○"/>
@@ -18441,7 +18661,7 @@
         <w:ind w:left="1440" w:hanging="360"/>
       </w:pPr>
     </w:lvl>
-    <w:lvl w:ilvl="2" w:tplc="C1E2B146" w:tentative="1">
+    <w:lvl w:ilvl="2" w:tplc="8D8814AE" w:tentative="1">
       <w:start w:val="1"/>
       <w:numFmt w:val="bullet"/>
       <w:lvlText w:val="■"/>
@@ -18450,7 +18670,7 @@
         <w:ind w:left="2160" w:hanging="360"/>
       </w:pPr>
     </w:lvl>
-    <w:lvl w:ilvl="3" w:tplc="451CD5A0" w:tentative="1">
+    <w:lvl w:ilvl="3" w:tplc="AA24A476" w:tentative="1">
       <w:start w:val="1"/>
       <w:numFmt w:val="bullet"/>
       <w:lvlText w:val="●"/>
@@ -18459,7 +18679,7 @@
         <w:ind w:left="2880" w:hanging="360"/>
       </w:pPr>
     </w:lvl>
-    <w:lvl w:ilvl="4" w:tplc="F0FEF090" w:tentative="1">
+    <w:lvl w:ilvl="4" w:tplc="AF8E6930" w:tentative="1">
       <w:start w:val="1"/>
       <w:numFmt w:val="bullet"/>
       <w:lvlText w:val="○"/>
@@ -18468,7 +18688,7 @@
         <w:ind w:left="3600" w:hanging="360"/>
       </w:pPr>
     </w:lvl>
-    <w:lvl w:ilvl="5" w:tplc="896670A4" w:tentative="1">
+    <w:lvl w:ilvl="5" w:tplc="B06A6708" w:tentative="1">
       <w:start w:val="1"/>
       <w:numFmt w:val="bullet"/>
       <w:lvlText w:val="■"/>
@@ -18477,7 +18697,7 @@
         <w:ind w:left="4320" w:hanging="360"/>
       </w:pPr>
     </w:lvl>
-    <w:lvl w:ilvl="6" w:tplc="AF142F7E" w:tentative="1">
+    <w:lvl w:ilvl="6" w:tplc="14B275A6" w:tentative="1">
       <w:start w:val="1"/>
       <w:numFmt w:val="bullet"/>
       <w:lvlText w:val="●"/>
@@ -18486,7 +18706,7 @@
         <w:ind w:left="5040" w:hanging="360"/>
       </w:pPr>
     </w:lvl>
-    <w:lvl w:ilvl="7" w:tplc="50764B96" w:tentative="1">
+    <w:lvl w:ilvl="7" w:tplc="BB9E3FB4" w:tentative="1">
       <w:start w:val="1"/>
       <w:numFmt w:val="bullet"/>
       <w:lvlText w:val="●"/>
@@ -18495,7 +18715,7 @@
         <w:ind w:left="5760" w:hanging="360"/>
       </w:pPr>
     </w:lvl>
-    <w:lvl w:ilvl="8" w:tplc="3E4A1E5A" w:tentative="1">
+    <w:lvl w:ilvl="8" w:tplc="4F52820E" w:tentative="1">
       <w:start w:val="1"/>
       <w:numFmt w:val="bullet"/>
       <w:lvlText w:val="●"/>
@@ -18506,10 +18726,10 @@
     </w:lvl>
   </w:abstractNum>
   <w:abstractNum w:abstractNumId="2" w15:restartNumberingAfterBreak="0">
-    <w:nsid w:val="70733781"/>
+    <w:nsid w:val="55403C50"/>
     <w:multiLevelType w:val="hybridMultilevel"/>
-    <w:tmpl w:val="FDC8A4A8"/>
-    <w:lvl w:ilvl="0" w:tplc="404281C2">
+    <w:tmpl w:val="FBAED6B4"/>
+    <w:lvl w:ilvl="0" w:tplc="709EDB74">
       <w:start w:val="1"/>
       <w:numFmt w:val="bullet"/>
       <w:lvlText w:val="•"/>
@@ -18518,7 +18738,7 @@
         <w:ind w:left="720" w:hanging="280"/>
       </w:pPr>
     </w:lvl>
-    <w:lvl w:ilvl="1" w:tplc="91481F2A" w:tentative="1">
+    <w:lvl w:ilvl="1" w:tplc="7EA0416C" w:tentative="1">
       <w:start w:val="1"/>
       <w:numFmt w:val="bullet"/>
       <w:lvlText w:val="–"/>
@@ -18527,7 +18747,7 @@
         <w:ind w:left="1080" w:hanging="280"/>
       </w:pPr>
     </w:lvl>
-    <w:lvl w:ilvl="2" w:tplc="D5EC6E1E" w:tentative="1">
+    <w:lvl w:ilvl="2" w:tplc="5204C8C4" w:tentative="1">
       <w:start w:val="1"/>
       <w:numFmt w:val="bullet"/>
       <w:lvlText w:val="▪"/>
@@ -18536,62 +18756,62 @@
         <w:ind w:left="1440" w:hanging="280"/>
       </w:pPr>
     </w:lvl>
-    <w:lvl w:ilvl="3" w:tplc="1256F4DA">
+    <w:lvl w:ilvl="3" w:tplc="9D28B1FE">
       <w:numFmt w:val="decimal"/>
       <w:lvlText w:val=""/>
       <w:lvlJc w:val="left"/>
     </w:lvl>
-    <w:lvl w:ilvl="4" w:tplc="D50487A6">
+    <w:lvl w:ilvl="4" w:tplc="10B43E58">
       <w:numFmt w:val="decimal"/>
       <w:lvlText w:val=""/>
       <w:lvlJc w:val="left"/>
     </w:lvl>
-    <w:lvl w:ilvl="5" w:tplc="88CA3B0C">
+    <w:lvl w:ilvl="5" w:tplc="0B4CE792">
       <w:numFmt w:val="decimal"/>
       <w:lvlText w:val=""/>
       <w:lvlJc w:val="left"/>
     </w:lvl>
-    <w:lvl w:ilvl="6" w:tplc="91D63C1C">
+    <w:lvl w:ilvl="6" w:tplc="6E5ACDC2">
       <w:numFmt w:val="decimal"/>
       <w:lvlText w:val=""/>
       <w:lvlJc w:val="left"/>
     </w:lvl>
-    <w:lvl w:ilvl="7" w:tplc="896EBD7A">
+    <w:lvl w:ilvl="7" w:tplc="197ADC6C">
       <w:numFmt w:val="decimal"/>
       <w:lvlText w:val=""/>
       <w:lvlJc w:val="left"/>
     </w:lvl>
-    <w:lvl w:ilvl="8" w:tplc="785842DC">
+    <w:lvl w:ilvl="8" w:tplc="BE72AE30">
       <w:numFmt w:val="decimal"/>
       <w:lvlText w:val=""/>
       <w:lvlJc w:val="left"/>
     </w:lvl>
   </w:abstractNum>
-  <w:num w:numId="1" w16cid:durableId="986974028">
+  <w:num w:numId="1" w16cid:durableId="460658424">
     <w:abstractNumId w:val="1"/>
     <w:lvlOverride w:ilvl="0">
       <w:startOverride w:val="1"/>
     </w:lvlOverride>
   </w:num>
-  <w:num w:numId="2" w16cid:durableId="1994023839">
+  <w:num w:numId="2" w16cid:durableId="306517984">
     <w:abstractNumId w:val="0"/>
     <w:lvlOverride w:ilvl="0">
       <w:startOverride w:val="1"/>
     </w:lvlOverride>
   </w:num>
-  <w:num w:numId="3" w16cid:durableId="2083985043">
+  <w:num w:numId="3" w16cid:durableId="1633057211">
     <w:abstractNumId w:val="2"/>
     <w:lvlOverride w:ilvl="0">
       <w:startOverride w:val="1"/>
     </w:lvlOverride>
   </w:num>
-  <w:num w:numId="4" w16cid:durableId="693117616">
+  <w:num w:numId="4" w16cid:durableId="1256665845">
     <w:abstractNumId w:val="2"/>
     <w:lvlOverride w:ilvl="0">
       <w:startOverride w:val="1"/>
     </w:lvlOverride>
   </w:num>
-  <w:num w:numId="5" w16cid:durableId="2033531064">
+  <w:num w:numId="5" w16cid:durableId="1802573858">
     <w:abstractNumId w:val="2"/>
     <w:lvlOverride w:ilvl="0">
       <w:startOverride w:val="1"/>
@@ -19296,7 +19516,7 @@
     <w:autoRedefine/>
     <w:uiPriority w:val="39"/>
     <w:unhideWhenUsed/>
-    <w:rsid w:val="00B47AA2"/>
+    <w:rsid w:val="00633F7A"/>
     <w:pPr>
       <w:spacing w:after="100"/>
     </w:pPr>
@@ -19308,7 +19528,7 @@
     <w:autoRedefine/>
     <w:uiPriority w:val="39"/>
     <w:unhideWhenUsed/>
-    <w:rsid w:val="00B47AA2"/>
+    <w:rsid w:val="00633F7A"/>
     <w:pPr>
       <w:spacing w:after="100"/>
       <w:ind w:left="210"/>
@@ -19320,7 +19540,7 @@
     <w:next w:val="Normal"/>
     <w:uiPriority w:val="99"/>
     <w:unhideWhenUsed/>
-    <w:rsid w:val="00B47AA2"/>
+    <w:rsid w:val="00633F7A"/>
   </w:style>
 </w:styles>
 </file>

</xml_diff>

<commit_message>
Docs for CR-012: ZP-DOC-01..04 2.2 draft also covers CR-012 (US-304 AC-304.2-5; FR-313..316); ZP-DOC-05 phone-only co-pilot data; ZP-DOC-07 Apply screen spec and route; ZP-DOC-08 TC-142, 547 passed; Test Summary Report; README; rebuilt
Co-Authored-By: Claude Opus 5.5 (1M context) <noreply@anthropic.com>
</commit_message>
<xml_diff>
--- a/docs/01-vision-and-scope/ZP-DOC-01_Vision-and-Scope.docx
+++ b/docs/01-vision-and-scope/ZP-DOC-01_Vision-and-Scope.docx
@@ -2155,6 +2155,122 @@
           </w:p>
         </w:tc>
       </w:tr>
+      <w:tr>
+        <w:tblPrEx>
+          <w:tblCellMar>
+            <w:top w:w="0" w:type="dxa"/>
+            <w:bottom w:w="0" w:type="dxa"/>
+          </w:tblCellMar>
+        </w:tblPrEx>
+        <w:trPr>
+          <w:cantSplit/>
+          <w:trHeight w:val="420"/>
+        </w:trPr>
+        <w:tc>
+          <w:tcPr>
+            <w:tcW w:w="964" w:type="dxa"/>
+            <w:tcBorders>
+              <w:top w:val="single" w:sz="4" w:space="0" w:color="C9D3D0"/>
+              <w:left w:val="single" w:sz="4" w:space="0" w:color="C9D3D0"/>
+              <w:bottom w:val="single" w:sz="4" w:space="0" w:color="C9D3D0"/>
+              <w:right w:val="single" w:sz="4" w:space="0" w:color="C9D3D0"/>
+            </w:tcBorders>
+            <w:tcMar>
+              <w:top w:w="50" w:type="dxa"/>
+              <w:left w:w="100" w:type="dxa"/>
+              <w:bottom w:w="50" w:type="dxa"/>
+              <w:right w:w="100" w:type="dxa"/>
+            </w:tcMar>
+          </w:tcPr>
+          <w:p>
+            <w:r>
+              <w:rPr>
+                <w:sz w:val="19"/>
+                <w:szCs w:val="19"/>
+              </w:rPr>
+              <w:t>2.2 (draft)</w:t>
+            </w:r>
+          </w:p>
+        </w:tc>
+        <w:tc>
+          <w:tcPr>
+            <w:tcW w:w="1542" w:type="dxa"/>
+            <w:tcBorders>
+              <w:top w:val="single" w:sz="4" w:space="0" w:color="C9D3D0"/>
+              <w:left w:val="single" w:sz="4" w:space="0" w:color="C9D3D0"/>
+              <w:bottom w:val="single" w:sz="4" w:space="0" w:color="C9D3D0"/>
+              <w:right w:val="single" w:sz="4" w:space="0" w:color="C9D3D0"/>
+            </w:tcBorders>
+            <w:tcMar>
+              <w:top w:w="50" w:type="dxa"/>
+              <w:left w:w="100" w:type="dxa"/>
+              <w:bottom w:w="50" w:type="dxa"/>
+              <w:right w:w="100" w:type="dxa"/>
+            </w:tcMar>
+          </w:tcPr>
+          <w:p>
+            <w:r>
+              <w:rPr>
+                <w:sz w:val="19"/>
+                <w:szCs w:val="19"/>
+              </w:rPr>
+              <w:t>23 Oct 2026</w:t>
+            </w:r>
+          </w:p>
+        </w:tc>
+        <w:tc>
+          <w:tcPr>
+            <w:tcW w:w="1928" w:type="dxa"/>
+            <w:tcBorders>
+              <w:top w:val="single" w:sz="4" w:space="0" w:color="C9D3D0"/>
+              <w:left w:val="single" w:sz="4" w:space="0" w:color="C9D3D0"/>
+              <w:bottom w:val="single" w:sz="4" w:space="0" w:color="C9D3D0"/>
+              <w:right w:val="single" w:sz="4" w:space="0" w:color="C9D3D0"/>
+            </w:tcBorders>
+            <w:tcMar>
+              <w:top w:w="50" w:type="dxa"/>
+              <w:left w:w="100" w:type="dxa"/>
+              <w:bottom w:w="50" w:type="dxa"/>
+              <w:right w:w="100" w:type="dxa"/>
+            </w:tcMar>
+          </w:tcPr>
+          <w:p>
+            <w:r>
+              <w:rPr>
+                <w:sz w:val="19"/>
+                <w:szCs w:val="19"/>
+              </w:rPr>
+              <w:t>Team Kestrel</w:t>
+            </w:r>
+          </w:p>
+        </w:tc>
+        <w:tc>
+          <w:tcPr>
+            <w:tcW w:w="5204" w:type="dxa"/>
+            <w:tcBorders>
+              <w:top w:val="single" w:sz="4" w:space="0" w:color="C9D3D0"/>
+              <w:left w:val="single" w:sz="4" w:space="0" w:color="C9D3D0"/>
+              <w:bottom w:val="single" w:sz="4" w:space="0" w:color="C9D3D0"/>
+              <w:right w:val="single" w:sz="4" w:space="0" w:color="C9D3D0"/>
+            </w:tcBorders>
+            <w:tcMar>
+              <w:top w:w="50" w:type="dxa"/>
+              <w:left w:w="100" w:type="dxa"/>
+              <w:bottom w:w="50" w:type="dxa"/>
+              <w:right w:w="100" w:type="dxa"/>
+            </w:tcMar>
+          </w:tcPr>
+          <w:p>
+            <w:r>
+              <w:rPr>
+                <w:sz w:val="19"/>
+                <w:szCs w:val="19"/>
+              </w:rPr>
+              <w:t>Also CR-012 (UGC application co-pilot); awaiting approval</w:t>
+            </w:r>
+          </w:p>
+        </w:tc>
+      </w:tr>
     </w:tbl>
     <w:p>
       <w:pPr>
@@ -2570,7 +2686,7 @@
     <w:sdt>
       <w:sdtPr>
         <w:alias w:val="Contents"/>
-        <w:id w:val="803580567"/>
+        <w:id w:val="641474044"/>
       </w:sdtPr>
       <w:sdtEndPr/>
       <w:sdtContent>
@@ -2599,7 +2715,7 @@
           <w:r>
             <w:fldChar w:fldCharType="separate"/>
           </w:r>
-          <w:hyperlink w:anchor="_Toc243647754" w:history="1">
+          <w:hyperlink w:anchor="_Toc243650732" w:history="1">
             <w:r>
               <w:rPr>
                 <w:rStyle w:val="Hyperlink"/>
@@ -2623,7 +2739,7 @@
               <w:rPr>
                 <w:noProof/>
               </w:rPr>
-              <w:instrText xml:space="preserve"> PAGEREF _Toc243647754 \h </w:instrText>
+              <w:instrText xml:space="preserve"> PAGEREF _Toc243650732 \h </w:instrText>
             </w:r>
             <w:r>
               <w:rPr>
@@ -2666,7 +2782,7 @@
               <w14:ligatures w14:val="standardContextual"/>
             </w:rPr>
           </w:pPr>
-          <w:hyperlink w:anchor="_Toc243647755" w:history="1">
+          <w:hyperlink w:anchor="_Toc243650733" w:history="1">
             <w:r>
               <w:rPr>
                 <w:rStyle w:val="Hyperlink"/>
@@ -2690,7 +2806,7 @@
               <w:rPr>
                 <w:noProof/>
               </w:rPr>
-              <w:instrText xml:space="preserve"> PAGEREF _Toc243647755 \h </w:instrText>
+              <w:instrText xml:space="preserve"> PAGEREF _Toc243650733 \h </w:instrText>
             </w:r>
             <w:r>
               <w:rPr>
@@ -2733,7 +2849,7 @@
               <w14:ligatures w14:val="standardContextual"/>
             </w:rPr>
           </w:pPr>
-          <w:hyperlink w:anchor="_Toc243647756" w:history="1">
+          <w:hyperlink w:anchor="_Toc243650734" w:history="1">
             <w:r>
               <w:rPr>
                 <w:rStyle w:val="Hyperlink"/>
@@ -2757,7 +2873,7 @@
               <w:rPr>
                 <w:noProof/>
               </w:rPr>
-              <w:instrText xml:space="preserve"> PAGEREF _Toc243647756 \h </w:instrText>
+              <w:instrText xml:space="preserve"> PAGEREF _Toc243650734 \h </w:instrText>
             </w:r>
             <w:r>
               <w:rPr>
@@ -2800,7 +2916,7 @@
               <w14:ligatures w14:val="standardContextual"/>
             </w:rPr>
           </w:pPr>
-          <w:hyperlink w:anchor="_Toc243647757" w:history="1">
+          <w:hyperlink w:anchor="_Toc243650735" w:history="1">
             <w:r>
               <w:rPr>
                 <w:rStyle w:val="Hyperlink"/>
@@ -2824,7 +2940,7 @@
               <w:rPr>
                 <w:noProof/>
               </w:rPr>
-              <w:instrText xml:space="preserve"> PAGEREF _Toc243647757 \h </w:instrText>
+              <w:instrText xml:space="preserve"> PAGEREF _Toc243650735 \h </w:instrText>
             </w:r>
             <w:r>
               <w:rPr>
@@ -2867,7 +2983,7 @@
               <w14:ligatures w14:val="standardContextual"/>
             </w:rPr>
           </w:pPr>
-          <w:hyperlink w:anchor="_Toc243647758" w:history="1">
+          <w:hyperlink w:anchor="_Toc243650736" w:history="1">
             <w:r>
               <w:rPr>
                 <w:rStyle w:val="Hyperlink"/>
@@ -2891,7 +3007,7 @@
               <w:rPr>
                 <w:noProof/>
               </w:rPr>
-              <w:instrText xml:space="preserve"> PAGEREF _Toc243647758 \h </w:instrText>
+              <w:instrText xml:space="preserve"> PAGEREF _Toc243650736 \h </w:instrText>
             </w:r>
             <w:r>
               <w:rPr>
@@ -2934,7 +3050,7 @@
               <w14:ligatures w14:val="standardContextual"/>
             </w:rPr>
           </w:pPr>
-          <w:hyperlink w:anchor="_Toc243647759" w:history="1">
+          <w:hyperlink w:anchor="_Toc243650737" w:history="1">
             <w:r>
               <w:rPr>
                 <w:rStyle w:val="Hyperlink"/>
@@ -2958,7 +3074,7 @@
               <w:rPr>
                 <w:noProof/>
               </w:rPr>
-              <w:instrText xml:space="preserve"> PAGEREF _Toc243647759 \h </w:instrText>
+              <w:instrText xml:space="preserve"> PAGEREF _Toc243650737 \h </w:instrText>
             </w:r>
             <w:r>
               <w:rPr>
@@ -3001,7 +3117,7 @@
               <w14:ligatures w14:val="standardContextual"/>
             </w:rPr>
           </w:pPr>
-          <w:hyperlink w:anchor="_Toc243647760" w:history="1">
+          <w:hyperlink w:anchor="_Toc243650738" w:history="1">
             <w:r>
               <w:rPr>
                 <w:rStyle w:val="Hyperlink"/>
@@ -3025,7 +3141,7 @@
               <w:rPr>
                 <w:noProof/>
               </w:rPr>
-              <w:instrText xml:space="preserve"> PAGEREF _Toc243647760 \h </w:instrText>
+              <w:instrText xml:space="preserve"> PAGEREF _Toc243650738 \h </w:instrText>
             </w:r>
             <w:r>
               <w:rPr>
@@ -3068,7 +3184,7 @@
               <w14:ligatures w14:val="standardContextual"/>
             </w:rPr>
           </w:pPr>
-          <w:hyperlink w:anchor="_Toc243647761" w:history="1">
+          <w:hyperlink w:anchor="_Toc243650739" w:history="1">
             <w:r>
               <w:rPr>
                 <w:rStyle w:val="Hyperlink"/>
@@ -3092,7 +3208,7 @@
               <w:rPr>
                 <w:noProof/>
               </w:rPr>
-              <w:instrText xml:space="preserve"> PAGEREF _Toc243647761 \h </w:instrText>
+              <w:instrText xml:space="preserve"> PAGEREF _Toc243650739 \h </w:instrText>
             </w:r>
             <w:r>
               <w:rPr>
@@ -3135,7 +3251,7 @@
               <w14:ligatures w14:val="standardContextual"/>
             </w:rPr>
           </w:pPr>
-          <w:hyperlink w:anchor="_Toc243647762" w:history="1">
+          <w:hyperlink w:anchor="_Toc243650740" w:history="1">
             <w:r>
               <w:rPr>
                 <w:rStyle w:val="Hyperlink"/>
@@ -3159,7 +3275,7 @@
               <w:rPr>
                 <w:noProof/>
               </w:rPr>
-              <w:instrText xml:space="preserve"> PAGEREF _Toc243647762 \h </w:instrText>
+              <w:instrText xml:space="preserve"> PAGEREF _Toc243650740 \h </w:instrText>
             </w:r>
             <w:r>
               <w:rPr>
@@ -3202,7 +3318,7 @@
               <w14:ligatures w14:val="standardContextual"/>
             </w:rPr>
           </w:pPr>
-          <w:hyperlink w:anchor="_Toc243647763" w:history="1">
+          <w:hyperlink w:anchor="_Toc243650741" w:history="1">
             <w:r>
               <w:rPr>
                 <w:rStyle w:val="Hyperlink"/>
@@ -3226,7 +3342,7 @@
               <w:rPr>
                 <w:noProof/>
               </w:rPr>
-              <w:instrText xml:space="preserve"> PAGEREF _Toc243647763 \h </w:instrText>
+              <w:instrText xml:space="preserve"> PAGEREF _Toc243650741 \h </w:instrText>
             </w:r>
             <w:r>
               <w:rPr>
@@ -3269,7 +3385,7 @@
               <w14:ligatures w14:val="standardContextual"/>
             </w:rPr>
           </w:pPr>
-          <w:hyperlink w:anchor="_Toc243647764" w:history="1">
+          <w:hyperlink w:anchor="_Toc243650742" w:history="1">
             <w:r>
               <w:rPr>
                 <w:rStyle w:val="Hyperlink"/>
@@ -3293,7 +3409,7 @@
               <w:rPr>
                 <w:noProof/>
               </w:rPr>
-              <w:instrText xml:space="preserve"> PAGEREF _Toc243647764 \h </w:instrText>
+              <w:instrText xml:space="preserve"> PAGEREF _Toc243650742 \h </w:instrText>
             </w:r>
             <w:r>
               <w:rPr>
@@ -3336,7 +3452,7 @@
               <w14:ligatures w14:val="standardContextual"/>
             </w:rPr>
           </w:pPr>
-          <w:hyperlink w:anchor="_Toc243647765" w:history="1">
+          <w:hyperlink w:anchor="_Toc243650743" w:history="1">
             <w:r>
               <w:rPr>
                 <w:rStyle w:val="Hyperlink"/>
@@ -3360,7 +3476,7 @@
               <w:rPr>
                 <w:noProof/>
               </w:rPr>
-              <w:instrText xml:space="preserve"> PAGEREF _Toc243647765 \h </w:instrText>
+              <w:instrText xml:space="preserve"> PAGEREF _Toc243650743 \h </w:instrText>
             </w:r>
             <w:r>
               <w:rPr>
@@ -3403,7 +3519,7 @@
               <w14:ligatures w14:val="standardContextual"/>
             </w:rPr>
           </w:pPr>
-          <w:hyperlink w:anchor="_Toc243647766" w:history="1">
+          <w:hyperlink w:anchor="_Toc243650744" w:history="1">
             <w:r>
               <w:rPr>
                 <w:rStyle w:val="Hyperlink"/>
@@ -3427,7 +3543,7 @@
               <w:rPr>
                 <w:noProof/>
               </w:rPr>
-              <w:instrText xml:space="preserve"> PAGEREF _Toc243647766 \h </w:instrText>
+              <w:instrText xml:space="preserve"> PAGEREF _Toc243650744 \h </w:instrText>
             </w:r>
             <w:r>
               <w:rPr>
@@ -3470,7 +3586,7 @@
               <w14:ligatures w14:val="standardContextual"/>
             </w:rPr>
           </w:pPr>
-          <w:hyperlink w:anchor="_Toc243647767" w:history="1">
+          <w:hyperlink w:anchor="_Toc243650745" w:history="1">
             <w:r>
               <w:rPr>
                 <w:rStyle w:val="Hyperlink"/>
@@ -3494,7 +3610,7 @@
               <w:rPr>
                 <w:noProof/>
               </w:rPr>
-              <w:instrText xml:space="preserve"> PAGEREF _Toc243647767 \h </w:instrText>
+              <w:instrText xml:space="preserve"> PAGEREF _Toc243650745 \h </w:instrText>
             </w:r>
             <w:r>
               <w:rPr>
@@ -3537,7 +3653,7 @@
               <w14:ligatures w14:val="standardContextual"/>
             </w:rPr>
           </w:pPr>
-          <w:hyperlink w:anchor="_Toc243647768" w:history="1">
+          <w:hyperlink w:anchor="_Toc243650746" w:history="1">
             <w:r>
               <w:rPr>
                 <w:rStyle w:val="Hyperlink"/>
@@ -3561,7 +3677,7 @@
               <w:rPr>
                 <w:noProof/>
               </w:rPr>
-              <w:instrText xml:space="preserve"> PAGEREF _Toc243647768 \h </w:instrText>
+              <w:instrText xml:space="preserve"> PAGEREF _Toc243650746 \h </w:instrText>
             </w:r>
             <w:r>
               <w:rPr>
@@ -3604,7 +3720,7 @@
               <w14:ligatures w14:val="standardContextual"/>
             </w:rPr>
           </w:pPr>
-          <w:hyperlink w:anchor="_Toc243647769" w:history="1">
+          <w:hyperlink w:anchor="_Toc243650747" w:history="1">
             <w:r>
               <w:rPr>
                 <w:rStyle w:val="Hyperlink"/>
@@ -3628,7 +3744,7 @@
               <w:rPr>
                 <w:noProof/>
               </w:rPr>
-              <w:instrText xml:space="preserve"> PAGEREF _Toc243647769 \h </w:instrText>
+              <w:instrText xml:space="preserve"> PAGEREF _Toc243650747 \h </w:instrText>
             </w:r>
             <w:r>
               <w:rPr>
@@ -3671,7 +3787,7 @@
               <w14:ligatures w14:val="standardContextual"/>
             </w:rPr>
           </w:pPr>
-          <w:hyperlink w:anchor="_Toc243647770" w:history="1">
+          <w:hyperlink w:anchor="_Toc243650748" w:history="1">
             <w:r>
               <w:rPr>
                 <w:rStyle w:val="Hyperlink"/>
@@ -3695,7 +3811,7 @@
               <w:rPr>
                 <w:noProof/>
               </w:rPr>
-              <w:instrText xml:space="preserve"> PAGEREF _Toc243647770 \h </w:instrText>
+              <w:instrText xml:space="preserve"> PAGEREF _Toc243650748 \h </w:instrText>
             </w:r>
             <w:r>
               <w:rPr>
@@ -3738,7 +3854,7 @@
               <w14:ligatures w14:val="standardContextual"/>
             </w:rPr>
           </w:pPr>
-          <w:hyperlink w:anchor="_Toc243647771" w:history="1">
+          <w:hyperlink w:anchor="_Toc243650749" w:history="1">
             <w:r>
               <w:rPr>
                 <w:rStyle w:val="Hyperlink"/>
@@ -3762,7 +3878,7 @@
               <w:rPr>
                 <w:noProof/>
               </w:rPr>
-              <w:instrText xml:space="preserve"> PAGEREF _Toc243647771 \h </w:instrText>
+              <w:instrText xml:space="preserve"> PAGEREF _Toc243650749 \h </w:instrText>
             </w:r>
             <w:r>
               <w:rPr>
@@ -3805,7 +3921,7 @@
               <w14:ligatures w14:val="standardContextual"/>
             </w:rPr>
           </w:pPr>
-          <w:hyperlink w:anchor="_Toc243647772" w:history="1">
+          <w:hyperlink w:anchor="_Toc243650750" w:history="1">
             <w:r>
               <w:rPr>
                 <w:rStyle w:val="Hyperlink"/>
@@ -3829,7 +3945,7 @@
               <w:rPr>
                 <w:noProof/>
               </w:rPr>
-              <w:instrText xml:space="preserve"> PAGEREF _Toc243647772 \h </w:instrText>
+              <w:instrText xml:space="preserve"> PAGEREF _Toc243650750 \h </w:instrText>
             </w:r>
             <w:r>
               <w:rPr>
@@ -3872,7 +3988,7 @@
               <w14:ligatures w14:val="standardContextual"/>
             </w:rPr>
           </w:pPr>
-          <w:hyperlink w:anchor="_Toc243647773" w:history="1">
+          <w:hyperlink w:anchor="_Toc243650751" w:history="1">
             <w:r>
               <w:rPr>
                 <w:rStyle w:val="Hyperlink"/>
@@ -3896,7 +4012,7 @@
               <w:rPr>
                 <w:noProof/>
               </w:rPr>
-              <w:instrText xml:space="preserve"> PAGEREF _Toc243647773 \h </w:instrText>
+              <w:instrText xml:space="preserve"> PAGEREF _Toc243650751 \h </w:instrText>
             </w:r>
             <w:r>
               <w:rPr>
@@ -3939,7 +4055,7 @@
               <w14:ligatures w14:val="standardContextual"/>
             </w:rPr>
           </w:pPr>
-          <w:hyperlink w:anchor="_Toc243647774" w:history="1">
+          <w:hyperlink w:anchor="_Toc243650752" w:history="1">
             <w:r>
               <w:rPr>
                 <w:rStyle w:val="Hyperlink"/>
@@ -3963,7 +4079,7 @@
               <w:rPr>
                 <w:noProof/>
               </w:rPr>
-              <w:instrText xml:space="preserve"> PAGEREF _Toc243647774 \h </w:instrText>
+              <w:instrText xml:space="preserve"> PAGEREF _Toc243650752 \h </w:instrText>
             </w:r>
             <w:r>
               <w:rPr>
@@ -4006,7 +4122,7 @@
               <w14:ligatures w14:val="standardContextual"/>
             </w:rPr>
           </w:pPr>
-          <w:hyperlink w:anchor="_Toc243647775" w:history="1">
+          <w:hyperlink w:anchor="_Toc243650753" w:history="1">
             <w:r>
               <w:rPr>
                 <w:rStyle w:val="Hyperlink"/>
@@ -4030,7 +4146,7 @@
               <w:rPr>
                 <w:noProof/>
               </w:rPr>
-              <w:instrText xml:space="preserve"> PAGEREF _Toc243647775 \h </w:instrText>
+              <w:instrText xml:space="preserve"> PAGEREF _Toc243650753 \h </w:instrText>
             </w:r>
             <w:r>
               <w:rPr>
@@ -4073,7 +4189,7 @@
               <w14:ligatures w14:val="standardContextual"/>
             </w:rPr>
           </w:pPr>
-          <w:hyperlink w:anchor="_Toc243647776" w:history="1">
+          <w:hyperlink w:anchor="_Toc243650754" w:history="1">
             <w:r>
               <w:rPr>
                 <w:rStyle w:val="Hyperlink"/>
@@ -4097,7 +4213,7 @@
               <w:rPr>
                 <w:noProof/>
               </w:rPr>
-              <w:instrText xml:space="preserve"> PAGEREF _Toc243647776 \h </w:instrText>
+              <w:instrText xml:space="preserve"> PAGEREF _Toc243650754 \h </w:instrText>
             </w:r>
             <w:r>
               <w:rPr>
@@ -4140,7 +4256,7 @@
               <w14:ligatures w14:val="standardContextual"/>
             </w:rPr>
           </w:pPr>
-          <w:hyperlink w:anchor="_Toc243647777" w:history="1">
+          <w:hyperlink w:anchor="_Toc243650755" w:history="1">
             <w:r>
               <w:rPr>
                 <w:rStyle w:val="Hyperlink"/>
@@ -4164,7 +4280,7 @@
               <w:rPr>
                 <w:noProof/>
               </w:rPr>
-              <w:instrText xml:space="preserve"> PAGEREF _Toc243647777 \h </w:instrText>
+              <w:instrText xml:space="preserve"> PAGEREF _Toc243650755 \h </w:instrText>
             </w:r>
             <w:r>
               <w:rPr>
@@ -4207,7 +4323,7 @@
               <w14:ligatures w14:val="standardContextual"/>
             </w:rPr>
           </w:pPr>
-          <w:hyperlink w:anchor="_Toc243647778" w:history="1">
+          <w:hyperlink w:anchor="_Toc243650756" w:history="1">
             <w:r>
               <w:rPr>
                 <w:rStyle w:val="Hyperlink"/>
@@ -4231,7 +4347,7 @@
               <w:rPr>
                 <w:noProof/>
               </w:rPr>
-              <w:instrText xml:space="preserve"> PAGEREF _Toc243647778 \h </w:instrText>
+              <w:instrText xml:space="preserve"> PAGEREF _Toc243650756 \h </w:instrText>
             </w:r>
             <w:r>
               <w:rPr>
@@ -4274,7 +4390,7 @@
               <w14:ligatures w14:val="standardContextual"/>
             </w:rPr>
           </w:pPr>
-          <w:hyperlink w:anchor="_Toc243647779" w:history="1">
+          <w:hyperlink w:anchor="_Toc243650757" w:history="1">
             <w:r>
               <w:rPr>
                 <w:rStyle w:val="Hyperlink"/>
@@ -4298,7 +4414,7 @@
               <w:rPr>
                 <w:noProof/>
               </w:rPr>
-              <w:instrText xml:space="preserve"> PAGEREF _Toc243647779 \h </w:instrText>
+              <w:instrText xml:space="preserve"> PAGEREF _Toc243650757 \h </w:instrText>
             </w:r>
             <w:r>
               <w:rPr>
@@ -4344,7 +4460,7 @@
     <w:sdt>
       <w:sdtPr>
         <w:alias w:val="Figures"/>
-        <w:id w:val="-894895529"/>
+        <w:id w:val="-1486929717"/>
       </w:sdtPr>
       <w:sdtEndPr/>
       <w:sdtContent>
@@ -4373,7 +4489,7 @@
           <w:r>
             <w:fldChar w:fldCharType="separate"/>
           </w:r>
-          <w:hyperlink w:anchor="_Toc243647780" w:history="1">
+          <w:hyperlink w:anchor="_Toc243650758" w:history="1">
             <w:r>
               <w:rPr>
                 <w:rStyle w:val="Hyperlink"/>
@@ -4397,7 +4513,7 @@
               <w:rPr>
                 <w:noProof/>
               </w:rPr>
-              <w:instrText xml:space="preserve"> PAGEREF _Toc243647780 \h </w:instrText>
+              <w:instrText xml:space="preserve"> PAGEREF _Toc243650758 \h </w:instrText>
             </w:r>
             <w:r>
               <w:rPr>
@@ -4443,7 +4559,7 @@
     <w:sdt>
       <w:sdtPr>
         <w:alias w:val="Tables"/>
-        <w:id w:val="1258176515"/>
+        <w:id w:val="176934008"/>
       </w:sdtPr>
       <w:sdtEndPr/>
       <w:sdtContent>
@@ -4472,7 +4588,7 @@
           <w:r>
             <w:fldChar w:fldCharType="separate"/>
           </w:r>
-          <w:hyperlink w:anchor="_Toc243647781" w:history="1">
+          <w:hyperlink w:anchor="_Toc243650759" w:history="1">
             <w:r>
               <w:rPr>
                 <w:rStyle w:val="Hyperlink"/>
@@ -4496,7 +4612,7 @@
               <w:rPr>
                 <w:noProof/>
               </w:rPr>
-              <w:instrText xml:space="preserve"> PAGEREF _Toc243647781 \h </w:instrText>
+              <w:instrText xml:space="preserve"> PAGEREF _Toc243650759 \h </w:instrText>
             </w:r>
             <w:r>
               <w:rPr>
@@ -4539,7 +4655,7 @@
               <w14:ligatures w14:val="standardContextual"/>
             </w:rPr>
           </w:pPr>
-          <w:hyperlink w:anchor="_Toc243647782" w:history="1">
+          <w:hyperlink w:anchor="_Toc243650760" w:history="1">
             <w:r>
               <w:rPr>
                 <w:rStyle w:val="Hyperlink"/>
@@ -4563,7 +4679,7 @@
               <w:rPr>
                 <w:noProof/>
               </w:rPr>
-              <w:instrText xml:space="preserve"> PAGEREF _Toc243647782 \h </w:instrText>
+              <w:instrText xml:space="preserve"> PAGEREF _Toc243650760 \h </w:instrText>
             </w:r>
             <w:r>
               <w:rPr>
@@ -4606,7 +4722,7 @@
               <w14:ligatures w14:val="standardContextual"/>
             </w:rPr>
           </w:pPr>
-          <w:hyperlink w:anchor="_Toc243647783" w:history="1">
+          <w:hyperlink w:anchor="_Toc243650761" w:history="1">
             <w:r>
               <w:rPr>
                 <w:rStyle w:val="Hyperlink"/>
@@ -4630,7 +4746,7 @@
               <w:rPr>
                 <w:noProof/>
               </w:rPr>
-              <w:instrText xml:space="preserve"> PAGEREF _Toc243647783 \h </w:instrText>
+              <w:instrText xml:space="preserve"> PAGEREF _Toc243650761 \h </w:instrText>
             </w:r>
             <w:r>
               <w:rPr>
@@ -4673,7 +4789,7 @@
               <w14:ligatures w14:val="standardContextual"/>
             </w:rPr>
           </w:pPr>
-          <w:hyperlink w:anchor="_Toc243647784" w:history="1">
+          <w:hyperlink w:anchor="_Toc243650762" w:history="1">
             <w:r>
               <w:rPr>
                 <w:rStyle w:val="Hyperlink"/>
@@ -4697,7 +4813,7 @@
               <w:rPr>
                 <w:noProof/>
               </w:rPr>
-              <w:instrText xml:space="preserve"> PAGEREF _Toc243647784 \h </w:instrText>
+              <w:instrText xml:space="preserve"> PAGEREF _Toc243650762 \h </w:instrText>
             </w:r>
             <w:r>
               <w:rPr>
@@ -4740,7 +4856,7 @@
               <w14:ligatures w14:val="standardContextual"/>
             </w:rPr>
           </w:pPr>
-          <w:hyperlink w:anchor="_Toc243647785" w:history="1">
+          <w:hyperlink w:anchor="_Toc243650763" w:history="1">
             <w:r>
               <w:rPr>
                 <w:rStyle w:val="Hyperlink"/>
@@ -4764,7 +4880,7 @@
               <w:rPr>
                 <w:noProof/>
               </w:rPr>
-              <w:instrText xml:space="preserve"> PAGEREF _Toc243647785 \h </w:instrText>
+              <w:instrText xml:space="preserve"> PAGEREF _Toc243650763 \h </w:instrText>
             </w:r>
             <w:r>
               <w:rPr>
@@ -4807,7 +4923,7 @@
               <w14:ligatures w14:val="standardContextual"/>
             </w:rPr>
           </w:pPr>
-          <w:hyperlink w:anchor="_Toc243647786" w:history="1">
+          <w:hyperlink w:anchor="_Toc243650764" w:history="1">
             <w:r>
               <w:rPr>
                 <w:rStyle w:val="Hyperlink"/>
@@ -4831,7 +4947,7 @@
               <w:rPr>
                 <w:noProof/>
               </w:rPr>
-              <w:instrText xml:space="preserve"> PAGEREF _Toc243647786 \h </w:instrText>
+              <w:instrText xml:space="preserve"> PAGEREF _Toc243650764 \h </w:instrText>
             </w:r>
             <w:r>
               <w:rPr>
@@ -4874,7 +4990,7 @@
               <w14:ligatures w14:val="standardContextual"/>
             </w:rPr>
           </w:pPr>
-          <w:hyperlink w:anchor="_Toc243647787" w:history="1">
+          <w:hyperlink w:anchor="_Toc243650765" w:history="1">
             <w:r>
               <w:rPr>
                 <w:rStyle w:val="Hyperlink"/>
@@ -4898,7 +5014,7 @@
               <w:rPr>
                 <w:noProof/>
               </w:rPr>
-              <w:instrText xml:space="preserve"> PAGEREF _Toc243647787 \h </w:instrText>
+              <w:instrText xml:space="preserve"> PAGEREF _Toc243650765 \h </w:instrText>
             </w:r>
             <w:r>
               <w:rPr>
@@ -4941,7 +5057,7 @@
               <w14:ligatures w14:val="standardContextual"/>
             </w:rPr>
           </w:pPr>
-          <w:hyperlink w:anchor="_Toc243647788" w:history="1">
+          <w:hyperlink w:anchor="_Toc243650766" w:history="1">
             <w:r>
               <w:rPr>
                 <w:rStyle w:val="Hyperlink"/>
@@ -4965,7 +5081,7 @@
               <w:rPr>
                 <w:noProof/>
               </w:rPr>
-              <w:instrText xml:space="preserve"> PAGEREF _Toc243647788 \h </w:instrText>
+              <w:instrText xml:space="preserve"> PAGEREF _Toc243650766 \h </w:instrText>
             </w:r>
             <w:r>
               <w:rPr>
@@ -5008,7 +5124,7 @@
               <w14:ligatures w14:val="standardContextual"/>
             </w:rPr>
           </w:pPr>
-          <w:hyperlink w:anchor="_Toc243647789" w:history="1">
+          <w:hyperlink w:anchor="_Toc243650767" w:history="1">
             <w:r>
               <w:rPr>
                 <w:rStyle w:val="Hyperlink"/>
@@ -5032,7 +5148,7 @@
               <w:rPr>
                 <w:noProof/>
               </w:rPr>
-              <w:instrText xml:space="preserve"> PAGEREF _Toc243647789 \h </w:instrText>
+              <w:instrText xml:space="preserve"> PAGEREF _Toc243650767 \h </w:instrText>
             </w:r>
             <w:r>
               <w:rPr>
@@ -5075,7 +5191,7 @@
               <w14:ligatures w14:val="standardContextual"/>
             </w:rPr>
           </w:pPr>
-          <w:hyperlink w:anchor="_Toc243647790" w:history="1">
+          <w:hyperlink w:anchor="_Toc243650768" w:history="1">
             <w:r>
               <w:rPr>
                 <w:rStyle w:val="Hyperlink"/>
@@ -5099,7 +5215,7 @@
               <w:rPr>
                 <w:noProof/>
               </w:rPr>
-              <w:instrText xml:space="preserve"> PAGEREF _Toc243647790 \h </w:instrText>
+              <w:instrText xml:space="preserve"> PAGEREF _Toc243650768 \h </w:instrText>
             </w:r>
             <w:r>
               <w:rPr>
@@ -5142,7 +5258,7 @@
               <w14:ligatures w14:val="standardContextual"/>
             </w:rPr>
           </w:pPr>
-          <w:hyperlink w:anchor="_Toc243647791" w:history="1">
+          <w:hyperlink w:anchor="_Toc243650769" w:history="1">
             <w:r>
               <w:rPr>
                 <w:rStyle w:val="Hyperlink"/>
@@ -5166,7 +5282,7 @@
               <w:rPr>
                 <w:noProof/>
               </w:rPr>
-              <w:instrText xml:space="preserve"> PAGEREF _Toc243647791 \h </w:instrText>
+              <w:instrText xml:space="preserve"> PAGEREF _Toc243650769 \h </w:instrText>
             </w:r>
             <w:r>
               <w:rPr>
@@ -5209,7 +5325,7 @@
               <w14:ligatures w14:val="standardContextual"/>
             </w:rPr>
           </w:pPr>
-          <w:hyperlink w:anchor="_Toc243647792" w:history="1">
+          <w:hyperlink w:anchor="_Toc243650770" w:history="1">
             <w:r>
               <w:rPr>
                 <w:rStyle w:val="Hyperlink"/>
@@ -5233,7 +5349,7 @@
               <w:rPr>
                 <w:noProof/>
               </w:rPr>
-              <w:instrText xml:space="preserve"> PAGEREF _Toc243647792 \h </w:instrText>
+              <w:instrText xml:space="preserve"> PAGEREF _Toc243650770 \h </w:instrText>
             </w:r>
             <w:r>
               <w:rPr>
@@ -5276,7 +5392,7 @@
               <w14:ligatures w14:val="standardContextual"/>
             </w:rPr>
           </w:pPr>
-          <w:hyperlink w:anchor="_Toc243647793" w:history="1">
+          <w:hyperlink w:anchor="_Toc243650771" w:history="1">
             <w:r>
               <w:rPr>
                 <w:rStyle w:val="Hyperlink"/>
@@ -5300,7 +5416,7 @@
               <w:rPr>
                 <w:noProof/>
               </w:rPr>
-              <w:instrText xml:space="preserve"> PAGEREF _Toc243647793 \h </w:instrText>
+              <w:instrText xml:space="preserve"> PAGEREF _Toc243650771 \h </w:instrText>
             </w:r>
             <w:r>
               <w:rPr>
@@ -5341,7 +5457,7 @@
         <w:keepLines/>
         <w:pageBreakBefore/>
       </w:pPr>
-      <w:bookmarkStart w:id="0" w:name="_Toc243647754"/>
+      <w:bookmarkStart w:id="0" w:name="_Toc243650732"/>
       <w:r>
         <w:lastRenderedPageBreak/>
         <w:t>1 Introduction</w:t>
@@ -5354,7 +5470,7 @@
         <w:keepNext/>
         <w:keepLines/>
       </w:pPr>
-      <w:bookmarkStart w:id="1" w:name="_Toc243647755"/>
+      <w:bookmarkStart w:id="1" w:name="_Toc243650733"/>
       <w:r>
         <w:t>1.1 Purpose</w:t>
       </w:r>
@@ -5395,10 +5511,7 @@
         <w:t>how</w:t>
       </w:r>
       <w:r>
-        <w:t xml:space="preserve"> its success </w:t>
-      </w:r>
-      <w:r>
-        <w:t>will be judged. It is the parent of every other ZedPath document: user stories (ZP-DOC-02) refine its features, and the requirements specification (ZP-DOC-03) makes them precise.</w:t>
+        <w:t xml:space="preserve"> its success will be judged. It is the parent of every other ZedPath document: user stories (ZP-DOC-02) refine its features, and the requirements specification (ZP-DOC-03) makes them precise.</w:t>
       </w:r>
     </w:p>
     <w:p>
@@ -5407,7 +5520,7 @@
         <w:keepNext/>
         <w:keepLines/>
       </w:pPr>
-      <w:bookmarkStart w:id="2" w:name="_Toc243647756"/>
+      <w:bookmarkStart w:id="2" w:name="_Toc243650734"/>
       <w:r>
         <w:t>1.2 Scope</w:t>
       </w:r>
@@ -5418,7 +5531,10 @@
         <w:spacing w:after="120"/>
       </w:pPr>
       <w:r>
-        <w:t>It covers the business requirements, the product vision, the scope of the first two releases, and the business context (stakeholders, priorities, risks and deployment constraints). Technical design is out of scope.</w:t>
+        <w:t xml:space="preserve">It covers the business requirements, the product vision, the scope of the first two releases, and the </w:t>
+      </w:r>
+      <w:r>
+        <w:t>business context (stakeholders, priorities, risks and deployment constraints). Technical design is out of scope.</w:t>
       </w:r>
     </w:p>
     <w:p>
@@ -5427,7 +5543,7 @@
         <w:keepNext/>
         <w:keepLines/>
       </w:pPr>
-      <w:bookmarkStart w:id="3" w:name="_Toc243647757"/>
+      <w:bookmarkStart w:id="3" w:name="_Toc243650735"/>
       <w:r>
         <w:t>1.3 Intended audience</w:t>
       </w:r>
@@ -5447,7 +5563,7 @@
         <w:keepNext/>
         <w:keepLines/>
       </w:pPr>
-      <w:bookmarkStart w:id="4" w:name="_Toc243647758"/>
+      <w:bookmarkStart w:id="4" w:name="_Toc243650736"/>
       <w:r>
         <w:t>1.4 Relationship to other documents</w:t>
       </w:r>
@@ -5458,7 +5574,7 @@
         <w:pStyle w:val="Caption"/>
         <w:keepNext/>
       </w:pPr>
-      <w:bookmarkStart w:id="5" w:name="_Toc243647781"/>
+      <w:bookmarkStart w:id="5" w:name="_Toc243650759"/>
       <w:r>
         <w:t xml:space="preserve">Table </w:t>
       </w:r>
@@ -5886,7 +6002,7 @@
         <w:keepNext/>
         <w:keepLines/>
       </w:pPr>
-      <w:bookmarkStart w:id="6" w:name="_Toc243647759"/>
+      <w:bookmarkStart w:id="6" w:name="_Toc243650737"/>
       <w:r>
         <w:t>1.5 Changes since version 1.0</w:t>
       </w:r>
@@ -5915,7 +6031,7 @@
         <w:pStyle w:val="Caption"/>
         <w:keepNext/>
       </w:pPr>
-      <w:bookmarkStart w:id="7" w:name="_Toc243647782"/>
+      <w:bookmarkStart w:id="7" w:name="_Toc243650760"/>
       <w:r>
         <w:t xml:space="preserve">Table </w:t>
       </w:r>
@@ -6839,7 +6955,7 @@
         <w:keepNext/>
         <w:keepLines/>
       </w:pPr>
-      <w:bookmarkStart w:id="8" w:name="_Toc243647760"/>
+      <w:bookmarkStart w:id="8" w:name="_Toc243650738"/>
       <w:r>
         <w:t>1.6 Changes since version 2.0</w:t>
       </w:r>
@@ -6888,7 +7004,7 @@
         <w:pStyle w:val="Caption"/>
         <w:keepNext/>
       </w:pPr>
-      <w:bookmarkStart w:id="9" w:name="_Toc243647783"/>
+      <w:bookmarkStart w:id="9" w:name="_Toc243650761"/>
       <w:r>
         <w:t xml:space="preserve">Table </w:t>
       </w:r>
@@ -7755,6 +7871,107 @@
           </w:p>
         </w:tc>
       </w:tr>
+      <w:tr>
+        <w:tblPrEx>
+          <w:tblCellMar>
+            <w:top w:w="0" w:type="dxa"/>
+            <w:bottom w:w="0" w:type="dxa"/>
+          </w:tblCellMar>
+        </w:tblPrEx>
+        <w:trPr>
+          <w:cantSplit/>
+        </w:trPr>
+        <w:tc>
+          <w:tcPr>
+            <w:tcW w:w="878" w:type="dxa"/>
+            <w:tcBorders>
+              <w:top w:val="single" w:sz="4" w:space="0" w:color="C9D3D0"/>
+              <w:left w:val="single" w:sz="4" w:space="0" w:color="C9D3D0"/>
+              <w:bottom w:val="single" w:sz="4" w:space="0" w:color="C9D3D0"/>
+              <w:right w:val="single" w:sz="4" w:space="0" w:color="C9D3D0"/>
+            </w:tcBorders>
+            <w:tcMar>
+              <w:top w:w="50" w:type="dxa"/>
+              <w:left w:w="100" w:type="dxa"/>
+              <w:bottom w:w="50" w:type="dxa"/>
+              <w:right w:w="100" w:type="dxa"/>
+            </w:tcMar>
+            <w:vAlign w:val="center"/>
+          </w:tcPr>
+          <w:p>
+            <w:pPr>
+              <w:spacing w:line="252" w:lineRule="auto"/>
+            </w:pPr>
+            <w:r>
+              <w:rPr>
+                <w:sz w:val="19"/>
+                <w:szCs w:val="19"/>
+              </w:rPr>
+              <w:t>CR-012</w:t>
+            </w:r>
+          </w:p>
+        </w:tc>
+        <w:tc>
+          <w:tcPr>
+            <w:tcW w:w="1877" w:type="dxa"/>
+            <w:tcBorders>
+              <w:top w:val="single" w:sz="4" w:space="0" w:color="C9D3D0"/>
+              <w:left w:val="single" w:sz="4" w:space="0" w:color="C9D3D0"/>
+              <w:bottom w:val="single" w:sz="4" w:space="0" w:color="C9D3D0"/>
+              <w:right w:val="single" w:sz="4" w:space="0" w:color="C9D3D0"/>
+            </w:tcBorders>
+            <w:tcMar>
+              <w:top w:w="50" w:type="dxa"/>
+              <w:left w:w="100" w:type="dxa"/>
+              <w:bottom w:w="50" w:type="dxa"/>
+              <w:right w:w="100" w:type="dxa"/>
+            </w:tcMar>
+            <w:vAlign w:val="center"/>
+          </w:tcPr>
+          <w:p>
+            <w:pPr>
+              <w:spacing w:line="252" w:lineRule="auto"/>
+            </w:pPr>
+            <w:r>
+              <w:rPr>
+                <w:sz w:val="19"/>
+                <w:szCs w:val="19"/>
+              </w:rPr>
+              <w:t>23 October 2026</w:t>
+            </w:r>
+          </w:p>
+        </w:tc>
+        <w:tc>
+          <w:tcPr>
+            <w:tcW w:w="6883" w:type="dxa"/>
+            <w:tcBorders>
+              <w:top w:val="single" w:sz="4" w:space="0" w:color="C9D3D0"/>
+              <w:left w:val="single" w:sz="4" w:space="0" w:color="C9D3D0"/>
+              <w:bottom w:val="single" w:sz="4" w:space="0" w:color="C9D3D0"/>
+              <w:right w:val="single" w:sz="4" w:space="0" w:color="C9D3D0"/>
+            </w:tcBorders>
+            <w:tcMar>
+              <w:top w:w="50" w:type="dxa"/>
+              <w:left w:w="100" w:type="dxa"/>
+              <w:bottom w:w="50" w:type="dxa"/>
+              <w:right w:w="100" w:type="dxa"/>
+            </w:tcMar>
+            <w:vAlign w:val="center"/>
+          </w:tcPr>
+          <w:p>
+            <w:pPr>
+              <w:spacing w:line="252" w:lineRule="auto"/>
+            </w:pPr>
+            <w:r>
+              <w:rPr>
+                <w:sz w:val="19"/>
+                <w:szCs w:val="19"/>
+              </w:rPr>
+              <w:t>UGC application co-pilot (the product owner's request after reviewing the UGC's form): a personal document checklist, every field of the UGC registration and steps 1 to 4 ready to copy (pre-filled where ZedPath already knows it, in the UGC's formats), and a print-and-post tracker, each citing the UGC handbook 2025/26 Section 5. ZedPath never logs in to the UGC or fills its form; the answers stay on the student's phone</w:t>
+            </w:r>
+          </w:p>
+        </w:tc>
+      </w:tr>
     </w:tbl>
     <w:p>
       <w:pPr>
@@ -7768,7 +7985,7 @@
         <w:keepLines/>
         <w:pageBreakBefore/>
       </w:pPr>
-      <w:bookmarkStart w:id="10" w:name="_Toc243647761"/>
+      <w:bookmarkStart w:id="10" w:name="_Toc243650739"/>
       <w:r>
         <w:lastRenderedPageBreak/>
         <w:t>2 Business requirements</w:t>
@@ -7781,7 +7998,7 @@
         <w:keepNext/>
         <w:keepLines/>
       </w:pPr>
-      <w:bookmarkStart w:id="11" w:name="_Toc243647762"/>
+      <w:bookmarkStart w:id="11" w:name="_Toc243650740"/>
       <w:r>
         <w:t>2.1 Background</w:t>
       </w:r>
@@ -7853,7 +8070,7 @@
         <w:keepNext/>
         <w:keepLines/>
       </w:pPr>
-      <w:bookmarkStart w:id="12" w:name="_Toc243647763"/>
+      <w:bookmarkStart w:id="12" w:name="_Toc243650741"/>
       <w:r>
         <w:t>2.2 Business opportunity</w:t>
       </w:r>
@@ -7951,7 +8168,7 @@
         <w:keepNext/>
         <w:keepLines/>
       </w:pPr>
-      <w:bookmarkStart w:id="13" w:name="_Toc243647764"/>
+      <w:bookmarkStart w:id="13" w:name="_Toc243650742"/>
       <w:r>
         <w:t>2.3 Business objectives</w:t>
       </w:r>
@@ -7962,7 +8179,7 @@
         <w:pStyle w:val="Caption"/>
         <w:keepNext/>
       </w:pPr>
-      <w:bookmarkStart w:id="14" w:name="_Toc243647784"/>
+      <w:bookmarkStart w:id="14" w:name="_Toc243650762"/>
       <w:r>
         <w:t xml:space="preserve">Table </w:t>
       </w:r>
@@ -8752,7 +8969,7 @@
         <w:keepNext/>
         <w:keepLines/>
       </w:pPr>
-      <w:bookmarkStart w:id="15" w:name="_Toc243647765"/>
+      <w:bookmarkStart w:id="15" w:name="_Toc243650743"/>
       <w:r>
         <w:t>2.4 Market size</w:t>
       </w:r>
@@ -8763,7 +8980,7 @@
         <w:pStyle w:val="Caption"/>
         <w:keepNext/>
       </w:pPr>
-      <w:bookmarkStart w:id="16" w:name="_Toc243647785"/>
+      <w:bookmarkStart w:id="16" w:name="_Toc243650763"/>
       <w:r>
         <w:t xml:space="preserve">Table </w:t>
       </w:r>
@@ -9244,7 +9461,7 @@
         <w:keepNext/>
         <w:keepLines/>
       </w:pPr>
-      <w:bookmarkStart w:id="17" w:name="_Toc243647766"/>
+      <w:bookmarkStart w:id="17" w:name="_Toc243650744"/>
       <w:r>
         <w:t>2.5 Success metrics</w:t>
       </w:r>
@@ -9356,7 +9573,7 @@
         <w:keepNext/>
         <w:keepLines/>
       </w:pPr>
-      <w:bookmarkStart w:id="18" w:name="_Toc243647767"/>
+      <w:bookmarkStart w:id="18" w:name="_Toc243650745"/>
       <w:r>
         <w:t>2.6 Vision statement</w:t>
       </w:r>
@@ -9438,7 +9655,7 @@
         <w:keepNext/>
         <w:keepLines/>
       </w:pPr>
-      <w:bookmarkStart w:id="19" w:name="_Toc243647768"/>
+      <w:bookmarkStart w:id="19" w:name="_Toc243650746"/>
       <w:r>
         <w:t>2.7 Business risks</w:t>
       </w:r>
@@ -9449,7 +9666,7 @@
         <w:pStyle w:val="Caption"/>
         <w:keepNext/>
       </w:pPr>
-      <w:bookmarkStart w:id="20" w:name="_Toc243647786"/>
+      <w:bookmarkStart w:id="20" w:name="_Toc243650764"/>
       <w:r>
         <w:t xml:space="preserve">Table </w:t>
       </w:r>
@@ -11069,7 +11286,7 @@
         <w:keepNext/>
         <w:keepLines/>
       </w:pPr>
-      <w:bookmarkStart w:id="21" w:name="_Toc243647769"/>
+      <w:bookmarkStart w:id="21" w:name="_Toc243650747"/>
       <w:r>
         <w:t>2.8 Assumptions and dependencies</w:t>
       </w:r>
@@ -11080,7 +11297,7 @@
         <w:pStyle w:val="Caption"/>
         <w:keepNext/>
       </w:pPr>
-      <w:bookmarkStart w:id="22" w:name="_Toc243647787"/>
+      <w:bookmarkStart w:id="22" w:name="_Toc243650765"/>
       <w:r>
         <w:t xml:space="preserve">Table </w:t>
       </w:r>
@@ -11724,7 +11941,7 @@
         <w:keepLines/>
         <w:pageBreakBefore/>
       </w:pPr>
-      <w:bookmarkStart w:id="23" w:name="_Toc243647770"/>
+      <w:bookmarkStart w:id="23" w:name="_Toc243650748"/>
       <w:r>
         <w:lastRenderedPageBreak/>
         <w:t>3 Scope and limitations</w:t>
@@ -11737,7 +11954,7 @@
         <w:keepNext/>
         <w:keepLines/>
       </w:pPr>
-      <w:bookmarkStart w:id="24" w:name="_Toc243647771"/>
+      <w:bookmarkStart w:id="24" w:name="_Toc243650749"/>
       <w:r>
         <w:t>3.1 Major features</w:t>
       </w:r>
@@ -11756,7 +11973,7 @@
         <w:pStyle w:val="Caption"/>
         <w:keepNext/>
       </w:pPr>
-      <w:bookmarkStart w:id="25" w:name="_Toc243647788"/>
+      <w:bookmarkStart w:id="25" w:name="_Toc243650766"/>
       <w:r>
         <w:t xml:space="preserve">Table </w:t>
       </w:r>
@@ -12979,7 +13196,7 @@
         <w:keepNext/>
         <w:keepLines/>
       </w:pPr>
-      <w:bookmarkStart w:id="26" w:name="_Toc243647772"/>
+      <w:bookmarkStart w:id="26" w:name="_Toc243650750"/>
       <w:r>
         <w:t>3.2 Scope of initial and subsequent releases</w:t>
       </w:r>
@@ -12990,7 +13207,7 @@
         <w:pStyle w:val="Caption"/>
         <w:keepNext/>
       </w:pPr>
-      <w:bookmarkStart w:id="27" w:name="_Toc243647789"/>
+      <w:bookmarkStart w:id="27" w:name="_Toc243650767"/>
       <w:r>
         <w:t xml:space="preserve">Table </w:t>
       </w:r>
@@ -14270,7 +14487,7 @@
           <w:noProof/>
         </w:rPr>
         <w:drawing>
-          <wp:inline distT="0" distB="0" distL="0" distR="0" wp14:anchorId="24DFECDB" wp14:editId="24DFECDC">
+          <wp:inline distT="0" distB="0" distL="0" distR="0" wp14:anchorId="276877A6" wp14:editId="276877A7">
             <wp:extent cx="6124575" cy="3848100"/>
             <wp:effectExtent l="0" t="0" r="0" b="0"/>
             <wp:docPr id="1" name="system-context.png" descr="ZedPath system context (C4 model, level 1)" title="ZedPath system context (C4 model, level 1)"/>
@@ -14313,7 +14530,7 @@
       <w:pPr>
         <w:pStyle w:val="Caption"/>
       </w:pPr>
-      <w:bookmarkStart w:id="28" w:name="_Toc243647780"/>
+      <w:bookmarkStart w:id="28" w:name="_Toc243650758"/>
       <w:r>
         <w:t xml:space="preserve">Figure </w:t>
       </w:r>
@@ -14366,7 +14583,7 @@
         <w:keepNext/>
         <w:keepLines/>
       </w:pPr>
-      <w:bookmarkStart w:id="29" w:name="_Toc243647773"/>
+      <w:bookmarkStart w:id="29" w:name="_Toc243650751"/>
       <w:r>
         <w:lastRenderedPageBreak/>
         <w:t>3.3 Limitations and exclusions</w:t>
@@ -14565,7 +14782,7 @@
         <w:keepLines/>
         <w:pageBreakBefore/>
       </w:pPr>
-      <w:bookmarkStart w:id="30" w:name="_Toc243647774"/>
+      <w:bookmarkStart w:id="30" w:name="_Toc243650752"/>
       <w:r>
         <w:lastRenderedPageBreak/>
         <w:t>4 Business context</w:t>
@@ -14578,7 +14795,7 @@
         <w:keepNext/>
         <w:keepLines/>
       </w:pPr>
-      <w:bookmarkStart w:id="31" w:name="_Toc243647775"/>
+      <w:bookmarkStart w:id="31" w:name="_Toc243650753"/>
       <w:r>
         <w:t>4.1 Stakeholder profiles</w:t>
       </w:r>
@@ -14589,7 +14806,7 @@
         <w:pStyle w:val="Caption"/>
         <w:keepNext/>
       </w:pPr>
-      <w:bookmarkStart w:id="32" w:name="_Toc243647790"/>
+      <w:bookmarkStart w:id="32" w:name="_Toc243650768"/>
       <w:r>
         <w:t xml:space="preserve">Table </w:t>
       </w:r>
@@ -15728,7 +15945,7 @@
         <w:keepNext/>
         <w:keepLines/>
       </w:pPr>
-      <w:bookmarkStart w:id="33" w:name="_Toc243647776"/>
+      <w:bookmarkStart w:id="33" w:name="_Toc243650754"/>
       <w:r>
         <w:t>4.2 Project priorities</w:t>
       </w:r>
@@ -15739,7 +15956,7 @@
         <w:pStyle w:val="Caption"/>
         <w:keepNext/>
       </w:pPr>
-      <w:bookmarkStart w:id="34" w:name="_Toc243647791"/>
+      <w:bookmarkStart w:id="34" w:name="_Toc243650769"/>
       <w:r>
         <w:t xml:space="preserve">Table </w:t>
       </w:r>
@@ -16425,7 +16642,7 @@
         <w:keepNext/>
         <w:keepLines/>
       </w:pPr>
-      <w:bookmarkStart w:id="35" w:name="_Toc243647777"/>
+      <w:bookmarkStart w:id="35" w:name="_Toc243650755"/>
       <w:r>
         <w:t>4.3 Deployment considerations</w:t>
       </w:r>
@@ -16513,7 +16730,7 @@
         <w:keepLines/>
         <w:pageBreakBefore/>
       </w:pPr>
-      <w:bookmarkStart w:id="36" w:name="_Toc243647778"/>
+      <w:bookmarkStart w:id="36" w:name="_Toc243650756"/>
       <w:r>
         <w:lastRenderedPageBreak/>
         <w:t>Appendix A: Glossary</w:t>
@@ -16525,7 +16742,7 @@
         <w:pStyle w:val="Caption"/>
         <w:keepNext/>
       </w:pPr>
-      <w:bookmarkStart w:id="37" w:name="_Toc243647792"/>
+      <w:bookmarkStart w:id="37" w:name="_Toc243650770"/>
       <w:r>
         <w:t xml:space="preserve">Table </w:t>
       </w:r>
@@ -17402,7 +17619,7 @@
         <w:keepLines/>
         <w:pageBreakBefore/>
       </w:pPr>
-      <w:bookmarkStart w:id="38" w:name="_Toc243647779"/>
+      <w:bookmarkStart w:id="38" w:name="_Toc243650757"/>
       <w:r>
         <w:lastRenderedPageBreak/>
         <w:t>Appendix B: References</w:t>
@@ -17414,7 +17631,7 @@
         <w:pStyle w:val="Caption"/>
         <w:keepNext/>
       </w:pPr>
-      <w:bookmarkStart w:id="39" w:name="_Toc243647793"/>
+      <w:bookmarkStart w:id="39" w:name="_Toc243650771"/>
       <w:r>
         <w:t xml:space="preserve">Table </w:t>
       </w:r>
@@ -18578,10 +18795,10 @@
 <file path=word/numbering.xml><?xml version="1.0" encoding="utf-8"?>
 <w:numbering xmlns:wpc="http://schemas.microsoft.com/office/word/2010/wordprocessingCanvas" xmlns:cx="http://schemas.microsoft.com/office/drawing/2014/chartex" xmlns:cx1="http://schemas.microsoft.com/office/drawing/2015/9/8/chartex" xmlns:cx2="http://schemas.microsoft.com/office/drawing/2015/10/21/chartex" xmlns:cx3="http://schemas.microsoft.com/office/drawing/2016/5/9/chartex" xmlns:cx4="http://schemas.microsoft.com/office/drawing/2016/5/10/chartex" xmlns:cx5="http://schemas.microsoft.com/office/drawing/2016/5/11/chartex" xmlns:cx6="http://schemas.microsoft.com/office/drawing/2016/5/12/chartex" xmlns:cx7="http://schemas.microsoft.com/office/drawing/2016/5/13/chartex" xmlns:cx8="http://schemas.microsoft.com/office/drawing/2016/5/14/chartex" xmlns:mc="http://schemas.openxmlformats.org/markup-compatibility/2006" xmlns:aink="http://schemas.microsoft.com/office/drawing/2016/ink" xmlns:am3d="http://schemas.microsoft.com/office/drawing/2017/model3d" xmlns:o="urn:schemas-microsoft-com:office:office" xmlns:oel="http://schemas.microsoft.com/office/2019/extlst" xmlns:r="http://schemas.openxmlformats.org/officeDocument/2006/relationships" xmlns:m="http://schemas.openxmlformats.org/officeDocument/2006/math" xmlns:v="urn:schemas-microsoft-com:vml" xmlns:wp14="http://schemas.microsoft.com/office/word/2010/wordprocessingDrawing" xmlns:wp="http://schemas.openxmlformats.org/drawingml/2006/wordprocessingDrawing" xmlns:w10="urn:schemas-microsoft-com:office:word" xmlns:w="http://schemas.openxmlformats.org/wordprocessingml/2006/main" xmlns:w14="http://schemas.microsoft.com/office/word/2010/wordml" xmlns:w15="http://schemas.microsoft.com/office/word/2012/wordml" xmlns:w16cex="http://schemas.microsoft.com/office/word/2018/wordml/cex" xmlns:w16cid="http://schemas.microsoft.com/office/word/2016/wordml/cid" xmlns:w16="http://schemas.microsoft.com/office/word/2018/wordml" xmlns:w16du="http://schemas.microsoft.com/office/word/2023/wordml/word16du" xmlns:w16sdtdh="http://schemas.microsoft.com/office/word/2020/wordml/sdtdatahash" xmlns:w16sdtfl="http://schemas.microsoft.com/office/word/2024/wordml/sdtformatlock" xmlns:w16se="http://schemas.microsoft.com/office/word/2015/wordml/symex" xmlns:wpg="http://schemas.microsoft.com/office/word/2010/wordprocessingGroup" xmlns:wpi="http://schemas.microsoft.com/office/word/2010/wordprocessingInk" xmlns:wne="http://schemas.microsoft.com/office/word/2006/wordml" xmlns:wps="http://schemas.microsoft.com/office/word/2010/wordprocessingShape" mc:Ignorable="w14 w15 w16se w16cid w16 w16cex w16sdtdh w16sdtfl w16du wp14">
   <w:abstractNum w:abstractNumId="0" w15:restartNumberingAfterBreak="0">
-    <w:nsid w:val="11A63459"/>
+    <w:nsid w:val="0955211A"/>
     <w:multiLevelType w:val="hybridMultilevel"/>
-    <w:tmpl w:val="CCE27FF6"/>
-    <w:lvl w:ilvl="0" w:tplc="84E00182">
+    <w:tmpl w:val="3FB8C52A"/>
+    <w:lvl w:ilvl="0" w:tplc="6F8AA102">
       <w:start w:val="1"/>
       <w:numFmt w:val="decimal"/>
       <w:lvlText w:val="%1."/>
@@ -18590,7 +18807,7 @@
         <w:ind w:left="720" w:hanging="360"/>
       </w:pPr>
     </w:lvl>
-    <w:lvl w:ilvl="1" w:tplc="2724FE60" w:tentative="1">
+    <w:lvl w:ilvl="1" w:tplc="3C38BD08" w:tentative="1">
       <w:start w:val="1"/>
       <w:numFmt w:val="lowerLetter"/>
       <w:lvlText w:val="%2."/>
@@ -18599,7 +18816,7 @@
         <w:ind w:left="1080" w:hanging="360"/>
       </w:pPr>
     </w:lvl>
-    <w:lvl w:ilvl="2" w:tplc="625A8F64" w:tentative="1">
+    <w:lvl w:ilvl="2" w:tplc="5C849884" w:tentative="1">
       <w:start w:val="1"/>
       <w:numFmt w:val="lowerRoman"/>
       <w:lvlText w:val="%3."/>
@@ -18608,42 +18825,104 @@
         <w:ind w:left="1440" w:hanging="360"/>
       </w:pPr>
     </w:lvl>
-    <w:lvl w:ilvl="3" w:tplc="6F78D640">
+    <w:lvl w:ilvl="3" w:tplc="6F9E58EE">
       <w:numFmt w:val="decimal"/>
       <w:lvlText w:val=""/>
       <w:lvlJc w:val="left"/>
     </w:lvl>
-    <w:lvl w:ilvl="4" w:tplc="09985DC6">
+    <w:lvl w:ilvl="4" w:tplc="FB720022">
       <w:numFmt w:val="decimal"/>
       <w:lvlText w:val=""/>
       <w:lvlJc w:val="left"/>
     </w:lvl>
-    <w:lvl w:ilvl="5" w:tplc="D24C5D12">
+    <w:lvl w:ilvl="5" w:tplc="77B85944">
       <w:numFmt w:val="decimal"/>
       <w:lvlText w:val=""/>
       <w:lvlJc w:val="left"/>
     </w:lvl>
-    <w:lvl w:ilvl="6" w:tplc="E3E8EDB8">
+    <w:lvl w:ilvl="6" w:tplc="0776BC3E">
       <w:numFmt w:val="decimal"/>
       <w:lvlText w:val=""/>
       <w:lvlJc w:val="left"/>
     </w:lvl>
-    <w:lvl w:ilvl="7" w:tplc="392A7E22">
+    <w:lvl w:ilvl="7" w:tplc="34D42BF2">
       <w:numFmt w:val="decimal"/>
       <w:lvlText w:val=""/>
       <w:lvlJc w:val="left"/>
     </w:lvl>
-    <w:lvl w:ilvl="8" w:tplc="602849A2">
+    <w:lvl w:ilvl="8" w:tplc="30B886F0">
       <w:numFmt w:val="decimal"/>
       <w:lvlText w:val=""/>
       <w:lvlJc w:val="left"/>
     </w:lvl>
   </w:abstractNum>
   <w:abstractNum w:abstractNumId="1" w15:restartNumberingAfterBreak="0">
-    <w:nsid w:val="3D302281"/>
+    <w:nsid w:val="508C501C"/>
     <w:multiLevelType w:val="hybridMultilevel"/>
-    <w:tmpl w:val="AD182040"/>
-    <w:lvl w:ilvl="0" w:tplc="96A00B8E" w:tentative="1">
+    <w:tmpl w:val="F364C866"/>
+    <w:lvl w:ilvl="0" w:tplc="65062C0E">
+      <w:start w:val="1"/>
+      <w:numFmt w:val="bullet"/>
+      <w:lvlText w:val="•"/>
+      <w:lvlJc w:val="left"/>
+      <w:pPr>
+        <w:ind w:left="720" w:hanging="280"/>
+      </w:pPr>
+    </w:lvl>
+    <w:lvl w:ilvl="1" w:tplc="8A64B59C" w:tentative="1">
+      <w:start w:val="1"/>
+      <w:numFmt w:val="bullet"/>
+      <w:lvlText w:val="–"/>
+      <w:lvlJc w:val="left"/>
+      <w:pPr>
+        <w:ind w:left="1080" w:hanging="280"/>
+      </w:pPr>
+    </w:lvl>
+    <w:lvl w:ilvl="2" w:tplc="C1382774" w:tentative="1">
+      <w:start w:val="1"/>
+      <w:numFmt w:val="bullet"/>
+      <w:lvlText w:val="▪"/>
+      <w:lvlJc w:val="left"/>
+      <w:pPr>
+        <w:ind w:left="1440" w:hanging="280"/>
+      </w:pPr>
+    </w:lvl>
+    <w:lvl w:ilvl="3" w:tplc="DCE49EB4">
+      <w:numFmt w:val="decimal"/>
+      <w:lvlText w:val=""/>
+      <w:lvlJc w:val="left"/>
+    </w:lvl>
+    <w:lvl w:ilvl="4" w:tplc="E864D11C">
+      <w:numFmt w:val="decimal"/>
+      <w:lvlText w:val=""/>
+      <w:lvlJc w:val="left"/>
+    </w:lvl>
+    <w:lvl w:ilvl="5" w:tplc="D20EE6EC">
+      <w:numFmt w:val="decimal"/>
+      <w:lvlText w:val=""/>
+      <w:lvlJc w:val="left"/>
+    </w:lvl>
+    <w:lvl w:ilvl="6" w:tplc="83061E8A">
+      <w:numFmt w:val="decimal"/>
+      <w:lvlText w:val=""/>
+      <w:lvlJc w:val="left"/>
+    </w:lvl>
+    <w:lvl w:ilvl="7" w:tplc="F5D81760">
+      <w:numFmt w:val="decimal"/>
+      <w:lvlText w:val=""/>
+      <w:lvlJc w:val="left"/>
+    </w:lvl>
+    <w:lvl w:ilvl="8" w:tplc="457278C4">
+      <w:numFmt w:val="decimal"/>
+      <w:lvlText w:val=""/>
+      <w:lvlJc w:val="left"/>
+    </w:lvl>
+  </w:abstractNum>
+  <w:abstractNum w:abstractNumId="2" w15:restartNumberingAfterBreak="0">
+    <w:nsid w:val="6D633D83"/>
+    <w:multiLevelType w:val="hybridMultilevel"/>
+    <w:tmpl w:val="FD38EC84"/>
+    <w:lvl w:ilvl="0" w:tplc="45BE116C" w:tentative="1">
       <w:start w:val="1"/>
       <w:numFmt w:val="bullet"/>
       <w:lvlText w:val="●"/>
@@ -18652,7 +18931,7 @@
         <w:ind w:left="720" w:hanging="360"/>
       </w:pPr>
     </w:lvl>
-    <w:lvl w:ilvl="1" w:tplc="9F983A1C" w:tentative="1">
+    <w:lvl w:ilvl="1" w:tplc="DE202A30" w:tentative="1">
       <w:start w:val="1"/>
       <w:numFmt w:val="bullet"/>
       <w:lvlText w:val="○"/>
@@ -18661,7 +18940,7 @@
         <w:ind w:left="1440" w:hanging="360"/>
       </w:pPr>
     </w:lvl>
-    <w:lvl w:ilvl="2" w:tplc="8D8814AE" w:tentative="1">
+    <w:lvl w:ilvl="2" w:tplc="F04C5998" w:tentative="1">
       <w:start w:val="1"/>
       <w:numFmt w:val="bullet"/>
       <w:lvlText w:val="■"/>
@@ -18670,7 +18949,7 @@
         <w:ind w:left="2160" w:hanging="360"/>
       </w:pPr>
     </w:lvl>
-    <w:lvl w:ilvl="3" w:tplc="AA24A476" w:tentative="1">
+    <w:lvl w:ilvl="3" w:tplc="8EA843EA" w:tentative="1">
       <w:start w:val="1"/>
       <w:numFmt w:val="bullet"/>
       <w:lvlText w:val="●"/>
@@ -18679,7 +18958,7 @@
         <w:ind w:left="2880" w:hanging="360"/>
       </w:pPr>
     </w:lvl>
-    <w:lvl w:ilvl="4" w:tplc="AF8E6930" w:tentative="1">
+    <w:lvl w:ilvl="4" w:tplc="C9BCDCB6" w:tentative="1">
       <w:start w:val="1"/>
       <w:numFmt w:val="bullet"/>
       <w:lvlText w:val="○"/>
@@ -18688,7 +18967,7 @@
         <w:ind w:left="3600" w:hanging="360"/>
       </w:pPr>
     </w:lvl>
-    <w:lvl w:ilvl="5" w:tplc="B06A6708" w:tentative="1">
+    <w:lvl w:ilvl="5" w:tplc="C9545874" w:tentative="1">
       <w:start w:val="1"/>
       <w:numFmt w:val="bullet"/>
       <w:lvlText w:val="■"/>
@@ -18697,7 +18976,7 @@
         <w:ind w:left="4320" w:hanging="360"/>
       </w:pPr>
     </w:lvl>
-    <w:lvl w:ilvl="6" w:tplc="14B275A6" w:tentative="1">
+    <w:lvl w:ilvl="6" w:tplc="B36255BC" w:tentative="1">
       <w:start w:val="1"/>
       <w:numFmt w:val="bullet"/>
       <w:lvlText w:val="●"/>
@@ -18706,7 +18985,7 @@
         <w:ind w:left="5040" w:hanging="360"/>
       </w:pPr>
     </w:lvl>
-    <w:lvl w:ilvl="7" w:tplc="BB9E3FB4" w:tentative="1">
+    <w:lvl w:ilvl="7" w:tplc="84762EC0" w:tentative="1">
       <w:start w:val="1"/>
       <w:numFmt w:val="bullet"/>
       <w:lvlText w:val="●"/>
@@ -18715,7 +18994,7 @@
         <w:ind w:left="5760" w:hanging="360"/>
       </w:pPr>
     </w:lvl>
-    <w:lvl w:ilvl="8" w:tplc="4F52820E" w:tentative="1">
+    <w:lvl w:ilvl="8" w:tplc="D5D6124E" w:tentative="1">
       <w:start w:val="1"/>
       <w:numFmt w:val="bullet"/>
       <w:lvlText w:val="●"/>
@@ -18725,94 +19004,32 @@
       </w:pPr>
     </w:lvl>
   </w:abstractNum>
-  <w:abstractNum w:abstractNumId="2" w15:restartNumberingAfterBreak="0">
-    <w:nsid w:val="55403C50"/>
-    <w:multiLevelType w:val="hybridMultilevel"/>
-    <w:tmpl w:val="FBAED6B4"/>
-    <w:lvl w:ilvl="0" w:tplc="709EDB74">
-      <w:start w:val="1"/>
-      <w:numFmt w:val="bullet"/>
-      <w:lvlText w:val="•"/>
-      <w:lvlJc w:val="left"/>
-      <w:pPr>
-        <w:ind w:left="720" w:hanging="280"/>
-      </w:pPr>
-    </w:lvl>
-    <w:lvl w:ilvl="1" w:tplc="7EA0416C" w:tentative="1">
-      <w:start w:val="1"/>
-      <w:numFmt w:val="bullet"/>
-      <w:lvlText w:val="–"/>
-      <w:lvlJc w:val="left"/>
-      <w:pPr>
-        <w:ind w:left="1080" w:hanging="280"/>
-      </w:pPr>
-    </w:lvl>
-    <w:lvl w:ilvl="2" w:tplc="5204C8C4" w:tentative="1">
-      <w:start w:val="1"/>
-      <w:numFmt w:val="bullet"/>
-      <w:lvlText w:val="▪"/>
-      <w:lvlJc w:val="left"/>
-      <w:pPr>
-        <w:ind w:left="1440" w:hanging="280"/>
-      </w:pPr>
-    </w:lvl>
-    <w:lvl w:ilvl="3" w:tplc="9D28B1FE">
-      <w:numFmt w:val="decimal"/>
-      <w:lvlText w:val=""/>
-      <w:lvlJc w:val="left"/>
-    </w:lvl>
-    <w:lvl w:ilvl="4" w:tplc="10B43E58">
-      <w:numFmt w:val="decimal"/>
-      <w:lvlText w:val=""/>
-      <w:lvlJc w:val="left"/>
-    </w:lvl>
-    <w:lvl w:ilvl="5" w:tplc="0B4CE792">
-      <w:numFmt w:val="decimal"/>
-      <w:lvlText w:val=""/>
-      <w:lvlJc w:val="left"/>
-    </w:lvl>
-    <w:lvl w:ilvl="6" w:tplc="6E5ACDC2">
-      <w:numFmt w:val="decimal"/>
-      <w:lvlText w:val=""/>
-      <w:lvlJc w:val="left"/>
-    </w:lvl>
-    <w:lvl w:ilvl="7" w:tplc="197ADC6C">
-      <w:numFmt w:val="decimal"/>
-      <w:lvlText w:val=""/>
-      <w:lvlJc w:val="left"/>
-    </w:lvl>
-    <w:lvl w:ilvl="8" w:tplc="BE72AE30">
-      <w:numFmt w:val="decimal"/>
-      <w:lvlText w:val=""/>
-      <w:lvlJc w:val="left"/>
-    </w:lvl>
-  </w:abstractNum>
-  <w:num w:numId="1" w16cid:durableId="460658424">
+  <w:num w:numId="1" w16cid:durableId="1800302497">
+    <w:abstractNumId w:val="2"/>
+    <w:lvlOverride w:ilvl="0">
+      <w:startOverride w:val="1"/>
+    </w:lvlOverride>
+  </w:num>
+  <w:num w:numId="2" w16cid:durableId="309406055">
+    <w:abstractNumId w:val="0"/>
+    <w:lvlOverride w:ilvl="0">
+      <w:startOverride w:val="1"/>
+    </w:lvlOverride>
+  </w:num>
+  <w:num w:numId="3" w16cid:durableId="520318717">
     <w:abstractNumId w:val="1"/>
     <w:lvlOverride w:ilvl="0">
       <w:startOverride w:val="1"/>
     </w:lvlOverride>
   </w:num>
-  <w:num w:numId="2" w16cid:durableId="306517984">
-    <w:abstractNumId w:val="0"/>
+  <w:num w:numId="4" w16cid:durableId="187106993">
+    <w:abstractNumId w:val="1"/>
     <w:lvlOverride w:ilvl="0">
       <w:startOverride w:val="1"/>
     </w:lvlOverride>
   </w:num>
-  <w:num w:numId="3" w16cid:durableId="1633057211">
-    <w:abstractNumId w:val="2"/>
-    <w:lvlOverride w:ilvl="0">
-      <w:startOverride w:val="1"/>
-    </w:lvlOverride>
-  </w:num>
-  <w:num w:numId="4" w16cid:durableId="1256665845">
-    <w:abstractNumId w:val="2"/>
-    <w:lvlOverride w:ilvl="0">
-      <w:startOverride w:val="1"/>
-    </w:lvlOverride>
-  </w:num>
-  <w:num w:numId="5" w16cid:durableId="1802573858">
-    <w:abstractNumId w:val="2"/>
+  <w:num w:numId="5" w16cid:durableId="2025667673">
+    <w:abstractNumId w:val="1"/>
     <w:lvlOverride w:ilvl="0">
       <w:startOverride w:val="1"/>
     </w:lvlOverride>
@@ -19516,7 +19733,7 @@
     <w:autoRedefine/>
     <w:uiPriority w:val="39"/>
     <w:unhideWhenUsed/>
-    <w:rsid w:val="00633F7A"/>
+    <w:rsid w:val="00841A59"/>
     <w:pPr>
       <w:spacing w:after="100"/>
     </w:pPr>
@@ -19528,7 +19745,7 @@
     <w:autoRedefine/>
     <w:uiPriority w:val="39"/>
     <w:unhideWhenUsed/>
-    <w:rsid w:val="00633F7A"/>
+    <w:rsid w:val="00841A59"/>
     <w:pPr>
       <w:spacing w:after="100"/>
       <w:ind w:left="210"/>
@@ -19540,7 +19757,7 @@
     <w:next w:val="Normal"/>
     <w:uiPriority w:val="99"/>
     <w:unhideWhenUsed/>
-    <w:rsid w:val="00633F7A"/>
+    <w:rsid w:val="00841A59"/>
   </w:style>
 </w:styles>
 </file>

</xml_diff>

<commit_message>
Docs for CR-015 scholarships and loans (ZP-DOC-01, 02, 03, 05 at the 2.2 / 0.9 drafts)
- ZP-DOC-02: US-510 "Find scholarships and loans that pay for my next step" (AC-510.1 to AC-510.4);
  CR-015 change-request and traceability rows; EP5 9 stories / 33 points, total 74 / 239 (checked by script).
- ZP-DOC-03: FR-512 to FR-516; CR-015 row; the US-509 trace row that had landed inside the FE-5 table
  moved to the traceability appendix, with US-510 beside it.
- ZP-DOC-01: CR-015 row; FE-5 restated; scholarships and loan schemes delivered 23 Oct (CR-015).
- ZP-DOC-05: why the catalogue is reused (no D1 table, no migration) and the build-time rules that
  stand in for the foreign key and CHECKs.
- Generated .docx and .pdf rebuilt with docs/_build/build.ts.

Co-Authored-By: Claude Opus 5.5 (1M context) <noreply@anthropic.com>
</commit_message>
<xml_diff>
--- a/docs/01-vision-and-scope/ZP-DOC-01_Vision-and-Scope.docx
+++ b/docs/01-vision-and-scope/ZP-DOC-01_Vision-and-Scope.docx
@@ -90,7 +90,7 @@
           <w:left w:w="10" w:type="dxa"/>
           <w:right w:w="10" w:type="dxa"/>
         </w:tblCellMar>
-        <w:tblLook w:val="04A0" w:firstRow="1" w:lastRow="0" w:firstColumn="1" w:lastColumn="0" w:noHBand="0" w:noVBand="1"/>
+        <w:tblLook w:val="0000" w:firstRow="0" w:lastRow="0" w:firstColumn="0" w:lastColumn="0" w:noHBand="0" w:noVBand="0"/>
       </w:tblPr>
       <w:tblGrid>
         <w:gridCol w:w="2600"/>
@@ -494,7 +494,7 @@
           <w:left w:w="10" w:type="dxa"/>
           <w:right w:w="10" w:type="dxa"/>
         </w:tblCellMar>
-        <w:tblLook w:val="04A0" w:firstRow="1" w:lastRow="0" w:firstColumn="1" w:lastColumn="0" w:noHBand="0" w:noVBand="1"/>
+        <w:tblLook w:val="0000" w:firstRow="0" w:lastRow="0" w:firstColumn="0" w:lastColumn="0" w:noHBand="0" w:noVBand="0"/>
       </w:tblPr>
       <w:tblGrid>
         <w:gridCol w:w="2600"/>
@@ -1189,7 +1189,7 @@
           <w:left w:w="10" w:type="dxa"/>
           <w:right w:w="10" w:type="dxa"/>
         </w:tblCellMar>
-        <w:tblLook w:val="04A0" w:firstRow="1" w:lastRow="0" w:firstColumn="1" w:lastColumn="0" w:noHBand="0" w:noVBand="1"/>
+        <w:tblLook w:val="0000" w:firstRow="0" w:lastRow="0" w:firstColumn="0" w:lastColumn="0" w:noHBand="0" w:noVBand="0"/>
       </w:tblPr>
       <w:tblGrid>
         <w:gridCol w:w="964"/>
@@ -2271,6 +2271,122 @@
           </w:p>
         </w:tc>
       </w:tr>
+      <w:tr>
+        <w:tblPrEx>
+          <w:tblCellMar>
+            <w:top w:w="0" w:type="dxa"/>
+            <w:bottom w:w="0" w:type="dxa"/>
+          </w:tblCellMar>
+        </w:tblPrEx>
+        <w:trPr>
+          <w:cantSplit/>
+          <w:trHeight w:val="420"/>
+        </w:trPr>
+        <w:tc>
+          <w:tcPr>
+            <w:tcW w:w="964" w:type="dxa"/>
+            <w:tcBorders>
+              <w:top w:val="single" w:sz="4" w:space="0" w:color="C9D3D0"/>
+              <w:left w:val="single" w:sz="4" w:space="0" w:color="C9D3D0"/>
+              <w:bottom w:val="single" w:sz="4" w:space="0" w:color="C9D3D0"/>
+              <w:right w:val="single" w:sz="4" w:space="0" w:color="C9D3D0"/>
+            </w:tcBorders>
+            <w:tcMar>
+              <w:top w:w="50" w:type="dxa"/>
+              <w:left w:w="100" w:type="dxa"/>
+              <w:bottom w:w="50" w:type="dxa"/>
+              <w:right w:w="100" w:type="dxa"/>
+            </w:tcMar>
+          </w:tcPr>
+          <w:p>
+            <w:r>
+              <w:rPr>
+                <w:sz w:val="19"/>
+                <w:szCs w:val="19"/>
+              </w:rPr>
+              <w:t>2.2 (draft)</w:t>
+            </w:r>
+          </w:p>
+        </w:tc>
+        <w:tc>
+          <w:tcPr>
+            <w:tcW w:w="1542" w:type="dxa"/>
+            <w:tcBorders>
+              <w:top w:val="single" w:sz="4" w:space="0" w:color="C9D3D0"/>
+              <w:left w:val="single" w:sz="4" w:space="0" w:color="C9D3D0"/>
+              <w:bottom w:val="single" w:sz="4" w:space="0" w:color="C9D3D0"/>
+              <w:right w:val="single" w:sz="4" w:space="0" w:color="C9D3D0"/>
+            </w:tcBorders>
+            <w:tcMar>
+              <w:top w:w="50" w:type="dxa"/>
+              <w:left w:w="100" w:type="dxa"/>
+              <w:bottom w:w="50" w:type="dxa"/>
+              <w:right w:w="100" w:type="dxa"/>
+            </w:tcMar>
+          </w:tcPr>
+          <w:p>
+            <w:r>
+              <w:rPr>
+                <w:sz w:val="19"/>
+                <w:szCs w:val="19"/>
+              </w:rPr>
+              <w:t>23 Oct 2026</w:t>
+            </w:r>
+          </w:p>
+        </w:tc>
+        <w:tc>
+          <w:tcPr>
+            <w:tcW w:w="1928" w:type="dxa"/>
+            <w:tcBorders>
+              <w:top w:val="single" w:sz="4" w:space="0" w:color="C9D3D0"/>
+              <w:left w:val="single" w:sz="4" w:space="0" w:color="C9D3D0"/>
+              <w:bottom w:val="single" w:sz="4" w:space="0" w:color="C9D3D0"/>
+              <w:right w:val="single" w:sz="4" w:space="0" w:color="C9D3D0"/>
+            </w:tcBorders>
+            <w:tcMar>
+              <w:top w:w="50" w:type="dxa"/>
+              <w:left w:w="100" w:type="dxa"/>
+              <w:bottom w:w="50" w:type="dxa"/>
+              <w:right w:w="100" w:type="dxa"/>
+            </w:tcMar>
+          </w:tcPr>
+          <w:p>
+            <w:r>
+              <w:rPr>
+                <w:sz w:val="19"/>
+                <w:szCs w:val="19"/>
+              </w:rPr>
+              <w:t>Team Kestrel</w:t>
+            </w:r>
+          </w:p>
+        </w:tc>
+        <w:tc>
+          <w:tcPr>
+            <w:tcW w:w="5204" w:type="dxa"/>
+            <w:tcBorders>
+              <w:top w:val="single" w:sz="4" w:space="0" w:color="C9D3D0"/>
+              <w:left w:val="single" w:sz="4" w:space="0" w:color="C9D3D0"/>
+              <w:bottom w:val="single" w:sz="4" w:space="0" w:color="C9D3D0"/>
+              <w:right w:val="single" w:sz="4" w:space="0" w:color="C9D3D0"/>
+            </w:tcBorders>
+            <w:tcMar>
+              <w:top w:w="50" w:type="dxa"/>
+              <w:left w:w="100" w:type="dxa"/>
+              <w:bottom w:w="50" w:type="dxa"/>
+              <w:right w:w="100" w:type="dxa"/>
+            </w:tcMar>
+          </w:tcPr>
+          <w:p>
+            <w:r>
+              <w:rPr>
+                <w:sz w:val="19"/>
+                <w:szCs w:val="19"/>
+              </w:rPr>
+              <w:t>Also CR-015 (scholarships and loans): change-request row; FE-5 restated; scholarships and loan schemes delivered 23 October 2026; awaiting approval</w:t>
+            </w:r>
+          </w:p>
+        </w:tc>
+      </w:tr>
     </w:tbl>
     <w:p>
       <w:pPr>
@@ -2313,7 +2429,7 @@
           <w:left w:w="10" w:type="dxa"/>
           <w:right w:w="10" w:type="dxa"/>
         </w:tblCellMar>
-        <w:tblLook w:val="04A0" w:firstRow="1" w:lastRow="0" w:firstColumn="1" w:lastColumn="0" w:noHBand="0" w:noVBand="1"/>
+        <w:tblLook w:val="0000" w:firstRow="0" w:lastRow="0" w:firstColumn="0" w:lastColumn="0" w:noHBand="0" w:noVBand="0"/>
       </w:tblPr>
       <w:tblGrid>
         <w:gridCol w:w="2120"/>
@@ -2686,7 +2802,7 @@
     <w:sdt>
       <w:sdtPr>
         <w:alias w:val="Contents"/>
-        <w:id w:val="641474044"/>
+        <w:id w:val="-814030152"/>
       </w:sdtPr>
       <w:sdtEndPr/>
       <w:sdtContent>
@@ -2715,7 +2831,7 @@
           <w:r>
             <w:fldChar w:fldCharType="separate"/>
           </w:r>
-          <w:hyperlink w:anchor="_Toc243650732" w:history="1">
+          <w:hyperlink w:anchor="_Toc243676576" w:history="1">
             <w:r>
               <w:rPr>
                 <w:rStyle w:val="Hyperlink"/>
@@ -2739,7 +2855,7 @@
               <w:rPr>
                 <w:noProof/>
               </w:rPr>
-              <w:instrText xml:space="preserve"> PAGEREF _Toc243650732 \h </w:instrText>
+              <w:instrText xml:space="preserve"> PAGEREF _Toc243676576 \h </w:instrText>
             </w:r>
             <w:r>
               <w:rPr>
@@ -2782,7 +2898,7 @@
               <w14:ligatures w14:val="standardContextual"/>
             </w:rPr>
           </w:pPr>
-          <w:hyperlink w:anchor="_Toc243650733" w:history="1">
+          <w:hyperlink w:anchor="_Toc243676577" w:history="1">
             <w:r>
               <w:rPr>
                 <w:rStyle w:val="Hyperlink"/>
@@ -2806,7 +2922,7 @@
               <w:rPr>
                 <w:noProof/>
               </w:rPr>
-              <w:instrText xml:space="preserve"> PAGEREF _Toc243650733 \h </w:instrText>
+              <w:instrText xml:space="preserve"> PAGEREF _Toc243676577 \h </w:instrText>
             </w:r>
             <w:r>
               <w:rPr>
@@ -2849,7 +2965,7 @@
               <w14:ligatures w14:val="standardContextual"/>
             </w:rPr>
           </w:pPr>
-          <w:hyperlink w:anchor="_Toc243650734" w:history="1">
+          <w:hyperlink w:anchor="_Toc243676578" w:history="1">
             <w:r>
               <w:rPr>
                 <w:rStyle w:val="Hyperlink"/>
@@ -2873,7 +2989,7 @@
               <w:rPr>
                 <w:noProof/>
               </w:rPr>
-              <w:instrText xml:space="preserve"> PAGEREF _Toc243650734 \h </w:instrText>
+              <w:instrText xml:space="preserve"> PAGEREF _Toc243676578 \h </w:instrText>
             </w:r>
             <w:r>
               <w:rPr>
@@ -2916,7 +3032,7 @@
               <w14:ligatures w14:val="standardContextual"/>
             </w:rPr>
           </w:pPr>
-          <w:hyperlink w:anchor="_Toc243650735" w:history="1">
+          <w:hyperlink w:anchor="_Toc243676579" w:history="1">
             <w:r>
               <w:rPr>
                 <w:rStyle w:val="Hyperlink"/>
@@ -2940,7 +3056,7 @@
               <w:rPr>
                 <w:noProof/>
               </w:rPr>
-              <w:instrText xml:space="preserve"> PAGEREF _Toc243650735 \h </w:instrText>
+              <w:instrText xml:space="preserve"> PAGEREF _Toc243676579 \h </w:instrText>
             </w:r>
             <w:r>
               <w:rPr>
@@ -2983,7 +3099,7 @@
               <w14:ligatures w14:val="standardContextual"/>
             </w:rPr>
           </w:pPr>
-          <w:hyperlink w:anchor="_Toc243650736" w:history="1">
+          <w:hyperlink w:anchor="_Toc243676580" w:history="1">
             <w:r>
               <w:rPr>
                 <w:rStyle w:val="Hyperlink"/>
@@ -3007,7 +3123,7 @@
               <w:rPr>
                 <w:noProof/>
               </w:rPr>
-              <w:instrText xml:space="preserve"> PAGEREF _Toc243650736 \h </w:instrText>
+              <w:instrText xml:space="preserve"> PAGEREF _Toc243676580 \h </w:instrText>
             </w:r>
             <w:r>
               <w:rPr>
@@ -3050,7 +3166,7 @@
               <w14:ligatures w14:val="standardContextual"/>
             </w:rPr>
           </w:pPr>
-          <w:hyperlink w:anchor="_Toc243650737" w:history="1">
+          <w:hyperlink w:anchor="_Toc243676581" w:history="1">
             <w:r>
               <w:rPr>
                 <w:rStyle w:val="Hyperlink"/>
@@ -3074,7 +3190,7 @@
               <w:rPr>
                 <w:noProof/>
               </w:rPr>
-              <w:instrText xml:space="preserve"> PAGEREF _Toc243650737 \h </w:instrText>
+              <w:instrText xml:space="preserve"> PAGEREF _Toc243676581 \h </w:instrText>
             </w:r>
             <w:r>
               <w:rPr>
@@ -3117,7 +3233,7 @@
               <w14:ligatures w14:val="standardContextual"/>
             </w:rPr>
           </w:pPr>
-          <w:hyperlink w:anchor="_Toc243650738" w:history="1">
+          <w:hyperlink w:anchor="_Toc243676582" w:history="1">
             <w:r>
               <w:rPr>
                 <w:rStyle w:val="Hyperlink"/>
@@ -3141,7 +3257,7 @@
               <w:rPr>
                 <w:noProof/>
               </w:rPr>
-              <w:instrText xml:space="preserve"> PAGEREF _Toc243650738 \h </w:instrText>
+              <w:instrText xml:space="preserve"> PAGEREF _Toc243676582 \h </w:instrText>
             </w:r>
             <w:r>
               <w:rPr>
@@ -3184,7 +3300,7 @@
               <w14:ligatures w14:val="standardContextual"/>
             </w:rPr>
           </w:pPr>
-          <w:hyperlink w:anchor="_Toc243650739" w:history="1">
+          <w:hyperlink w:anchor="_Toc243676583" w:history="1">
             <w:r>
               <w:rPr>
                 <w:rStyle w:val="Hyperlink"/>
@@ -3208,7 +3324,7 @@
               <w:rPr>
                 <w:noProof/>
               </w:rPr>
-              <w:instrText xml:space="preserve"> PAGEREF _Toc243650739 \h </w:instrText>
+              <w:instrText xml:space="preserve"> PAGEREF _Toc243676583 \h </w:instrText>
             </w:r>
             <w:r>
               <w:rPr>
@@ -3225,7 +3341,7 @@
               <w:rPr>
                 <w:noProof/>
               </w:rPr>
-              <w:t>8</w:t>
+              <w:t>9</w:t>
             </w:r>
             <w:r>
               <w:rPr>
@@ -3251,7 +3367,7 @@
               <w14:ligatures w14:val="standardContextual"/>
             </w:rPr>
           </w:pPr>
-          <w:hyperlink w:anchor="_Toc243650740" w:history="1">
+          <w:hyperlink w:anchor="_Toc243676584" w:history="1">
             <w:r>
               <w:rPr>
                 <w:rStyle w:val="Hyperlink"/>
@@ -3275,7 +3391,7 @@
               <w:rPr>
                 <w:noProof/>
               </w:rPr>
-              <w:instrText xml:space="preserve"> PAGEREF _Toc243650740 \h </w:instrText>
+              <w:instrText xml:space="preserve"> PAGEREF _Toc243676584 \h </w:instrText>
             </w:r>
             <w:r>
               <w:rPr>
@@ -3292,7 +3408,7 @@
               <w:rPr>
                 <w:noProof/>
               </w:rPr>
-              <w:t>8</w:t>
+              <w:t>9</w:t>
             </w:r>
             <w:r>
               <w:rPr>
@@ -3318,7 +3434,7 @@
               <w14:ligatures w14:val="standardContextual"/>
             </w:rPr>
           </w:pPr>
-          <w:hyperlink w:anchor="_Toc243650741" w:history="1">
+          <w:hyperlink w:anchor="_Toc243676585" w:history="1">
             <w:r>
               <w:rPr>
                 <w:rStyle w:val="Hyperlink"/>
@@ -3342,7 +3458,7 @@
               <w:rPr>
                 <w:noProof/>
               </w:rPr>
-              <w:instrText xml:space="preserve"> PAGEREF _Toc243650741 \h </w:instrText>
+              <w:instrText xml:space="preserve"> PAGEREF _Toc243676585 \h </w:instrText>
             </w:r>
             <w:r>
               <w:rPr>
@@ -3359,7 +3475,7 @@
               <w:rPr>
                 <w:noProof/>
               </w:rPr>
-              <w:t>8</w:t>
+              <w:t>9</w:t>
             </w:r>
             <w:r>
               <w:rPr>
@@ -3385,7 +3501,7 @@
               <w14:ligatures w14:val="standardContextual"/>
             </w:rPr>
           </w:pPr>
-          <w:hyperlink w:anchor="_Toc243650742" w:history="1">
+          <w:hyperlink w:anchor="_Toc243676586" w:history="1">
             <w:r>
               <w:rPr>
                 <w:rStyle w:val="Hyperlink"/>
@@ -3409,7 +3525,7 @@
               <w:rPr>
                 <w:noProof/>
               </w:rPr>
-              <w:instrText xml:space="preserve"> PAGEREF _Toc243650742 \h </w:instrText>
+              <w:instrText xml:space="preserve"> PAGEREF _Toc243676586 \h </w:instrText>
             </w:r>
             <w:r>
               <w:rPr>
@@ -3426,7 +3542,7 @@
               <w:rPr>
                 <w:noProof/>
               </w:rPr>
-              <w:t>8</w:t>
+              <w:t>9</w:t>
             </w:r>
             <w:r>
               <w:rPr>
@@ -3452,7 +3568,7 @@
               <w14:ligatures w14:val="standardContextual"/>
             </w:rPr>
           </w:pPr>
-          <w:hyperlink w:anchor="_Toc243650743" w:history="1">
+          <w:hyperlink w:anchor="_Toc243676587" w:history="1">
             <w:r>
               <w:rPr>
                 <w:rStyle w:val="Hyperlink"/>
@@ -3476,7 +3592,7 @@
               <w:rPr>
                 <w:noProof/>
               </w:rPr>
-              <w:instrText xml:space="preserve"> PAGEREF _Toc243650743 \h </w:instrText>
+              <w:instrText xml:space="preserve"> PAGEREF _Toc243676587 \h </w:instrText>
             </w:r>
             <w:r>
               <w:rPr>
@@ -3493,7 +3609,7 @@
               <w:rPr>
                 <w:noProof/>
               </w:rPr>
-              <w:t>9</w:t>
+              <w:t>10</w:t>
             </w:r>
             <w:r>
               <w:rPr>
@@ -3519,7 +3635,7 @@
               <w14:ligatures w14:val="standardContextual"/>
             </w:rPr>
           </w:pPr>
-          <w:hyperlink w:anchor="_Toc243650744" w:history="1">
+          <w:hyperlink w:anchor="_Toc243676588" w:history="1">
             <w:r>
               <w:rPr>
                 <w:rStyle w:val="Hyperlink"/>
@@ -3543,7 +3659,7 @@
               <w:rPr>
                 <w:noProof/>
               </w:rPr>
-              <w:instrText xml:space="preserve"> PAGEREF _Toc243650744 \h </w:instrText>
+              <w:instrText xml:space="preserve"> PAGEREF _Toc243676588 \h </w:instrText>
             </w:r>
             <w:r>
               <w:rPr>
@@ -3560,7 +3676,7 @@
               <w:rPr>
                 <w:noProof/>
               </w:rPr>
-              <w:t>9</w:t>
+              <w:t>10</w:t>
             </w:r>
             <w:r>
               <w:rPr>
@@ -3586,7 +3702,7 @@
               <w14:ligatures w14:val="standardContextual"/>
             </w:rPr>
           </w:pPr>
-          <w:hyperlink w:anchor="_Toc243650745" w:history="1">
+          <w:hyperlink w:anchor="_Toc243676589" w:history="1">
             <w:r>
               <w:rPr>
                 <w:rStyle w:val="Hyperlink"/>
@@ -3610,7 +3726,7 @@
               <w:rPr>
                 <w:noProof/>
               </w:rPr>
-              <w:instrText xml:space="preserve"> PAGEREF _Toc243650745 \h </w:instrText>
+              <w:instrText xml:space="preserve"> PAGEREF _Toc243676589 \h </w:instrText>
             </w:r>
             <w:r>
               <w:rPr>
@@ -3627,7 +3743,7 @@
               <w:rPr>
                 <w:noProof/>
               </w:rPr>
-              <w:t>9</w:t>
+              <w:t>10</w:t>
             </w:r>
             <w:r>
               <w:rPr>
@@ -3653,7 +3769,7 @@
               <w14:ligatures w14:val="standardContextual"/>
             </w:rPr>
           </w:pPr>
-          <w:hyperlink w:anchor="_Toc243650746" w:history="1">
+          <w:hyperlink w:anchor="_Toc243676590" w:history="1">
             <w:r>
               <w:rPr>
                 <w:rStyle w:val="Hyperlink"/>
@@ -3677,7 +3793,7 @@
               <w:rPr>
                 <w:noProof/>
               </w:rPr>
-              <w:instrText xml:space="preserve"> PAGEREF _Toc243650746 \h </w:instrText>
+              <w:instrText xml:space="preserve"> PAGEREF _Toc243676590 \h </w:instrText>
             </w:r>
             <w:r>
               <w:rPr>
@@ -3694,7 +3810,7 @@
               <w:rPr>
                 <w:noProof/>
               </w:rPr>
-              <w:t>9</w:t>
+              <w:t>10</w:t>
             </w:r>
             <w:r>
               <w:rPr>
@@ -3720,7 +3836,7 @@
               <w14:ligatures w14:val="standardContextual"/>
             </w:rPr>
           </w:pPr>
-          <w:hyperlink w:anchor="_Toc243650747" w:history="1">
+          <w:hyperlink w:anchor="_Toc243676591" w:history="1">
             <w:r>
               <w:rPr>
                 <w:rStyle w:val="Hyperlink"/>
@@ -3744,7 +3860,7 @@
               <w:rPr>
                 <w:noProof/>
               </w:rPr>
-              <w:instrText xml:space="preserve"> PAGEREF _Toc243650747 \h </w:instrText>
+              <w:instrText xml:space="preserve"> PAGEREF _Toc243676591 \h </w:instrText>
             </w:r>
             <w:r>
               <w:rPr>
@@ -3761,7 +3877,7 @@
               <w:rPr>
                 <w:noProof/>
               </w:rPr>
-              <w:t>10</w:t>
+              <w:t>11</w:t>
             </w:r>
             <w:r>
               <w:rPr>
@@ -3787,7 +3903,7 @@
               <w14:ligatures w14:val="standardContextual"/>
             </w:rPr>
           </w:pPr>
-          <w:hyperlink w:anchor="_Toc243650748" w:history="1">
+          <w:hyperlink w:anchor="_Toc243676592" w:history="1">
             <w:r>
               <w:rPr>
                 <w:rStyle w:val="Hyperlink"/>
@@ -3811,7 +3927,7 @@
               <w:rPr>
                 <w:noProof/>
               </w:rPr>
-              <w:instrText xml:space="preserve"> PAGEREF _Toc243650748 \h </w:instrText>
+              <w:instrText xml:space="preserve"> PAGEREF _Toc243676592 \h </w:instrText>
             </w:r>
             <w:r>
               <w:rPr>
@@ -3828,7 +3944,7 @@
               <w:rPr>
                 <w:noProof/>
               </w:rPr>
-              <w:t>11</w:t>
+              <w:t>12</w:t>
             </w:r>
             <w:r>
               <w:rPr>
@@ -3854,7 +3970,7 @@
               <w14:ligatures w14:val="standardContextual"/>
             </w:rPr>
           </w:pPr>
-          <w:hyperlink w:anchor="_Toc243650749" w:history="1">
+          <w:hyperlink w:anchor="_Toc243676593" w:history="1">
             <w:r>
               <w:rPr>
                 <w:rStyle w:val="Hyperlink"/>
@@ -3878,7 +3994,7 @@
               <w:rPr>
                 <w:noProof/>
               </w:rPr>
-              <w:instrText xml:space="preserve"> PAGEREF _Toc243650749 \h </w:instrText>
+              <w:instrText xml:space="preserve"> PAGEREF _Toc243676593 \h </w:instrText>
             </w:r>
             <w:r>
               <w:rPr>
@@ -3895,7 +4011,7 @@
               <w:rPr>
                 <w:noProof/>
               </w:rPr>
-              <w:t>11</w:t>
+              <w:t>12</w:t>
             </w:r>
             <w:r>
               <w:rPr>
@@ -3921,7 +4037,7 @@
               <w14:ligatures w14:val="standardContextual"/>
             </w:rPr>
           </w:pPr>
-          <w:hyperlink w:anchor="_Toc243650750" w:history="1">
+          <w:hyperlink w:anchor="_Toc243676594" w:history="1">
             <w:r>
               <w:rPr>
                 <w:rStyle w:val="Hyperlink"/>
@@ -3945,7 +4061,7 @@
               <w:rPr>
                 <w:noProof/>
               </w:rPr>
-              <w:instrText xml:space="preserve"> PAGEREF _Toc243650750 \h </w:instrText>
+              <w:instrText xml:space="preserve"> PAGEREF _Toc243676594 \h </w:instrText>
             </w:r>
             <w:r>
               <w:rPr>
@@ -3962,7 +4078,7 @@
               <w:rPr>
                 <w:noProof/>
               </w:rPr>
-              <w:t>11</w:t>
+              <w:t>12</w:t>
             </w:r>
             <w:r>
               <w:rPr>
@@ -3988,7 +4104,7 @@
               <w14:ligatures w14:val="standardContextual"/>
             </w:rPr>
           </w:pPr>
-          <w:hyperlink w:anchor="_Toc243650751" w:history="1">
+          <w:hyperlink w:anchor="_Toc243676595" w:history="1">
             <w:r>
               <w:rPr>
                 <w:rStyle w:val="Hyperlink"/>
@@ -4012,7 +4128,7 @@
               <w:rPr>
                 <w:noProof/>
               </w:rPr>
-              <w:instrText xml:space="preserve"> PAGEREF _Toc243650751 \h </w:instrText>
+              <w:instrText xml:space="preserve"> PAGEREF _Toc243676595 \h </w:instrText>
             </w:r>
             <w:r>
               <w:rPr>
@@ -4029,7 +4145,7 @@
               <w:rPr>
                 <w:noProof/>
               </w:rPr>
-              <w:t>13</w:t>
+              <w:t>14</w:t>
             </w:r>
             <w:r>
               <w:rPr>
@@ -4055,7 +4171,7 @@
               <w14:ligatures w14:val="standardContextual"/>
             </w:rPr>
           </w:pPr>
-          <w:hyperlink w:anchor="_Toc243650752" w:history="1">
+          <w:hyperlink w:anchor="_Toc243676596" w:history="1">
             <w:r>
               <w:rPr>
                 <w:rStyle w:val="Hyperlink"/>
@@ -4079,7 +4195,7 @@
               <w:rPr>
                 <w:noProof/>
               </w:rPr>
-              <w:instrText xml:space="preserve"> PAGEREF _Toc243650752 \h </w:instrText>
+              <w:instrText xml:space="preserve"> PAGEREF _Toc243676596 \h </w:instrText>
             </w:r>
             <w:r>
               <w:rPr>
@@ -4096,7 +4212,7 @@
               <w:rPr>
                 <w:noProof/>
               </w:rPr>
-              <w:t>14</w:t>
+              <w:t>15</w:t>
             </w:r>
             <w:r>
               <w:rPr>
@@ -4122,7 +4238,7 @@
               <w14:ligatures w14:val="standardContextual"/>
             </w:rPr>
           </w:pPr>
-          <w:hyperlink w:anchor="_Toc243650753" w:history="1">
+          <w:hyperlink w:anchor="_Toc243676597" w:history="1">
             <w:r>
               <w:rPr>
                 <w:rStyle w:val="Hyperlink"/>
@@ -4146,7 +4262,7 @@
               <w:rPr>
                 <w:noProof/>
               </w:rPr>
-              <w:instrText xml:space="preserve"> PAGEREF _Toc243650753 \h </w:instrText>
+              <w:instrText xml:space="preserve"> PAGEREF _Toc243676597 \h </w:instrText>
             </w:r>
             <w:r>
               <w:rPr>
@@ -4163,7 +4279,7 @@
               <w:rPr>
                 <w:noProof/>
               </w:rPr>
-              <w:t>14</w:t>
+              <w:t>15</w:t>
             </w:r>
             <w:r>
               <w:rPr>
@@ -4189,7 +4305,7 @@
               <w14:ligatures w14:val="standardContextual"/>
             </w:rPr>
           </w:pPr>
-          <w:hyperlink w:anchor="_Toc243650754" w:history="1">
+          <w:hyperlink w:anchor="_Toc243676598" w:history="1">
             <w:r>
               <w:rPr>
                 <w:rStyle w:val="Hyperlink"/>
@@ -4213,7 +4329,7 @@
               <w:rPr>
                 <w:noProof/>
               </w:rPr>
-              <w:instrText xml:space="preserve"> PAGEREF _Toc243650754 \h </w:instrText>
+              <w:instrText xml:space="preserve"> PAGEREF _Toc243676598 \h </w:instrText>
             </w:r>
             <w:r>
               <w:rPr>
@@ -4230,7 +4346,7 @@
               <w:rPr>
                 <w:noProof/>
               </w:rPr>
-              <w:t>14</w:t>
+              <w:t>15</w:t>
             </w:r>
             <w:r>
               <w:rPr>
@@ -4256,7 +4372,7 @@
               <w14:ligatures w14:val="standardContextual"/>
             </w:rPr>
           </w:pPr>
-          <w:hyperlink w:anchor="_Toc243650755" w:history="1">
+          <w:hyperlink w:anchor="_Toc243676599" w:history="1">
             <w:r>
               <w:rPr>
                 <w:rStyle w:val="Hyperlink"/>
@@ -4280,7 +4396,7 @@
               <w:rPr>
                 <w:noProof/>
               </w:rPr>
-              <w:instrText xml:space="preserve"> PAGEREF _Toc243650755 \h </w:instrText>
+              <w:instrText xml:space="preserve"> PAGEREF _Toc243676599 \h </w:instrText>
             </w:r>
             <w:r>
               <w:rPr>
@@ -4297,7 +4413,7 @@
               <w:rPr>
                 <w:noProof/>
               </w:rPr>
-              <w:t>14</w:t>
+              <w:t>15</w:t>
             </w:r>
             <w:r>
               <w:rPr>
@@ -4323,7 +4439,7 @@
               <w14:ligatures w14:val="standardContextual"/>
             </w:rPr>
           </w:pPr>
-          <w:hyperlink w:anchor="_Toc243650756" w:history="1">
+          <w:hyperlink w:anchor="_Toc243676600" w:history="1">
             <w:r>
               <w:rPr>
                 <w:rStyle w:val="Hyperlink"/>
@@ -4347,7 +4463,7 @@
               <w:rPr>
                 <w:noProof/>
               </w:rPr>
-              <w:instrText xml:space="preserve"> PAGEREF _Toc243650756 \h </w:instrText>
+              <w:instrText xml:space="preserve"> PAGEREF _Toc243676600 \h </w:instrText>
             </w:r>
             <w:r>
               <w:rPr>
@@ -4364,7 +4480,7 @@
               <w:rPr>
                 <w:noProof/>
               </w:rPr>
-              <w:t>15</w:t>
+              <w:t>16</w:t>
             </w:r>
             <w:r>
               <w:rPr>
@@ -4390,7 +4506,7 @@
               <w14:ligatures w14:val="standardContextual"/>
             </w:rPr>
           </w:pPr>
-          <w:hyperlink w:anchor="_Toc243650757" w:history="1">
+          <w:hyperlink w:anchor="_Toc243676601" w:history="1">
             <w:r>
               <w:rPr>
                 <w:rStyle w:val="Hyperlink"/>
@@ -4414,7 +4530,7 @@
               <w:rPr>
                 <w:noProof/>
               </w:rPr>
-              <w:instrText xml:space="preserve"> PAGEREF _Toc243650757 \h </w:instrText>
+              <w:instrText xml:space="preserve"> PAGEREF _Toc243676601 \h </w:instrText>
             </w:r>
             <w:r>
               <w:rPr>
@@ -4431,7 +4547,7 @@
               <w:rPr>
                 <w:noProof/>
               </w:rPr>
-              <w:t>16</w:t>
+              <w:t>17</w:t>
             </w:r>
             <w:r>
               <w:rPr>
@@ -4460,7 +4576,7 @@
     <w:sdt>
       <w:sdtPr>
         <w:alias w:val="Figures"/>
-        <w:id w:val="-1486929717"/>
+        <w:id w:val="355546321"/>
       </w:sdtPr>
       <w:sdtEndPr/>
       <w:sdtContent>
@@ -4489,7 +4605,7 @@
           <w:r>
             <w:fldChar w:fldCharType="separate"/>
           </w:r>
-          <w:hyperlink w:anchor="_Toc243650758" w:history="1">
+          <w:hyperlink w:anchor="_Toc243676602" w:history="1">
             <w:r>
               <w:rPr>
                 <w:rStyle w:val="Hyperlink"/>
@@ -4513,7 +4629,7 @@
               <w:rPr>
                 <w:noProof/>
               </w:rPr>
-              <w:instrText xml:space="preserve"> PAGEREF _Toc243650758 \h </w:instrText>
+              <w:instrText xml:space="preserve"> PAGEREF _Toc243676602 \h </w:instrText>
             </w:r>
             <w:r>
               <w:rPr>
@@ -4530,7 +4646,7 @@
               <w:rPr>
                 <w:noProof/>
               </w:rPr>
-              <w:t>12</w:t>
+              <w:t>13</w:t>
             </w:r>
             <w:r>
               <w:rPr>
@@ -4559,7 +4675,7 @@
     <w:sdt>
       <w:sdtPr>
         <w:alias w:val="Tables"/>
-        <w:id w:val="176934008"/>
+        <w:id w:val="-1850324296"/>
       </w:sdtPr>
       <w:sdtEndPr/>
       <w:sdtContent>
@@ -4588,7 +4704,7 @@
           <w:r>
             <w:fldChar w:fldCharType="separate"/>
           </w:r>
-          <w:hyperlink w:anchor="_Toc243650759" w:history="1">
+          <w:hyperlink w:anchor="_Toc243676603" w:history="1">
             <w:r>
               <w:rPr>
                 <w:rStyle w:val="Hyperlink"/>
@@ -4612,7 +4728,7 @@
               <w:rPr>
                 <w:noProof/>
               </w:rPr>
-              <w:instrText xml:space="preserve"> PAGEREF _Toc243650759 \h </w:instrText>
+              <w:instrText xml:space="preserve"> PAGEREF _Toc243676603 \h </w:instrText>
             </w:r>
             <w:r>
               <w:rPr>
@@ -4655,7 +4771,7 @@
               <w14:ligatures w14:val="standardContextual"/>
             </w:rPr>
           </w:pPr>
-          <w:hyperlink w:anchor="_Toc243650760" w:history="1">
+          <w:hyperlink w:anchor="_Toc243676604" w:history="1">
             <w:r>
               <w:rPr>
                 <w:rStyle w:val="Hyperlink"/>
@@ -4679,7 +4795,7 @@
               <w:rPr>
                 <w:noProof/>
               </w:rPr>
-              <w:instrText xml:space="preserve"> PAGEREF _Toc243650760 \h </w:instrText>
+              <w:instrText xml:space="preserve"> PAGEREF _Toc243676604 \h </w:instrText>
             </w:r>
             <w:r>
               <w:rPr>
@@ -4722,7 +4838,7 @@
               <w14:ligatures w14:val="standardContextual"/>
             </w:rPr>
           </w:pPr>
-          <w:hyperlink w:anchor="_Toc243650761" w:history="1">
+          <w:hyperlink w:anchor="_Toc243676605" w:history="1">
             <w:r>
               <w:rPr>
                 <w:rStyle w:val="Hyperlink"/>
@@ -4746,7 +4862,7 @@
               <w:rPr>
                 <w:noProof/>
               </w:rPr>
-              <w:instrText xml:space="preserve"> PAGEREF _Toc243650761 \h </w:instrText>
+              <w:instrText xml:space="preserve"> PAGEREF _Toc243676605 \h </w:instrText>
             </w:r>
             <w:r>
               <w:rPr>
@@ -4789,7 +4905,7 @@
               <w14:ligatures w14:val="standardContextual"/>
             </w:rPr>
           </w:pPr>
-          <w:hyperlink w:anchor="_Toc243650762" w:history="1">
+          <w:hyperlink w:anchor="_Toc243676606" w:history="1">
             <w:r>
               <w:rPr>
                 <w:rStyle w:val="Hyperlink"/>
@@ -4813,7 +4929,7 @@
               <w:rPr>
                 <w:noProof/>
               </w:rPr>
-              <w:instrText xml:space="preserve"> PAGEREF _Toc243650762 \h </w:instrText>
+              <w:instrText xml:space="preserve"> PAGEREF _Toc243676606 \h </w:instrText>
             </w:r>
             <w:r>
               <w:rPr>
@@ -4830,7 +4946,7 @@
               <w:rPr>
                 <w:noProof/>
               </w:rPr>
-              <w:t>8</w:t>
+              <w:t>9</w:t>
             </w:r>
             <w:r>
               <w:rPr>
@@ -4856,7 +4972,7 @@
               <w14:ligatures w14:val="standardContextual"/>
             </w:rPr>
           </w:pPr>
-          <w:hyperlink w:anchor="_Toc243650763" w:history="1">
+          <w:hyperlink w:anchor="_Toc243676607" w:history="1">
             <w:r>
               <w:rPr>
                 <w:rStyle w:val="Hyperlink"/>
@@ -4880,7 +4996,7 @@
               <w:rPr>
                 <w:noProof/>
               </w:rPr>
-              <w:instrText xml:space="preserve"> PAGEREF _Toc243650763 \h </w:instrText>
+              <w:instrText xml:space="preserve"> PAGEREF _Toc243676607 \h </w:instrText>
             </w:r>
             <w:r>
               <w:rPr>
@@ -4897,7 +5013,7 @@
               <w:rPr>
                 <w:noProof/>
               </w:rPr>
-              <w:t>9</w:t>
+              <w:t>10</w:t>
             </w:r>
             <w:r>
               <w:rPr>
@@ -4923,7 +5039,7 @@
               <w14:ligatures w14:val="standardContextual"/>
             </w:rPr>
           </w:pPr>
-          <w:hyperlink w:anchor="_Toc243650764" w:history="1">
+          <w:hyperlink w:anchor="_Toc243676608" w:history="1">
             <w:r>
               <w:rPr>
                 <w:rStyle w:val="Hyperlink"/>
@@ -4947,7 +5063,7 @@
               <w:rPr>
                 <w:noProof/>
               </w:rPr>
-              <w:instrText xml:space="preserve"> PAGEREF _Toc243650764 \h </w:instrText>
+              <w:instrText xml:space="preserve"> PAGEREF _Toc243676608 \h </w:instrText>
             </w:r>
             <w:r>
               <w:rPr>
@@ -4964,7 +5080,7 @@
               <w:rPr>
                 <w:noProof/>
               </w:rPr>
-              <w:t>9</w:t>
+              <w:t>10</w:t>
             </w:r>
             <w:r>
               <w:rPr>
@@ -4990,7 +5106,7 @@
               <w14:ligatures w14:val="standardContextual"/>
             </w:rPr>
           </w:pPr>
-          <w:hyperlink w:anchor="_Toc243650765" w:history="1">
+          <w:hyperlink w:anchor="_Toc243676609" w:history="1">
             <w:r>
               <w:rPr>
                 <w:rStyle w:val="Hyperlink"/>
@@ -5014,7 +5130,7 @@
               <w:rPr>
                 <w:noProof/>
               </w:rPr>
-              <w:instrText xml:space="preserve"> PAGEREF _Toc243650765 \h </w:instrText>
+              <w:instrText xml:space="preserve"> PAGEREF _Toc243676609 \h </w:instrText>
             </w:r>
             <w:r>
               <w:rPr>
@@ -5031,7 +5147,7 @@
               <w:rPr>
                 <w:noProof/>
               </w:rPr>
-              <w:t>10</w:t>
+              <w:t>11</w:t>
             </w:r>
             <w:r>
               <w:rPr>
@@ -5057,7 +5173,7 @@
               <w14:ligatures w14:val="standardContextual"/>
             </w:rPr>
           </w:pPr>
-          <w:hyperlink w:anchor="_Toc243650766" w:history="1">
+          <w:hyperlink w:anchor="_Toc243676610" w:history="1">
             <w:r>
               <w:rPr>
                 <w:rStyle w:val="Hyperlink"/>
@@ -5081,7 +5197,7 @@
               <w:rPr>
                 <w:noProof/>
               </w:rPr>
-              <w:instrText xml:space="preserve"> PAGEREF _Toc243650766 \h </w:instrText>
+              <w:instrText xml:space="preserve"> PAGEREF _Toc243676610 \h </w:instrText>
             </w:r>
             <w:r>
               <w:rPr>
@@ -5098,7 +5214,7 @@
               <w:rPr>
                 <w:noProof/>
               </w:rPr>
-              <w:t>11</w:t>
+              <w:t>12</w:t>
             </w:r>
             <w:r>
               <w:rPr>
@@ -5124,7 +5240,7 @@
               <w14:ligatures w14:val="standardContextual"/>
             </w:rPr>
           </w:pPr>
-          <w:hyperlink w:anchor="_Toc243650767" w:history="1">
+          <w:hyperlink w:anchor="_Toc243676611" w:history="1">
             <w:r>
               <w:rPr>
                 <w:rStyle w:val="Hyperlink"/>
@@ -5148,7 +5264,7 @@
               <w:rPr>
                 <w:noProof/>
               </w:rPr>
-              <w:instrText xml:space="preserve"> PAGEREF _Toc243650767 \h </w:instrText>
+              <w:instrText xml:space="preserve"> PAGEREF _Toc243676611 \h </w:instrText>
             </w:r>
             <w:r>
               <w:rPr>
@@ -5165,7 +5281,7 @@
               <w:rPr>
                 <w:noProof/>
               </w:rPr>
-              <w:t>11</w:t>
+              <w:t>12</w:t>
             </w:r>
             <w:r>
               <w:rPr>
@@ -5191,7 +5307,7 @@
               <w14:ligatures w14:val="standardContextual"/>
             </w:rPr>
           </w:pPr>
-          <w:hyperlink w:anchor="_Toc243650768" w:history="1">
+          <w:hyperlink w:anchor="_Toc243676612" w:history="1">
             <w:r>
               <w:rPr>
                 <w:rStyle w:val="Hyperlink"/>
@@ -5215,7 +5331,7 @@
               <w:rPr>
                 <w:noProof/>
               </w:rPr>
-              <w:instrText xml:space="preserve"> PAGEREF _Toc243650768 \h </w:instrText>
+              <w:instrText xml:space="preserve"> PAGEREF _Toc243676612 \h </w:instrText>
             </w:r>
             <w:r>
               <w:rPr>
@@ -5232,7 +5348,7 @@
               <w:rPr>
                 <w:noProof/>
               </w:rPr>
-              <w:t>14</w:t>
+              <w:t>15</w:t>
             </w:r>
             <w:r>
               <w:rPr>
@@ -5258,7 +5374,7 @@
               <w14:ligatures w14:val="standardContextual"/>
             </w:rPr>
           </w:pPr>
-          <w:hyperlink w:anchor="_Toc243650769" w:history="1">
+          <w:hyperlink w:anchor="_Toc243676613" w:history="1">
             <w:r>
               <w:rPr>
                 <w:rStyle w:val="Hyperlink"/>
@@ -5282,7 +5398,7 @@
               <w:rPr>
                 <w:noProof/>
               </w:rPr>
-              <w:instrText xml:space="preserve"> PAGEREF _Toc243650769 \h </w:instrText>
+              <w:instrText xml:space="preserve"> PAGEREF _Toc243676613 \h </w:instrText>
             </w:r>
             <w:r>
               <w:rPr>
@@ -5299,7 +5415,7 @@
               <w:rPr>
                 <w:noProof/>
               </w:rPr>
-              <w:t>14</w:t>
+              <w:t>15</w:t>
             </w:r>
             <w:r>
               <w:rPr>
@@ -5325,7 +5441,7 @@
               <w14:ligatures w14:val="standardContextual"/>
             </w:rPr>
           </w:pPr>
-          <w:hyperlink w:anchor="_Toc243650770" w:history="1">
+          <w:hyperlink w:anchor="_Toc243676614" w:history="1">
             <w:r>
               <w:rPr>
                 <w:rStyle w:val="Hyperlink"/>
@@ -5349,7 +5465,7 @@
               <w:rPr>
                 <w:noProof/>
               </w:rPr>
-              <w:instrText xml:space="preserve"> PAGEREF _Toc243650770 \h </w:instrText>
+              <w:instrText xml:space="preserve"> PAGEREF _Toc243676614 \h </w:instrText>
             </w:r>
             <w:r>
               <w:rPr>
@@ -5366,7 +5482,7 @@
               <w:rPr>
                 <w:noProof/>
               </w:rPr>
-              <w:t>15</w:t>
+              <w:t>16</w:t>
             </w:r>
             <w:r>
               <w:rPr>
@@ -5392,7 +5508,7 @@
               <w14:ligatures w14:val="standardContextual"/>
             </w:rPr>
           </w:pPr>
-          <w:hyperlink w:anchor="_Toc243650771" w:history="1">
+          <w:hyperlink w:anchor="_Toc243676615" w:history="1">
             <w:r>
               <w:rPr>
                 <w:rStyle w:val="Hyperlink"/>
@@ -5416,7 +5532,7 @@
               <w:rPr>
                 <w:noProof/>
               </w:rPr>
-              <w:instrText xml:space="preserve"> PAGEREF _Toc243650771 \h </w:instrText>
+              <w:instrText xml:space="preserve"> PAGEREF _Toc243676615 \h </w:instrText>
             </w:r>
             <w:r>
               <w:rPr>
@@ -5433,7 +5549,7 @@
               <w:rPr>
                 <w:noProof/>
               </w:rPr>
-              <w:t>16</w:t>
+              <w:t>17</w:t>
             </w:r>
             <w:r>
               <w:rPr>
@@ -5457,7 +5573,7 @@
         <w:keepLines/>
         <w:pageBreakBefore/>
       </w:pPr>
-      <w:bookmarkStart w:id="0" w:name="_Toc243650732"/>
+      <w:bookmarkStart w:id="0" w:name="_Toc243676576"/>
       <w:r>
         <w:lastRenderedPageBreak/>
         <w:t>1 Introduction</w:t>
@@ -5470,7 +5586,7 @@
         <w:keepNext/>
         <w:keepLines/>
       </w:pPr>
-      <w:bookmarkStart w:id="1" w:name="_Toc243650733"/>
+      <w:bookmarkStart w:id="1" w:name="_Toc243676577"/>
       <w:r>
         <w:t>1.1 Purpose</w:t>
       </w:r>
@@ -5511,7 +5627,10 @@
         <w:t>how</w:t>
       </w:r>
       <w:r>
-        <w:t xml:space="preserve"> its success will be judged. It is the parent of every other ZedPath document: user stories (ZP-DOC-02) refine its features, and the requirements specification (ZP-DOC-03) makes them precise.</w:t>
+        <w:t xml:space="preserve"> its success </w:t>
+      </w:r>
+      <w:r>
+        <w:t>will be judged. It is the parent of every other ZedPath document: user stories (ZP-DOC-02) refine its features, and the requirements specification (ZP-DOC-03) makes them precise.</w:t>
       </w:r>
     </w:p>
     <w:p>
@@ -5520,7 +5639,7 @@
         <w:keepNext/>
         <w:keepLines/>
       </w:pPr>
-      <w:bookmarkStart w:id="2" w:name="_Toc243650734"/>
+      <w:bookmarkStart w:id="2" w:name="_Toc243676578"/>
       <w:r>
         <w:t>1.2 Scope</w:t>
       </w:r>
@@ -5531,10 +5650,7 @@
         <w:spacing w:after="120"/>
       </w:pPr>
       <w:r>
-        <w:t xml:space="preserve">It covers the business requirements, the product vision, the scope of the first two releases, and the </w:t>
-      </w:r>
-      <w:r>
-        <w:t>business context (stakeholders, priorities, risks and deployment constraints). Technical design is out of scope.</w:t>
+        <w:t>It covers the business requirements, the product vision, the scope of the first two releases, and the business context (stakeholders, priorities, risks and deployment constraints). Technical design is out of scope.</w:t>
       </w:r>
     </w:p>
     <w:p>
@@ -5543,7 +5659,7 @@
         <w:keepNext/>
         <w:keepLines/>
       </w:pPr>
-      <w:bookmarkStart w:id="3" w:name="_Toc243650735"/>
+      <w:bookmarkStart w:id="3" w:name="_Toc243676579"/>
       <w:r>
         <w:t>1.3 Intended audience</w:t>
       </w:r>
@@ -5563,7 +5679,7 @@
         <w:keepNext/>
         <w:keepLines/>
       </w:pPr>
-      <w:bookmarkStart w:id="4" w:name="_Toc243650736"/>
+      <w:bookmarkStart w:id="4" w:name="_Toc243676580"/>
       <w:r>
         <w:t>1.4 Relationship to other documents</w:t>
       </w:r>
@@ -5574,7 +5690,7 @@
         <w:pStyle w:val="Caption"/>
         <w:keepNext/>
       </w:pPr>
-      <w:bookmarkStart w:id="5" w:name="_Toc243650759"/>
+      <w:bookmarkStart w:id="5" w:name="_Toc243676603"/>
       <w:r>
         <w:t xml:space="preserve">Table </w:t>
       </w:r>
@@ -5616,7 +5732,7 @@
           <w:left w:w="10" w:type="dxa"/>
           <w:right w:w="10" w:type="dxa"/>
         </w:tblCellMar>
-        <w:tblLook w:val="04A0" w:firstRow="1" w:lastRow="0" w:firstColumn="1" w:lastColumn="0" w:noHBand="0" w:noVBand="1"/>
+        <w:tblLook w:val="0000" w:firstRow="0" w:lastRow="0" w:firstColumn="0" w:lastColumn="0" w:noHBand="0" w:noVBand="0"/>
       </w:tblPr>
       <w:tblGrid>
         <w:gridCol w:w="4337"/>
@@ -6002,7 +6118,7 @@
         <w:keepNext/>
         <w:keepLines/>
       </w:pPr>
-      <w:bookmarkStart w:id="6" w:name="_Toc243650737"/>
+      <w:bookmarkStart w:id="6" w:name="_Toc243676581"/>
       <w:r>
         <w:t>1.5 Changes since version 1.0</w:t>
       </w:r>
@@ -6031,7 +6147,7 @@
         <w:pStyle w:val="Caption"/>
         <w:keepNext/>
       </w:pPr>
-      <w:bookmarkStart w:id="7" w:name="_Toc243650760"/>
+      <w:bookmarkStart w:id="7" w:name="_Toc243676604"/>
       <w:r>
         <w:t xml:space="preserve">Table </w:t>
       </w:r>
@@ -6073,7 +6189,7 @@
           <w:left w:w="10" w:type="dxa"/>
           <w:right w:w="10" w:type="dxa"/>
         </w:tblCellMar>
-        <w:tblLook w:val="04A0" w:firstRow="1" w:lastRow="0" w:firstColumn="1" w:lastColumn="0" w:noHBand="0" w:noVBand="1"/>
+        <w:tblLook w:val="0000" w:firstRow="0" w:lastRow="0" w:firstColumn="0" w:lastColumn="0" w:noHBand="0" w:noVBand="0"/>
       </w:tblPr>
       <w:tblGrid>
         <w:gridCol w:w="1410"/>
@@ -6955,7 +7071,7 @@
         <w:keepNext/>
         <w:keepLines/>
       </w:pPr>
-      <w:bookmarkStart w:id="8" w:name="_Toc243650738"/>
+      <w:bookmarkStart w:id="8" w:name="_Toc243676582"/>
       <w:r>
         <w:t>1.6 Changes since version 2.0</w:t>
       </w:r>
@@ -7004,7 +7120,7 @@
         <w:pStyle w:val="Caption"/>
         <w:keepNext/>
       </w:pPr>
-      <w:bookmarkStart w:id="9" w:name="_Toc243650761"/>
+      <w:bookmarkStart w:id="9" w:name="_Toc243676605"/>
       <w:r>
         <w:t xml:space="preserve">Table </w:t>
       </w:r>
@@ -7046,7 +7162,7 @@
           <w:left w:w="10" w:type="dxa"/>
           <w:right w:w="10" w:type="dxa"/>
         </w:tblCellMar>
-        <w:tblLook w:val="04A0" w:firstRow="1" w:lastRow="0" w:firstColumn="1" w:lastColumn="0" w:noHBand="0" w:noVBand="1"/>
+        <w:tblLook w:val="0000" w:firstRow="0" w:lastRow="0" w:firstColumn="0" w:lastColumn="0" w:noHBand="0" w:noVBand="0"/>
       </w:tblPr>
       <w:tblGrid>
         <w:gridCol w:w="878"/>
@@ -7972,6 +8088,143 @@
           </w:p>
         </w:tc>
       </w:tr>
+      <w:tr>
+        <w:tblPrEx>
+          <w:tblCellMar>
+            <w:top w:w="0" w:type="dxa"/>
+            <w:bottom w:w="0" w:type="dxa"/>
+          </w:tblCellMar>
+        </w:tblPrEx>
+        <w:trPr>
+          <w:cantSplit/>
+        </w:trPr>
+        <w:tc>
+          <w:tcPr>
+            <w:tcW w:w="878" w:type="dxa"/>
+            <w:tcBorders>
+              <w:top w:val="single" w:sz="4" w:space="0" w:color="C9D3D0"/>
+              <w:left w:val="single" w:sz="4" w:space="0" w:color="C9D3D0"/>
+              <w:bottom w:val="single" w:sz="4" w:space="0" w:color="C9D3D0"/>
+              <w:right w:val="single" w:sz="4" w:space="0" w:color="C9D3D0"/>
+            </w:tcBorders>
+            <w:shd w:val="clear" w:color="auto" w:fill="F3F8F6"/>
+            <w:tcMar>
+              <w:top w:w="50" w:type="dxa"/>
+              <w:left w:w="100" w:type="dxa"/>
+              <w:bottom w:w="50" w:type="dxa"/>
+              <w:right w:w="100" w:type="dxa"/>
+            </w:tcMar>
+            <w:vAlign w:val="center"/>
+          </w:tcPr>
+          <w:p>
+            <w:pPr>
+              <w:spacing w:line="252" w:lineRule="auto"/>
+            </w:pPr>
+            <w:r>
+              <w:rPr>
+                <w:sz w:val="19"/>
+                <w:szCs w:val="19"/>
+              </w:rPr>
+              <w:lastRenderedPageBreak/>
+              <w:t>CR-015</w:t>
+            </w:r>
+          </w:p>
+        </w:tc>
+        <w:tc>
+          <w:tcPr>
+            <w:tcW w:w="1877" w:type="dxa"/>
+            <w:tcBorders>
+              <w:top w:val="single" w:sz="4" w:space="0" w:color="C9D3D0"/>
+              <w:left w:val="single" w:sz="4" w:space="0" w:color="C9D3D0"/>
+              <w:bottom w:val="single" w:sz="4" w:space="0" w:color="C9D3D0"/>
+              <w:right w:val="single" w:sz="4" w:space="0" w:color="C9D3D0"/>
+            </w:tcBorders>
+            <w:shd w:val="clear" w:color="auto" w:fill="F3F8F6"/>
+            <w:tcMar>
+              <w:top w:w="50" w:type="dxa"/>
+              <w:left w:w="100" w:type="dxa"/>
+              <w:bottom w:w="50" w:type="dxa"/>
+              <w:right w:w="100" w:type="dxa"/>
+            </w:tcMar>
+            <w:vAlign w:val="center"/>
+          </w:tcPr>
+          <w:p>
+            <w:pPr>
+              <w:spacing w:line="252" w:lineRule="auto"/>
+            </w:pPr>
+            <w:r>
+              <w:rPr>
+                <w:sz w:val="19"/>
+                <w:szCs w:val="19"/>
+              </w:rPr>
+              <w:t>23 October 2026</w:t>
+            </w:r>
+          </w:p>
+        </w:tc>
+        <w:tc>
+          <w:tcPr>
+            <w:tcW w:w="6883" w:type="dxa"/>
+            <w:tcBorders>
+              <w:top w:val="single" w:sz="4" w:space="0" w:color="C9D3D0"/>
+              <w:left w:val="single" w:sz="4" w:space="0" w:color="C9D3D0"/>
+              <w:bottom w:val="single" w:sz="4" w:space="0" w:color="C9D3D0"/>
+              <w:right w:val="single" w:sz="4" w:space="0" w:color="C9D3D0"/>
+            </w:tcBorders>
+            <w:shd w:val="clear" w:color="auto" w:fill="F3F8F6"/>
+            <w:tcMar>
+              <w:top w:w="50" w:type="dxa"/>
+              <w:left w:w="100" w:type="dxa"/>
+              <w:bottom w:w="50" w:type="dxa"/>
+              <w:right w:w="100" w:type="dxa"/>
+            </w:tcMar>
+            <w:vAlign w:val="center"/>
+          </w:tcPr>
+          <w:p>
+            <w:pPr>
+              <w:spacing w:line="252" w:lineRule="auto"/>
+            </w:pPr>
+            <w:r>
+              <w:rPr>
+                <w:sz w:val="19"/>
+                <w:szCs w:val="19"/>
+              </w:rPr>
+              <w:t xml:space="preserve">Scholarships and loans (the product owner's request, 23 October 2026): a seventh group of other paths, </w:t>
+            </w:r>
+            <w:r>
+              <w:rPr>
+                <w:i/>
+                <w:iCs/>
+                <w:sz w:val="19"/>
+                <w:szCs w:val="19"/>
+              </w:rPr>
+              <w:t>Scholarships and loans</w:t>
+            </w:r>
+            <w:r>
+              <w:rPr>
+                <w:sz w:val="19"/>
+                <w:szCs w:val="19"/>
+              </w:rPr>
+              <w:t xml:space="preserve"> ("Ways to pay for your next step"), that also lists the government scholarships abroad; each scholarship or loan names the paths it pays for, and those paths show it under </w:t>
+            </w:r>
+            <w:r>
+              <w:rPr>
+                <w:i/>
+                <w:iCs/>
+                <w:sz w:val="19"/>
+                <w:szCs w:val="19"/>
+              </w:rPr>
+              <w:t>Ways to pay</w:t>
+            </w:r>
+            <w:r>
+              <w:rPr>
+                <w:sz w:val="19"/>
+                <w:szCs w:val="19"/>
+              </w:rPr>
+              <w:t>; it never shows a cost or "Free" (what it gives is in its notes); searchable in English, Sinhala and Tamil; included in Ask. The entries themselves are added only after a fact-check against their official sources</w:t>
+            </w:r>
+          </w:p>
+        </w:tc>
+      </w:tr>
     </w:tbl>
     <w:p>
       <w:pPr>
@@ -7985,7 +8238,7 @@
         <w:keepLines/>
         <w:pageBreakBefore/>
       </w:pPr>
-      <w:bookmarkStart w:id="10" w:name="_Toc243650739"/>
+      <w:bookmarkStart w:id="10" w:name="_Toc243676583"/>
       <w:r>
         <w:lastRenderedPageBreak/>
         <w:t>2 Business requirements</w:t>
@@ -7998,7 +8251,7 @@
         <w:keepNext/>
         <w:keepLines/>
       </w:pPr>
-      <w:bookmarkStart w:id="11" w:name="_Toc243650740"/>
+      <w:bookmarkStart w:id="11" w:name="_Toc243676584"/>
       <w:r>
         <w:t>2.1 Background</w:t>
       </w:r>
@@ -8047,10 +8300,10 @@
         <w:spacing w:after="120"/>
       </w:pPr>
       <w:r>
-        <w:t xml:space="preserve">Within a few weeks of results, each student must decide. Students aiming for a state university must choose and rank up to 125 course preferences under rules published in a handbook of more than 200 pages that changes </w:t>
-      </w:r>
-      <w:r>
-        <w:t>every year, inside a three-week application window. Because places are limited, most also need a backup: a private or non-state degree, study abroad, a government job examination announced in the Gazette, a vocational course, or sitting the examination again. Each path has its own rules, calendar and website.</w:t>
+        <w:t xml:space="preserve">Within a few weeks of results, each student must decide. Students aiming for a state university must choose and rank up to 125 course preferences under rules published in a handbook of more than 200 pages that changes every year, inside a three-week application window. Because places are limited, most also need a backup: a private or non-state degree, study abroad, a government job examination announced in the Gazette, a </w:t>
+      </w:r>
+      <w:r>
+        <w:t>vocational course, or sitting the examination again. Each path has its own rules, calendar and website.</w:t>
       </w:r>
     </w:p>
     <w:p>
@@ -8058,10 +8311,10 @@
         <w:spacing w:after="120"/>
       </w:pPr>
       <w:r>
-        <w:t xml:space="preserve">Gate 1 research (six interviews, E1 to E6, and a hands-on test of four existing tools, T1) found one pattern: </w:t>
-      </w:r>
-      <w:r>
-        <w:t>students decide mostly on hearsay from tuition teachers, seniors and social-media groups. A badly ordered preference list, an ineligible choice, a missed deadline or a path never heard of can cost a year. The National Education Commission reached the same conclusion: most students and parents are unaware of alternative education and career options [3].</w:t>
+        <w:t xml:space="preserve">Gate 1 research (six interviews, E1 to E6, and a hands-on test of four existing tools, T1) found one pattern: students decide mostly on hearsay from tuition teachers, seniors and social-media groups. A badly ordered preference list, an ineligible choice, a missed deadline or a path never heard of can cost a year. The </w:t>
+      </w:r>
+      <w:r>
+        <w:t>National Education Commission reached the same conclusion: most students and parents are unaware of alternative education and career options [3].</w:t>
       </w:r>
     </w:p>
     <w:p>
@@ -8070,7 +8323,7 @@
         <w:keepNext/>
         <w:keepLines/>
       </w:pPr>
-      <w:bookmarkStart w:id="12" w:name="_Toc243650741"/>
+      <w:bookmarkStart w:id="12" w:name="_Toc243676585"/>
       <w:r>
         <w:t>2.2 Business opportunity</w:t>
       </w:r>
@@ -8111,7 +8364,10 @@
         <w:t>dated deadlines</w:t>
       </w:r>
       <w:r>
-        <w:t xml:space="preserve"> in one place. The tools tested (findmydegree.lk, Unicompass, induwara.lk, ThuSh LK) compare a Z-score with cut-offs, but none checks subject and grade rules, preference order or deadlines, and none covers routes outside the University Grants Commission (UGC) [4].</w:t>
+        <w:t xml:space="preserve"> in one place. The tools tested (findmydegree.lk, Unicompass, induwara.lk, ThuSh LK) compare a Z-score with cut-offs, but none checks subject and grade rules, preference order or deadlines, and none covers </w:t>
+      </w:r>
+      <w:r>
+        <w:t>routes outside the University Grants Commission (UGC) [4].</w:t>
       </w:r>
     </w:p>
     <w:p>
@@ -8168,7 +8424,7 @@
         <w:keepNext/>
         <w:keepLines/>
       </w:pPr>
-      <w:bookmarkStart w:id="13" w:name="_Toc243650742"/>
+      <w:bookmarkStart w:id="13" w:name="_Toc243676586"/>
       <w:r>
         <w:t>2.3 Business objectives</w:t>
       </w:r>
@@ -8179,7 +8435,7 @@
         <w:pStyle w:val="Caption"/>
         <w:keepNext/>
       </w:pPr>
-      <w:bookmarkStart w:id="14" w:name="_Toc243650762"/>
+      <w:bookmarkStart w:id="14" w:name="_Toc243676606"/>
       <w:r>
         <w:t xml:space="preserve">Table </w:t>
       </w:r>
@@ -8221,7 +8477,7 @@
           <w:left w:w="10" w:type="dxa"/>
           <w:right w:w="10" w:type="dxa"/>
         </w:tblCellMar>
-        <w:tblLook w:val="04A0" w:firstRow="1" w:lastRow="0" w:firstColumn="1" w:lastColumn="0" w:noHBand="0" w:noVBand="1"/>
+        <w:tblLook w:val="0000" w:firstRow="0" w:lastRow="0" w:firstColumn="0" w:lastColumn="0" w:noHBand="0" w:noVBand="0"/>
       </w:tblPr>
       <w:tblGrid>
         <w:gridCol w:w="665"/>
@@ -8969,7 +9225,7 @@
         <w:keepNext/>
         <w:keepLines/>
       </w:pPr>
-      <w:bookmarkStart w:id="15" w:name="_Toc243650743"/>
+      <w:bookmarkStart w:id="15" w:name="_Toc243676587"/>
       <w:r>
         <w:t>2.4 Market size</w:t>
       </w:r>
@@ -8980,7 +9236,7 @@
         <w:pStyle w:val="Caption"/>
         <w:keepNext/>
       </w:pPr>
-      <w:bookmarkStart w:id="16" w:name="_Toc243650763"/>
+      <w:bookmarkStart w:id="16" w:name="_Toc243676607"/>
       <w:r>
         <w:t xml:space="preserve">Table </w:t>
       </w:r>
@@ -9022,7 +9278,7 @@
           <w:left w:w="10" w:type="dxa"/>
           <w:right w:w="10" w:type="dxa"/>
         </w:tblCellMar>
-        <w:tblLook w:val="04A0" w:firstRow="1" w:lastRow="0" w:firstColumn="1" w:lastColumn="0" w:noHBand="0" w:noVBand="1"/>
+        <w:tblLook w:val="0000" w:firstRow="0" w:lastRow="0" w:firstColumn="0" w:lastColumn="0" w:noHBand="0" w:noVBand="0"/>
       </w:tblPr>
       <w:tblGrid>
         <w:gridCol w:w="3109"/>
@@ -9461,7 +9717,7 @@
         <w:keepNext/>
         <w:keepLines/>
       </w:pPr>
-      <w:bookmarkStart w:id="17" w:name="_Toc243650744"/>
+      <w:bookmarkStart w:id="17" w:name="_Toc243676588"/>
       <w:r>
         <w:t>2.5 Success metrics</w:t>
       </w:r>
@@ -9573,7 +9829,7 @@
         <w:keepNext/>
         <w:keepLines/>
       </w:pPr>
-      <w:bookmarkStart w:id="18" w:name="_Toc243650745"/>
+      <w:bookmarkStart w:id="18" w:name="_Toc243676589"/>
       <w:r>
         <w:t>2.6 Vision statement</w:t>
       </w:r>
@@ -9646,7 +9902,10 @@
         <w:t>ZedPath</w:t>
       </w:r>
       <w:r>
-        <w:t xml:space="preserve"> checks subject and grade rules, preference order and deadlines, covers routes outside the UGC, and never states a fact without its source.</w:t>
+        <w:t xml:space="preserve"> checks subject and grade rules, </w:t>
+      </w:r>
+      <w:r>
+        <w:t>preference order and deadlines, covers routes outside the UGC, and never states a fact without its source.</w:t>
       </w:r>
     </w:p>
     <w:p>
@@ -9655,7 +9914,7 @@
         <w:keepNext/>
         <w:keepLines/>
       </w:pPr>
-      <w:bookmarkStart w:id="19" w:name="_Toc243650746"/>
+      <w:bookmarkStart w:id="19" w:name="_Toc243676590"/>
       <w:r>
         <w:t>2.7 Business risks</w:t>
       </w:r>
@@ -9666,7 +9925,7 @@
         <w:pStyle w:val="Caption"/>
         <w:keepNext/>
       </w:pPr>
-      <w:bookmarkStart w:id="20" w:name="_Toc243650764"/>
+      <w:bookmarkStart w:id="20" w:name="_Toc243676608"/>
       <w:r>
         <w:t xml:space="preserve">Table </w:t>
       </w:r>
@@ -9708,7 +9967,7 @@
           <w:left w:w="10" w:type="dxa"/>
           <w:right w:w="10" w:type="dxa"/>
         </w:tblCellMar>
-        <w:tblLook w:val="04A0" w:firstRow="1" w:lastRow="0" w:firstColumn="1" w:lastColumn="0" w:noHBand="0" w:noVBand="1"/>
+        <w:tblLook w:val="0000" w:firstRow="0" w:lastRow="0" w:firstColumn="0" w:lastColumn="0" w:noHBand="0" w:noVBand="0"/>
       </w:tblPr>
       <w:tblGrid>
         <w:gridCol w:w="679"/>
@@ -11286,7 +11545,7 @@
         <w:keepNext/>
         <w:keepLines/>
       </w:pPr>
-      <w:bookmarkStart w:id="21" w:name="_Toc243650747"/>
+      <w:bookmarkStart w:id="21" w:name="_Toc243676591"/>
       <w:r>
         <w:t>2.8 Assumptions and dependencies</w:t>
       </w:r>
@@ -11297,7 +11556,7 @@
         <w:pStyle w:val="Caption"/>
         <w:keepNext/>
       </w:pPr>
-      <w:bookmarkStart w:id="22" w:name="_Toc243650765"/>
+      <w:bookmarkStart w:id="22" w:name="_Toc243676609"/>
       <w:r>
         <w:t xml:space="preserve">Table </w:t>
       </w:r>
@@ -11339,7 +11598,7 @@
           <w:left w:w="10" w:type="dxa"/>
           <w:right w:w="10" w:type="dxa"/>
         </w:tblCellMar>
-        <w:tblLook w:val="04A0" w:firstRow="1" w:lastRow="0" w:firstColumn="1" w:lastColumn="0" w:noHBand="0" w:noVBand="1"/>
+        <w:tblLook w:val="0000" w:firstRow="0" w:lastRow="0" w:firstColumn="0" w:lastColumn="0" w:noHBand="0" w:noVBand="0"/>
       </w:tblPr>
       <w:tblGrid>
         <w:gridCol w:w="803"/>
@@ -11941,7 +12200,7 @@
         <w:keepLines/>
         <w:pageBreakBefore/>
       </w:pPr>
-      <w:bookmarkStart w:id="23" w:name="_Toc243650748"/>
+      <w:bookmarkStart w:id="23" w:name="_Toc243676592"/>
       <w:r>
         <w:lastRenderedPageBreak/>
         <w:t>3 Scope and limitations</w:t>
@@ -11954,7 +12213,7 @@
         <w:keepNext/>
         <w:keepLines/>
       </w:pPr>
-      <w:bookmarkStart w:id="24" w:name="_Toc243650749"/>
+      <w:bookmarkStart w:id="24" w:name="_Toc243676593"/>
       <w:r>
         <w:t>3.1 Major features</w:t>
       </w:r>
@@ -11973,7 +12232,7 @@
         <w:pStyle w:val="Caption"/>
         <w:keepNext/>
       </w:pPr>
-      <w:bookmarkStart w:id="25" w:name="_Toc243650766"/>
+      <w:bookmarkStart w:id="25" w:name="_Toc243676610"/>
       <w:r>
         <w:t xml:space="preserve">Table </w:t>
       </w:r>
@@ -12015,7 +12274,7 @@
           <w:left w:w="10" w:type="dxa"/>
           <w:right w:w="10" w:type="dxa"/>
         </w:tblCellMar>
-        <w:tblLook w:val="04A0" w:firstRow="1" w:lastRow="0" w:firstColumn="1" w:lastColumn="0" w:noHBand="0" w:noVBand="1"/>
+        <w:tblLook w:val="0000" w:firstRow="0" w:lastRow="0" w:firstColumn="0" w:lastColumn="0" w:noHBand="0" w:noVBand="0"/>
       </w:tblPr>
       <w:tblGrid>
         <w:gridCol w:w="741"/>
@@ -12689,14 +12948,62 @@
                 <w:sz w:val="19"/>
                 <w:szCs w:val="19"/>
               </w:rPr>
-              <w:t>Revised (CR-002, VR, CR-009).</w:t>
-            </w:r>
-            <w:r>
-              <w:rPr>
-                <w:sz w:val="19"/>
-                <w:szCs w:val="19"/>
-              </w:rPr>
-              <w:t xml:space="preserve"> Every other route matched to the student's results, in six groups (the retry path was removed), with Gazette job-exam and intake notices checked on the phone under the Journey's </w:t>
+              <w:t>Revised (CR-002, VR, CR-009, CR-015).</w:t>
+            </w:r>
+            <w:r>
+              <w:rPr>
+                <w:sz w:val="19"/>
+                <w:szCs w:val="19"/>
+              </w:rPr>
+              <w:t xml:space="preserve"> Every other route matched to the student's results, in six groups (the retry path was removed) and, </w:t>
+            </w:r>
+            <w:r>
+              <w:rPr>
+                <w:i/>
+                <w:iCs/>
+                <w:sz w:val="19"/>
+                <w:szCs w:val="19"/>
+              </w:rPr>
+              <w:t>(CR-015)</w:t>
+            </w:r>
+            <w:r>
+              <w:rPr>
+                <w:sz w:val="19"/>
+                <w:szCs w:val="19"/>
+              </w:rPr>
+              <w:t xml:space="preserve"> a seventh, </w:t>
+            </w:r>
+            <w:r>
+              <w:rPr>
+                <w:i/>
+                <w:iCs/>
+                <w:sz w:val="19"/>
+                <w:szCs w:val="19"/>
+              </w:rPr>
+              <w:t>Scholarships and loans</w:t>
+            </w:r>
+            <w:r>
+              <w:rPr>
+                <w:sz w:val="19"/>
+                <w:szCs w:val="19"/>
+              </w:rPr>
+              <w:t>, each scheme linked to the paths it pays for (</w:t>
+            </w:r>
+            <w:r>
+              <w:rPr>
+                <w:i/>
+                <w:iCs/>
+                <w:sz w:val="19"/>
+                <w:szCs w:val="19"/>
+              </w:rPr>
+              <w:t>Ways to pay</w:t>
+            </w:r>
+            <w:r>
+              <w:rPr>
+                <w:sz w:val="19"/>
+                <w:szCs w:val="19"/>
+              </w:rPr>
+              <w:t xml:space="preserve">); Gazette job-exam and intake notices checked on the phone under the Journey's </w:t>
             </w:r>
             <w:r>
               <w:rPr>
@@ -13196,7 +13503,7 @@
         <w:keepNext/>
         <w:keepLines/>
       </w:pPr>
-      <w:bookmarkStart w:id="26" w:name="_Toc243650750"/>
+      <w:bookmarkStart w:id="26" w:name="_Toc243676594"/>
       <w:r>
         <w:t>3.2 Scope of initial and subsequent releases</w:t>
       </w:r>
@@ -13207,7 +13514,7 @@
         <w:pStyle w:val="Caption"/>
         <w:keepNext/>
       </w:pPr>
-      <w:bookmarkStart w:id="27" w:name="_Toc243650767"/>
+      <w:bookmarkStart w:id="27" w:name="_Toc243676611"/>
       <w:r>
         <w:t xml:space="preserve">Table </w:t>
       </w:r>
@@ -13249,7 +13556,7 @@
           <w:left w:w="10" w:type="dxa"/>
           <w:right w:w="10" w:type="dxa"/>
         </w:tblCellMar>
-        <w:tblLook w:val="04A0" w:firstRow="1" w:lastRow="0" w:firstColumn="1" w:lastColumn="0" w:noHBand="0" w:noVBand="1"/>
+        <w:tblLook w:val="0000" w:firstRow="0" w:lastRow="0" w:firstColumn="0" w:lastColumn="0" w:noHBand="0" w:noVBand="0"/>
       </w:tblPr>
       <w:tblGrid>
         <w:gridCol w:w="968"/>
@@ -13902,7 +14209,7 @@
                 <w:sz w:val="19"/>
                 <w:szCs w:val="19"/>
               </w:rPr>
-              <w:t xml:space="preserve">Recognition check, loan scheme, scholarships; </w:t>
+              <w:t xml:space="preserve">Recognition check, loan-scheme eligibility check; </w:t>
             </w:r>
             <w:r>
               <w:rPr>
@@ -13918,7 +14225,55 @@
                 <w:sz w:val="19"/>
                 <w:szCs w:val="19"/>
               </w:rPr>
-              <w:t xml:space="preserve"> NVQ ladder to a degree</w:t>
+              <w:t xml:space="preserve"> NVQ ladder to a degree; </w:t>
+            </w:r>
+            <w:r>
+              <w:rPr>
+                <w:i/>
+                <w:iCs/>
+                <w:sz w:val="19"/>
+                <w:szCs w:val="19"/>
+              </w:rPr>
+              <w:t>delivered 23 October 2026 (CR-015):</w:t>
+            </w:r>
+            <w:r>
+              <w:rPr>
+                <w:sz w:val="19"/>
+                <w:szCs w:val="19"/>
+              </w:rPr>
+              <w:t xml:space="preserve"> scholarships and loan schemes, as the </w:t>
+            </w:r>
+            <w:r>
+              <w:rPr>
+                <w:i/>
+                <w:iCs/>
+                <w:sz w:val="19"/>
+                <w:szCs w:val="19"/>
+              </w:rPr>
+              <w:t>Scholarships and loans</w:t>
+            </w:r>
+            <w:r>
+              <w:rPr>
+                <w:sz w:val="19"/>
+                <w:szCs w:val="19"/>
+              </w:rPr>
+              <w:t xml:space="preserve"> group with </w:t>
+            </w:r>
+            <w:r>
+              <w:rPr>
+                <w:i/>
+                <w:iCs/>
+                <w:sz w:val="19"/>
+                <w:szCs w:val="19"/>
+              </w:rPr>
+              <w:t>Ways to pay</w:t>
+            </w:r>
+            <w:r>
+              <w:rPr>
+                <w:sz w:val="19"/>
+                <w:szCs w:val="19"/>
+              </w:rPr>
+              <w:t xml:space="preserve"> (entries added after their fact-check)</w:t>
             </w:r>
           </w:p>
         </w:tc>
@@ -14470,10 +14825,7 @@
         <w:spacing w:after="120"/>
       </w:pPr>
       <w:r>
-        <w:t xml:space="preserve">v1.0 planned 35 stories (122 points) for R1 and 15 (54 points) for R2. The change requests added 19 stories, moved </w:t>
-      </w:r>
-      <w:r>
-        <w:t>four from R2 to R1 (answer actions, senior answers, senior verification, groups), superseded "custom journey steps" (replaced by following courses and notices) and withdrew "what retrying would take" with the retry path. After the buildathon submission, CR-007 to CR-010 added five R2 stories (11 points), all delivered on 15 October 2026; R1 is unchanged.</w:t>
+        <w:t>v1.0 planned 35 stories (122 points) for R1 and 15 (54 points) for R2. The change requests added 19 stories, moved four from R2 to R1 (answer actions, senior answers, senior verification, groups), superseded "custom journey steps" (replaced by following courses and notices) and withdrew "what retrying would take" with the retry path. After the buildathon submission, CR-007 to CR-010 added five R2 stories (11 points), all delivered on 15 October 2026; R1 is unchanged.</w:t>
       </w:r>
     </w:p>
     <w:p>
@@ -14487,7 +14839,7 @@
           <w:noProof/>
         </w:rPr>
         <w:drawing>
-          <wp:inline distT="0" distB="0" distL="0" distR="0" wp14:anchorId="276877A6" wp14:editId="276877A7">
+          <wp:inline distT="0" distB="0" distL="0" distR="0" wp14:anchorId="6C42C34C" wp14:editId="6C42C34D">
             <wp:extent cx="6124575" cy="3848100"/>
             <wp:effectExtent l="0" t="0" r="0" b="0"/>
             <wp:docPr id="1" name="system-context.png" descr="ZedPath system context (C4 model, level 1)" title="ZedPath system context (C4 model, level 1)"/>
@@ -14530,7 +14882,7 @@
       <w:pPr>
         <w:pStyle w:val="Caption"/>
       </w:pPr>
-      <w:bookmarkStart w:id="28" w:name="_Toc243650758"/>
+      <w:bookmarkStart w:id="28" w:name="_Toc243676602"/>
       <w:r>
         <w:t xml:space="preserve">Figure </w:t>
       </w:r>
@@ -14583,7 +14935,7 @@
         <w:keepNext/>
         <w:keepLines/>
       </w:pPr>
-      <w:bookmarkStart w:id="29" w:name="_Toc243650751"/>
+      <w:bookmarkStart w:id="29" w:name="_Toc243676595"/>
       <w:r>
         <w:lastRenderedPageBreak/>
         <w:t>3.3 Limitations and exclusions</w:t>
@@ -14782,7 +15134,7 @@
         <w:keepLines/>
         <w:pageBreakBefore/>
       </w:pPr>
-      <w:bookmarkStart w:id="30" w:name="_Toc243650752"/>
+      <w:bookmarkStart w:id="30" w:name="_Toc243676596"/>
       <w:r>
         <w:lastRenderedPageBreak/>
         <w:t>4 Business context</w:t>
@@ -14795,7 +15147,7 @@
         <w:keepNext/>
         <w:keepLines/>
       </w:pPr>
-      <w:bookmarkStart w:id="31" w:name="_Toc243650753"/>
+      <w:bookmarkStart w:id="31" w:name="_Toc243676597"/>
       <w:r>
         <w:t>4.1 Stakeholder profiles</w:t>
       </w:r>
@@ -14806,7 +15158,7 @@
         <w:pStyle w:val="Caption"/>
         <w:keepNext/>
       </w:pPr>
-      <w:bookmarkStart w:id="32" w:name="_Toc243650768"/>
+      <w:bookmarkStart w:id="32" w:name="_Toc243676612"/>
       <w:r>
         <w:t xml:space="preserve">Table </w:t>
       </w:r>
@@ -14848,7 +15200,7 @@
           <w:left w:w="10" w:type="dxa"/>
           <w:right w:w="10" w:type="dxa"/>
         </w:tblCellMar>
-        <w:tblLook w:val="04A0" w:firstRow="1" w:lastRow="0" w:firstColumn="1" w:lastColumn="0" w:noHBand="0" w:noVBand="1"/>
+        <w:tblLook w:val="0000" w:firstRow="0" w:lastRow="0" w:firstColumn="0" w:lastColumn="0" w:noHBand="0" w:noVBand="0"/>
       </w:tblPr>
       <w:tblGrid>
         <w:gridCol w:w="1762"/>
@@ -15945,7 +16297,7 @@
         <w:keepNext/>
         <w:keepLines/>
       </w:pPr>
-      <w:bookmarkStart w:id="33" w:name="_Toc243650754"/>
+      <w:bookmarkStart w:id="33" w:name="_Toc243676598"/>
       <w:r>
         <w:t>4.2 Project priorities</w:t>
       </w:r>
@@ -15956,7 +16308,7 @@
         <w:pStyle w:val="Caption"/>
         <w:keepNext/>
       </w:pPr>
-      <w:bookmarkStart w:id="34" w:name="_Toc243650769"/>
+      <w:bookmarkStart w:id="34" w:name="_Toc243676613"/>
       <w:r>
         <w:t xml:space="preserve">Table </w:t>
       </w:r>
@@ -15998,7 +16350,7 @@
           <w:left w:w="10" w:type="dxa"/>
           <w:right w:w="10" w:type="dxa"/>
         </w:tblCellMar>
-        <w:tblLook w:val="04A0" w:firstRow="1" w:lastRow="0" w:firstColumn="1" w:lastColumn="0" w:noHBand="0" w:noVBand="1"/>
+        <w:tblLook w:val="0000" w:firstRow="0" w:lastRow="0" w:firstColumn="0" w:lastColumn="0" w:noHBand="0" w:noVBand="0"/>
       </w:tblPr>
       <w:tblGrid>
         <w:gridCol w:w="1188"/>
@@ -16642,7 +16994,7 @@
         <w:keepNext/>
         <w:keepLines/>
       </w:pPr>
-      <w:bookmarkStart w:id="35" w:name="_Toc243650755"/>
+      <w:bookmarkStart w:id="35" w:name="_Toc243676599"/>
       <w:r>
         <w:t>4.3 Deployment considerations</w:t>
       </w:r>
@@ -16730,7 +17082,7 @@
         <w:keepLines/>
         <w:pageBreakBefore/>
       </w:pPr>
-      <w:bookmarkStart w:id="36" w:name="_Toc243650756"/>
+      <w:bookmarkStart w:id="36" w:name="_Toc243676600"/>
       <w:r>
         <w:lastRenderedPageBreak/>
         <w:t>Appendix A: Glossary</w:t>
@@ -16742,7 +17094,7 @@
         <w:pStyle w:val="Caption"/>
         <w:keepNext/>
       </w:pPr>
-      <w:bookmarkStart w:id="37" w:name="_Toc243650770"/>
+      <w:bookmarkStart w:id="37" w:name="_Toc243676614"/>
       <w:r>
         <w:t xml:space="preserve">Table </w:t>
       </w:r>
@@ -16784,7 +17136,7 @@
           <w:left w:w="10" w:type="dxa"/>
           <w:right w:w="10" w:type="dxa"/>
         </w:tblCellMar>
-        <w:tblLook w:val="04A0" w:firstRow="1" w:lastRow="0" w:firstColumn="1" w:lastColumn="0" w:noHBand="0" w:noVBand="1"/>
+        <w:tblLook w:val="0000" w:firstRow="0" w:lastRow="0" w:firstColumn="0" w:lastColumn="0" w:noHBand="0" w:noVBand="0"/>
       </w:tblPr>
       <w:tblGrid>
         <w:gridCol w:w="1843"/>
@@ -17619,7 +17971,7 @@
         <w:keepLines/>
         <w:pageBreakBefore/>
       </w:pPr>
-      <w:bookmarkStart w:id="38" w:name="_Toc243650757"/>
+      <w:bookmarkStart w:id="38" w:name="_Toc243676601"/>
       <w:r>
         <w:lastRenderedPageBreak/>
         <w:t>Appendix B: References</w:t>
@@ -17631,7 +17983,7 @@
         <w:pStyle w:val="Caption"/>
         <w:keepNext/>
       </w:pPr>
-      <w:bookmarkStart w:id="39" w:name="_Toc243650771"/>
+      <w:bookmarkStart w:id="39" w:name="_Toc243676615"/>
       <w:r>
         <w:t xml:space="preserve">Table </w:t>
       </w:r>
@@ -17673,7 +18025,7 @@
           <w:left w:w="10" w:type="dxa"/>
           <w:right w:w="10" w:type="dxa"/>
         </w:tblCellMar>
-        <w:tblLook w:val="04A0" w:firstRow="1" w:lastRow="0" w:firstColumn="1" w:lastColumn="0" w:noHBand="0" w:noVBand="1"/>
+        <w:tblLook w:val="0000" w:firstRow="0" w:lastRow="0" w:firstColumn="0" w:lastColumn="0" w:noHBand="0" w:noVBand="0"/>
       </w:tblPr>
       <w:tblGrid>
         <w:gridCol w:w="803"/>
@@ -18795,72 +19147,10 @@
 <file path=word/numbering.xml><?xml version="1.0" encoding="utf-8"?>
 <w:numbering xmlns:wpc="http://schemas.microsoft.com/office/word/2010/wordprocessingCanvas" xmlns:cx="http://schemas.microsoft.com/office/drawing/2014/chartex" xmlns:cx1="http://schemas.microsoft.com/office/drawing/2015/9/8/chartex" xmlns:cx2="http://schemas.microsoft.com/office/drawing/2015/10/21/chartex" xmlns:cx3="http://schemas.microsoft.com/office/drawing/2016/5/9/chartex" xmlns:cx4="http://schemas.microsoft.com/office/drawing/2016/5/10/chartex" xmlns:cx5="http://schemas.microsoft.com/office/drawing/2016/5/11/chartex" xmlns:cx6="http://schemas.microsoft.com/office/drawing/2016/5/12/chartex" xmlns:cx7="http://schemas.microsoft.com/office/drawing/2016/5/13/chartex" xmlns:cx8="http://schemas.microsoft.com/office/drawing/2016/5/14/chartex" xmlns:mc="http://schemas.openxmlformats.org/markup-compatibility/2006" xmlns:aink="http://schemas.microsoft.com/office/drawing/2016/ink" xmlns:am3d="http://schemas.microsoft.com/office/drawing/2017/model3d" xmlns:o="urn:schemas-microsoft-com:office:office" xmlns:oel="http://schemas.microsoft.com/office/2019/extlst" xmlns:r="http://schemas.openxmlformats.org/officeDocument/2006/relationships" xmlns:m="http://schemas.openxmlformats.org/officeDocument/2006/math" xmlns:v="urn:schemas-microsoft-com:vml" xmlns:wp14="http://schemas.microsoft.com/office/word/2010/wordprocessingDrawing" xmlns:wp="http://schemas.openxmlformats.org/drawingml/2006/wordprocessingDrawing" xmlns:w10="urn:schemas-microsoft-com:office:word" xmlns:w="http://schemas.openxmlformats.org/wordprocessingml/2006/main" xmlns:w14="http://schemas.microsoft.com/office/word/2010/wordml" xmlns:w15="http://schemas.microsoft.com/office/word/2012/wordml" xmlns:w16cex="http://schemas.microsoft.com/office/word/2018/wordml/cex" xmlns:w16cid="http://schemas.microsoft.com/office/word/2016/wordml/cid" xmlns:w16="http://schemas.microsoft.com/office/word/2018/wordml" xmlns:w16du="http://schemas.microsoft.com/office/word/2023/wordml/word16du" xmlns:w16sdtdh="http://schemas.microsoft.com/office/word/2020/wordml/sdtdatahash" xmlns:w16sdtfl="http://schemas.microsoft.com/office/word/2024/wordml/sdtformatlock" xmlns:w16se="http://schemas.microsoft.com/office/word/2015/wordml/symex" xmlns:wpg="http://schemas.microsoft.com/office/word/2010/wordprocessingGroup" xmlns:wpi="http://schemas.microsoft.com/office/word/2010/wordprocessingInk" xmlns:wne="http://schemas.microsoft.com/office/word/2006/wordml" xmlns:wps="http://schemas.microsoft.com/office/word/2010/wordprocessingShape" mc:Ignorable="w14 w15 w16se w16cid w16 w16cex w16sdtdh w16sdtfl w16du wp14">
   <w:abstractNum w:abstractNumId="0" w15:restartNumberingAfterBreak="0">
-    <w:nsid w:val="0955211A"/>
+    <w:nsid w:val="4BB113B8"/>
     <w:multiLevelType w:val="hybridMultilevel"/>
-    <w:tmpl w:val="3FB8C52A"/>
-    <w:lvl w:ilvl="0" w:tplc="6F8AA102">
-      <w:start w:val="1"/>
-      <w:numFmt w:val="decimal"/>
-      <w:lvlText w:val="%1."/>
-      <w:lvlJc w:val="left"/>
-      <w:pPr>
-        <w:ind w:left="720" w:hanging="360"/>
-      </w:pPr>
-    </w:lvl>
-    <w:lvl w:ilvl="1" w:tplc="3C38BD08" w:tentative="1">
-      <w:start w:val="1"/>
-      <w:numFmt w:val="lowerLetter"/>
-      <w:lvlText w:val="%2."/>
-      <w:lvlJc w:val="left"/>
-      <w:pPr>
-        <w:ind w:left="1080" w:hanging="360"/>
-      </w:pPr>
-    </w:lvl>
-    <w:lvl w:ilvl="2" w:tplc="5C849884" w:tentative="1">
-      <w:start w:val="1"/>
-      <w:numFmt w:val="lowerRoman"/>
-      <w:lvlText w:val="%3."/>
-      <w:lvlJc w:val="left"/>
-      <w:pPr>
-        <w:ind w:left="1440" w:hanging="360"/>
-      </w:pPr>
-    </w:lvl>
-    <w:lvl w:ilvl="3" w:tplc="6F9E58EE">
-      <w:numFmt w:val="decimal"/>
-      <w:lvlText w:val=""/>
-      <w:lvlJc w:val="left"/>
-    </w:lvl>
-    <w:lvl w:ilvl="4" w:tplc="FB720022">
-      <w:numFmt w:val="decimal"/>
-      <w:lvlText w:val=""/>
-      <w:lvlJc w:val="left"/>
-    </w:lvl>
-    <w:lvl w:ilvl="5" w:tplc="77B85944">
-      <w:numFmt w:val="decimal"/>
-      <w:lvlText w:val=""/>
-      <w:lvlJc w:val="left"/>
-    </w:lvl>
-    <w:lvl w:ilvl="6" w:tplc="0776BC3E">
-      <w:numFmt w:val="decimal"/>
-      <w:lvlText w:val=""/>
-      <w:lvlJc w:val="left"/>
-    </w:lvl>
-    <w:lvl w:ilvl="7" w:tplc="34D42BF2">
-      <w:numFmt w:val="decimal"/>
-      <w:lvlText w:val=""/>
-      <w:lvlJc w:val="left"/>
-    </w:lvl>
-    <w:lvl w:ilvl="8" w:tplc="30B886F0">
-      <w:numFmt w:val="decimal"/>
-      <w:lvlText w:val=""/>
-      <w:lvlJc w:val="left"/>
-    </w:lvl>
-  </w:abstractNum>
-  <w:abstractNum w:abstractNumId="1" w15:restartNumberingAfterBreak="0">
-    <w:nsid w:val="508C501C"/>
-    <w:multiLevelType w:val="hybridMultilevel"/>
-    <w:tmpl w:val="F364C866"/>
-    <w:lvl w:ilvl="0" w:tplc="65062C0E">
+    <w:tmpl w:val="6E4CF7E8"/>
+    <w:lvl w:ilvl="0" w:tplc="16809892">
       <w:start w:val="1"/>
       <w:numFmt w:val="bullet"/>
       <w:lvlText w:val="•"/>
@@ -18869,7 +19159,7 @@
         <w:ind w:left="720" w:hanging="280"/>
       </w:pPr>
     </w:lvl>
-    <w:lvl w:ilvl="1" w:tplc="8A64B59C" w:tentative="1">
+    <w:lvl w:ilvl="1" w:tplc="C624E9DA" w:tentative="1">
       <w:start w:val="1"/>
       <w:numFmt w:val="bullet"/>
       <w:lvlText w:val="–"/>
@@ -18878,7 +19168,7 @@
         <w:ind w:left="1080" w:hanging="280"/>
       </w:pPr>
     </w:lvl>
-    <w:lvl w:ilvl="2" w:tplc="C1382774" w:tentative="1">
+    <w:lvl w:ilvl="2" w:tplc="E28A63A0" w:tentative="1">
       <w:start w:val="1"/>
       <w:numFmt w:val="bullet"/>
       <w:lvlText w:val="▪"/>
@@ -18887,42 +19177,42 @@
         <w:ind w:left="1440" w:hanging="280"/>
       </w:pPr>
     </w:lvl>
-    <w:lvl w:ilvl="3" w:tplc="DCE49EB4">
+    <w:lvl w:ilvl="3" w:tplc="911C763E">
       <w:numFmt w:val="decimal"/>
       <w:lvlText w:val=""/>
       <w:lvlJc w:val="left"/>
     </w:lvl>
-    <w:lvl w:ilvl="4" w:tplc="E864D11C">
+    <w:lvl w:ilvl="4" w:tplc="8648EB00">
       <w:numFmt w:val="decimal"/>
       <w:lvlText w:val=""/>
       <w:lvlJc w:val="left"/>
     </w:lvl>
-    <w:lvl w:ilvl="5" w:tplc="D20EE6EC">
+    <w:lvl w:ilvl="5" w:tplc="FC3650FC">
       <w:numFmt w:val="decimal"/>
       <w:lvlText w:val=""/>
       <w:lvlJc w:val="left"/>
     </w:lvl>
-    <w:lvl w:ilvl="6" w:tplc="83061E8A">
+    <w:lvl w:ilvl="6" w:tplc="6914A116">
       <w:numFmt w:val="decimal"/>
       <w:lvlText w:val=""/>
       <w:lvlJc w:val="left"/>
     </w:lvl>
-    <w:lvl w:ilvl="7" w:tplc="F5D81760">
+    <w:lvl w:ilvl="7" w:tplc="4AFACDEA">
       <w:numFmt w:val="decimal"/>
       <w:lvlText w:val=""/>
       <w:lvlJc w:val="left"/>
     </w:lvl>
-    <w:lvl w:ilvl="8" w:tplc="457278C4">
+    <w:lvl w:ilvl="8" w:tplc="27EC07E4">
       <w:numFmt w:val="decimal"/>
       <w:lvlText w:val=""/>
       <w:lvlJc w:val="left"/>
     </w:lvl>
   </w:abstractNum>
-  <w:abstractNum w:abstractNumId="2" w15:restartNumberingAfterBreak="0">
-    <w:nsid w:val="6D633D83"/>
+  <w:abstractNum w:abstractNumId="1" w15:restartNumberingAfterBreak="0">
+    <w:nsid w:val="57EA7814"/>
     <w:multiLevelType w:val="hybridMultilevel"/>
-    <w:tmpl w:val="FD38EC84"/>
-    <w:lvl w:ilvl="0" w:tplc="45BE116C" w:tentative="1">
+    <w:tmpl w:val="E06416F8"/>
+    <w:lvl w:ilvl="0" w:tplc="6A2CB65A" w:tentative="1">
       <w:start w:val="1"/>
       <w:numFmt w:val="bullet"/>
       <w:lvlText w:val="●"/>
@@ -18931,7 +19221,7 @@
         <w:ind w:left="720" w:hanging="360"/>
       </w:pPr>
     </w:lvl>
-    <w:lvl w:ilvl="1" w:tplc="DE202A30" w:tentative="1">
+    <w:lvl w:ilvl="1" w:tplc="393E6464" w:tentative="1">
       <w:start w:val="1"/>
       <w:numFmt w:val="bullet"/>
       <w:lvlText w:val="○"/>
@@ -18940,7 +19230,7 @@
         <w:ind w:left="1440" w:hanging="360"/>
       </w:pPr>
     </w:lvl>
-    <w:lvl w:ilvl="2" w:tplc="F04C5998" w:tentative="1">
+    <w:lvl w:ilvl="2" w:tplc="AB3487C0" w:tentative="1">
       <w:start w:val="1"/>
       <w:numFmt w:val="bullet"/>
       <w:lvlText w:val="■"/>
@@ -18949,7 +19239,7 @@
         <w:ind w:left="2160" w:hanging="360"/>
       </w:pPr>
     </w:lvl>
-    <w:lvl w:ilvl="3" w:tplc="8EA843EA" w:tentative="1">
+    <w:lvl w:ilvl="3" w:tplc="7B5C0886" w:tentative="1">
       <w:start w:val="1"/>
       <w:numFmt w:val="bullet"/>
       <w:lvlText w:val="●"/>
@@ -18958,7 +19248,7 @@
         <w:ind w:left="2880" w:hanging="360"/>
       </w:pPr>
     </w:lvl>
-    <w:lvl w:ilvl="4" w:tplc="C9BCDCB6" w:tentative="1">
+    <w:lvl w:ilvl="4" w:tplc="3828D1BC" w:tentative="1">
       <w:start w:val="1"/>
       <w:numFmt w:val="bullet"/>
       <w:lvlText w:val="○"/>
@@ -18967,7 +19257,7 @@
         <w:ind w:left="3600" w:hanging="360"/>
       </w:pPr>
     </w:lvl>
-    <w:lvl w:ilvl="5" w:tplc="C9545874" w:tentative="1">
+    <w:lvl w:ilvl="5" w:tplc="C81C642E" w:tentative="1">
       <w:start w:val="1"/>
       <w:numFmt w:val="bullet"/>
       <w:lvlText w:val="■"/>
@@ -18976,7 +19266,7 @@
         <w:ind w:left="4320" w:hanging="360"/>
       </w:pPr>
     </w:lvl>
-    <w:lvl w:ilvl="6" w:tplc="B36255BC" w:tentative="1">
+    <w:lvl w:ilvl="6" w:tplc="C4DCA42E" w:tentative="1">
       <w:start w:val="1"/>
       <w:numFmt w:val="bullet"/>
       <w:lvlText w:val="●"/>
@@ -18985,7 +19275,7 @@
         <w:ind w:left="5040" w:hanging="360"/>
       </w:pPr>
     </w:lvl>
-    <w:lvl w:ilvl="7" w:tplc="84762EC0" w:tentative="1">
+    <w:lvl w:ilvl="7" w:tplc="22D22710" w:tentative="1">
       <w:start w:val="1"/>
       <w:numFmt w:val="bullet"/>
       <w:lvlText w:val="●"/>
@@ -18994,7 +19284,7 @@
         <w:ind w:left="5760" w:hanging="360"/>
       </w:pPr>
     </w:lvl>
-    <w:lvl w:ilvl="8" w:tplc="D5D6124E" w:tentative="1">
+    <w:lvl w:ilvl="8" w:tplc="098814A2" w:tentative="1">
       <w:start w:val="1"/>
       <w:numFmt w:val="bullet"/>
       <w:lvlText w:val="●"/>
@@ -19004,32 +19294,94 @@
       </w:pPr>
     </w:lvl>
   </w:abstractNum>
-  <w:num w:numId="1" w16cid:durableId="1800302497">
+  <w:abstractNum w:abstractNumId="2" w15:restartNumberingAfterBreak="0">
+    <w:nsid w:val="6E797A6F"/>
+    <w:multiLevelType w:val="hybridMultilevel"/>
+    <w:tmpl w:val="B08A2B44"/>
+    <w:lvl w:ilvl="0" w:tplc="212CEA7C">
+      <w:start w:val="1"/>
+      <w:numFmt w:val="decimal"/>
+      <w:lvlText w:val="%1."/>
+      <w:lvlJc w:val="left"/>
+      <w:pPr>
+        <w:ind w:left="720" w:hanging="360"/>
+      </w:pPr>
+    </w:lvl>
+    <w:lvl w:ilvl="1" w:tplc="363E2FC6" w:tentative="1">
+      <w:start w:val="1"/>
+      <w:numFmt w:val="lowerLetter"/>
+      <w:lvlText w:val="%2."/>
+      <w:lvlJc w:val="left"/>
+      <w:pPr>
+        <w:ind w:left="1080" w:hanging="360"/>
+      </w:pPr>
+    </w:lvl>
+    <w:lvl w:ilvl="2" w:tplc="1C6491A6" w:tentative="1">
+      <w:start w:val="1"/>
+      <w:numFmt w:val="lowerRoman"/>
+      <w:lvlText w:val="%3."/>
+      <w:lvlJc w:val="left"/>
+      <w:pPr>
+        <w:ind w:left="1440" w:hanging="360"/>
+      </w:pPr>
+    </w:lvl>
+    <w:lvl w:ilvl="3" w:tplc="11C04D4E">
+      <w:numFmt w:val="decimal"/>
+      <w:lvlText w:val=""/>
+      <w:lvlJc w:val="left"/>
+    </w:lvl>
+    <w:lvl w:ilvl="4" w:tplc="FD1A73E2">
+      <w:numFmt w:val="decimal"/>
+      <w:lvlText w:val=""/>
+      <w:lvlJc w:val="left"/>
+    </w:lvl>
+    <w:lvl w:ilvl="5" w:tplc="31D28EFA">
+      <w:numFmt w:val="decimal"/>
+      <w:lvlText w:val=""/>
+      <w:lvlJc w:val="left"/>
+    </w:lvl>
+    <w:lvl w:ilvl="6" w:tplc="A7946756">
+      <w:numFmt w:val="decimal"/>
+      <w:lvlText w:val=""/>
+      <w:lvlJc w:val="left"/>
+    </w:lvl>
+    <w:lvl w:ilvl="7" w:tplc="C94E5FB4">
+      <w:numFmt w:val="decimal"/>
+      <w:lvlText w:val=""/>
+      <w:lvlJc w:val="left"/>
+    </w:lvl>
+    <w:lvl w:ilvl="8" w:tplc="D02815D0">
+      <w:numFmt w:val="decimal"/>
+      <w:lvlText w:val=""/>
+      <w:lvlJc w:val="left"/>
+    </w:lvl>
+  </w:abstractNum>
+  <w:num w:numId="1" w16cid:durableId="401683937">
+    <w:abstractNumId w:val="1"/>
+    <w:lvlOverride w:ilvl="0">
+      <w:startOverride w:val="1"/>
+    </w:lvlOverride>
+  </w:num>
+  <w:num w:numId="2" w16cid:durableId="570311985">
     <w:abstractNumId w:val="2"/>
     <w:lvlOverride w:ilvl="0">
       <w:startOverride w:val="1"/>
     </w:lvlOverride>
   </w:num>
-  <w:num w:numId="2" w16cid:durableId="309406055">
+  <w:num w:numId="3" w16cid:durableId="1621951840">
     <w:abstractNumId w:val="0"/>
     <w:lvlOverride w:ilvl="0">
       <w:startOverride w:val="1"/>
     </w:lvlOverride>
   </w:num>
-  <w:num w:numId="3" w16cid:durableId="520318717">
-    <w:abstractNumId w:val="1"/>
+  <w:num w:numId="4" w16cid:durableId="2001423385">
+    <w:abstractNumId w:val="0"/>
     <w:lvlOverride w:ilvl="0">
       <w:startOverride w:val="1"/>
     </w:lvlOverride>
   </w:num>
-  <w:num w:numId="4" w16cid:durableId="187106993">
-    <w:abstractNumId w:val="1"/>
-    <w:lvlOverride w:ilvl="0">
-      <w:startOverride w:val="1"/>
-    </w:lvlOverride>
-  </w:num>
-  <w:num w:numId="5" w16cid:durableId="2025667673">
-    <w:abstractNumId w:val="1"/>
+  <w:num w:numId="5" w16cid:durableId="340855562">
+    <w:abstractNumId w:val="0"/>
     <w:lvlOverride w:ilvl="0">
       <w:startOverride w:val="1"/>
     </w:lvlOverride>
@@ -19733,7 +20085,7 @@
     <w:autoRedefine/>
     <w:uiPriority w:val="39"/>
     <w:unhideWhenUsed/>
-    <w:rsid w:val="00841A59"/>
+    <w:rsid w:val="00984D47"/>
     <w:pPr>
       <w:spacing w:after="100"/>
     </w:pPr>
@@ -19745,7 +20097,7 @@
     <w:autoRedefine/>
     <w:uiPriority w:val="39"/>
     <w:unhideWhenUsed/>
-    <w:rsid w:val="00841A59"/>
+    <w:rsid w:val="00984D47"/>
     <w:pPr>
       <w:spacing w:after="100"/>
       <w:ind w:left="210"/>
@@ -19757,7 +20109,7 @@
     <w:next w:val="Normal"/>
     <w:uiPriority w:val="99"/>
     <w:unhideWhenUsed/>
-    <w:rsid w:val="00841A59"/>
+    <w:rsid w:val="00984D47"/>
   </w:style>
 </w:styles>
 </file>

</xml_diff>